<commit_message>
Practiced Window Functions First_Value() and Last_Value() with window frames, and updated documentation.
</commit_message>
<xml_diff>
--- a/documentation/da-gym-doumentation .docx
+++ b/documentation/da-gym-doumentation .docx
@@ -25,20 +25,61 @@
         <w:rPr>
           <w:u w:val="single"/>
         </w:rPr>
+        <w:t>9/9/2026</w:t>
+      </w:r>
+    </w:p>
+    <w:p>
+      <w:r>
+        <w:t xml:space="preserve">Learning </w:t>
+      </w:r>
+      <w:r>
+        <w:t>First_Value() and Last_Value()</w:t>
+      </w:r>
+      <w:r>
+        <w:t xml:space="preserve"> with Window Frames</w:t>
+      </w:r>
+    </w:p>
+    <w:p>
+      <w:pPr>
+        <w:pStyle w:val="ListParagraph"/>
+        <w:numPr>
+          <w:ilvl w:val="0"/>
+          <w:numId w:val="3"/>
+        </w:numPr>
+      </w:pPr>
+      <w:r>
+        <w:t>Business-wise, FIRST_VALUE() is useful for comparing current performance to a starting baseline, while LAST_VALUE() is useful for comparing rows to the final value in a defined sequence.</w:t>
+      </w:r>
+    </w:p>
+    <w:p>
+      <w:pPr>
+        <w:pStyle w:val="ListParagraph"/>
+        <w:numPr>
+          <w:ilvl w:val="0"/>
+          <w:numId w:val="3"/>
+        </w:numPr>
+      </w:pPr>
+      <w:r>
+        <w:t>Window Frame = defines how much of a sequence a function can see</w:t>
+      </w:r>
+    </w:p>
+    <w:p/>
+    <w:p>
+      <w:pPr>
+        <w:rPr>
+          <w:u w:val="single"/>
+        </w:rPr>
+      </w:pPr>
+      <w:r>
+        <w:rPr>
+          <w:u w:val="single"/>
+        </w:rPr>
         <w:t>9-8-2026</w:t>
       </w:r>
     </w:p>
     <w:p>
       <w:r>
-        <w:t xml:space="preserve">Practiced </w:t>
-      </w:r>
-      <w:proofErr w:type="gramStart"/>
-      <w:r>
-        <w:t>Lag(</w:t>
-      </w:r>
-      <w:proofErr w:type="gramEnd"/>
-      <w:r>
-        <w:t>) – Value/Navigation windows</w:t>
+        <w:t>Practiced Lag() – Value/Navigation windows</w:t>
       </w:r>
     </w:p>
     <w:p>
@@ -87,15 +128,7 @@
         </w:numPr>
       </w:pPr>
       <w:r>
-        <w:t xml:space="preserve">Partition </w:t>
-      </w:r>
-      <w:proofErr w:type="gramStart"/>
-      <w:r>
-        <w:t>By(</w:t>
-      </w:r>
-      <w:proofErr w:type="gramEnd"/>
-      <w:r>
-        <w:t>)</w:t>
+        <w:t>Partition By()</w:t>
       </w:r>
     </w:p>
     <w:p>
@@ -122,15 +155,7 @@
         </w:numPr>
       </w:pPr>
       <w:r>
-        <w:t xml:space="preserve">Order </w:t>
-      </w:r>
-      <w:proofErr w:type="gramStart"/>
-      <w:r>
-        <w:t>By(</w:t>
-      </w:r>
-      <w:proofErr w:type="gramEnd"/>
-      <w:r>
-        <w:t>)</w:t>
+        <w:t>Order By()</w:t>
       </w:r>
     </w:p>
     <w:p>
@@ -153,21 +178,8 @@
           <w:numId w:val="2"/>
         </w:numPr>
       </w:pPr>
-      <w:proofErr w:type="spellStart"/>
-      <w:r>
-        <w:t>Row_</w:t>
-      </w:r>
-      <w:proofErr w:type="gramStart"/>
-      <w:r>
-        <w:t>Number</w:t>
-      </w:r>
-      <w:proofErr w:type="spellEnd"/>
-      <w:r>
-        <w:t>(</w:t>
-      </w:r>
-      <w:proofErr w:type="gramEnd"/>
-      <w:r>
-        <w:t>)</w:t>
+      <w:r>
+        <w:t>Row_Number()</w:t>
       </w:r>
     </w:p>
     <w:p>
@@ -178,13 +190,8 @@
           <w:numId w:val="2"/>
         </w:numPr>
       </w:pPr>
-      <w:proofErr w:type="gramStart"/>
-      <w:r>
-        <w:t>Rank(</w:t>
-      </w:r>
-      <w:proofErr w:type="gramEnd"/>
-      <w:r>
-        <w:t>)</w:t>
+      <w:r>
+        <w:t>Rank()</w:t>
       </w:r>
     </w:p>
     <w:p>
@@ -195,21 +202,8 @@
           <w:numId w:val="2"/>
         </w:numPr>
       </w:pPr>
-      <w:proofErr w:type="spellStart"/>
-      <w:r>
-        <w:t>Dense_</w:t>
-      </w:r>
-      <w:proofErr w:type="gramStart"/>
-      <w:r>
-        <w:t>Rank</w:t>
-      </w:r>
-      <w:proofErr w:type="spellEnd"/>
-      <w:r>
-        <w:t>(</w:t>
-      </w:r>
-      <w:proofErr w:type="gramEnd"/>
-      <w:r>
-        <w:t>)</w:t>
+      <w:r>
+        <w:t>Dense_Rank()</w:t>
       </w:r>
     </w:p>
     <w:p>
@@ -220,13 +214,8 @@
           <w:numId w:val="2"/>
         </w:numPr>
       </w:pPr>
-      <w:proofErr w:type="gramStart"/>
-      <w:r>
-        <w:t>Lag(</w:t>
-      </w:r>
-      <w:proofErr w:type="gramEnd"/>
-      <w:r>
-        <w:t>)</w:t>
+      <w:r>
+        <w:t>Lag()</w:t>
       </w:r>
     </w:p>
     <w:p>
@@ -250,21 +239,11 @@
         </w:numPr>
       </w:pPr>
       <w:r>
-        <w:t xml:space="preserve">Define the field I want the value from and </w:t>
-      </w:r>
-      <w:proofErr w:type="gramStart"/>
-      <w:r>
-        <w:t>pull  a</w:t>
-      </w:r>
-      <w:proofErr w:type="gramEnd"/>
-      <w:r>
-        <w:t xml:space="preserve"> previous record </w:t>
-      </w:r>
-      <w:proofErr w:type="gramStart"/>
+        <w:t xml:space="preserve">Define the field I want the value from and pull  a previous record </w:t>
+      </w:r>
       <w:r>
         <w:t>git</w:t>
       </w:r>
-      <w:proofErr w:type="gramEnd"/>
     </w:p>
     <w:p/>
     <w:p>
@@ -299,6 +278,119 @@
 <file path=word/numbering.xml><?xml version="1.0" encoding="utf-8"?>
 <w:numbering xmlns:wpc="http://schemas.microsoft.com/office/word/2010/wordprocessingCanvas" xmlns:cx="http://schemas.microsoft.com/office/drawing/2014/chartex" xmlns:cx1="http://schemas.microsoft.com/office/drawing/2015/9/8/chartex" xmlns:cx2="http://schemas.microsoft.com/office/drawing/2015/10/21/chartex" xmlns:cx3="http://schemas.microsoft.com/office/drawing/2016/5/9/chartex" xmlns:cx4="http://schemas.microsoft.com/office/drawing/2016/5/10/chartex" xmlns:cx5="http://schemas.microsoft.com/office/drawing/2016/5/11/chartex" xmlns:cx6="http://schemas.microsoft.com/office/drawing/2016/5/12/chartex" xmlns:cx7="http://schemas.microsoft.com/office/drawing/2016/5/13/chartex" xmlns:cx8="http://schemas.microsoft.com/office/drawing/2016/5/14/chartex" xmlns:mc="http://schemas.openxmlformats.org/markup-compatibility/2006" xmlns:aink="http://schemas.microsoft.com/office/drawing/2016/ink" xmlns:am3d="http://schemas.microsoft.com/office/drawing/2017/model3d" xmlns:o="urn:schemas-microsoft-com:office:office" xmlns:oel="http://schemas.microsoft.com/office/2019/extlst" xmlns:r="http://schemas.openxmlformats.org/officeDocument/2006/relationships" xmlns:m="http://schemas.openxmlformats.org/officeDocument/2006/math" xmlns:v="urn:schemas-microsoft-com:vml" xmlns:wp14="http://schemas.microsoft.com/office/word/2010/wordprocessingDrawing" xmlns:wp="http://schemas.openxmlformats.org/drawingml/2006/wordprocessingDrawing" xmlns:w10="urn:schemas-microsoft-com:office:word" xmlns:w="http://schemas.openxmlformats.org/wordprocessingml/2006/main" xmlns:w14="http://schemas.microsoft.com/office/word/2010/wordml" xmlns:w15="http://schemas.microsoft.com/office/word/2012/wordml" xmlns:w16cex="http://schemas.microsoft.com/office/word/2018/wordml/cex" xmlns:w16cid="http://schemas.microsoft.com/office/word/2016/wordml/cid" xmlns:w16="http://schemas.microsoft.com/office/word/2018/wordml" xmlns:w16du="http://schemas.microsoft.com/office/word/2023/wordml/word16du" xmlns:w16sdtdh="http://schemas.microsoft.com/office/word/2020/wordml/sdtdatahash" xmlns:w16sdtfl="http://schemas.microsoft.com/office/word/2024/wordml/sdtformatlock" xmlns:w16se="http://schemas.microsoft.com/office/word/2015/wordml/symex" xmlns:wpg="http://schemas.microsoft.com/office/word/2010/wordprocessingGroup" xmlns:wpi="http://schemas.microsoft.com/office/word/2010/wordprocessingInk" xmlns:wne="http://schemas.microsoft.com/office/word/2006/wordml" xmlns:wps="http://schemas.microsoft.com/office/word/2010/wordprocessingShape" mc:Ignorable="w14 w15 w16se w16cid w16 w16cex w16sdtdh w16sdtfl w16du wp14">
   <w:abstractNum w:abstractNumId="0" w15:restartNumberingAfterBreak="0">
+    <w:nsid w:val="1E473C7C"/>
+    <w:multiLevelType w:val="hybridMultilevel"/>
+    <w:tmpl w:val="588A0A06"/>
+    <w:lvl w:ilvl="0" w:tplc="04090001">
+      <w:start w:val="1"/>
+      <w:numFmt w:val="bullet"/>
+      <w:lvlText w:val=""/>
+      <w:lvlJc w:val="left"/>
+      <w:pPr>
+        <w:ind w:left="720" w:hanging="360"/>
+      </w:pPr>
+      <w:rPr>
+        <w:rFonts w:ascii="Symbol" w:hAnsi="Symbol" w:hint="default"/>
+      </w:rPr>
+    </w:lvl>
+    <w:lvl w:ilvl="1" w:tplc="04090003" w:tentative="1">
+      <w:start w:val="1"/>
+      <w:numFmt w:val="bullet"/>
+      <w:lvlText w:val="o"/>
+      <w:lvlJc w:val="left"/>
+      <w:pPr>
+        <w:ind w:left="1440" w:hanging="360"/>
+      </w:pPr>
+      <w:rPr>
+        <w:rFonts w:ascii="Courier New" w:hAnsi="Courier New" w:cs="Courier New" w:hint="default"/>
+      </w:rPr>
+    </w:lvl>
+    <w:lvl w:ilvl="2" w:tplc="04090005" w:tentative="1">
+      <w:start w:val="1"/>
+      <w:numFmt w:val="bullet"/>
+      <w:lvlText w:val=""/>
+      <w:lvlJc w:val="left"/>
+      <w:pPr>
+        <w:ind w:left="2160" w:hanging="360"/>
+      </w:pPr>
+      <w:rPr>
+        <w:rFonts w:ascii="Wingdings" w:hAnsi="Wingdings" w:hint="default"/>
+      </w:rPr>
+    </w:lvl>
+    <w:lvl w:ilvl="3" w:tplc="04090001" w:tentative="1">
+      <w:start w:val="1"/>
+      <w:numFmt w:val="bullet"/>
+      <w:lvlText w:val=""/>
+      <w:lvlJc w:val="left"/>
+      <w:pPr>
+        <w:ind w:left="2880" w:hanging="360"/>
+      </w:pPr>
+      <w:rPr>
+        <w:rFonts w:ascii="Symbol" w:hAnsi="Symbol" w:hint="default"/>
+      </w:rPr>
+    </w:lvl>
+    <w:lvl w:ilvl="4" w:tplc="04090003" w:tentative="1">
+      <w:start w:val="1"/>
+      <w:numFmt w:val="bullet"/>
+      <w:lvlText w:val="o"/>
+      <w:lvlJc w:val="left"/>
+      <w:pPr>
+        <w:ind w:left="3600" w:hanging="360"/>
+      </w:pPr>
+      <w:rPr>
+        <w:rFonts w:ascii="Courier New" w:hAnsi="Courier New" w:cs="Courier New" w:hint="default"/>
+      </w:rPr>
+    </w:lvl>
+    <w:lvl w:ilvl="5" w:tplc="04090005" w:tentative="1">
+      <w:start w:val="1"/>
+      <w:numFmt w:val="bullet"/>
+      <w:lvlText w:val=""/>
+      <w:lvlJc w:val="left"/>
+      <w:pPr>
+        <w:ind w:left="4320" w:hanging="360"/>
+      </w:pPr>
+      <w:rPr>
+        <w:rFonts w:ascii="Wingdings" w:hAnsi="Wingdings" w:hint="default"/>
+      </w:rPr>
+    </w:lvl>
+    <w:lvl w:ilvl="6" w:tplc="04090001" w:tentative="1">
+      <w:start w:val="1"/>
+      <w:numFmt w:val="bullet"/>
+      <w:lvlText w:val=""/>
+      <w:lvlJc w:val="left"/>
+      <w:pPr>
+        <w:ind w:left="5040" w:hanging="360"/>
+      </w:pPr>
+      <w:rPr>
+        <w:rFonts w:ascii="Symbol" w:hAnsi="Symbol" w:hint="default"/>
+      </w:rPr>
+    </w:lvl>
+    <w:lvl w:ilvl="7" w:tplc="04090003" w:tentative="1">
+      <w:start w:val="1"/>
+      <w:numFmt w:val="bullet"/>
+      <w:lvlText w:val="o"/>
+      <w:lvlJc w:val="left"/>
+      <w:pPr>
+        <w:ind w:left="5760" w:hanging="360"/>
+      </w:pPr>
+      <w:rPr>
+        <w:rFonts w:ascii="Courier New" w:hAnsi="Courier New" w:cs="Courier New" w:hint="default"/>
+      </w:rPr>
+    </w:lvl>
+    <w:lvl w:ilvl="8" w:tplc="04090005" w:tentative="1">
+      <w:start w:val="1"/>
+      <w:numFmt w:val="bullet"/>
+      <w:lvlText w:val=""/>
+      <w:lvlJc w:val="left"/>
+      <w:pPr>
+        <w:ind w:left="6480" w:hanging="360"/>
+      </w:pPr>
+      <w:rPr>
+        <w:rFonts w:ascii="Wingdings" w:hAnsi="Wingdings" w:hint="default"/>
+      </w:rPr>
+    </w:lvl>
+  </w:abstractNum>
+  <w:abstractNum w:abstractNumId="1" w15:restartNumberingAfterBreak="0">
     <w:nsid w:val="5C0C7049"/>
     <w:multiLevelType w:val="hybridMultilevel"/>
     <w:tmpl w:val="E0EC6138"/>
@@ -411,7 +503,7 @@
       </w:rPr>
     </w:lvl>
   </w:abstractNum>
-  <w:abstractNum w:abstractNumId="1" w15:restartNumberingAfterBreak="0">
+  <w:abstractNum w:abstractNumId="2" w15:restartNumberingAfterBreak="0">
     <w:nsid w:val="5DA55689"/>
     <w:multiLevelType w:val="hybridMultilevel"/>
     <w:tmpl w:val="0A525742"/>
@@ -525,9 +617,12 @@
     </w:lvl>
   </w:abstractNum>
   <w:num w:numId="1" w16cid:durableId="686248213">
+    <w:abstractNumId w:val="2"/>
+  </w:num>
+  <w:num w:numId="2" w16cid:durableId="805394223">
     <w:abstractNumId w:val="1"/>
   </w:num>
-  <w:num w:numId="2" w16cid:durableId="805394223">
+  <w:num w:numId="3" w16cid:durableId="1326520074">
     <w:abstractNumId w:val="0"/>
   </w:num>
 </w:numbering>

</xml_diff>

<commit_message>
Practiced answering questions about all Window Functions learned so far, and updated project notes/ oneNote.
</commit_message>
<xml_diff>
--- a/documentation/da-gym-doumentation .docx
+++ b/documentation/da-gym-doumentation .docx
@@ -25,6 +25,32 @@
         <w:rPr>
           <w:u w:val="single"/>
         </w:rPr>
+        <w:t>9/10/2026</w:t>
+      </w:r>
+    </w:p>
+    <w:p>
+      <w:r>
+        <w:t xml:space="preserve">Conducted Testing on everything I’ve learned so far, then updated </w:t>
+      </w:r>
+      <w:proofErr w:type="spellStart"/>
+      <w:r>
+        <w:t>oneNote</w:t>
+      </w:r>
+      <w:proofErr w:type="spellEnd"/>
+      <w:r>
+        <w:t xml:space="preserve">. Focusing on knowing when to apply certain Window Functions based off of business needs. Growing past learning Window Functions in isolation. </w:t>
+      </w:r>
+    </w:p>
+    <w:p>
+      <w:pPr>
+        <w:rPr>
+          <w:u w:val="single"/>
+        </w:rPr>
+      </w:pPr>
+      <w:r>
+        <w:rPr>
+          <w:u w:val="single"/>
+        </w:rPr>
         <w:t>9/9/2026</w:t>
       </w:r>
     </w:p>
@@ -32,8 +58,21 @@
       <w:r>
         <w:t xml:space="preserve">Learning </w:t>
       </w:r>
-      <w:r>
-        <w:t>First_Value() and Last_Value()</w:t>
+      <w:proofErr w:type="spellStart"/>
+      <w:r>
+        <w:t>First_Value</w:t>
+      </w:r>
+      <w:proofErr w:type="spellEnd"/>
+      <w:r>
+        <w:t xml:space="preserve">() and </w:t>
+      </w:r>
+      <w:proofErr w:type="spellStart"/>
+      <w:r>
+        <w:t>Last_Value</w:t>
+      </w:r>
+      <w:proofErr w:type="spellEnd"/>
+      <w:r>
+        <w:t>()</w:t>
       </w:r>
       <w:r>
         <w:t xml:space="preserve"> with Window Frames</w:t>
@@ -178,8 +217,13 @@
           <w:numId w:val="2"/>
         </w:numPr>
       </w:pPr>
-      <w:r>
-        <w:t>Row_Number()</w:t>
+      <w:proofErr w:type="spellStart"/>
+      <w:r>
+        <w:t>Row_Number</w:t>
+      </w:r>
+      <w:proofErr w:type="spellEnd"/>
+      <w:r>
+        <w:t>()</w:t>
       </w:r>
     </w:p>
     <w:p>
@@ -202,8 +246,13 @@
           <w:numId w:val="2"/>
         </w:numPr>
       </w:pPr>
-      <w:r>
-        <w:t>Dense_Rank()</w:t>
+      <w:proofErr w:type="spellStart"/>
+      <w:r>
+        <w:t>Dense_Rank</w:t>
+      </w:r>
+      <w:proofErr w:type="spellEnd"/>
+      <w:r>
+        <w:t>()</w:t>
       </w:r>
     </w:p>
     <w:p>
@@ -248,6 +297,7 @@
     <w:p/>
     <w:p>
       <w:r>
+        <w:lastRenderedPageBreak/>
         <w:t>9-6-2026</w:t>
       </w:r>
     </w:p>
@@ -1231,6 +1281,7 @@
   <w:style w:type="character" w:default="1" w:styleId="DefaultParagraphFont">
     <w:name w:val="Default Paragraph Font"/>
     <w:uiPriority w:val="1"/>
+    <w:semiHidden/>
     <w:unhideWhenUsed/>
   </w:style>
   <w:style w:type="table" w:default="1" w:styleId="TableNormal">

</xml_diff>

<commit_message>
updated notes: function and purpose of SQL joins. Linking business problems to SQL concepts that could pull results that produce insights to help solve.
</commit_message>
<xml_diff>
--- a/documentation/da-gym-doumentation .docx
+++ b/documentation/da-gym-doumentation .docx
@@ -13,6 +13,35 @@
           <w:u w:val="single"/>
         </w:rPr>
         <w:t xml:space="preserve">Data Analytics Gym – Documentation </w:t>
+      </w:r>
+    </w:p>
+    <w:p>
+      <w:pPr>
+        <w:rPr>
+          <w:u w:val="single"/>
+        </w:rPr>
+      </w:pPr>
+      <w:r>
+        <w:rPr>
+          <w:u w:val="single"/>
+        </w:rPr>
+        <w:t>9/11/2026</w:t>
+      </w:r>
+    </w:p>
+    <w:p>
+      <w:r>
+        <w:t xml:space="preserve">Went over concepts of joins. Instead of syntaxes in isolation, my goal is to understand purpose and function of SQL concepts, but also develop the ability to apply them to various scenarios; effective application within real world. </w:t>
+      </w:r>
+    </w:p>
+    <w:p>
+      <w:r>
+        <w:t xml:space="preserve">My process: Understand the </w:t>
+      </w:r>
+      <w:r>
+        <w:t>Business question → identify the underlying problem → choose the right concept/tool → write the syntax</w:t>
+      </w:r>
+      <w:r>
+        <w:t xml:space="preserve">, produce the results/insights that lead to solutions to the problem. </w:t>
       </w:r>
     </w:p>
     <w:p>
@@ -206,6 +235,7 @@
         </w:numPr>
       </w:pPr>
       <w:r>
+        <w:lastRenderedPageBreak/>
         <w:t xml:space="preserve">Difference between within Window Function vs Outside; Running Total vs Final Result Ordered normally w/o Running Total </w:t>
       </w:r>
     </w:p>
@@ -297,7 +327,6 @@
     <w:p/>
     <w:p>
       <w:r>
-        <w:lastRenderedPageBreak/>
         <w:t>9-6-2026</w:t>
       </w:r>
     </w:p>
@@ -1281,7 +1310,6 @@
   <w:style w:type="character" w:default="1" w:styleId="DefaultParagraphFont">
     <w:name w:val="Default Paragraph Font"/>
     <w:uiPriority w:val="1"/>
-    <w:semiHidden/>
     <w:unhideWhenUsed/>
   </w:style>
   <w:style w:type="table" w:default="1" w:styleId="TableNormal">

</xml_diff>

<commit_message>
Practiced CTEs and learned how aliases within CTE lost function outside of it.
</commit_message>
<xml_diff>
--- a/documentation/da-gym-doumentation .docx
+++ b/documentation/da-gym-doumentation .docx
@@ -25,12 +25,92 @@
         <w:rPr>
           <w:u w:val="single"/>
         </w:rPr>
+        <w:t>9/12/2026</w:t>
+      </w:r>
+    </w:p>
+    <w:p>
+      <w:pPr>
+        <w:pStyle w:val="ListParagraph"/>
+        <w:numPr>
+          <w:ilvl w:val="0"/>
+          <w:numId w:val="4"/>
+        </w:numPr>
+      </w:pPr>
+      <w:proofErr w:type="gramStart"/>
+      <w:r>
+        <w:t>a CTE</w:t>
+      </w:r>
+      <w:proofErr w:type="gramEnd"/>
+      <w:r>
+        <w:t xml:space="preserve"> can create a new state-level dataset </w:t>
+      </w:r>
+    </w:p>
+    <w:p>
+      <w:pPr>
+        <w:pStyle w:val="ListParagraph"/>
+        <w:numPr>
+          <w:ilvl w:val="0"/>
+          <w:numId w:val="4"/>
+        </w:numPr>
+      </w:pPr>
+      <w:r>
+        <w:t xml:space="preserve">aliases inside the CTE do not carry outside it </w:t>
+      </w:r>
+    </w:p>
+    <w:p>
+      <w:pPr>
+        <w:pStyle w:val="ListParagraph"/>
+        <w:numPr>
+          <w:ilvl w:val="0"/>
+          <w:numId w:val="4"/>
+        </w:numPr>
+      </w:pPr>
+      <w:r>
+        <w:t xml:space="preserve">aggregate functions work on columns/expressions, not the CTE name itself </w:t>
+      </w:r>
+    </w:p>
+    <w:p>
+      <w:pPr>
+        <w:pStyle w:val="ListParagraph"/>
+        <w:numPr>
+          <w:ilvl w:val="0"/>
+          <w:numId w:val="4"/>
+        </w:numPr>
+      </w:pPr>
+      <w:proofErr w:type="gramStart"/>
+      <w:r>
+        <w:t>the</w:t>
+      </w:r>
+      <w:proofErr w:type="gramEnd"/>
+      <w:r>
+        <w:t xml:space="preserve"> outer query can compare each row against an aggregate of the CTE</w:t>
+      </w:r>
+    </w:p>
+    <w:p/>
+    <w:p>
+      <w:pPr>
+        <w:rPr>
+          <w:u w:val="single"/>
+        </w:rPr>
+      </w:pPr>
+      <w:r>
+        <w:rPr>
+          <w:u w:val="single"/>
+        </w:rPr>
         <w:t>9/11/2026</w:t>
       </w:r>
     </w:p>
     <w:p>
       <w:r>
-        <w:t xml:space="preserve">Went over concepts of joins. Instead of syntaxes in isolation, my goal is to understand purpose and function of SQL concepts, but also develop the ability to apply them to various scenarios; effective application within real world. </w:t>
+        <w:t xml:space="preserve">Went over concepts of joins. Instead of syntaxes in isolation, my goal is to understand purpose and function of SQL </w:t>
+      </w:r>
+      <w:proofErr w:type="gramStart"/>
+      <w:r>
+        <w:t>concepts, but</w:t>
+      </w:r>
+      <w:proofErr w:type="gramEnd"/>
+      <w:r>
+        <w:t xml:space="preserve"> also develop the ability to apply them to various scenarios; effective application within real world. </w:t>
       </w:r>
     </w:p>
     <w:p>
@@ -67,7 +147,15 @@
       </w:r>
       <w:proofErr w:type="spellEnd"/>
       <w:r>
-        <w:t xml:space="preserve">. Focusing on knowing when to apply certain Window Functions based off of business needs. Growing past learning Window Functions in isolation. </w:t>
+        <w:t xml:space="preserve">. Focusing on knowing when to apply certain Window Functions based </w:t>
+      </w:r>
+      <w:proofErr w:type="gramStart"/>
+      <w:r>
+        <w:t>off of</w:t>
+      </w:r>
+      <w:proofErr w:type="gramEnd"/>
+      <w:r>
+        <w:t xml:space="preserve"> business needs. Growing past learning Window Functions in isolation. </w:t>
       </w:r>
     </w:p>
     <w:p>
@@ -89,19 +177,35 @@
       </w:r>
       <w:proofErr w:type="spellStart"/>
       <w:r>
-        <w:t>First_Value</w:t>
+        <w:t>First_</w:t>
+      </w:r>
+      <w:proofErr w:type="gramStart"/>
+      <w:r>
+        <w:t>Value</w:t>
       </w:r>
       <w:proofErr w:type="spellEnd"/>
       <w:r>
-        <w:t xml:space="preserve">() and </w:t>
+        <w:t>(</w:t>
+      </w:r>
+      <w:proofErr w:type="gramEnd"/>
+      <w:r>
+        <w:t xml:space="preserve">) and </w:t>
       </w:r>
       <w:proofErr w:type="spellStart"/>
       <w:r>
-        <w:t>Last_Value</w:t>
+        <w:t>Last_</w:t>
+      </w:r>
+      <w:proofErr w:type="gramStart"/>
+      <w:r>
+        <w:t>Value</w:t>
       </w:r>
       <w:proofErr w:type="spellEnd"/>
       <w:r>
-        <w:t>()</w:t>
+        <w:t>(</w:t>
+      </w:r>
+      <w:proofErr w:type="gramEnd"/>
+      <w:r>
+        <w:t>)</w:t>
       </w:r>
       <w:r>
         <w:t xml:space="preserve"> with Window Frames</w:t>
@@ -116,7 +220,23 @@
         </w:numPr>
       </w:pPr>
       <w:r>
-        <w:t>Business-wise, FIRST_VALUE() is useful for comparing current performance to a starting baseline, while LAST_VALUE() is useful for comparing rows to the final value in a defined sequence.</w:t>
+        <w:t>Business-wise, FIRST_</w:t>
+      </w:r>
+      <w:proofErr w:type="gramStart"/>
+      <w:r>
+        <w:t>VALUE(</w:t>
+      </w:r>
+      <w:proofErr w:type="gramEnd"/>
+      <w:r>
+        <w:t>) is useful for comparing current performance to a starting baseline, while LAST_</w:t>
+      </w:r>
+      <w:proofErr w:type="gramStart"/>
+      <w:r>
+        <w:t>VALUE(</w:t>
+      </w:r>
+      <w:proofErr w:type="gramEnd"/>
+      <w:r>
+        <w:t>) is useful for comparing rows to the final value in a defined sequence.</w:t>
       </w:r>
     </w:p>
     <w:p>
@@ -147,7 +267,15 @@
     </w:p>
     <w:p>
       <w:r>
-        <w:t>Practiced Lag() – Value/Navigation windows</w:t>
+        <w:t xml:space="preserve">Practiced </w:t>
+      </w:r>
+      <w:proofErr w:type="gramStart"/>
+      <w:r>
+        <w:t>Lag(</w:t>
+      </w:r>
+      <w:proofErr w:type="gramEnd"/>
+      <w:r>
+        <w:t>) – Value/Navigation windows</w:t>
       </w:r>
     </w:p>
     <w:p>
@@ -184,6 +312,7 @@
     </w:p>
     <w:p>
       <w:r>
+        <w:lastRenderedPageBreak/>
         <w:t>Starting very first DA Gym exercise:</w:t>
       </w:r>
     </w:p>
@@ -196,7 +325,15 @@
         </w:numPr>
       </w:pPr>
       <w:r>
-        <w:t>Partition By()</w:t>
+        <w:t xml:space="preserve">Partition </w:t>
+      </w:r>
+      <w:proofErr w:type="gramStart"/>
+      <w:r>
+        <w:t>By(</w:t>
+      </w:r>
+      <w:proofErr w:type="gramEnd"/>
+      <w:r>
+        <w:t>)</w:t>
       </w:r>
     </w:p>
     <w:p>
@@ -223,7 +360,15 @@
         </w:numPr>
       </w:pPr>
       <w:r>
-        <w:t>Order By()</w:t>
+        <w:t xml:space="preserve">Order </w:t>
+      </w:r>
+      <w:proofErr w:type="gramStart"/>
+      <w:r>
+        <w:t>By(</w:t>
+      </w:r>
+      <w:proofErr w:type="gramEnd"/>
+      <w:r>
+        <w:t>)</w:t>
       </w:r>
     </w:p>
     <w:p>
@@ -235,7 +380,6 @@
         </w:numPr>
       </w:pPr>
       <w:r>
-        <w:lastRenderedPageBreak/>
         <w:t xml:space="preserve">Difference between within Window Function vs Outside; Running Total vs Final Result Ordered normally w/o Running Total </w:t>
       </w:r>
     </w:p>
@@ -249,11 +393,19 @@
       </w:pPr>
       <w:proofErr w:type="spellStart"/>
       <w:r>
-        <w:t>Row_Number</w:t>
+        <w:t>Row_</w:t>
+      </w:r>
+      <w:proofErr w:type="gramStart"/>
+      <w:r>
+        <w:t>Number</w:t>
       </w:r>
       <w:proofErr w:type="spellEnd"/>
       <w:r>
-        <w:t>()</w:t>
+        <w:t>(</w:t>
+      </w:r>
+      <w:proofErr w:type="gramEnd"/>
+      <w:r>
+        <w:t>)</w:t>
       </w:r>
     </w:p>
     <w:p>
@@ -264,8 +416,13 @@
           <w:numId w:val="2"/>
         </w:numPr>
       </w:pPr>
-      <w:r>
-        <w:t>Rank()</w:t>
+      <w:proofErr w:type="gramStart"/>
+      <w:r>
+        <w:t>Rank(</w:t>
+      </w:r>
+      <w:proofErr w:type="gramEnd"/>
+      <w:r>
+        <w:t>)</w:t>
       </w:r>
     </w:p>
     <w:p>
@@ -278,11 +435,19 @@
       </w:pPr>
       <w:proofErr w:type="spellStart"/>
       <w:r>
-        <w:t>Dense_Rank</w:t>
+        <w:t>Dense_</w:t>
+      </w:r>
+      <w:proofErr w:type="gramStart"/>
+      <w:r>
+        <w:t>Rank</w:t>
       </w:r>
       <w:proofErr w:type="spellEnd"/>
       <w:r>
-        <w:t>()</w:t>
+        <w:t>(</w:t>
+      </w:r>
+      <w:proofErr w:type="gramEnd"/>
+      <w:r>
+        <w:t>)</w:t>
       </w:r>
     </w:p>
     <w:p>
@@ -293,8 +458,13 @@
           <w:numId w:val="2"/>
         </w:numPr>
       </w:pPr>
-      <w:r>
-        <w:t>Lag()</w:t>
+      <w:proofErr w:type="gramStart"/>
+      <w:r>
+        <w:t>Lag(</w:t>
+      </w:r>
+      <w:proofErr w:type="gramEnd"/>
+      <w:r>
+        <w:t>)</w:t>
       </w:r>
     </w:p>
     <w:p>
@@ -318,11 +488,21 @@
         </w:numPr>
       </w:pPr>
       <w:r>
-        <w:t xml:space="preserve">Define the field I want the value from and pull  a previous record </w:t>
-      </w:r>
+        <w:t xml:space="preserve">Define the field I want the value from and </w:t>
+      </w:r>
+      <w:proofErr w:type="gramStart"/>
+      <w:r>
+        <w:t>pull  a</w:t>
+      </w:r>
+      <w:proofErr w:type="gramEnd"/>
+      <w:r>
+        <w:t xml:space="preserve"> previous record </w:t>
+      </w:r>
+      <w:proofErr w:type="gramStart"/>
       <w:r>
         <w:t>git</w:t>
       </w:r>
+      <w:proofErr w:type="gramEnd"/>
     </w:p>
     <w:p/>
     <w:p>
@@ -470,6 +650,119 @@
     </w:lvl>
   </w:abstractNum>
   <w:abstractNum w:abstractNumId="1" w15:restartNumberingAfterBreak="0">
+    <w:nsid w:val="41187D30"/>
+    <w:multiLevelType w:val="hybridMultilevel"/>
+    <w:tmpl w:val="EA5EB43A"/>
+    <w:lvl w:ilvl="0" w:tplc="04090001">
+      <w:start w:val="1"/>
+      <w:numFmt w:val="bullet"/>
+      <w:lvlText w:val=""/>
+      <w:lvlJc w:val="left"/>
+      <w:pPr>
+        <w:ind w:left="720" w:hanging="360"/>
+      </w:pPr>
+      <w:rPr>
+        <w:rFonts w:ascii="Symbol" w:hAnsi="Symbol" w:hint="default"/>
+      </w:rPr>
+    </w:lvl>
+    <w:lvl w:ilvl="1" w:tplc="04090003" w:tentative="1">
+      <w:start w:val="1"/>
+      <w:numFmt w:val="bullet"/>
+      <w:lvlText w:val="o"/>
+      <w:lvlJc w:val="left"/>
+      <w:pPr>
+        <w:ind w:left="1440" w:hanging="360"/>
+      </w:pPr>
+      <w:rPr>
+        <w:rFonts w:ascii="Courier New" w:hAnsi="Courier New" w:cs="Courier New" w:hint="default"/>
+      </w:rPr>
+    </w:lvl>
+    <w:lvl w:ilvl="2" w:tplc="04090005" w:tentative="1">
+      <w:start w:val="1"/>
+      <w:numFmt w:val="bullet"/>
+      <w:lvlText w:val=""/>
+      <w:lvlJc w:val="left"/>
+      <w:pPr>
+        <w:ind w:left="2160" w:hanging="360"/>
+      </w:pPr>
+      <w:rPr>
+        <w:rFonts w:ascii="Wingdings" w:hAnsi="Wingdings" w:hint="default"/>
+      </w:rPr>
+    </w:lvl>
+    <w:lvl w:ilvl="3" w:tplc="04090001" w:tentative="1">
+      <w:start w:val="1"/>
+      <w:numFmt w:val="bullet"/>
+      <w:lvlText w:val=""/>
+      <w:lvlJc w:val="left"/>
+      <w:pPr>
+        <w:ind w:left="2880" w:hanging="360"/>
+      </w:pPr>
+      <w:rPr>
+        <w:rFonts w:ascii="Symbol" w:hAnsi="Symbol" w:hint="default"/>
+      </w:rPr>
+    </w:lvl>
+    <w:lvl w:ilvl="4" w:tplc="04090003" w:tentative="1">
+      <w:start w:val="1"/>
+      <w:numFmt w:val="bullet"/>
+      <w:lvlText w:val="o"/>
+      <w:lvlJc w:val="left"/>
+      <w:pPr>
+        <w:ind w:left="3600" w:hanging="360"/>
+      </w:pPr>
+      <w:rPr>
+        <w:rFonts w:ascii="Courier New" w:hAnsi="Courier New" w:cs="Courier New" w:hint="default"/>
+      </w:rPr>
+    </w:lvl>
+    <w:lvl w:ilvl="5" w:tplc="04090005" w:tentative="1">
+      <w:start w:val="1"/>
+      <w:numFmt w:val="bullet"/>
+      <w:lvlText w:val=""/>
+      <w:lvlJc w:val="left"/>
+      <w:pPr>
+        <w:ind w:left="4320" w:hanging="360"/>
+      </w:pPr>
+      <w:rPr>
+        <w:rFonts w:ascii="Wingdings" w:hAnsi="Wingdings" w:hint="default"/>
+      </w:rPr>
+    </w:lvl>
+    <w:lvl w:ilvl="6" w:tplc="04090001" w:tentative="1">
+      <w:start w:val="1"/>
+      <w:numFmt w:val="bullet"/>
+      <w:lvlText w:val=""/>
+      <w:lvlJc w:val="left"/>
+      <w:pPr>
+        <w:ind w:left="5040" w:hanging="360"/>
+      </w:pPr>
+      <w:rPr>
+        <w:rFonts w:ascii="Symbol" w:hAnsi="Symbol" w:hint="default"/>
+      </w:rPr>
+    </w:lvl>
+    <w:lvl w:ilvl="7" w:tplc="04090003" w:tentative="1">
+      <w:start w:val="1"/>
+      <w:numFmt w:val="bullet"/>
+      <w:lvlText w:val="o"/>
+      <w:lvlJc w:val="left"/>
+      <w:pPr>
+        <w:ind w:left="5760" w:hanging="360"/>
+      </w:pPr>
+      <w:rPr>
+        <w:rFonts w:ascii="Courier New" w:hAnsi="Courier New" w:cs="Courier New" w:hint="default"/>
+      </w:rPr>
+    </w:lvl>
+    <w:lvl w:ilvl="8" w:tplc="04090005" w:tentative="1">
+      <w:start w:val="1"/>
+      <w:numFmt w:val="bullet"/>
+      <w:lvlText w:val=""/>
+      <w:lvlJc w:val="left"/>
+      <w:pPr>
+        <w:ind w:left="6480" w:hanging="360"/>
+      </w:pPr>
+      <w:rPr>
+        <w:rFonts w:ascii="Wingdings" w:hAnsi="Wingdings" w:hint="default"/>
+      </w:rPr>
+    </w:lvl>
+  </w:abstractNum>
+  <w:abstractNum w:abstractNumId="2" w15:restartNumberingAfterBreak="0">
     <w:nsid w:val="5C0C7049"/>
     <w:multiLevelType w:val="hybridMultilevel"/>
     <w:tmpl w:val="E0EC6138"/>
@@ -582,7 +875,7 @@
       </w:rPr>
     </w:lvl>
   </w:abstractNum>
-  <w:abstractNum w:abstractNumId="2" w15:restartNumberingAfterBreak="0">
+  <w:abstractNum w:abstractNumId="3" w15:restartNumberingAfterBreak="0">
     <w:nsid w:val="5DA55689"/>
     <w:multiLevelType w:val="hybridMultilevel"/>
     <w:tmpl w:val="0A525742"/>
@@ -696,13 +989,16 @@
     </w:lvl>
   </w:abstractNum>
   <w:num w:numId="1" w16cid:durableId="686248213">
-    <w:abstractNumId w:val="2"/>
+    <w:abstractNumId w:val="3"/>
   </w:num>
   <w:num w:numId="2" w16cid:durableId="805394223">
-    <w:abstractNumId w:val="1"/>
+    <w:abstractNumId w:val="2"/>
   </w:num>
   <w:num w:numId="3" w16cid:durableId="1326520074">
     <w:abstractNumId w:val="0"/>
+  </w:num>
+  <w:num w:numId="4" w16cid:durableId="1552691628">
+    <w:abstractNumId w:val="1"/>
   </w:num>
 </w:numbering>
 </file>

</xml_diff>

<commit_message>
practicing CTE logic and concept of figuring out the final grain of a SQL query. Also updated documentation.
</commit_message>
<xml_diff>
--- a/documentation/da-gym-doumentation .docx
+++ b/documentation/da-gym-doumentation .docx
@@ -15,6 +15,213 @@
         <w:t xml:space="preserve">Data Analytics Gym – Documentation </w:t>
       </w:r>
     </w:p>
+    <w:p>
+      <w:pPr>
+        <w:rPr>
+          <w:u w:val="single"/>
+        </w:rPr>
+      </w:pPr>
+      <w:r>
+        <w:rPr>
+          <w:u w:val="single"/>
+        </w:rPr>
+        <w:t>9/13/2026</w:t>
+      </w:r>
+    </w:p>
+    <w:p>
+      <w:r>
+        <w:t xml:space="preserve">Started with some join logic and difference between distinct and Group By in a CTE to achieve the same result. </w:t>
+      </w:r>
+    </w:p>
+    <w:p>
+      <w:r>
+        <w:t>In telling stories to showcase my experiences, use this format:</w:t>
+      </w:r>
+    </w:p>
+    <w:p>
+      <w:pPr>
+        <w:pStyle w:val="ListParagraph"/>
+        <w:numPr>
+          <w:ilvl w:val="0"/>
+          <w:numId w:val="5"/>
+        </w:numPr>
+      </w:pPr>
+      <w:r>
+        <w:rPr>
+          <w:b/>
+          <w:bCs/>
+        </w:rPr>
+        <w:t>Problem:</w:t>
+      </w:r>
+      <w:r>
+        <w:t xml:space="preserve"> what were you trying to improve? </w:t>
+      </w:r>
+    </w:p>
+    <w:p>
+      <w:pPr>
+        <w:pStyle w:val="ListParagraph"/>
+        <w:numPr>
+          <w:ilvl w:val="0"/>
+          <w:numId w:val="5"/>
+        </w:numPr>
+      </w:pPr>
+      <w:r>
+        <w:rPr>
+          <w:b/>
+          <w:bCs/>
+        </w:rPr>
+        <w:t>Data:</w:t>
+      </w:r>
+      <w:r>
+        <w:t xml:space="preserve"> what did you track? </w:t>
+      </w:r>
+    </w:p>
+    <w:p>
+      <w:pPr>
+        <w:pStyle w:val="ListParagraph"/>
+        <w:numPr>
+          <w:ilvl w:val="0"/>
+          <w:numId w:val="5"/>
+        </w:numPr>
+      </w:pPr>
+      <w:r>
+        <w:rPr>
+          <w:b/>
+          <w:bCs/>
+        </w:rPr>
+        <w:t>Analysis:</w:t>
+      </w:r>
+      <w:r>
+        <w:t xml:space="preserve"> what did you actually do with the data? </w:t>
+      </w:r>
+    </w:p>
+    <w:p>
+      <w:pPr>
+        <w:pStyle w:val="ListParagraph"/>
+        <w:numPr>
+          <w:ilvl w:val="0"/>
+          <w:numId w:val="5"/>
+        </w:numPr>
+      </w:pPr>
+      <w:r>
+        <w:rPr>
+          <w:b/>
+          <w:bCs/>
+        </w:rPr>
+        <w:t>Decision:</w:t>
+      </w:r>
+      <w:r>
+        <w:t xml:space="preserve"> what changed because of the analysis? </w:t>
+      </w:r>
+    </w:p>
+    <w:p>
+      <w:pPr>
+        <w:pStyle w:val="ListParagraph"/>
+        <w:numPr>
+          <w:ilvl w:val="0"/>
+          <w:numId w:val="5"/>
+        </w:numPr>
+      </w:pPr>
+      <w:r>
+        <w:rPr>
+          <w:b/>
+          <w:bCs/>
+        </w:rPr>
+        <w:t>Impact:</w:t>
+      </w:r>
+      <w:r>
+        <w:t xml:space="preserve"> what measurable result came out of it?</w:t>
+      </w:r>
+    </w:p>
+    <w:p>
+      <w:pPr>
+        <w:rPr>
+          <w:u w:val="single"/>
+        </w:rPr>
+      </w:pPr>
+      <w:r>
+        <w:rPr>
+          <w:u w:val="single"/>
+        </w:rPr>
+        <w:t>Quick story for when asked about one of my analytics projects and what impact it had:</w:t>
+      </w:r>
+    </w:p>
+    <w:p>
+      <w:r>
+        <w:t>When I started doing DoorDash, I wanted to find a way to earn more money in less time while also reducing unnecessary mileage and gas costs. The goal was really to work smarter, not harder.</w:t>
+      </w:r>
+    </w:p>
+    <w:p>
+      <w:r>
+        <w:t xml:space="preserve">I started tracking daily earnings, shift times, miles driven, earnings per mile, and hours worked per shift. Then I analyzed those metrics to look for </w:t>
+      </w:r>
+      <w:r>
+        <w:t>trends</w:t>
+      </w:r>
+      <w:r>
+        <w:t xml:space="preserve"> when I was most efficient and which shifts were actually worth my time.</w:t>
+      </w:r>
+    </w:p>
+    <w:p>
+      <w:r>
+        <w:t>Based on what I found, I changed how and when I worked. As a result, I increased my earnings from about $9 per hour to around $18 per hour, improved my earnings per mile from roughly $0.50 to at least $2.00, and reduced the time it took to hit the same daily earnings goal from about 6–7 hours to 3–4 hours.</w:t>
+      </w:r>
+    </w:p>
+    <w:p>
+      <w:r>
+        <w:t>What I liked about that project was that it showed me how useful even simple data can be when it’s tied to a clear business question and a decision.</w:t>
+      </w:r>
+    </w:p>
+    <w:p>
+      <w:pPr>
+        <w:rPr>
+          <w:u w:val="single"/>
+        </w:rPr>
+      </w:pPr>
+      <w:r>
+        <w:rPr>
+          <w:u w:val="single"/>
+        </w:rPr>
+        <w:t>Tell me about yourself:</w:t>
+      </w:r>
+    </w:p>
+    <w:p>
+      <w:r>
+        <w:t xml:space="preserve">From running my own fitness business, I’ve always been interested in using metrics to improve results </w:t>
+      </w:r>
+      <w:r>
+        <w:t xml:space="preserve">for my clients </w:t>
+      </w:r>
+      <w:r>
+        <w:t>and make better</w:t>
+      </w:r>
+      <w:r>
+        <w:t xml:space="preserve"> business </w:t>
+      </w:r>
+      <w:r>
+        <w:t>decisions.</w:t>
+      </w:r>
+    </w:p>
+    <w:p>
+      <w:r>
+        <w:t>When I transitioned to Three Square as a Nutrition Education Specialist, I was regularly reviewing performance metrics, improving processes, and using data to help support health and operational goals for the Las Vegas community.</w:t>
+      </w:r>
+    </w:p>
+    <w:p>
+      <w:r>
+        <w:lastRenderedPageBreak/>
+        <w:t>That experience pushed me to go deeper into analytics. I started building my skills in SQL, Excel, Power BI, and more recently Python, and I found that I really enjoy using data to solve practical problems and improve how systems work.</w:t>
+      </w:r>
+    </w:p>
+    <w:p>
+      <w:r>
+        <w:t>What interests me about Mercury is the opportunity to keep developing those technical skills while contributing to a team that works across analytics, data, and systems. I think my background in operations, problem-solving, and analytics gives me a strong foundation to contribute while continuing to grow.</w:t>
+      </w:r>
+      <w:r>
+        <w:t xml:space="preserve">  </w:t>
+      </w:r>
+    </w:p>
+    <w:p/>
     <w:p>
       <w:pPr>
         <w:rPr>
@@ -36,13 +243,8 @@
           <w:numId w:val="4"/>
         </w:numPr>
       </w:pPr>
-      <w:proofErr w:type="gramStart"/>
-      <w:r>
-        <w:t>a CTE</w:t>
-      </w:r>
-      <w:proofErr w:type="gramEnd"/>
-      <w:r>
-        <w:t xml:space="preserve"> can create a new state-level dataset </w:t>
+      <w:r>
+        <w:t xml:space="preserve">a CTE can create a new state-level dataset </w:t>
       </w:r>
     </w:p>
     <w:p>
@@ -77,13 +279,8 @@
           <w:numId w:val="4"/>
         </w:numPr>
       </w:pPr>
-      <w:proofErr w:type="gramStart"/>
-      <w:r>
-        <w:t>the</w:t>
-      </w:r>
-      <w:proofErr w:type="gramEnd"/>
-      <w:r>
-        <w:t xml:space="preserve"> outer query can compare each row against an aggregate of the CTE</w:t>
+      <w:r>
+        <w:t>the outer query can compare each row against an aggregate of the CTE</w:t>
       </w:r>
     </w:p>
     <w:p/>
@@ -102,15 +299,7 @@
     </w:p>
     <w:p>
       <w:r>
-        <w:t xml:space="preserve">Went over concepts of joins. Instead of syntaxes in isolation, my goal is to understand purpose and function of SQL </w:t>
-      </w:r>
-      <w:proofErr w:type="gramStart"/>
-      <w:r>
-        <w:t>concepts, but</w:t>
-      </w:r>
-      <w:proofErr w:type="gramEnd"/>
-      <w:r>
-        <w:t xml:space="preserve"> also develop the ability to apply them to various scenarios; effective application within real world. </w:t>
+        <w:t xml:space="preserve">Went over concepts of joins. Instead of syntaxes in isolation, my goal is to understand purpose and function of SQL concepts, but also develop the ability to apply them to various scenarios; effective application within real world. </w:t>
       </w:r>
     </w:p>
     <w:p>
@@ -139,23 +328,7 @@
     </w:p>
     <w:p>
       <w:r>
-        <w:t xml:space="preserve">Conducted Testing on everything I’ve learned so far, then updated </w:t>
-      </w:r>
-      <w:proofErr w:type="spellStart"/>
-      <w:r>
-        <w:t>oneNote</w:t>
-      </w:r>
-      <w:proofErr w:type="spellEnd"/>
-      <w:r>
-        <w:t xml:space="preserve">. Focusing on knowing when to apply certain Window Functions based </w:t>
-      </w:r>
-      <w:proofErr w:type="gramStart"/>
-      <w:r>
-        <w:t>off of</w:t>
-      </w:r>
-      <w:proofErr w:type="gramEnd"/>
-      <w:r>
-        <w:t xml:space="preserve"> business needs. Growing past learning Window Functions in isolation. </w:t>
+        <w:t xml:space="preserve">Conducted Testing on everything I’ve learned so far, then updated oneNote. Focusing on knowing when to apply certain Window Functions based off of business needs. Growing past learning Window Functions in isolation. </w:t>
       </w:r>
     </w:p>
     <w:p>
@@ -175,37 +348,8 @@
       <w:r>
         <w:t xml:space="preserve">Learning </w:t>
       </w:r>
-      <w:proofErr w:type="spellStart"/>
-      <w:r>
-        <w:t>First_</w:t>
-      </w:r>
-      <w:proofErr w:type="gramStart"/>
-      <w:r>
-        <w:t>Value</w:t>
-      </w:r>
-      <w:proofErr w:type="spellEnd"/>
-      <w:r>
-        <w:t>(</w:t>
-      </w:r>
-      <w:proofErr w:type="gramEnd"/>
-      <w:r>
-        <w:t xml:space="preserve">) and </w:t>
-      </w:r>
-      <w:proofErr w:type="spellStart"/>
-      <w:r>
-        <w:t>Last_</w:t>
-      </w:r>
-      <w:proofErr w:type="gramStart"/>
-      <w:r>
-        <w:t>Value</w:t>
-      </w:r>
-      <w:proofErr w:type="spellEnd"/>
-      <w:r>
-        <w:t>(</w:t>
-      </w:r>
-      <w:proofErr w:type="gramEnd"/>
-      <w:r>
-        <w:t>)</w:t>
+      <w:r>
+        <w:t>First_Value() and Last_Value()</w:t>
       </w:r>
       <w:r>
         <w:t xml:space="preserve"> with Window Frames</w:t>
@@ -220,23 +364,7 @@
         </w:numPr>
       </w:pPr>
       <w:r>
-        <w:t>Business-wise, FIRST_</w:t>
-      </w:r>
-      <w:proofErr w:type="gramStart"/>
-      <w:r>
-        <w:t>VALUE(</w:t>
-      </w:r>
-      <w:proofErr w:type="gramEnd"/>
-      <w:r>
-        <w:t>) is useful for comparing current performance to a starting baseline, while LAST_</w:t>
-      </w:r>
-      <w:proofErr w:type="gramStart"/>
-      <w:r>
-        <w:t>VALUE(</w:t>
-      </w:r>
-      <w:proofErr w:type="gramEnd"/>
-      <w:r>
-        <w:t>) is useful for comparing rows to the final value in a defined sequence.</w:t>
+        <w:t>Business-wise, FIRST_VALUE() is useful for comparing current performance to a starting baseline, while LAST_VALUE() is useful for comparing rows to the final value in a defined sequence.</w:t>
       </w:r>
     </w:p>
     <w:p>
@@ -267,15 +395,7 @@
     </w:p>
     <w:p>
       <w:r>
-        <w:t xml:space="preserve">Practiced </w:t>
-      </w:r>
-      <w:proofErr w:type="gramStart"/>
-      <w:r>
-        <w:t>Lag(</w:t>
-      </w:r>
-      <w:proofErr w:type="gramEnd"/>
-      <w:r>
-        <w:t>) – Value/Navigation windows</w:t>
+        <w:t>Practiced Lag() – Value/Navigation windows</w:t>
       </w:r>
     </w:p>
     <w:p>
@@ -312,7 +432,6 @@
     </w:p>
     <w:p>
       <w:r>
-        <w:lastRenderedPageBreak/>
         <w:t>Starting very first DA Gym exercise:</w:t>
       </w:r>
     </w:p>
@@ -325,15 +444,7 @@
         </w:numPr>
       </w:pPr>
       <w:r>
-        <w:t xml:space="preserve">Partition </w:t>
-      </w:r>
-      <w:proofErr w:type="gramStart"/>
-      <w:r>
-        <w:t>By(</w:t>
-      </w:r>
-      <w:proofErr w:type="gramEnd"/>
-      <w:r>
-        <w:t>)</w:t>
+        <w:t>Partition By()</w:t>
       </w:r>
     </w:p>
     <w:p>
@@ -360,15 +471,7 @@
         </w:numPr>
       </w:pPr>
       <w:r>
-        <w:t xml:space="preserve">Order </w:t>
-      </w:r>
-      <w:proofErr w:type="gramStart"/>
-      <w:r>
-        <w:t>By(</w:t>
-      </w:r>
-      <w:proofErr w:type="gramEnd"/>
-      <w:r>
-        <w:t>)</w:t>
+        <w:t>Order By()</w:t>
       </w:r>
     </w:p>
     <w:p>
@@ -391,21 +494,8 @@
           <w:numId w:val="2"/>
         </w:numPr>
       </w:pPr>
-      <w:proofErr w:type="spellStart"/>
-      <w:r>
-        <w:t>Row_</w:t>
-      </w:r>
-      <w:proofErr w:type="gramStart"/>
-      <w:r>
-        <w:t>Number</w:t>
-      </w:r>
-      <w:proofErr w:type="spellEnd"/>
-      <w:r>
-        <w:t>(</w:t>
-      </w:r>
-      <w:proofErr w:type="gramEnd"/>
-      <w:r>
-        <w:t>)</w:t>
+      <w:r>
+        <w:t>Row_Number()</w:t>
       </w:r>
     </w:p>
     <w:p>
@@ -416,13 +506,8 @@
           <w:numId w:val="2"/>
         </w:numPr>
       </w:pPr>
-      <w:proofErr w:type="gramStart"/>
-      <w:r>
-        <w:t>Rank(</w:t>
-      </w:r>
-      <w:proofErr w:type="gramEnd"/>
-      <w:r>
-        <w:t>)</w:t>
+      <w:r>
+        <w:t>Rank()</w:t>
       </w:r>
     </w:p>
     <w:p>
@@ -433,21 +518,8 @@
           <w:numId w:val="2"/>
         </w:numPr>
       </w:pPr>
-      <w:proofErr w:type="spellStart"/>
-      <w:r>
-        <w:t>Dense_</w:t>
-      </w:r>
-      <w:proofErr w:type="gramStart"/>
-      <w:r>
-        <w:t>Rank</w:t>
-      </w:r>
-      <w:proofErr w:type="spellEnd"/>
-      <w:r>
-        <w:t>(</w:t>
-      </w:r>
-      <w:proofErr w:type="gramEnd"/>
-      <w:r>
-        <w:t>)</w:t>
+      <w:r>
+        <w:t>Dense_Rank()</w:t>
       </w:r>
     </w:p>
     <w:p>
@@ -458,13 +530,8 @@
           <w:numId w:val="2"/>
         </w:numPr>
       </w:pPr>
-      <w:proofErr w:type="gramStart"/>
-      <w:r>
-        <w:t>Lag(</w:t>
-      </w:r>
-      <w:proofErr w:type="gramEnd"/>
-      <w:r>
-        <w:t>)</w:t>
+      <w:r>
+        <w:t>Lag()</w:t>
       </w:r>
     </w:p>
     <w:p>
@@ -488,21 +555,11 @@
         </w:numPr>
       </w:pPr>
       <w:r>
-        <w:t xml:space="preserve">Define the field I want the value from and </w:t>
-      </w:r>
-      <w:proofErr w:type="gramStart"/>
-      <w:r>
-        <w:t>pull  a</w:t>
-      </w:r>
-      <w:proofErr w:type="gramEnd"/>
-      <w:r>
-        <w:t xml:space="preserve"> previous record </w:t>
-      </w:r>
-      <w:proofErr w:type="gramStart"/>
+        <w:t xml:space="preserve">Define the field I want the value from and pull  a previous record </w:t>
+      </w:r>
       <w:r>
         <w:t>git</w:t>
       </w:r>
-      <w:proofErr w:type="gramEnd"/>
     </w:p>
     <w:p/>
     <w:p>
@@ -650,6 +707,119 @@
     </w:lvl>
   </w:abstractNum>
   <w:abstractNum w:abstractNumId="1" w15:restartNumberingAfterBreak="0">
+    <w:nsid w:val="3505313F"/>
+    <w:multiLevelType w:val="hybridMultilevel"/>
+    <w:tmpl w:val="EC8A3396"/>
+    <w:lvl w:ilvl="0" w:tplc="04090001">
+      <w:start w:val="1"/>
+      <w:numFmt w:val="bullet"/>
+      <w:lvlText w:val=""/>
+      <w:lvlJc w:val="left"/>
+      <w:pPr>
+        <w:ind w:left="720" w:hanging="360"/>
+      </w:pPr>
+      <w:rPr>
+        <w:rFonts w:ascii="Symbol" w:hAnsi="Symbol" w:hint="default"/>
+      </w:rPr>
+    </w:lvl>
+    <w:lvl w:ilvl="1" w:tplc="04090003" w:tentative="1">
+      <w:start w:val="1"/>
+      <w:numFmt w:val="bullet"/>
+      <w:lvlText w:val="o"/>
+      <w:lvlJc w:val="left"/>
+      <w:pPr>
+        <w:ind w:left="1440" w:hanging="360"/>
+      </w:pPr>
+      <w:rPr>
+        <w:rFonts w:ascii="Courier New" w:hAnsi="Courier New" w:cs="Courier New" w:hint="default"/>
+      </w:rPr>
+    </w:lvl>
+    <w:lvl w:ilvl="2" w:tplc="04090005" w:tentative="1">
+      <w:start w:val="1"/>
+      <w:numFmt w:val="bullet"/>
+      <w:lvlText w:val=""/>
+      <w:lvlJc w:val="left"/>
+      <w:pPr>
+        <w:ind w:left="2160" w:hanging="360"/>
+      </w:pPr>
+      <w:rPr>
+        <w:rFonts w:ascii="Wingdings" w:hAnsi="Wingdings" w:hint="default"/>
+      </w:rPr>
+    </w:lvl>
+    <w:lvl w:ilvl="3" w:tplc="04090001" w:tentative="1">
+      <w:start w:val="1"/>
+      <w:numFmt w:val="bullet"/>
+      <w:lvlText w:val=""/>
+      <w:lvlJc w:val="left"/>
+      <w:pPr>
+        <w:ind w:left="2880" w:hanging="360"/>
+      </w:pPr>
+      <w:rPr>
+        <w:rFonts w:ascii="Symbol" w:hAnsi="Symbol" w:hint="default"/>
+      </w:rPr>
+    </w:lvl>
+    <w:lvl w:ilvl="4" w:tplc="04090003" w:tentative="1">
+      <w:start w:val="1"/>
+      <w:numFmt w:val="bullet"/>
+      <w:lvlText w:val="o"/>
+      <w:lvlJc w:val="left"/>
+      <w:pPr>
+        <w:ind w:left="3600" w:hanging="360"/>
+      </w:pPr>
+      <w:rPr>
+        <w:rFonts w:ascii="Courier New" w:hAnsi="Courier New" w:cs="Courier New" w:hint="default"/>
+      </w:rPr>
+    </w:lvl>
+    <w:lvl w:ilvl="5" w:tplc="04090005" w:tentative="1">
+      <w:start w:val="1"/>
+      <w:numFmt w:val="bullet"/>
+      <w:lvlText w:val=""/>
+      <w:lvlJc w:val="left"/>
+      <w:pPr>
+        <w:ind w:left="4320" w:hanging="360"/>
+      </w:pPr>
+      <w:rPr>
+        <w:rFonts w:ascii="Wingdings" w:hAnsi="Wingdings" w:hint="default"/>
+      </w:rPr>
+    </w:lvl>
+    <w:lvl w:ilvl="6" w:tplc="04090001" w:tentative="1">
+      <w:start w:val="1"/>
+      <w:numFmt w:val="bullet"/>
+      <w:lvlText w:val=""/>
+      <w:lvlJc w:val="left"/>
+      <w:pPr>
+        <w:ind w:left="5040" w:hanging="360"/>
+      </w:pPr>
+      <w:rPr>
+        <w:rFonts w:ascii="Symbol" w:hAnsi="Symbol" w:hint="default"/>
+      </w:rPr>
+    </w:lvl>
+    <w:lvl w:ilvl="7" w:tplc="04090003" w:tentative="1">
+      <w:start w:val="1"/>
+      <w:numFmt w:val="bullet"/>
+      <w:lvlText w:val="o"/>
+      <w:lvlJc w:val="left"/>
+      <w:pPr>
+        <w:ind w:left="5760" w:hanging="360"/>
+      </w:pPr>
+      <w:rPr>
+        <w:rFonts w:ascii="Courier New" w:hAnsi="Courier New" w:cs="Courier New" w:hint="default"/>
+      </w:rPr>
+    </w:lvl>
+    <w:lvl w:ilvl="8" w:tplc="04090005" w:tentative="1">
+      <w:start w:val="1"/>
+      <w:numFmt w:val="bullet"/>
+      <w:lvlText w:val=""/>
+      <w:lvlJc w:val="left"/>
+      <w:pPr>
+        <w:ind w:left="6480" w:hanging="360"/>
+      </w:pPr>
+      <w:rPr>
+        <w:rFonts w:ascii="Wingdings" w:hAnsi="Wingdings" w:hint="default"/>
+      </w:rPr>
+    </w:lvl>
+  </w:abstractNum>
+  <w:abstractNum w:abstractNumId="2" w15:restartNumberingAfterBreak="0">
     <w:nsid w:val="41187D30"/>
     <w:multiLevelType w:val="hybridMultilevel"/>
     <w:tmpl w:val="EA5EB43A"/>
@@ -762,7 +932,7 @@
       </w:rPr>
     </w:lvl>
   </w:abstractNum>
-  <w:abstractNum w:abstractNumId="2" w15:restartNumberingAfterBreak="0">
+  <w:abstractNum w:abstractNumId="3" w15:restartNumberingAfterBreak="0">
     <w:nsid w:val="5C0C7049"/>
     <w:multiLevelType w:val="hybridMultilevel"/>
     <w:tmpl w:val="E0EC6138"/>
@@ -875,7 +1045,7 @@
       </w:rPr>
     </w:lvl>
   </w:abstractNum>
-  <w:abstractNum w:abstractNumId="3" w15:restartNumberingAfterBreak="0">
+  <w:abstractNum w:abstractNumId="4" w15:restartNumberingAfterBreak="0">
     <w:nsid w:val="5DA55689"/>
     <w:multiLevelType w:val="hybridMultilevel"/>
     <w:tmpl w:val="0A525742"/>
@@ -989,15 +1159,18 @@
     </w:lvl>
   </w:abstractNum>
   <w:num w:numId="1" w16cid:durableId="686248213">
-    <w:abstractNumId w:val="3"/>
+    <w:abstractNumId w:val="4"/>
   </w:num>
   <w:num w:numId="2" w16cid:durableId="805394223">
-    <w:abstractNumId w:val="2"/>
+    <w:abstractNumId w:val="3"/>
   </w:num>
   <w:num w:numId="3" w16cid:durableId="1326520074">
     <w:abstractNumId w:val="0"/>
   </w:num>
   <w:num w:numId="4" w16cid:durableId="1552691628">
+    <w:abstractNumId w:val="2"/>
+  </w:num>
+  <w:num w:numId="5" w16cid:durableId="285432705">
     <w:abstractNumId w:val="1"/>
   </w:num>
 </w:numbering>

</xml_diff>

<commit_message>
SQL practice within vscode, created flashcards, and updated project documentation.
</commit_message>
<xml_diff>
--- a/documentation/da-gym-doumentation .docx
+++ b/documentation/da-gym-doumentation .docx
@@ -30,7 +30,18 @@
     </w:p>
     <w:p>
       <w:r>
-        <w:t xml:space="preserve">Started with some join logic and difference between distinct and Group By in a CTE to achieve the same result. </w:t>
+        <w:t xml:space="preserve">Started with some join logic and difference between distinct and Group </w:t>
+      </w:r>
+      <w:proofErr w:type="gramStart"/>
+      <w:r>
+        <w:t>By</w:t>
+      </w:r>
+      <w:proofErr w:type="gramEnd"/>
+      <w:r>
+        <w:t xml:space="preserve"> in a CTE to achieve the same result</w:t>
+      </w:r>
+      <w:r>
+        <w:t xml:space="preserve">; CTE above/below average comparisons. </w:t>
       </w:r>
     </w:p>
     <w:p>
@@ -92,7 +103,15 @@
         <w:t>Analysis:</w:t>
       </w:r>
       <w:r>
-        <w:t xml:space="preserve"> what did you actually do with the data? </w:t>
+        <w:t xml:space="preserve"> what did you </w:t>
+      </w:r>
+      <w:proofErr w:type="gramStart"/>
+      <w:r>
+        <w:t>actually do</w:t>
+      </w:r>
+      <w:proofErr w:type="gramEnd"/>
+      <w:r>
+        <w:t xml:space="preserve"> with the data? </w:t>
       </w:r>
     </w:p>
     <w:p>
@@ -134,6 +153,12 @@
       </w:r>
     </w:p>
     <w:p>
+      <w:r>
+        <w:t xml:space="preserve">I also created flashcards to help me with basics of SQL and some window functions. </w:t>
+      </w:r>
+    </w:p>
+    <w:p/>
+    <w:p>
       <w:pPr>
         <w:rPr>
           <w:u w:val="single"/>
@@ -159,7 +184,15 @@
         <w:t>trends</w:t>
       </w:r>
       <w:r>
-        <w:t xml:space="preserve"> when I was most efficient and which shifts were actually worth my time.</w:t>
+        <w:t xml:space="preserve"> when I was most efficient and which shifts were </w:t>
+      </w:r>
+      <w:proofErr w:type="gramStart"/>
+      <w:r>
+        <w:t>actually worth</w:t>
+      </w:r>
+      <w:proofErr w:type="gramEnd"/>
+      <w:r>
+        <w:t xml:space="preserve"> my time.</w:t>
       </w:r>
     </w:p>
     <w:p>
@@ -204,7 +237,23 @@
     </w:p>
     <w:p>
       <w:r>
-        <w:t>When I transitioned to Three Square as a Nutrition Education Specialist, I was regularly reviewing performance metrics, improving processes, and using data to help support health and operational goals for the Las Vegas community.</w:t>
+        <w:t xml:space="preserve">When I transitioned to Three Square as a Nutrition Education Specialist, </w:t>
+      </w:r>
+      <w:proofErr w:type="gramStart"/>
+      <w:r>
+        <w:t>I was</w:t>
+      </w:r>
+      <w:proofErr w:type="gramEnd"/>
+      <w:r>
+        <w:t xml:space="preserve"> regularly </w:t>
+      </w:r>
+      <w:proofErr w:type="gramStart"/>
+      <w:r>
+        <w:t>reviewing</w:t>
+      </w:r>
+      <w:proofErr w:type="gramEnd"/>
+      <w:r>
+        <w:t xml:space="preserve"> performance metrics, improving processes, and using data to help support health and operational goals for the Las Vegas community.</w:t>
       </w:r>
     </w:p>
     <w:p>
@@ -243,8 +292,13 @@
           <w:numId w:val="4"/>
         </w:numPr>
       </w:pPr>
-      <w:r>
-        <w:t xml:space="preserve">a CTE can create a new state-level dataset </w:t>
+      <w:proofErr w:type="gramStart"/>
+      <w:r>
+        <w:t>a CTE</w:t>
+      </w:r>
+      <w:proofErr w:type="gramEnd"/>
+      <w:r>
+        <w:t xml:space="preserve"> can create a new state-level dataset </w:t>
       </w:r>
     </w:p>
     <w:p>
@@ -279,8 +333,13 @@
           <w:numId w:val="4"/>
         </w:numPr>
       </w:pPr>
-      <w:r>
-        <w:t>the outer query can compare each row against an aggregate of the CTE</w:t>
+      <w:proofErr w:type="gramStart"/>
+      <w:r>
+        <w:t>the</w:t>
+      </w:r>
+      <w:proofErr w:type="gramEnd"/>
+      <w:r>
+        <w:t xml:space="preserve"> outer query can compare each row against an aggregate of the CTE</w:t>
       </w:r>
     </w:p>
     <w:p/>
@@ -299,7 +358,15 @@
     </w:p>
     <w:p>
       <w:r>
-        <w:t xml:space="preserve">Went over concepts of joins. Instead of syntaxes in isolation, my goal is to understand purpose and function of SQL concepts, but also develop the ability to apply them to various scenarios; effective application within real world. </w:t>
+        <w:t xml:space="preserve">Went over concepts of joins. Instead of syntaxes in isolation, my goal is to understand purpose and function of SQL </w:t>
+      </w:r>
+      <w:proofErr w:type="gramStart"/>
+      <w:r>
+        <w:t>concepts, but</w:t>
+      </w:r>
+      <w:proofErr w:type="gramEnd"/>
+      <w:r>
+        <w:t xml:space="preserve"> also develop the ability to apply them to various scenarios; effective application within real world. </w:t>
       </w:r>
     </w:p>
     <w:p>
@@ -328,7 +395,15 @@
     </w:p>
     <w:p>
       <w:r>
-        <w:t xml:space="preserve">Conducted Testing on everything I’ve learned so far, then updated oneNote. Focusing on knowing when to apply certain Window Functions based off of business needs. Growing past learning Window Functions in isolation. </w:t>
+        <w:t xml:space="preserve">Conducted Testing on everything I’ve learned so far, then updated oneNote. Focusing on knowing when to apply certain Window Functions based </w:t>
+      </w:r>
+      <w:proofErr w:type="gramStart"/>
+      <w:r>
+        <w:t>off of</w:t>
+      </w:r>
+      <w:proofErr w:type="gramEnd"/>
+      <w:r>
+        <w:t xml:space="preserve"> business needs. Growing past learning Window Functions in isolation. </w:t>
       </w:r>
     </w:p>
     <w:p>
@@ -349,7 +424,23 @@
         <w:t xml:space="preserve">Learning </w:t>
       </w:r>
       <w:r>
-        <w:t>First_Value() and Last_Value()</w:t>
+        <w:t>First_</w:t>
+      </w:r>
+      <w:proofErr w:type="gramStart"/>
+      <w:r>
+        <w:t>Value(</w:t>
+      </w:r>
+      <w:proofErr w:type="gramEnd"/>
+      <w:r>
+        <w:t>) and Last_</w:t>
+      </w:r>
+      <w:proofErr w:type="gramStart"/>
+      <w:r>
+        <w:t>Value(</w:t>
+      </w:r>
+      <w:proofErr w:type="gramEnd"/>
+      <w:r>
+        <w:t>)</w:t>
       </w:r>
       <w:r>
         <w:t xml:space="preserve"> with Window Frames</w:t>
@@ -364,7 +455,23 @@
         </w:numPr>
       </w:pPr>
       <w:r>
-        <w:t>Business-wise, FIRST_VALUE() is useful for comparing current performance to a starting baseline, while LAST_VALUE() is useful for comparing rows to the final value in a defined sequence.</w:t>
+        <w:t>Business-wise, FIRST_</w:t>
+      </w:r>
+      <w:proofErr w:type="gramStart"/>
+      <w:r>
+        <w:t>VALUE(</w:t>
+      </w:r>
+      <w:proofErr w:type="gramEnd"/>
+      <w:r>
+        <w:t>) is useful for comparing current performance to a starting baseline, while LAST_</w:t>
+      </w:r>
+      <w:proofErr w:type="gramStart"/>
+      <w:r>
+        <w:t>VALUE(</w:t>
+      </w:r>
+      <w:proofErr w:type="gramEnd"/>
+      <w:r>
+        <w:t>) is useful for comparing rows to the final value in a defined sequence.</w:t>
       </w:r>
     </w:p>
     <w:p>
@@ -395,7 +502,15 @@
     </w:p>
     <w:p>
       <w:r>
-        <w:t>Practiced Lag() – Value/Navigation windows</w:t>
+        <w:t xml:space="preserve">Practiced </w:t>
+      </w:r>
+      <w:proofErr w:type="gramStart"/>
+      <w:r>
+        <w:t>Lag(</w:t>
+      </w:r>
+      <w:proofErr w:type="gramEnd"/>
+      <w:r>
+        <w:t>) – Value/Navigation windows</w:t>
       </w:r>
     </w:p>
     <w:p>
@@ -444,7 +559,15 @@
         </w:numPr>
       </w:pPr>
       <w:r>
-        <w:t>Partition By()</w:t>
+        <w:t xml:space="preserve">Partition </w:t>
+      </w:r>
+      <w:proofErr w:type="gramStart"/>
+      <w:r>
+        <w:t>By(</w:t>
+      </w:r>
+      <w:proofErr w:type="gramEnd"/>
+      <w:r>
+        <w:t>)</w:t>
       </w:r>
     </w:p>
     <w:p>
@@ -471,7 +594,15 @@
         </w:numPr>
       </w:pPr>
       <w:r>
-        <w:t>Order By()</w:t>
+        <w:t xml:space="preserve">Order </w:t>
+      </w:r>
+      <w:proofErr w:type="gramStart"/>
+      <w:r>
+        <w:t>By(</w:t>
+      </w:r>
+      <w:proofErr w:type="gramEnd"/>
+      <w:r>
+        <w:t>)</w:t>
       </w:r>
     </w:p>
     <w:p>
@@ -495,7 +626,15 @@
         </w:numPr>
       </w:pPr>
       <w:r>
-        <w:t>Row_Number()</w:t>
+        <w:t>Row_</w:t>
+      </w:r>
+      <w:proofErr w:type="gramStart"/>
+      <w:r>
+        <w:t>Number(</w:t>
+      </w:r>
+      <w:proofErr w:type="gramEnd"/>
+      <w:r>
+        <w:t>)</w:t>
       </w:r>
     </w:p>
     <w:p>
@@ -506,8 +645,13 @@
           <w:numId w:val="2"/>
         </w:numPr>
       </w:pPr>
-      <w:r>
-        <w:t>Rank()</w:t>
+      <w:proofErr w:type="gramStart"/>
+      <w:r>
+        <w:t>Rank(</w:t>
+      </w:r>
+      <w:proofErr w:type="gramEnd"/>
+      <w:r>
+        <w:t>)</w:t>
       </w:r>
     </w:p>
     <w:p>
@@ -519,7 +663,15 @@
         </w:numPr>
       </w:pPr>
       <w:r>
-        <w:t>Dense_Rank()</w:t>
+        <w:t>Dense_</w:t>
+      </w:r>
+      <w:proofErr w:type="gramStart"/>
+      <w:r>
+        <w:t>Rank(</w:t>
+      </w:r>
+      <w:proofErr w:type="gramEnd"/>
+      <w:r>
+        <w:t>)</w:t>
       </w:r>
     </w:p>
     <w:p>
@@ -530,8 +682,13 @@
           <w:numId w:val="2"/>
         </w:numPr>
       </w:pPr>
-      <w:r>
-        <w:t>Lag()</w:t>
+      <w:proofErr w:type="gramStart"/>
+      <w:r>
+        <w:t>Lag(</w:t>
+      </w:r>
+      <w:proofErr w:type="gramEnd"/>
+      <w:r>
+        <w:t>)</w:t>
       </w:r>
     </w:p>
     <w:p>
@@ -555,11 +712,21 @@
         </w:numPr>
       </w:pPr>
       <w:r>
-        <w:t xml:space="preserve">Define the field I want the value from and pull  a previous record </w:t>
-      </w:r>
+        <w:t xml:space="preserve">Define the field I want the value from and </w:t>
+      </w:r>
+      <w:proofErr w:type="gramStart"/>
+      <w:r>
+        <w:t>pull  a</w:t>
+      </w:r>
+      <w:proofErr w:type="gramEnd"/>
+      <w:r>
+        <w:t xml:space="preserve"> previous record </w:t>
+      </w:r>
+      <w:proofErr w:type="gramStart"/>
       <w:r>
         <w:t>git</w:t>
       </w:r>
+      <w:proofErr w:type="gramEnd"/>
     </w:p>
     <w:p/>
     <w:p>
@@ -1779,6 +1946,7 @@
   <w:style w:type="character" w:default="1" w:styleId="DefaultParagraphFont">
     <w:name w:val="Default Paragraph Font"/>
     <w:uiPriority w:val="1"/>
+    <w:semiHidden/>
     <w:unhideWhenUsed/>
   </w:style>
   <w:style w:type="table" w:default="1" w:styleId="TableNormal">

</xml_diff>

<commit_message>
Updated SQL notes for business use-cases.
</commit_message>
<xml_diff>
--- a/documentation/da-gym-doumentation .docx
+++ b/documentation/da-gym-doumentation .docx
@@ -12,7 +12,75 @@
         <w:rPr>
           <w:u w:val="single"/>
         </w:rPr>
+        <w:t>/</w:t>
+      </w:r>
+      <w:r>
+        <w:rPr>
+          <w:u w:val="single"/>
+        </w:rPr>
         <w:t xml:space="preserve">Data Analytics Gym – Documentation </w:t>
+      </w:r>
+    </w:p>
+    <w:p>
+      <w:pPr>
+        <w:rPr>
+          <w:u w:val="single"/>
+        </w:rPr>
+      </w:pPr>
+      <w:r>
+        <w:rPr>
+          <w:u w:val="single"/>
+        </w:rPr>
+        <w:t>9/14/2026</w:t>
+      </w:r>
+    </w:p>
+    <w:p>
+      <w:r>
+        <w:t>Continuing with SQL Drilling</w:t>
+      </w:r>
+      <w:r>
+        <w:t xml:space="preserve">: Group By vs Window Function. </w:t>
+      </w:r>
+    </w:p>
+    <w:p>
+      <w:r>
+        <w:t>Knowing when to use CTE vs Window Function:</w:t>
+      </w:r>
+    </w:p>
+    <w:p>
+      <w:pPr>
+        <w:numPr>
+          <w:ilvl w:val="0"/>
+          <w:numId w:val="6"/>
+        </w:numPr>
+      </w:pPr>
+      <w:r>
+        <w:t xml:space="preserve">Need to change grain first? </w:t>
+      </w:r>
+      <w:proofErr w:type="gramStart"/>
+      <w:r>
+        <w:t>Think</w:t>
+      </w:r>
+      <w:proofErr w:type="gramEnd"/>
+      <w:r>
+        <w:t xml:space="preserve"> CTE/subquery.</w:t>
+      </w:r>
+    </w:p>
+    <w:p>
+      <w:pPr>
+        <w:numPr>
+          <w:ilvl w:val="0"/>
+          <w:numId w:val="6"/>
+        </w:numPr>
+      </w:pPr>
+      <w:r>
+        <w:t>Need to keep the current grain and add context? Think window function.</w:t>
+      </w:r>
+    </w:p>
+    <w:p/>
+    <w:p>
+      <w:r>
+        <w:t xml:space="preserve"> </w:t>
       </w:r>
     </w:p>
     <w:p>
@@ -202,6 +270,7 @@
     </w:p>
     <w:p>
       <w:r>
+        <w:lastRenderedPageBreak/>
         <w:t>What I liked about that project was that it showed me how useful even simple data can be when it’s tied to a clear business question and a decision.</w:t>
       </w:r>
     </w:p>
@@ -258,7 +327,6 @@
     </w:p>
     <w:p>
       <w:r>
-        <w:lastRenderedPageBreak/>
         <w:t>That experience pushed me to go deeper into analytics. I started building my skills in SQL, Excel, Power BI, and more recently Python, and I found that I really enjoy using data to solve practical problems and improve how systems work.</w:t>
       </w:r>
     </w:p>
@@ -395,6 +463,7 @@
     </w:p>
     <w:p>
       <w:r>
+        <w:lastRenderedPageBreak/>
         <w:t xml:space="preserve">Conducted Testing on everything I’ve learned so far, then updated oneNote. Focusing on knowing when to apply certain Window Functions based </w:t>
       </w:r>
       <w:proofErr w:type="gramStart"/>
@@ -1325,6 +1394,155 @@
       </w:rPr>
     </w:lvl>
   </w:abstractNum>
+  <w:abstractNum w:abstractNumId="5" w15:restartNumberingAfterBreak="0">
+    <w:nsid w:val="61DE4327"/>
+    <w:multiLevelType w:val="multilevel"/>
+    <w:tmpl w:val="F5E87F82"/>
+    <w:lvl w:ilvl="0">
+      <w:start w:val="1"/>
+      <w:numFmt w:val="bullet"/>
+      <w:lvlText w:val=""/>
+      <w:lvlJc w:val="left"/>
+      <w:pPr>
+        <w:tabs>
+          <w:tab w:val="num" w:pos="720"/>
+        </w:tabs>
+        <w:ind w:left="720" w:hanging="360"/>
+      </w:pPr>
+      <w:rPr>
+        <w:rFonts w:ascii="Symbol" w:hAnsi="Symbol" w:hint="default"/>
+        <w:sz w:val="20"/>
+      </w:rPr>
+    </w:lvl>
+    <w:lvl w:ilvl="1" w:tentative="1">
+      <w:start w:val="1"/>
+      <w:numFmt w:val="bullet"/>
+      <w:lvlText w:val=""/>
+      <w:lvlJc w:val="left"/>
+      <w:pPr>
+        <w:tabs>
+          <w:tab w:val="num" w:pos="1440"/>
+        </w:tabs>
+        <w:ind w:left="1440" w:hanging="360"/>
+      </w:pPr>
+      <w:rPr>
+        <w:rFonts w:ascii="Symbol" w:hAnsi="Symbol" w:hint="default"/>
+        <w:sz w:val="20"/>
+      </w:rPr>
+    </w:lvl>
+    <w:lvl w:ilvl="2" w:tentative="1">
+      <w:start w:val="1"/>
+      <w:numFmt w:val="bullet"/>
+      <w:lvlText w:val=""/>
+      <w:lvlJc w:val="left"/>
+      <w:pPr>
+        <w:tabs>
+          <w:tab w:val="num" w:pos="2160"/>
+        </w:tabs>
+        <w:ind w:left="2160" w:hanging="360"/>
+      </w:pPr>
+      <w:rPr>
+        <w:rFonts w:ascii="Symbol" w:hAnsi="Symbol" w:hint="default"/>
+        <w:sz w:val="20"/>
+      </w:rPr>
+    </w:lvl>
+    <w:lvl w:ilvl="3" w:tentative="1">
+      <w:start w:val="1"/>
+      <w:numFmt w:val="bullet"/>
+      <w:lvlText w:val=""/>
+      <w:lvlJc w:val="left"/>
+      <w:pPr>
+        <w:tabs>
+          <w:tab w:val="num" w:pos="2880"/>
+        </w:tabs>
+        <w:ind w:left="2880" w:hanging="360"/>
+      </w:pPr>
+      <w:rPr>
+        <w:rFonts w:ascii="Symbol" w:hAnsi="Symbol" w:hint="default"/>
+        <w:sz w:val="20"/>
+      </w:rPr>
+    </w:lvl>
+    <w:lvl w:ilvl="4" w:tentative="1">
+      <w:start w:val="1"/>
+      <w:numFmt w:val="bullet"/>
+      <w:lvlText w:val=""/>
+      <w:lvlJc w:val="left"/>
+      <w:pPr>
+        <w:tabs>
+          <w:tab w:val="num" w:pos="3600"/>
+        </w:tabs>
+        <w:ind w:left="3600" w:hanging="360"/>
+      </w:pPr>
+      <w:rPr>
+        <w:rFonts w:ascii="Symbol" w:hAnsi="Symbol" w:hint="default"/>
+        <w:sz w:val="20"/>
+      </w:rPr>
+    </w:lvl>
+    <w:lvl w:ilvl="5" w:tentative="1">
+      <w:start w:val="1"/>
+      <w:numFmt w:val="bullet"/>
+      <w:lvlText w:val=""/>
+      <w:lvlJc w:val="left"/>
+      <w:pPr>
+        <w:tabs>
+          <w:tab w:val="num" w:pos="4320"/>
+        </w:tabs>
+        <w:ind w:left="4320" w:hanging="360"/>
+      </w:pPr>
+      <w:rPr>
+        <w:rFonts w:ascii="Symbol" w:hAnsi="Symbol" w:hint="default"/>
+        <w:sz w:val="20"/>
+      </w:rPr>
+    </w:lvl>
+    <w:lvl w:ilvl="6" w:tentative="1">
+      <w:start w:val="1"/>
+      <w:numFmt w:val="bullet"/>
+      <w:lvlText w:val=""/>
+      <w:lvlJc w:val="left"/>
+      <w:pPr>
+        <w:tabs>
+          <w:tab w:val="num" w:pos="5040"/>
+        </w:tabs>
+        <w:ind w:left="5040" w:hanging="360"/>
+      </w:pPr>
+      <w:rPr>
+        <w:rFonts w:ascii="Symbol" w:hAnsi="Symbol" w:hint="default"/>
+        <w:sz w:val="20"/>
+      </w:rPr>
+    </w:lvl>
+    <w:lvl w:ilvl="7" w:tentative="1">
+      <w:start w:val="1"/>
+      <w:numFmt w:val="bullet"/>
+      <w:lvlText w:val=""/>
+      <w:lvlJc w:val="left"/>
+      <w:pPr>
+        <w:tabs>
+          <w:tab w:val="num" w:pos="5760"/>
+        </w:tabs>
+        <w:ind w:left="5760" w:hanging="360"/>
+      </w:pPr>
+      <w:rPr>
+        <w:rFonts w:ascii="Symbol" w:hAnsi="Symbol" w:hint="default"/>
+        <w:sz w:val="20"/>
+      </w:rPr>
+    </w:lvl>
+    <w:lvl w:ilvl="8" w:tentative="1">
+      <w:start w:val="1"/>
+      <w:numFmt w:val="bullet"/>
+      <w:lvlText w:val=""/>
+      <w:lvlJc w:val="left"/>
+      <w:pPr>
+        <w:tabs>
+          <w:tab w:val="num" w:pos="6480"/>
+        </w:tabs>
+        <w:ind w:left="6480" w:hanging="360"/>
+      </w:pPr>
+      <w:rPr>
+        <w:rFonts w:ascii="Symbol" w:hAnsi="Symbol" w:hint="default"/>
+        <w:sz w:val="20"/>
+      </w:rPr>
+    </w:lvl>
+  </w:abstractNum>
   <w:num w:numId="1" w16cid:durableId="686248213">
     <w:abstractNumId w:val="4"/>
   </w:num>
@@ -1339,6 +1557,9 @@
   </w:num>
   <w:num w:numId="5" w16cid:durableId="285432705">
     <w:abstractNumId w:val="1"/>
+  </w:num>
+  <w:num w:numId="6" w16cid:durableId="115032699">
+    <w:abstractNumId w:val="5"/>
   </w:num>
 </w:numbering>
 </file>
@@ -1946,7 +2167,6 @@
   <w:style w:type="character" w:default="1" w:styleId="DefaultParagraphFont">
     <w:name w:val="Default Paragraph Font"/>
     <w:uiPriority w:val="1"/>
-    <w:semiHidden/>
     <w:unhideWhenUsed/>
   </w:style>
   <w:style w:type="table" w:default="1" w:styleId="TableNormal">

</xml_diff>

<commit_message>
added more notes to project documentation: continued SQL decomposition prior to SQL coding.
</commit_message>
<xml_diff>
--- a/documentation/da-gym-doumentation .docx
+++ b/documentation/da-gym-doumentation .docx
@@ -75,6 +75,42 @@
       </w:pPr>
       <w:r>
         <w:t>Need to keep the current grain and add context? Think window function.</w:t>
+      </w:r>
+    </w:p>
+    <w:p>
+      <w:r>
+        <w:t xml:space="preserve">Getting used to </w:t>
+      </w:r>
+      <w:proofErr w:type="gramStart"/>
+      <w:r>
+        <w:t>decomposing</w:t>
+      </w:r>
+      <w:proofErr w:type="gramEnd"/>
+      <w:r>
+        <w:t xml:space="preserve"> the</w:t>
+      </w:r>
+      <w:r>
+        <w:t xml:space="preserve"> </w:t>
+      </w:r>
+      <w:r>
+        <w:t xml:space="preserve">business questions before starting with SQL; normally I would just start trying to write SQL to solve the business problem. </w:t>
+      </w:r>
+    </w:p>
+    <w:p>
+      <w:r>
+        <w:t xml:space="preserve">Now it’s like understanding a math problem fully and then hand-picking the concept or formula to solve the problem first.  </w:t>
+      </w:r>
+    </w:p>
+    <w:p>
+      <w:pPr>
+        <w:pStyle w:val="ListParagraph"/>
+        <w:numPr>
+          <w:ilvl w:val="0"/>
+          <w:numId w:val="7"/>
+        </w:numPr>
+      </w:pPr>
+      <w:r>
+        <w:t>In SQL, that means decomposing the business question into grain, metrics, relationships, and required transformations before choosing the appropriate query logic.</w:t>
       </w:r>
     </w:p>
     <w:p/>
@@ -241,6 +277,7 @@
     </w:p>
     <w:p>
       <w:r>
+        <w:lastRenderedPageBreak/>
         <w:t>When I started doing DoorDash, I wanted to find a way to earn more money in less time while also reducing unnecessary mileage and gas costs. The goal was really to work smarter, not harder.</w:t>
       </w:r>
     </w:p>
@@ -270,7 +307,6 @@
     </w:p>
     <w:p>
       <w:r>
-        <w:lastRenderedPageBreak/>
         <w:t>What I liked about that project was that it showed me how useful even simple data can be when it’s tied to a clear business question and a decision.</w:t>
       </w:r>
     </w:p>
@@ -421,6 +457,7 @@
         <w:rPr>
           <w:u w:val="single"/>
         </w:rPr>
+        <w:lastRenderedPageBreak/>
         <w:t>9/11/2026</w:t>
       </w:r>
     </w:p>
@@ -463,7 +500,6 @@
     </w:p>
     <w:p>
       <w:r>
-        <w:lastRenderedPageBreak/>
         <w:t xml:space="preserve">Conducted Testing on everything I’ve learned so far, then updated oneNote. Focusing on knowing when to apply certain Window Functions based </w:t>
       </w:r>
       <w:proofErr w:type="gramStart"/>
@@ -716,6 +752,7 @@
       </w:pPr>
       <w:proofErr w:type="gramStart"/>
       <w:r>
+        <w:lastRenderedPageBreak/>
         <w:t>Rank(</w:t>
       </w:r>
       <w:proofErr w:type="gramEnd"/>
@@ -830,6 +867,119 @@
 <file path=word/numbering.xml><?xml version="1.0" encoding="utf-8"?>
 <w:numbering xmlns:wpc="http://schemas.microsoft.com/office/word/2010/wordprocessingCanvas" xmlns:cx="http://schemas.microsoft.com/office/drawing/2014/chartex" xmlns:cx1="http://schemas.microsoft.com/office/drawing/2015/9/8/chartex" xmlns:cx2="http://schemas.microsoft.com/office/drawing/2015/10/21/chartex" xmlns:cx3="http://schemas.microsoft.com/office/drawing/2016/5/9/chartex" xmlns:cx4="http://schemas.microsoft.com/office/drawing/2016/5/10/chartex" xmlns:cx5="http://schemas.microsoft.com/office/drawing/2016/5/11/chartex" xmlns:cx6="http://schemas.microsoft.com/office/drawing/2016/5/12/chartex" xmlns:cx7="http://schemas.microsoft.com/office/drawing/2016/5/13/chartex" xmlns:cx8="http://schemas.microsoft.com/office/drawing/2016/5/14/chartex" xmlns:mc="http://schemas.openxmlformats.org/markup-compatibility/2006" xmlns:aink="http://schemas.microsoft.com/office/drawing/2016/ink" xmlns:am3d="http://schemas.microsoft.com/office/drawing/2017/model3d" xmlns:o="urn:schemas-microsoft-com:office:office" xmlns:oel="http://schemas.microsoft.com/office/2019/extlst" xmlns:r="http://schemas.openxmlformats.org/officeDocument/2006/relationships" xmlns:m="http://schemas.openxmlformats.org/officeDocument/2006/math" xmlns:v="urn:schemas-microsoft-com:vml" xmlns:wp14="http://schemas.microsoft.com/office/word/2010/wordprocessingDrawing" xmlns:wp="http://schemas.openxmlformats.org/drawingml/2006/wordprocessingDrawing" xmlns:w10="urn:schemas-microsoft-com:office:word" xmlns:w="http://schemas.openxmlformats.org/wordprocessingml/2006/main" xmlns:w14="http://schemas.microsoft.com/office/word/2010/wordml" xmlns:w15="http://schemas.microsoft.com/office/word/2012/wordml" xmlns:w16cex="http://schemas.microsoft.com/office/word/2018/wordml/cex" xmlns:w16cid="http://schemas.microsoft.com/office/word/2016/wordml/cid" xmlns:w16="http://schemas.microsoft.com/office/word/2018/wordml" xmlns:w16du="http://schemas.microsoft.com/office/word/2023/wordml/word16du" xmlns:w16sdtdh="http://schemas.microsoft.com/office/word/2020/wordml/sdtdatahash" xmlns:w16sdtfl="http://schemas.microsoft.com/office/word/2024/wordml/sdtformatlock" xmlns:w16se="http://schemas.microsoft.com/office/word/2015/wordml/symex" xmlns:wpg="http://schemas.microsoft.com/office/word/2010/wordprocessingGroup" xmlns:wpi="http://schemas.microsoft.com/office/word/2010/wordprocessingInk" xmlns:wne="http://schemas.microsoft.com/office/word/2006/wordml" xmlns:wps="http://schemas.microsoft.com/office/word/2010/wordprocessingShape" mc:Ignorable="w14 w15 w16se w16cid w16 w16cex w16sdtdh w16sdtfl w16du wp14">
   <w:abstractNum w:abstractNumId="0" w15:restartNumberingAfterBreak="0">
+    <w:nsid w:val="0B1960B4"/>
+    <w:multiLevelType w:val="hybridMultilevel"/>
+    <w:tmpl w:val="2FDECA20"/>
+    <w:lvl w:ilvl="0" w:tplc="04090001">
+      <w:start w:val="1"/>
+      <w:numFmt w:val="bullet"/>
+      <w:lvlText w:val=""/>
+      <w:lvlJc w:val="left"/>
+      <w:pPr>
+        <w:ind w:left="720" w:hanging="360"/>
+      </w:pPr>
+      <w:rPr>
+        <w:rFonts w:ascii="Symbol" w:hAnsi="Symbol" w:hint="default"/>
+      </w:rPr>
+    </w:lvl>
+    <w:lvl w:ilvl="1" w:tplc="04090003" w:tentative="1">
+      <w:start w:val="1"/>
+      <w:numFmt w:val="bullet"/>
+      <w:lvlText w:val="o"/>
+      <w:lvlJc w:val="left"/>
+      <w:pPr>
+        <w:ind w:left="1440" w:hanging="360"/>
+      </w:pPr>
+      <w:rPr>
+        <w:rFonts w:ascii="Courier New" w:hAnsi="Courier New" w:cs="Courier New" w:hint="default"/>
+      </w:rPr>
+    </w:lvl>
+    <w:lvl w:ilvl="2" w:tplc="04090005" w:tentative="1">
+      <w:start w:val="1"/>
+      <w:numFmt w:val="bullet"/>
+      <w:lvlText w:val=""/>
+      <w:lvlJc w:val="left"/>
+      <w:pPr>
+        <w:ind w:left="2160" w:hanging="360"/>
+      </w:pPr>
+      <w:rPr>
+        <w:rFonts w:ascii="Wingdings" w:hAnsi="Wingdings" w:hint="default"/>
+      </w:rPr>
+    </w:lvl>
+    <w:lvl w:ilvl="3" w:tplc="04090001" w:tentative="1">
+      <w:start w:val="1"/>
+      <w:numFmt w:val="bullet"/>
+      <w:lvlText w:val=""/>
+      <w:lvlJc w:val="left"/>
+      <w:pPr>
+        <w:ind w:left="2880" w:hanging="360"/>
+      </w:pPr>
+      <w:rPr>
+        <w:rFonts w:ascii="Symbol" w:hAnsi="Symbol" w:hint="default"/>
+      </w:rPr>
+    </w:lvl>
+    <w:lvl w:ilvl="4" w:tplc="04090003" w:tentative="1">
+      <w:start w:val="1"/>
+      <w:numFmt w:val="bullet"/>
+      <w:lvlText w:val="o"/>
+      <w:lvlJc w:val="left"/>
+      <w:pPr>
+        <w:ind w:left="3600" w:hanging="360"/>
+      </w:pPr>
+      <w:rPr>
+        <w:rFonts w:ascii="Courier New" w:hAnsi="Courier New" w:cs="Courier New" w:hint="default"/>
+      </w:rPr>
+    </w:lvl>
+    <w:lvl w:ilvl="5" w:tplc="04090005" w:tentative="1">
+      <w:start w:val="1"/>
+      <w:numFmt w:val="bullet"/>
+      <w:lvlText w:val=""/>
+      <w:lvlJc w:val="left"/>
+      <w:pPr>
+        <w:ind w:left="4320" w:hanging="360"/>
+      </w:pPr>
+      <w:rPr>
+        <w:rFonts w:ascii="Wingdings" w:hAnsi="Wingdings" w:hint="default"/>
+      </w:rPr>
+    </w:lvl>
+    <w:lvl w:ilvl="6" w:tplc="04090001" w:tentative="1">
+      <w:start w:val="1"/>
+      <w:numFmt w:val="bullet"/>
+      <w:lvlText w:val=""/>
+      <w:lvlJc w:val="left"/>
+      <w:pPr>
+        <w:ind w:left="5040" w:hanging="360"/>
+      </w:pPr>
+      <w:rPr>
+        <w:rFonts w:ascii="Symbol" w:hAnsi="Symbol" w:hint="default"/>
+      </w:rPr>
+    </w:lvl>
+    <w:lvl w:ilvl="7" w:tplc="04090003" w:tentative="1">
+      <w:start w:val="1"/>
+      <w:numFmt w:val="bullet"/>
+      <w:lvlText w:val="o"/>
+      <w:lvlJc w:val="left"/>
+      <w:pPr>
+        <w:ind w:left="5760" w:hanging="360"/>
+      </w:pPr>
+      <w:rPr>
+        <w:rFonts w:ascii="Courier New" w:hAnsi="Courier New" w:cs="Courier New" w:hint="default"/>
+      </w:rPr>
+    </w:lvl>
+    <w:lvl w:ilvl="8" w:tplc="04090005" w:tentative="1">
+      <w:start w:val="1"/>
+      <w:numFmt w:val="bullet"/>
+      <w:lvlText w:val=""/>
+      <w:lvlJc w:val="left"/>
+      <w:pPr>
+        <w:ind w:left="6480" w:hanging="360"/>
+      </w:pPr>
+      <w:rPr>
+        <w:rFonts w:ascii="Wingdings" w:hAnsi="Wingdings" w:hint="default"/>
+      </w:rPr>
+    </w:lvl>
+  </w:abstractNum>
+  <w:abstractNum w:abstractNumId="1" w15:restartNumberingAfterBreak="0">
     <w:nsid w:val="1E473C7C"/>
     <w:multiLevelType w:val="hybridMultilevel"/>
     <w:tmpl w:val="588A0A06"/>
@@ -942,7 +1092,7 @@
       </w:rPr>
     </w:lvl>
   </w:abstractNum>
-  <w:abstractNum w:abstractNumId="1" w15:restartNumberingAfterBreak="0">
+  <w:abstractNum w:abstractNumId="2" w15:restartNumberingAfterBreak="0">
     <w:nsid w:val="3505313F"/>
     <w:multiLevelType w:val="hybridMultilevel"/>
     <w:tmpl w:val="EC8A3396"/>
@@ -1055,7 +1205,7 @@
       </w:rPr>
     </w:lvl>
   </w:abstractNum>
-  <w:abstractNum w:abstractNumId="2" w15:restartNumberingAfterBreak="0">
+  <w:abstractNum w:abstractNumId="3" w15:restartNumberingAfterBreak="0">
     <w:nsid w:val="41187D30"/>
     <w:multiLevelType w:val="hybridMultilevel"/>
     <w:tmpl w:val="EA5EB43A"/>
@@ -1168,7 +1318,7 @@
       </w:rPr>
     </w:lvl>
   </w:abstractNum>
-  <w:abstractNum w:abstractNumId="3" w15:restartNumberingAfterBreak="0">
+  <w:abstractNum w:abstractNumId="4" w15:restartNumberingAfterBreak="0">
     <w:nsid w:val="5C0C7049"/>
     <w:multiLevelType w:val="hybridMultilevel"/>
     <w:tmpl w:val="E0EC6138"/>
@@ -1281,7 +1431,7 @@
       </w:rPr>
     </w:lvl>
   </w:abstractNum>
-  <w:abstractNum w:abstractNumId="4" w15:restartNumberingAfterBreak="0">
+  <w:abstractNum w:abstractNumId="5" w15:restartNumberingAfterBreak="0">
     <w:nsid w:val="5DA55689"/>
     <w:multiLevelType w:val="hybridMultilevel"/>
     <w:tmpl w:val="0A525742"/>
@@ -1394,7 +1544,7 @@
       </w:rPr>
     </w:lvl>
   </w:abstractNum>
-  <w:abstractNum w:abstractNumId="5" w15:restartNumberingAfterBreak="0">
+  <w:abstractNum w:abstractNumId="6" w15:restartNumberingAfterBreak="0">
     <w:nsid w:val="61DE4327"/>
     <w:multiLevelType w:val="multilevel"/>
     <w:tmpl w:val="F5E87F82"/>
@@ -1544,22 +1694,25 @@
     </w:lvl>
   </w:abstractNum>
   <w:num w:numId="1" w16cid:durableId="686248213">
+    <w:abstractNumId w:val="5"/>
+  </w:num>
+  <w:num w:numId="2" w16cid:durableId="805394223">
     <w:abstractNumId w:val="4"/>
   </w:num>
-  <w:num w:numId="2" w16cid:durableId="805394223">
+  <w:num w:numId="3" w16cid:durableId="1326520074">
+    <w:abstractNumId w:val="1"/>
+  </w:num>
+  <w:num w:numId="4" w16cid:durableId="1552691628">
     <w:abstractNumId w:val="3"/>
   </w:num>
-  <w:num w:numId="3" w16cid:durableId="1326520074">
-    <w:abstractNumId w:val="0"/>
-  </w:num>
-  <w:num w:numId="4" w16cid:durableId="1552691628">
+  <w:num w:numId="5" w16cid:durableId="285432705">
     <w:abstractNumId w:val="2"/>
   </w:num>
-  <w:num w:numId="5" w16cid:durableId="285432705">
-    <w:abstractNumId w:val="1"/>
+  <w:num w:numId="6" w16cid:durableId="115032699">
+    <w:abstractNumId w:val="6"/>
   </w:num>
-  <w:num w:numId="6" w16cid:durableId="115032699">
-    <w:abstractNumId w:val="5"/>
+  <w:num w:numId="7" w16cid:durableId="358437463">
+    <w:abstractNumId w:val="0"/>
   </w:num>
 </w:numbering>
 </file>

</xml_diff>

<commit_message>
Practicing how to design data for future project, updated documentation.
</commit_message>
<xml_diff>
--- a/documentation/da-gym-doumentation .docx
+++ b/documentation/da-gym-doumentation .docx
@@ -12,15 +12,407 @@
         <w:rPr>
           <w:u w:val="single"/>
         </w:rPr>
-        <w:t>/</w:t>
-      </w:r>
-      <w:r>
+        <w:t xml:space="preserve">Data Analytics Gym – Documentation </w:t>
+      </w:r>
+    </w:p>
+    <w:p>
+      <w:pPr>
         <w:rPr>
           <w:u w:val="single"/>
         </w:rPr>
-        <w:t xml:space="preserve">Data Analytics Gym – Documentation </w:t>
-      </w:r>
-    </w:p>
+      </w:pPr>
+      <w:r>
+        <w:rPr>
+          <w:u w:val="single"/>
+        </w:rPr>
+        <w:t>9/15/2026</w:t>
+      </w:r>
+    </w:p>
+    <w:p>
+      <w:r>
+        <w:t>Getting in reps for designing data for Life CC:</w:t>
+      </w:r>
+    </w:p>
+    <w:p>
+      <w:pPr>
+        <w:pStyle w:val="ListParagraph"/>
+        <w:numPr>
+          <w:ilvl w:val="0"/>
+          <w:numId w:val="8"/>
+        </w:numPr>
+      </w:pPr>
+      <w:r>
+        <w:t xml:space="preserve">What business/user question are we </w:t>
+      </w:r>
+      <w:proofErr w:type="gramStart"/>
+      <w:r>
+        <w:t>actually trying</w:t>
+      </w:r>
+      <w:proofErr w:type="gramEnd"/>
+      <w:r>
+        <w:t xml:space="preserve"> to answer? </w:t>
+      </w:r>
+    </w:p>
+    <w:p>
+      <w:pPr>
+        <w:pStyle w:val="ListParagraph"/>
+        <w:numPr>
+          <w:ilvl w:val="1"/>
+          <w:numId w:val="8"/>
+        </w:numPr>
+      </w:pPr>
+      <w:r>
+        <w:t>How to combine the two things my father prioritizes in his life: financial and physical health, and showcase an overview of progress and goals? Furthermore, how can we design it so that, when my dad interacts with the app, it would create a sense meaningful work and purpose?</w:t>
+      </w:r>
+    </w:p>
+    <w:p>
+      <w:pPr>
+        <w:pStyle w:val="ListParagraph"/>
+        <w:numPr>
+          <w:ilvl w:val="0"/>
+          <w:numId w:val="8"/>
+        </w:numPr>
+      </w:pPr>
+      <w:r>
+        <w:t>What metric or metrics would matter?</w:t>
+      </w:r>
+    </w:p>
+    <w:p>
+      <w:pPr>
+        <w:pStyle w:val="ListParagraph"/>
+        <w:numPr>
+          <w:ilvl w:val="1"/>
+          <w:numId w:val="8"/>
+        </w:numPr>
+      </w:pPr>
+      <w:r>
+        <w:t xml:space="preserve"> </w:t>
+      </w:r>
+      <w:r>
+        <w:t>Total income, expenses and debt</w:t>
+      </w:r>
+    </w:p>
+    <w:p>
+      <w:pPr>
+        <w:pStyle w:val="ListParagraph"/>
+        <w:numPr>
+          <w:ilvl w:val="1"/>
+          <w:numId w:val="8"/>
+        </w:numPr>
+      </w:pPr>
+      <w:r>
+        <w:t xml:space="preserve">Count days of exercise </w:t>
+      </w:r>
+    </w:p>
+    <w:p>
+      <w:pPr>
+        <w:pStyle w:val="ListParagraph"/>
+        <w:numPr>
+          <w:ilvl w:val="1"/>
+          <w:numId w:val="8"/>
+        </w:numPr>
+      </w:pPr>
+      <w:r>
+        <w:t>Average sleep per week</w:t>
+      </w:r>
+    </w:p>
+    <w:p>
+      <w:pPr>
+        <w:pStyle w:val="ListParagraph"/>
+        <w:numPr>
+          <w:ilvl w:val="1"/>
+          <w:numId w:val="8"/>
+        </w:numPr>
+      </w:pPr>
+      <w:r>
+        <w:t xml:space="preserve">Calories per day | count of macronutrients consumed daily | days adherence to MyPlate method of eating </w:t>
+      </w:r>
+    </w:p>
+    <w:p>
+      <w:pPr>
+        <w:pStyle w:val="ListParagraph"/>
+        <w:numPr>
+          <w:ilvl w:val="1"/>
+          <w:numId w:val="8"/>
+        </w:numPr>
+      </w:pPr>
+      <w:r>
+        <w:t xml:space="preserve">Count of bills paid for the month  </w:t>
+      </w:r>
+    </w:p>
+    <w:p>
+      <w:pPr>
+        <w:pStyle w:val="ListParagraph"/>
+        <w:ind w:left="1440"/>
+      </w:pPr>
+    </w:p>
+    <w:p>
+      <w:pPr>
+        <w:pStyle w:val="ListParagraph"/>
+        <w:numPr>
+          <w:ilvl w:val="0"/>
+          <w:numId w:val="8"/>
+        </w:numPr>
+      </w:pPr>
+      <w:r>
+        <w:t>What raw fields would we need to collect?</w:t>
+      </w:r>
+    </w:p>
+    <w:p>
+      <w:pPr>
+        <w:pStyle w:val="ListParagraph"/>
+        <w:numPr>
+          <w:ilvl w:val="1"/>
+          <w:numId w:val="8"/>
+        </w:numPr>
+      </w:pPr>
+      <w:r>
+        <w:t xml:space="preserve">Monthly bank statements </w:t>
+      </w:r>
+    </w:p>
+    <w:p>
+      <w:pPr>
+        <w:pStyle w:val="ListParagraph"/>
+        <w:numPr>
+          <w:ilvl w:val="1"/>
+          <w:numId w:val="8"/>
+        </w:numPr>
+      </w:pPr>
+      <w:r>
+        <w:t xml:space="preserve">Debt balances </w:t>
+      </w:r>
+    </w:p>
+    <w:p>
+      <w:pPr>
+        <w:pStyle w:val="ListParagraph"/>
+        <w:numPr>
+          <w:ilvl w:val="1"/>
+          <w:numId w:val="8"/>
+        </w:numPr>
+      </w:pPr>
+      <w:r>
+        <w:t xml:space="preserve">Lab reports from doctor’s appointments </w:t>
+      </w:r>
+    </w:p>
+    <w:p>
+      <w:pPr>
+        <w:pStyle w:val="ListParagraph"/>
+        <w:numPr>
+          <w:ilvl w:val="1"/>
+          <w:numId w:val="8"/>
+        </w:numPr>
+      </w:pPr>
+      <w:r>
+        <w:t xml:space="preserve">Bp </w:t>
+      </w:r>
+    </w:p>
+    <w:p>
+      <w:pPr>
+        <w:pStyle w:val="ListParagraph"/>
+        <w:numPr>
+          <w:ilvl w:val="1"/>
+          <w:numId w:val="8"/>
+        </w:numPr>
+      </w:pPr>
+      <w:r>
+        <w:t xml:space="preserve">Food </w:t>
+      </w:r>
+      <w:proofErr w:type="gramStart"/>
+      <w:r>
+        <w:t>log</w:t>
+      </w:r>
+      <w:proofErr w:type="gramEnd"/>
+      <w:r>
+        <w:t xml:space="preserve"> </w:t>
+      </w:r>
+    </w:p>
+    <w:p>
+      <w:pPr>
+        <w:pStyle w:val="ListParagraph"/>
+        <w:numPr>
+          <w:ilvl w:val="1"/>
+          <w:numId w:val="8"/>
+        </w:numPr>
+      </w:pPr>
+      <w:r>
+        <w:t xml:space="preserve">Apple watch activity: steps, calories burned, rings close rate </w:t>
+      </w:r>
+    </w:p>
+    <w:p>
+      <w:pPr>
+        <w:pStyle w:val="ListParagraph"/>
+        <w:numPr>
+          <w:ilvl w:val="1"/>
+          <w:numId w:val="8"/>
+        </w:numPr>
+      </w:pPr>
+      <w:r>
+        <w:t xml:space="preserve">Work outs </w:t>
+      </w:r>
+    </w:p>
+    <w:p>
+      <w:pPr>
+        <w:pStyle w:val="ListParagraph"/>
+        <w:numPr>
+          <w:ilvl w:val="1"/>
+          <w:numId w:val="8"/>
+        </w:numPr>
+      </w:pPr>
+      <w:r>
+        <w:t xml:space="preserve">Sleep </w:t>
+      </w:r>
+      <w:proofErr w:type="gramStart"/>
+      <w:r>
+        <w:t>log</w:t>
+      </w:r>
+      <w:proofErr w:type="gramEnd"/>
+      <w:r>
+        <w:t xml:space="preserve"> </w:t>
+      </w:r>
+    </w:p>
+    <w:p>
+      <w:pPr>
+        <w:pStyle w:val="ListParagraph"/>
+        <w:numPr>
+          <w:ilvl w:val="2"/>
+          <w:numId w:val="8"/>
+        </w:numPr>
+      </w:pPr>
+      <w:r>
+        <w:t>Correction:</w:t>
+      </w:r>
+    </w:p>
+    <w:p>
+      <w:pPr>
+        <w:pStyle w:val="ListParagraph"/>
+        <w:numPr>
+          <w:ilvl w:val="3"/>
+          <w:numId w:val="8"/>
+        </w:numPr>
+      </w:pPr>
+      <w:proofErr w:type="spellStart"/>
+      <w:r>
+        <w:t>transaction_date</w:t>
+      </w:r>
+      <w:proofErr w:type="spellEnd"/>
+      <w:r>
+        <w:t xml:space="preserve">, amount, category, </w:t>
+      </w:r>
+      <w:proofErr w:type="spellStart"/>
+      <w:r>
+        <w:t>systolic_bp</w:t>
+      </w:r>
+      <w:proofErr w:type="spellEnd"/>
+      <w:r>
+        <w:t xml:space="preserve">, </w:t>
+      </w:r>
+      <w:proofErr w:type="spellStart"/>
+      <w:r>
+        <w:t>diastolic_bp</w:t>
+      </w:r>
+      <w:proofErr w:type="spellEnd"/>
+      <w:r>
+        <w:t xml:space="preserve">, </w:t>
+      </w:r>
+      <w:proofErr w:type="spellStart"/>
+      <w:r>
+        <w:t>lab_test_name</w:t>
+      </w:r>
+      <w:proofErr w:type="spellEnd"/>
+      <w:r>
+        <w:t xml:space="preserve">, </w:t>
+      </w:r>
+      <w:proofErr w:type="spellStart"/>
+      <w:r>
+        <w:t>lab_value</w:t>
+      </w:r>
+      <w:proofErr w:type="spellEnd"/>
+    </w:p>
+    <w:p>
+      <w:pPr>
+        <w:pStyle w:val="ListParagraph"/>
+        <w:numPr>
+          <w:ilvl w:val="0"/>
+          <w:numId w:val="8"/>
+        </w:numPr>
+      </w:pPr>
+      <w:r>
+        <w:t xml:space="preserve">What would the grain of the exercise data </w:t>
+      </w:r>
+      <w:proofErr w:type="gramStart"/>
+      <w:r>
+        <w:t>be</w:t>
+      </w:r>
+      <w:proofErr w:type="gramEnd"/>
+      <w:r>
+        <w:t>?</w:t>
+      </w:r>
+    </w:p>
+    <w:p>
+      <w:pPr>
+        <w:pStyle w:val="ListParagraph"/>
+        <w:numPr>
+          <w:ilvl w:val="1"/>
+          <w:numId w:val="8"/>
+        </w:numPr>
+      </w:pPr>
+      <w:r>
+        <w:t xml:space="preserve">One row per day or one row per </w:t>
+      </w:r>
+      <w:r>
+        <w:t>workout session</w:t>
+      </w:r>
+    </w:p>
+    <w:p>
+      <w:pPr>
+        <w:pStyle w:val="ListParagraph"/>
+        <w:numPr>
+          <w:ilvl w:val="0"/>
+          <w:numId w:val="8"/>
+        </w:numPr>
+      </w:pPr>
+      <w:r>
+        <w:t xml:space="preserve">What entity or entities do you think exist? </w:t>
+      </w:r>
+    </w:p>
+    <w:p>
+      <w:pPr>
+        <w:pStyle w:val="ListParagraph"/>
+        <w:numPr>
+          <w:ilvl w:val="1"/>
+          <w:numId w:val="8"/>
+        </w:numPr>
+      </w:pPr>
+      <w:r>
+        <w:t>I want to say there’s just one entity: my dad. But I’m not sure. Maybe: health, finances, so then two entities?</w:t>
+      </w:r>
+    </w:p>
+    <w:p>
+      <w:pPr>
+        <w:pStyle w:val="ListParagraph"/>
+        <w:numPr>
+          <w:ilvl w:val="0"/>
+          <w:numId w:val="8"/>
+        </w:numPr>
+      </w:pPr>
+      <w:r>
+        <w:t>Would you store everything in one table, or do you already see a reason for multiple tables?</w:t>
+      </w:r>
+    </w:p>
+    <w:p>
+      <w:pPr>
+        <w:pStyle w:val="ListParagraph"/>
+        <w:numPr>
+          <w:ilvl w:val="1"/>
+          <w:numId w:val="8"/>
+        </w:numPr>
+      </w:pPr>
+      <w:r>
+        <w:lastRenderedPageBreak/>
+        <w:t>I see multiple tables: income/expenses, debt, lab results, food log, exercise log, and sleep log</w:t>
+      </w:r>
+    </w:p>
+    <w:p/>
     <w:p>
       <w:pPr>
         <w:rPr>
@@ -278,7 +670,13 @@
     <w:p>
       <w:r>
         <w:lastRenderedPageBreak/>
-        <w:t>When I started doing DoorDash, I wanted to find a way to earn more money in less time while also reducing unnecessary mileage and gas costs. The goal was really to work smarter, not harder.</w:t>
+        <w:t xml:space="preserve">When I started doing DoorDash, I wanted to find a way to earn more money in less time while also reducing unnecessary mileage and gas costs. </w:t>
+      </w:r>
+      <w:r>
+        <w:t xml:space="preserve">So essentially, </w:t>
+      </w:r>
+      <w:r>
+        <w:t>work smarter, not harder.</w:t>
       </w:r>
     </w:p>
     <w:p>
@@ -307,7 +705,17 @@
     </w:p>
     <w:p>
       <w:r>
-        <w:t>What I liked about that project was that it showed me how useful even simple data can be when it’s tied to a clear business question and a decision.</w:t>
+        <w:t xml:space="preserve">What I liked about that project was that it showed me how </w:t>
+      </w:r>
+      <w:r>
+        <w:rPr>
+          <w:b/>
+          <w:bCs/>
+        </w:rPr>
+        <w:t>useful</w:t>
+      </w:r>
+      <w:r>
+        <w:t xml:space="preserve"> even simple data can be when it’s tied to a clear business question and a decision.</w:t>
       </w:r>
     </w:p>
     <w:p>
@@ -980,6 +1388,119 @@
     </w:lvl>
   </w:abstractNum>
   <w:abstractNum w:abstractNumId="1" w15:restartNumberingAfterBreak="0">
+    <w:nsid w:val="0C7340B1"/>
+    <w:multiLevelType w:val="hybridMultilevel"/>
+    <w:tmpl w:val="EEEA04E8"/>
+    <w:lvl w:ilvl="0" w:tplc="04090001">
+      <w:start w:val="1"/>
+      <w:numFmt w:val="bullet"/>
+      <w:lvlText w:val=""/>
+      <w:lvlJc w:val="left"/>
+      <w:pPr>
+        <w:ind w:left="720" w:hanging="360"/>
+      </w:pPr>
+      <w:rPr>
+        <w:rFonts w:ascii="Symbol" w:hAnsi="Symbol" w:hint="default"/>
+      </w:rPr>
+    </w:lvl>
+    <w:lvl w:ilvl="1" w:tplc="04090003">
+      <w:start w:val="1"/>
+      <w:numFmt w:val="bullet"/>
+      <w:lvlText w:val="o"/>
+      <w:lvlJc w:val="left"/>
+      <w:pPr>
+        <w:ind w:left="1440" w:hanging="360"/>
+      </w:pPr>
+      <w:rPr>
+        <w:rFonts w:ascii="Courier New" w:hAnsi="Courier New" w:cs="Courier New" w:hint="default"/>
+      </w:rPr>
+    </w:lvl>
+    <w:lvl w:ilvl="2" w:tplc="04090005">
+      <w:start w:val="1"/>
+      <w:numFmt w:val="bullet"/>
+      <w:lvlText w:val=""/>
+      <w:lvlJc w:val="left"/>
+      <w:pPr>
+        <w:ind w:left="2160" w:hanging="360"/>
+      </w:pPr>
+      <w:rPr>
+        <w:rFonts w:ascii="Wingdings" w:hAnsi="Wingdings" w:hint="default"/>
+      </w:rPr>
+    </w:lvl>
+    <w:lvl w:ilvl="3" w:tplc="04090001">
+      <w:start w:val="1"/>
+      <w:numFmt w:val="bullet"/>
+      <w:lvlText w:val=""/>
+      <w:lvlJc w:val="left"/>
+      <w:pPr>
+        <w:ind w:left="2880" w:hanging="360"/>
+      </w:pPr>
+      <w:rPr>
+        <w:rFonts w:ascii="Symbol" w:hAnsi="Symbol" w:hint="default"/>
+      </w:rPr>
+    </w:lvl>
+    <w:lvl w:ilvl="4" w:tplc="04090003" w:tentative="1">
+      <w:start w:val="1"/>
+      <w:numFmt w:val="bullet"/>
+      <w:lvlText w:val="o"/>
+      <w:lvlJc w:val="left"/>
+      <w:pPr>
+        <w:ind w:left="3600" w:hanging="360"/>
+      </w:pPr>
+      <w:rPr>
+        <w:rFonts w:ascii="Courier New" w:hAnsi="Courier New" w:cs="Courier New" w:hint="default"/>
+      </w:rPr>
+    </w:lvl>
+    <w:lvl w:ilvl="5" w:tplc="04090005" w:tentative="1">
+      <w:start w:val="1"/>
+      <w:numFmt w:val="bullet"/>
+      <w:lvlText w:val=""/>
+      <w:lvlJc w:val="left"/>
+      <w:pPr>
+        <w:ind w:left="4320" w:hanging="360"/>
+      </w:pPr>
+      <w:rPr>
+        <w:rFonts w:ascii="Wingdings" w:hAnsi="Wingdings" w:hint="default"/>
+      </w:rPr>
+    </w:lvl>
+    <w:lvl w:ilvl="6" w:tplc="04090001" w:tentative="1">
+      <w:start w:val="1"/>
+      <w:numFmt w:val="bullet"/>
+      <w:lvlText w:val=""/>
+      <w:lvlJc w:val="left"/>
+      <w:pPr>
+        <w:ind w:left="5040" w:hanging="360"/>
+      </w:pPr>
+      <w:rPr>
+        <w:rFonts w:ascii="Symbol" w:hAnsi="Symbol" w:hint="default"/>
+      </w:rPr>
+    </w:lvl>
+    <w:lvl w:ilvl="7" w:tplc="04090003" w:tentative="1">
+      <w:start w:val="1"/>
+      <w:numFmt w:val="bullet"/>
+      <w:lvlText w:val="o"/>
+      <w:lvlJc w:val="left"/>
+      <w:pPr>
+        <w:ind w:left="5760" w:hanging="360"/>
+      </w:pPr>
+      <w:rPr>
+        <w:rFonts w:ascii="Courier New" w:hAnsi="Courier New" w:cs="Courier New" w:hint="default"/>
+      </w:rPr>
+    </w:lvl>
+    <w:lvl w:ilvl="8" w:tplc="04090005" w:tentative="1">
+      <w:start w:val="1"/>
+      <w:numFmt w:val="bullet"/>
+      <w:lvlText w:val=""/>
+      <w:lvlJc w:val="left"/>
+      <w:pPr>
+        <w:ind w:left="6480" w:hanging="360"/>
+      </w:pPr>
+      <w:rPr>
+        <w:rFonts w:ascii="Wingdings" w:hAnsi="Wingdings" w:hint="default"/>
+      </w:rPr>
+    </w:lvl>
+  </w:abstractNum>
+  <w:abstractNum w:abstractNumId="2" w15:restartNumberingAfterBreak="0">
     <w:nsid w:val="1E473C7C"/>
     <w:multiLevelType w:val="hybridMultilevel"/>
     <w:tmpl w:val="588A0A06"/>
@@ -1092,7 +1613,7 @@
       </w:rPr>
     </w:lvl>
   </w:abstractNum>
-  <w:abstractNum w:abstractNumId="2" w15:restartNumberingAfterBreak="0">
+  <w:abstractNum w:abstractNumId="3" w15:restartNumberingAfterBreak="0">
     <w:nsid w:val="3505313F"/>
     <w:multiLevelType w:val="hybridMultilevel"/>
     <w:tmpl w:val="EC8A3396"/>
@@ -1205,7 +1726,7 @@
       </w:rPr>
     </w:lvl>
   </w:abstractNum>
-  <w:abstractNum w:abstractNumId="3" w15:restartNumberingAfterBreak="0">
+  <w:abstractNum w:abstractNumId="4" w15:restartNumberingAfterBreak="0">
     <w:nsid w:val="41187D30"/>
     <w:multiLevelType w:val="hybridMultilevel"/>
     <w:tmpl w:val="EA5EB43A"/>
@@ -1318,7 +1839,7 @@
       </w:rPr>
     </w:lvl>
   </w:abstractNum>
-  <w:abstractNum w:abstractNumId="4" w15:restartNumberingAfterBreak="0">
+  <w:abstractNum w:abstractNumId="5" w15:restartNumberingAfterBreak="0">
     <w:nsid w:val="5C0C7049"/>
     <w:multiLevelType w:val="hybridMultilevel"/>
     <w:tmpl w:val="E0EC6138"/>
@@ -1431,7 +1952,7 @@
       </w:rPr>
     </w:lvl>
   </w:abstractNum>
-  <w:abstractNum w:abstractNumId="5" w15:restartNumberingAfterBreak="0">
+  <w:abstractNum w:abstractNumId="6" w15:restartNumberingAfterBreak="0">
     <w:nsid w:val="5DA55689"/>
     <w:multiLevelType w:val="hybridMultilevel"/>
     <w:tmpl w:val="0A525742"/>
@@ -1544,7 +2065,7 @@
       </w:rPr>
     </w:lvl>
   </w:abstractNum>
-  <w:abstractNum w:abstractNumId="6" w15:restartNumberingAfterBreak="0">
+  <w:abstractNum w:abstractNumId="7" w15:restartNumberingAfterBreak="0">
     <w:nsid w:val="61DE4327"/>
     <w:multiLevelType w:val="multilevel"/>
     <w:tmpl w:val="F5E87F82"/>
@@ -1694,25 +2215,28 @@
     </w:lvl>
   </w:abstractNum>
   <w:num w:numId="1" w16cid:durableId="686248213">
+    <w:abstractNumId w:val="6"/>
+  </w:num>
+  <w:num w:numId="2" w16cid:durableId="805394223">
     <w:abstractNumId w:val="5"/>
   </w:num>
-  <w:num w:numId="2" w16cid:durableId="805394223">
+  <w:num w:numId="3" w16cid:durableId="1326520074">
+    <w:abstractNumId w:val="2"/>
+  </w:num>
+  <w:num w:numId="4" w16cid:durableId="1552691628">
     <w:abstractNumId w:val="4"/>
   </w:num>
-  <w:num w:numId="3" w16cid:durableId="1326520074">
-    <w:abstractNumId w:val="1"/>
-  </w:num>
-  <w:num w:numId="4" w16cid:durableId="1552691628">
+  <w:num w:numId="5" w16cid:durableId="285432705">
     <w:abstractNumId w:val="3"/>
   </w:num>
-  <w:num w:numId="5" w16cid:durableId="285432705">
-    <w:abstractNumId w:val="2"/>
-  </w:num>
   <w:num w:numId="6" w16cid:durableId="115032699">
-    <w:abstractNumId w:val="6"/>
+    <w:abstractNumId w:val="7"/>
   </w:num>
   <w:num w:numId="7" w16cid:durableId="358437463">
     <w:abstractNumId w:val="0"/>
+  </w:num>
+  <w:num w:numId="8" w16cid:durableId="2053381955">
+    <w:abstractNumId w:val="1"/>
   </w:num>
 </w:numbering>
 </file>

</xml_diff>

<commit_message>
Pracitce scenarios for analysis with a community service organization.
</commit_message>
<xml_diff>
--- a/documentation/da-gym-doumentation .docx
+++ b/documentation/da-gym-doumentation .docx
@@ -25,6 +25,525 @@
         <w:rPr>
           <w:u w:val="single"/>
         </w:rPr>
+        <w:t>9/16/2026</w:t>
+      </w:r>
+    </w:p>
+    <w:p>
+      <w:r>
+        <w:t xml:space="preserve">Today, we are pivoting and taking a different approach to my development </w:t>
+      </w:r>
+      <w:proofErr w:type="gramStart"/>
+      <w:r>
+        <w:t>in light of</w:t>
+      </w:r>
+      <w:proofErr w:type="gramEnd"/>
+      <w:r>
+        <w:t xml:space="preserve"> a new position I’d be starting in a couple weeks. </w:t>
+      </w:r>
+    </w:p>
+    <w:p>
+      <w:pPr>
+        <w:rPr>
+          <w:b/>
+          <w:bCs/>
+        </w:rPr>
+      </w:pPr>
+      <w:r>
+        <w:rPr>
+          <w:b/>
+          <w:bCs/>
+        </w:rPr>
+        <w:t>Operational Thinking Before Optimization</w:t>
+      </w:r>
+    </w:p>
+    <w:p>
+      <w:pPr>
+        <w:pStyle w:val="ListParagraph"/>
+        <w:numPr>
+          <w:ilvl w:val="0"/>
+          <w:numId w:val="9"/>
+        </w:numPr>
+      </w:pPr>
+      <w:r>
+        <w:t xml:space="preserve">Before making changes to workflows or optimizing a process, FIRST understand </w:t>
+      </w:r>
+      <w:r>
+        <w:rPr>
+          <w:b/>
+          <w:bCs/>
+        </w:rPr>
+        <w:t xml:space="preserve">why </w:t>
+      </w:r>
+      <w:proofErr w:type="gramStart"/>
+      <w:r>
+        <w:rPr>
+          <w:b/>
+          <w:bCs/>
+        </w:rPr>
+        <w:t>did this</w:t>
+      </w:r>
+      <w:r>
+        <w:rPr>
+          <w:b/>
+          <w:bCs/>
+        </w:rPr>
+        <w:t xml:space="preserve"> exist</w:t>
+      </w:r>
+      <w:proofErr w:type="gramEnd"/>
+      <w:r>
+        <w:rPr>
+          <w:b/>
+          <w:bCs/>
+        </w:rPr>
+        <w:t xml:space="preserve"> in the first place.</w:t>
+      </w:r>
+    </w:p>
+    <w:p>
+      <w:pPr>
+        <w:pStyle w:val="ListParagraph"/>
+        <w:numPr>
+          <w:ilvl w:val="1"/>
+          <w:numId w:val="9"/>
+        </w:numPr>
+      </w:pPr>
+      <w:r>
+        <w:t>Therefore, when evaluating</w:t>
+      </w:r>
+      <w:r>
+        <w:t xml:space="preserve"> operations ask: </w:t>
+      </w:r>
+      <w:r>
+        <w:rPr>
+          <w:b/>
+          <w:bCs/>
+        </w:rPr>
+        <w:t xml:space="preserve">How does this </w:t>
+      </w:r>
+      <w:proofErr w:type="gramStart"/>
+      <w:r>
+        <w:rPr>
+          <w:b/>
+          <w:bCs/>
+        </w:rPr>
+        <w:t>actually work</w:t>
+      </w:r>
+      <w:proofErr w:type="gramEnd"/>
+      <w:r>
+        <w:rPr>
+          <w:b/>
+          <w:bCs/>
+        </w:rPr>
+        <w:t>?</w:t>
+      </w:r>
+    </w:p>
+    <w:p/>
+    <w:p>
+      <w:pPr>
+        <w:rPr>
+          <w:u w:val="single"/>
+        </w:rPr>
+      </w:pPr>
+      <w:r>
+        <w:rPr>
+          <w:u w:val="single"/>
+        </w:rPr>
+        <w:t xml:space="preserve">Use this </w:t>
+      </w:r>
+      <w:r>
+        <w:rPr>
+          <w:u w:val="single"/>
+        </w:rPr>
+        <w:t>framework</w:t>
+      </w:r>
+      <w:r>
+        <w:rPr>
+          <w:u w:val="single"/>
+        </w:rPr>
+        <w:t xml:space="preserve"> as</w:t>
+      </w:r>
+      <w:r>
+        <w:rPr>
+          <w:u w:val="single"/>
+        </w:rPr>
+        <w:t xml:space="preserve"> a general way to evaluate operational workflows/processes</w:t>
+      </w:r>
+      <w:r>
+        <w:rPr>
+          <w:u w:val="single"/>
+        </w:rPr>
+        <w:t>:</w:t>
+      </w:r>
+    </w:p>
+    <w:p>
+      <w:r>
+        <w:rPr>
+          <w:b/>
+          <w:bCs/>
+        </w:rPr>
+        <w:t>Input:</w:t>
+      </w:r>
+      <w:r>
+        <w:t xml:space="preserve"> What starts the work?</w:t>
+      </w:r>
+    </w:p>
+    <w:p>
+      <w:r>
+        <w:rPr>
+          <w:b/>
+          <w:bCs/>
+        </w:rPr>
+        <w:t>Process:</w:t>
+      </w:r>
+      <w:r>
+        <w:t xml:space="preserve"> What happens to the request?</w:t>
+      </w:r>
+    </w:p>
+    <w:p>
+      <w:r>
+        <w:rPr>
+          <w:b/>
+          <w:bCs/>
+        </w:rPr>
+        <w:t>Handoff:</w:t>
+      </w:r>
+      <w:r>
+        <w:t xml:space="preserve"> Who or what receives it next?</w:t>
+      </w:r>
+    </w:p>
+    <w:p>
+      <w:r>
+        <w:rPr>
+          <w:b/>
+          <w:bCs/>
+        </w:rPr>
+        <w:t>Output:</w:t>
+      </w:r>
+      <w:r>
+        <w:t xml:space="preserve"> What does "</w:t>
+      </w:r>
+      <w:proofErr w:type="gramStart"/>
+      <w:r>
+        <w:t>finished</w:t>
+      </w:r>
+      <w:proofErr w:type="gramEnd"/>
+      <w:r>
+        <w:t xml:space="preserve">" </w:t>
+      </w:r>
+      <w:proofErr w:type="gramStart"/>
+      <w:r>
+        <w:t>actually mean</w:t>
+      </w:r>
+      <w:proofErr w:type="gramEnd"/>
+      <w:r>
+        <w:t>?</w:t>
+      </w:r>
+    </w:p>
+    <w:p>
+      <w:r>
+        <w:rPr>
+          <w:b/>
+          <w:bCs/>
+        </w:rPr>
+        <w:t>Measurement:</w:t>
+      </w:r>
+      <w:r>
+        <w:t xml:space="preserve"> How would we know whether the process is working well?</w:t>
+      </w:r>
+    </w:p>
+    <w:p/>
+    <w:p>
+      <w:r>
+        <w:t xml:space="preserve">The following is a Synthetic Scenario Exercise: </w:t>
+      </w:r>
+    </w:p>
+    <w:p>
+      <w:pPr>
+        <w:rPr>
+          <w:u w:val="single"/>
+        </w:rPr>
+      </w:pPr>
+      <w:r>
+        <w:rPr>
+          <w:u w:val="single"/>
+        </w:rPr>
+        <w:t xml:space="preserve">Mapping the Current State </w:t>
+      </w:r>
+    </w:p>
+    <w:p>
+      <w:r>
+        <w:t xml:space="preserve">Occasional complaints from partners that some requests take a long time. </w:t>
+      </w:r>
+    </w:p>
+    <w:p>
+      <w:r>
+        <w:t>Inp</w:t>
+      </w:r>
+      <w:r>
+        <w:t>ut:</w:t>
+      </w:r>
+      <w:r>
+        <w:t xml:space="preserve"> partner-emailed request within inbox</w:t>
+      </w:r>
+    </w:p>
+    <w:p>
+      <w:r>
+        <w:t>Process: a dedicated or any available employee notices the email (seems random not standardized/ regularly scanned) and manually enters request into a shared Excel tracker. After that, an organization’s info is reviewed in the database (2</w:t>
+      </w:r>
+      <w:r>
+        <w:rPr>
+          <w:vertAlign w:val="superscript"/>
+        </w:rPr>
+        <w:t>nd</w:t>
+      </w:r>
+      <w:r>
+        <w:t xml:space="preserve"> home for the same information). If there is mission information, an employee </w:t>
+      </w:r>
+      <w:proofErr w:type="gramStart"/>
+      <w:r>
+        <w:t>has to</w:t>
+      </w:r>
+      <w:proofErr w:type="gramEnd"/>
+      <w:r>
+        <w:t xml:space="preserve"> </w:t>
+      </w:r>
+      <w:proofErr w:type="gramStart"/>
+      <w:r>
+        <w:t>reach back</w:t>
+      </w:r>
+      <w:proofErr w:type="gramEnd"/>
+      <w:r>
+        <w:t xml:space="preserve"> out to partner for clarification; this back and forth potentially causes delays in updating partner information. After a response, there seems to not be a dedicated resolution because </w:t>
+      </w:r>
+      <w:r>
+        <w:t xml:space="preserve">sometimes the available employee will update the Excel or not (wtf, that’s </w:t>
+      </w:r>
+      <w:proofErr w:type="gramStart"/>
+      <w:r>
+        <w:t>there</w:t>
+      </w:r>
+      <w:proofErr w:type="gramEnd"/>
+      <w:r>
+        <w:t xml:space="preserve"> job). </w:t>
+      </w:r>
+    </w:p>
+    <w:p>
+      <w:r>
+        <w:t xml:space="preserve">Handoff: If changes require supervisor approval, staff must send a Teams message to super for review (an employee may or may not do this/ forgetful/ delayed request to super). </w:t>
+      </w:r>
+      <w:r>
+        <w:lastRenderedPageBreak/>
+        <w:t xml:space="preserve">Here’s what I don’t like: once a super reviews the request, they then </w:t>
+      </w:r>
+      <w:proofErr w:type="gramStart"/>
+      <w:r>
+        <w:t>have to</w:t>
+      </w:r>
+      <w:proofErr w:type="gramEnd"/>
+      <w:r>
+        <w:t xml:space="preserve"> message the employee back </w:t>
+      </w:r>
+      <w:r>
+        <w:t>for</w:t>
+      </w:r>
+      <w:r>
+        <w:t xml:space="preserve"> them to reach back out to the parter notifying completion of their update request. </w:t>
+      </w:r>
+    </w:p>
+    <w:p>
+      <w:r>
+        <w:t xml:space="preserve">Output: At the end of the month, the super must manually count completed rows in Excel to report completed request summary for the month. </w:t>
+      </w:r>
+      <w:r>
+        <w:t xml:space="preserve"> </w:t>
+      </w:r>
+    </w:p>
+    <w:p>
+      <w:r>
+        <w:t>Current Measurement: The only way to measure if the process was working well was if complaints about request-completion times were reduced.</w:t>
+      </w:r>
+    </w:p>
+    <w:p>
+      <w:r>
+        <w:t xml:space="preserve">There’s no tracker for how long requests </w:t>
+      </w:r>
+      <w:proofErr w:type="gramStart"/>
+      <w:r>
+        <w:t>are</w:t>
+      </w:r>
+      <w:proofErr w:type="gramEnd"/>
+      <w:r>
+        <w:t xml:space="preserve"> taking to process. That metric could be valuable in identifying bottle necks. </w:t>
+      </w:r>
+    </w:p>
+    <w:p>
+      <w:r>
+        <w:t>There must be a way to reduce time for repetitive manual data entries, keeping data in a centralized location versus having multiple versions of the same data (loss of data integrity), and a way to reduce dead space between handoffs for verifications.</w:t>
+      </w:r>
+    </w:p>
+    <w:p>
+      <w:pPr>
+        <w:rPr>
+          <w:u w:val="single"/>
+        </w:rPr>
+      </w:pPr>
+    </w:p>
+    <w:p>
+      <w:pPr>
+        <w:rPr>
+          <w:u w:val="single"/>
+        </w:rPr>
+      </w:pPr>
+      <w:r>
+        <w:rPr>
+          <w:u w:val="single"/>
+        </w:rPr>
+        <w:t xml:space="preserve">Diagnose Before Fixing </w:t>
+      </w:r>
+    </w:p>
+    <w:p>
+      <w:r>
+        <w:t xml:space="preserve">Is there a priority pipeline for the tasks we handle on a regular basis? </w:t>
+      </w:r>
+      <w:r>
+        <w:t xml:space="preserve">How would we define priority order? </w:t>
+      </w:r>
+      <w:proofErr w:type="gramStart"/>
+      <w:r>
+        <w:t>This</w:t>
+      </w:r>
+      <w:proofErr w:type="gramEnd"/>
+      <w:r>
+        <w:t xml:space="preserve"> would provide direct guidance on which tasks to prioritize. Every partner service representative would be trained </w:t>
+      </w:r>
+      <w:proofErr w:type="gramStart"/>
+      <w:r>
+        <w:t>on</w:t>
+      </w:r>
+      <w:proofErr w:type="gramEnd"/>
+      <w:r>
+        <w:t xml:space="preserve"> how to support partners. Therefore, anyone would be able to jump in and complete tasks. I would request that documentation be built </w:t>
+      </w:r>
+      <w:proofErr w:type="gramStart"/>
+      <w:r>
+        <w:t>in to</w:t>
+      </w:r>
+      <w:proofErr w:type="gramEnd"/>
+      <w:r>
+        <w:t xml:space="preserve"> daily tasks for transparency and clarity of work being done.</w:t>
+      </w:r>
+    </w:p>
+    <w:p>
+      <w:r>
+        <w:t xml:space="preserve">Is there a system to track completion of types of work we do on a regular basis? Identifying the average completion time could help locate inefficiencies and be the start to reducing prolonged wait times. </w:t>
+      </w:r>
+    </w:p>
+    <w:p>
+      <w:r>
+        <w:t xml:space="preserve">Is there a way to have one location where </w:t>
+      </w:r>
+      <w:proofErr w:type="gramStart"/>
+      <w:r>
+        <w:t>partners</w:t>
+      </w:r>
+      <w:proofErr w:type="gramEnd"/>
+      <w:r>
+        <w:t xml:space="preserve"> info can be inputted and stored? Reducing multiple locations of the duplicate data could reduce confusion, support data security and accurate records. </w:t>
+      </w:r>
+    </w:p>
+    <w:p>
+      <w:r>
+        <w:t xml:space="preserve">Can we design some sort of ticketing system to organize regular work? This way tasks can live in a central place instead of being spread across email threads and </w:t>
+      </w:r>
+      <w:proofErr w:type="gramStart"/>
+      <w:r>
+        <w:t>teams</w:t>
+      </w:r>
+      <w:proofErr w:type="gramEnd"/>
+      <w:r>
+        <w:t xml:space="preserve"> messages. Maybe Teams can be utilized more like Slack; making quicker reference to projects and ideas: can Teams be utilized the same way?</w:t>
+      </w:r>
+    </w:p>
+    <w:p>
+      <w:r>
+        <w:t>If things require supervisor approval, can they be batched and ranked and ordered by priority so that the super can have a systemized way to process work efficiently?</w:t>
+      </w:r>
+    </w:p>
+    <w:p/>
+    <w:p>
+      <w:pPr>
+        <w:rPr>
+          <w:u w:val="single"/>
+        </w:rPr>
+      </w:pPr>
+      <w:r>
+        <w:rPr>
+          <w:u w:val="single"/>
+        </w:rPr>
+        <w:lastRenderedPageBreak/>
+        <w:t>Importance of understanding and investigating a process before trying to improve it:</w:t>
+      </w:r>
+    </w:p>
+    <w:p>
+      <w:proofErr w:type="gramStart"/>
+      <w:r>
+        <w:t>we</w:t>
+      </w:r>
+      <w:proofErr w:type="gramEnd"/>
+      <w:r>
+        <w:t xml:space="preserve"> would want to provide relevant solutions instead of </w:t>
+      </w:r>
+      <w:proofErr w:type="gramStart"/>
+      <w:r>
+        <w:t>create</w:t>
+      </w:r>
+      <w:proofErr w:type="gramEnd"/>
+      <w:r>
+        <w:t xml:space="preserve"> unnecessary work for everyone. </w:t>
+      </w:r>
+      <w:proofErr w:type="gramStart"/>
+      <w:r>
+        <w:t>change</w:t>
+      </w:r>
+      <w:proofErr w:type="gramEnd"/>
+      <w:r>
+        <w:t xml:space="preserve"> can already be challenging, and </w:t>
+      </w:r>
+      <w:proofErr w:type="gramStart"/>
+      <w:r>
+        <w:t xml:space="preserve">if </w:t>
+      </w:r>
+      <w:proofErr w:type="spellStart"/>
+      <w:r>
+        <w:t>i</w:t>
+      </w:r>
+      <w:proofErr w:type="spellEnd"/>
+      <w:proofErr w:type="gramEnd"/>
+      <w:r>
+        <w:t xml:space="preserve"> propose solutions that create more problems that solve, that's very ineffective and bad for the team and clients. </w:t>
+      </w:r>
+    </w:p>
+    <w:p>
+      <w:pPr>
+        <w:pStyle w:val="ListParagraph"/>
+        <w:numPr>
+          <w:ilvl w:val="0"/>
+          <w:numId w:val="9"/>
+        </w:numPr>
+      </w:pPr>
+      <w:r>
+        <w:t>Understand and investigate the current process so that changes address the actual cause of a problem rather than an assumption. A good improvement should make the operation more effective without unnecessarily increasing workload, complexity, or friction for employees and partners.</w:t>
+      </w:r>
+    </w:p>
+    <w:p>
+      <w:pPr>
+        <w:rPr>
+          <w:u w:val="single"/>
+        </w:rPr>
+      </w:pPr>
+      <w:r>
+        <w:rPr>
+          <w:u w:val="single"/>
+        </w:rPr>
         <w:t>9/15/2026</w:t>
       </w:r>
     </w:p>
@@ -337,6 +856,7 @@
         </w:numPr>
       </w:pPr>
       <w:r>
+        <w:lastRenderedPageBreak/>
         <w:t xml:space="preserve">What would the grain of the exercise data </w:t>
       </w:r>
       <w:proofErr w:type="gramStart"/>
@@ -408,7 +928,6 @@
         </w:numPr>
       </w:pPr>
       <w:r>
-        <w:lastRenderedPageBreak/>
         <w:t>I see multiple tables: income/expenses, debt, lab results, food log, exercise log, and sleep log</w:t>
       </w:r>
     </w:p>
@@ -596,6 +1115,7 @@
           <w:b/>
           <w:bCs/>
         </w:rPr>
+        <w:lastRenderedPageBreak/>
         <w:t>Analysis:</w:t>
       </w:r>
       <w:r>
@@ -669,7 +1189,6 @@
     </w:p>
     <w:p>
       <w:r>
-        <w:lastRenderedPageBreak/>
         <w:t xml:space="preserve">When I started doing DoorDash, I wanted to find a way to earn more money in less time while also reducing unnecessary mileage and gas costs. </w:t>
       </w:r>
       <w:r>
@@ -793,6 +1312,7 @@
         <w:rPr>
           <w:u w:val="single"/>
         </w:rPr>
+        <w:lastRenderedPageBreak/>
         <w:t>9/12/2026</w:t>
       </w:r>
     </w:p>
@@ -865,7 +1385,6 @@
         <w:rPr>
           <w:u w:val="single"/>
         </w:rPr>
-        <w:lastRenderedPageBreak/>
         <w:t>9/11/2026</w:t>
       </w:r>
     </w:p>
@@ -1072,6 +1591,7 @@
         </w:numPr>
       </w:pPr>
       <w:r>
+        <w:lastRenderedPageBreak/>
         <w:t xml:space="preserve">Partition </w:t>
       </w:r>
       <w:proofErr w:type="gramStart"/>
@@ -1160,7 +1680,6 @@
       </w:pPr>
       <w:proofErr w:type="gramStart"/>
       <w:r>
-        <w:lastRenderedPageBreak/>
         <w:t>Rank(</w:t>
       </w:r>
       <w:proofErr w:type="gramEnd"/>
@@ -1840,6 +2359,119 @@
     </w:lvl>
   </w:abstractNum>
   <w:abstractNum w:abstractNumId="5" w15:restartNumberingAfterBreak="0">
+    <w:nsid w:val="562E5D3D"/>
+    <w:multiLevelType w:val="hybridMultilevel"/>
+    <w:tmpl w:val="19260D84"/>
+    <w:lvl w:ilvl="0" w:tplc="04090001">
+      <w:start w:val="1"/>
+      <w:numFmt w:val="bullet"/>
+      <w:lvlText w:val=""/>
+      <w:lvlJc w:val="left"/>
+      <w:pPr>
+        <w:ind w:left="720" w:hanging="360"/>
+      </w:pPr>
+      <w:rPr>
+        <w:rFonts w:ascii="Symbol" w:hAnsi="Symbol" w:hint="default"/>
+      </w:rPr>
+    </w:lvl>
+    <w:lvl w:ilvl="1" w:tplc="04090003">
+      <w:start w:val="1"/>
+      <w:numFmt w:val="bullet"/>
+      <w:lvlText w:val="o"/>
+      <w:lvlJc w:val="left"/>
+      <w:pPr>
+        <w:ind w:left="1440" w:hanging="360"/>
+      </w:pPr>
+      <w:rPr>
+        <w:rFonts w:ascii="Courier New" w:hAnsi="Courier New" w:cs="Courier New" w:hint="default"/>
+      </w:rPr>
+    </w:lvl>
+    <w:lvl w:ilvl="2" w:tplc="04090005" w:tentative="1">
+      <w:start w:val="1"/>
+      <w:numFmt w:val="bullet"/>
+      <w:lvlText w:val=""/>
+      <w:lvlJc w:val="left"/>
+      <w:pPr>
+        <w:ind w:left="2160" w:hanging="360"/>
+      </w:pPr>
+      <w:rPr>
+        <w:rFonts w:ascii="Wingdings" w:hAnsi="Wingdings" w:hint="default"/>
+      </w:rPr>
+    </w:lvl>
+    <w:lvl w:ilvl="3" w:tplc="04090001" w:tentative="1">
+      <w:start w:val="1"/>
+      <w:numFmt w:val="bullet"/>
+      <w:lvlText w:val=""/>
+      <w:lvlJc w:val="left"/>
+      <w:pPr>
+        <w:ind w:left="2880" w:hanging="360"/>
+      </w:pPr>
+      <w:rPr>
+        <w:rFonts w:ascii="Symbol" w:hAnsi="Symbol" w:hint="default"/>
+      </w:rPr>
+    </w:lvl>
+    <w:lvl w:ilvl="4" w:tplc="04090003" w:tentative="1">
+      <w:start w:val="1"/>
+      <w:numFmt w:val="bullet"/>
+      <w:lvlText w:val="o"/>
+      <w:lvlJc w:val="left"/>
+      <w:pPr>
+        <w:ind w:left="3600" w:hanging="360"/>
+      </w:pPr>
+      <w:rPr>
+        <w:rFonts w:ascii="Courier New" w:hAnsi="Courier New" w:cs="Courier New" w:hint="default"/>
+      </w:rPr>
+    </w:lvl>
+    <w:lvl w:ilvl="5" w:tplc="04090005" w:tentative="1">
+      <w:start w:val="1"/>
+      <w:numFmt w:val="bullet"/>
+      <w:lvlText w:val=""/>
+      <w:lvlJc w:val="left"/>
+      <w:pPr>
+        <w:ind w:left="4320" w:hanging="360"/>
+      </w:pPr>
+      <w:rPr>
+        <w:rFonts w:ascii="Wingdings" w:hAnsi="Wingdings" w:hint="default"/>
+      </w:rPr>
+    </w:lvl>
+    <w:lvl w:ilvl="6" w:tplc="04090001" w:tentative="1">
+      <w:start w:val="1"/>
+      <w:numFmt w:val="bullet"/>
+      <w:lvlText w:val=""/>
+      <w:lvlJc w:val="left"/>
+      <w:pPr>
+        <w:ind w:left="5040" w:hanging="360"/>
+      </w:pPr>
+      <w:rPr>
+        <w:rFonts w:ascii="Symbol" w:hAnsi="Symbol" w:hint="default"/>
+      </w:rPr>
+    </w:lvl>
+    <w:lvl w:ilvl="7" w:tplc="04090003" w:tentative="1">
+      <w:start w:val="1"/>
+      <w:numFmt w:val="bullet"/>
+      <w:lvlText w:val="o"/>
+      <w:lvlJc w:val="left"/>
+      <w:pPr>
+        <w:ind w:left="5760" w:hanging="360"/>
+      </w:pPr>
+      <w:rPr>
+        <w:rFonts w:ascii="Courier New" w:hAnsi="Courier New" w:cs="Courier New" w:hint="default"/>
+      </w:rPr>
+    </w:lvl>
+    <w:lvl w:ilvl="8" w:tplc="04090005" w:tentative="1">
+      <w:start w:val="1"/>
+      <w:numFmt w:val="bullet"/>
+      <w:lvlText w:val=""/>
+      <w:lvlJc w:val="left"/>
+      <w:pPr>
+        <w:ind w:left="6480" w:hanging="360"/>
+      </w:pPr>
+      <w:rPr>
+        <w:rFonts w:ascii="Wingdings" w:hAnsi="Wingdings" w:hint="default"/>
+      </w:rPr>
+    </w:lvl>
+  </w:abstractNum>
+  <w:abstractNum w:abstractNumId="6" w15:restartNumberingAfterBreak="0">
     <w:nsid w:val="5C0C7049"/>
     <w:multiLevelType w:val="hybridMultilevel"/>
     <w:tmpl w:val="E0EC6138"/>
@@ -1952,7 +2584,7 @@
       </w:rPr>
     </w:lvl>
   </w:abstractNum>
-  <w:abstractNum w:abstractNumId="6" w15:restartNumberingAfterBreak="0">
+  <w:abstractNum w:abstractNumId="7" w15:restartNumberingAfterBreak="0">
     <w:nsid w:val="5DA55689"/>
     <w:multiLevelType w:val="hybridMultilevel"/>
     <w:tmpl w:val="0A525742"/>
@@ -2065,7 +2697,7 @@
       </w:rPr>
     </w:lvl>
   </w:abstractNum>
-  <w:abstractNum w:abstractNumId="7" w15:restartNumberingAfterBreak="0">
+  <w:abstractNum w:abstractNumId="8" w15:restartNumberingAfterBreak="0">
     <w:nsid w:val="61DE4327"/>
     <w:multiLevelType w:val="multilevel"/>
     <w:tmpl w:val="F5E87F82"/>
@@ -2215,10 +2847,10 @@
     </w:lvl>
   </w:abstractNum>
   <w:num w:numId="1" w16cid:durableId="686248213">
-    <w:abstractNumId w:val="6"/>
+    <w:abstractNumId w:val="7"/>
   </w:num>
   <w:num w:numId="2" w16cid:durableId="805394223">
-    <w:abstractNumId w:val="5"/>
+    <w:abstractNumId w:val="6"/>
   </w:num>
   <w:num w:numId="3" w16cid:durableId="1326520074">
     <w:abstractNumId w:val="2"/>
@@ -2230,13 +2862,16 @@
     <w:abstractNumId w:val="3"/>
   </w:num>
   <w:num w:numId="6" w16cid:durableId="115032699">
-    <w:abstractNumId w:val="7"/>
+    <w:abstractNumId w:val="8"/>
   </w:num>
   <w:num w:numId="7" w16cid:durableId="358437463">
     <w:abstractNumId w:val="0"/>
   </w:num>
   <w:num w:numId="8" w16cid:durableId="2053381955">
     <w:abstractNumId w:val="1"/>
+  </w:num>
+  <w:num w:numId="9" w16cid:durableId="484008388">
+    <w:abstractNumId w:val="5"/>
   </w:num>
 </w:numbering>
 </file>

</xml_diff>

<commit_message>
Updated progress notes: flashcards for Python/Pandas and practiced scenario simulating issues within operations/ workflow issues.
</commit_message>
<xml_diff>
--- a/documentation/da-gym-doumentation .docx
+++ b/documentation/da-gym-doumentation .docx
@@ -25,20 +25,41 @@
         <w:rPr>
           <w:u w:val="single"/>
         </w:rPr>
+        <w:t>9/17/2026</w:t>
+      </w:r>
+    </w:p>
+    <w:p>
+      <w:r>
+        <w:t xml:space="preserve">Continued making flashcards with Python: using as a validator to SQL results. </w:t>
+      </w:r>
+    </w:p>
+    <w:p>
+      <w:r>
+        <w:t xml:space="preserve">Completed another round of simulated operational workflow/processes and how in regard to incomplete or missing items in a client’s delivery. </w:t>
+      </w:r>
+    </w:p>
+    <w:p>
+      <w:r>
+        <w:t xml:space="preserve">Input | Process | Handoff | Output | Measurement </w:t>
+      </w:r>
+    </w:p>
+    <w:p/>
+    <w:p>
+      <w:pPr>
+        <w:rPr>
+          <w:u w:val="single"/>
+        </w:rPr>
+      </w:pPr>
+      <w:r>
+        <w:rPr>
+          <w:u w:val="single"/>
+        </w:rPr>
         <w:t>9/16/2026</w:t>
       </w:r>
     </w:p>
     <w:p>
       <w:r>
-        <w:t xml:space="preserve">Today, we are pivoting and taking a different approach to my development </w:t>
-      </w:r>
-      <w:proofErr w:type="gramStart"/>
-      <w:r>
-        <w:t>in light of</w:t>
-      </w:r>
-      <w:proofErr w:type="gramEnd"/>
-      <w:r>
-        <w:t xml:space="preserve"> a new position I’d be starting in a couple weeks. </w:t>
+        <w:t xml:space="preserve">Today, we are pivoting and taking a different approach to my development in light of a new position I’d be starting in a couple weeks. </w:t>
       </w:r>
     </w:p>
     <w:p>
@@ -74,7 +95,6 @@
         </w:rPr>
         <w:t xml:space="preserve">why </w:t>
       </w:r>
-      <w:proofErr w:type="gramStart"/>
       <w:r>
         <w:rPr>
           <w:b/>
@@ -87,91 +107,104 @@
           <w:b/>
           <w:bCs/>
         </w:rPr>
-        <w:t xml:space="preserve"> exist</w:t>
-      </w:r>
-      <w:proofErr w:type="gramEnd"/>
+        <w:t xml:space="preserve"> exist in the first place.</w:t>
+      </w:r>
+    </w:p>
+    <w:p>
+      <w:pPr>
+        <w:pStyle w:val="ListParagraph"/>
+        <w:numPr>
+          <w:ilvl w:val="1"/>
+          <w:numId w:val="9"/>
+        </w:numPr>
+      </w:pPr>
+      <w:r>
+        <w:t>Therefore, when evaluating</w:t>
+      </w:r>
+      <w:r>
+        <w:t xml:space="preserve"> operations ask: </w:t>
+      </w:r>
       <w:r>
         <w:rPr>
           <w:b/>
           <w:bCs/>
         </w:rPr>
-        <w:t xml:space="preserve"> in the first place.</w:t>
-      </w:r>
-    </w:p>
-    <w:p>
-      <w:pPr>
-        <w:pStyle w:val="ListParagraph"/>
-        <w:numPr>
-          <w:ilvl w:val="1"/>
-          <w:numId w:val="9"/>
-        </w:numPr>
-      </w:pPr>
-      <w:r>
-        <w:t>Therefore, when evaluating</w:t>
-      </w:r>
-      <w:r>
-        <w:t xml:space="preserve"> operations ask: </w:t>
-      </w:r>
+        <w:t>How does this actually work?</w:t>
+      </w:r>
+    </w:p>
+    <w:p/>
+    <w:p/>
+    <w:p>
+      <w:pPr>
+        <w:rPr>
+          <w:u w:val="single"/>
+        </w:rPr>
+      </w:pPr>
+      <w:r>
+        <w:rPr>
+          <w:u w:val="single"/>
+        </w:rPr>
+        <w:t xml:space="preserve">Use this </w:t>
+      </w:r>
+      <w:r>
+        <w:rPr>
+          <w:u w:val="single"/>
+        </w:rPr>
+        <w:t>framework</w:t>
+      </w:r>
+      <w:r>
+        <w:rPr>
+          <w:u w:val="single"/>
+        </w:rPr>
+        <w:t xml:space="preserve"> as</w:t>
+      </w:r>
+      <w:r>
+        <w:rPr>
+          <w:u w:val="single"/>
+        </w:rPr>
+        <w:t xml:space="preserve"> a general way to evaluate operational workflows/processes</w:t>
+      </w:r>
+      <w:r>
+        <w:rPr>
+          <w:u w:val="single"/>
+        </w:rPr>
+        <w:t>:</w:t>
+      </w:r>
+    </w:p>
+    <w:p>
       <w:r>
         <w:rPr>
           <w:b/>
           <w:bCs/>
         </w:rPr>
-        <w:t xml:space="preserve">How does this </w:t>
-      </w:r>
-      <w:proofErr w:type="gramStart"/>
+        <w:t>Input:</w:t>
+      </w:r>
+      <w:r>
+        <w:t xml:space="preserve"> What starts the work?</w:t>
+      </w:r>
+    </w:p>
+    <w:p>
       <w:r>
         <w:rPr>
           <w:b/>
           <w:bCs/>
         </w:rPr>
-        <w:t>actually work</w:t>
-      </w:r>
-      <w:proofErr w:type="gramEnd"/>
+        <w:t>Process:</w:t>
+      </w:r>
+      <w:r>
+        <w:t xml:space="preserve"> What happens to the request?</w:t>
+      </w:r>
+    </w:p>
+    <w:p>
       <w:r>
         <w:rPr>
           <w:b/>
           <w:bCs/>
         </w:rPr>
-        <w:t>?</w:t>
-      </w:r>
-    </w:p>
-    <w:p/>
-    <w:p>
-      <w:pPr>
-        <w:rPr>
-          <w:u w:val="single"/>
-        </w:rPr>
-      </w:pPr>
-      <w:r>
-        <w:rPr>
-          <w:u w:val="single"/>
-        </w:rPr>
-        <w:t xml:space="preserve">Use this </w:t>
-      </w:r>
-      <w:r>
-        <w:rPr>
-          <w:u w:val="single"/>
-        </w:rPr>
-        <w:t>framework</w:t>
-      </w:r>
-      <w:r>
-        <w:rPr>
-          <w:u w:val="single"/>
-        </w:rPr>
-        <w:t xml:space="preserve"> as</w:t>
-      </w:r>
-      <w:r>
-        <w:rPr>
-          <w:u w:val="single"/>
-        </w:rPr>
-        <w:t xml:space="preserve"> a general way to evaluate operational workflows/processes</w:t>
-      </w:r>
-      <w:r>
-        <w:rPr>
-          <w:u w:val="single"/>
-        </w:rPr>
-        <w:t>:</w:t>
+        <w:t>Handoff:</w:t>
+      </w:r>
+      <w:r>
+        <w:t xml:space="preserve"> Who or what receives it next?</w:t>
       </w:r>
     </w:p>
     <w:p>
@@ -180,10 +213,10 @@
           <w:b/>
           <w:bCs/>
         </w:rPr>
-        <w:t>Input:</w:t>
-      </w:r>
-      <w:r>
-        <w:t xml:space="preserve"> What starts the work?</w:t>
+        <w:t>Output:</w:t>
+      </w:r>
+      <w:r>
+        <w:t xml:space="preserve"> What does "finished" actually mean?</w:t>
       </w:r>
     </w:p>
     <w:p>
@@ -192,876 +225,729 @@
           <w:b/>
           <w:bCs/>
         </w:rPr>
-        <w:t>Process:</w:t>
-      </w:r>
-      <w:r>
-        <w:t xml:space="preserve"> What happens to the request?</w:t>
-      </w:r>
-    </w:p>
-    <w:p>
+        <w:t>Measurement:</w:t>
+      </w:r>
+      <w:r>
+        <w:t xml:space="preserve"> How would we know whether the process is working well?</w:t>
+      </w:r>
+    </w:p>
+    <w:p/>
+    <w:p>
+      <w:r>
+        <w:t xml:space="preserve">The following is a Synthetic Scenario Exercise: </w:t>
+      </w:r>
+    </w:p>
+    <w:p>
+      <w:pPr>
+        <w:rPr>
+          <w:u w:val="single"/>
+        </w:rPr>
+      </w:pPr>
+      <w:r>
+        <w:rPr>
+          <w:u w:val="single"/>
+        </w:rPr>
+        <w:t xml:space="preserve">Mapping the Current State </w:t>
+      </w:r>
+    </w:p>
+    <w:p>
+      <w:r>
+        <w:t xml:space="preserve">Occasional complaints from partners that some requests take a long time. </w:t>
+      </w:r>
+    </w:p>
+    <w:p>
+      <w:r>
+        <w:t>Inp</w:t>
+      </w:r>
+      <w:r>
+        <w:t>ut:</w:t>
+      </w:r>
+      <w:r>
+        <w:t xml:space="preserve"> partner-emailed request within inbox</w:t>
+      </w:r>
+    </w:p>
+    <w:p>
+      <w:r>
+        <w:lastRenderedPageBreak/>
+        <w:t>Process: a dedicated or any available employee notices the email (seems random not standardized/ regularly scanned) and manually enters request into a shared Excel tracker. After that, an organization’s info is reviewed in the database (2</w:t>
+      </w:r>
+      <w:r>
+        <w:rPr>
+          <w:vertAlign w:val="superscript"/>
+        </w:rPr>
+        <w:t>nd</w:t>
+      </w:r>
+      <w:r>
+        <w:t xml:space="preserve"> home for the same information). If there is mission information, an employee has to reach back out to partner for clarification; this back and forth potentially causes delays in updating partner information. After a response, there seems to not be a dedicated resolution because </w:t>
+      </w:r>
+      <w:r>
+        <w:t xml:space="preserve">sometimes the available employee will update the Excel or not (wtf, that’s there job). </w:t>
+      </w:r>
+    </w:p>
+    <w:p>
+      <w:r>
+        <w:t xml:space="preserve">Handoff: If changes require supervisor approval, staff must send a Teams message to super for review (an employee may or may not do this/ forgetful/ delayed request to super). Here’s what I don’t like: once a super reviews the request, they then have to message the employee back </w:t>
+      </w:r>
+      <w:r>
+        <w:t>for</w:t>
+      </w:r>
+      <w:r>
+        <w:t xml:space="preserve"> them to reach back out to the parter notifying completion of their update request. </w:t>
+      </w:r>
+    </w:p>
+    <w:p>
+      <w:r>
+        <w:t xml:space="preserve">Output: At the end of the month, the super must manually count completed rows in Excel to report completed request summary for the month. </w:t>
+      </w:r>
+      <w:r>
+        <w:t xml:space="preserve"> </w:t>
+      </w:r>
+    </w:p>
+    <w:p>
+      <w:r>
+        <w:t>Current Measurement: The only way to measure if the process was working well was if complaints about request-completion times were reduced.</w:t>
+      </w:r>
+    </w:p>
+    <w:p>
+      <w:r>
+        <w:t xml:space="preserve">There’s no tracker for how long requests are taking to process. That metric could be valuable in identifying bottle necks. </w:t>
+      </w:r>
+    </w:p>
+    <w:p>
+      <w:r>
+        <w:t>There must be a way to reduce time for repetitive manual data entries, keeping data in a centralized location versus having multiple versions of the same data (loss of data integrity), and a way to reduce dead space between handoffs for verifications.</w:t>
+      </w:r>
+    </w:p>
+    <w:p>
+      <w:pPr>
+        <w:rPr>
+          <w:u w:val="single"/>
+        </w:rPr>
+      </w:pPr>
+    </w:p>
+    <w:p>
+      <w:pPr>
+        <w:rPr>
+          <w:u w:val="single"/>
+        </w:rPr>
+      </w:pPr>
+      <w:r>
+        <w:rPr>
+          <w:u w:val="single"/>
+        </w:rPr>
+        <w:t xml:space="preserve">Diagnose Before Fixing </w:t>
+      </w:r>
+    </w:p>
+    <w:p>
+      <w:r>
+        <w:t xml:space="preserve">Is there a priority pipeline for the tasks we handle on a regular basis? </w:t>
+      </w:r>
+      <w:r>
+        <w:t xml:space="preserve">How would we define priority order? </w:t>
+      </w:r>
+      <w:r>
+        <w:t>This</w:t>
+      </w:r>
+      <w:r>
+        <w:t xml:space="preserve"> would provide direct guidance on which tasks to prioritize. Every partner service representative would be trained on how to support partners. Therefore, anyone would be able to jump in and complete tasks. I would request that documentation be built in to daily tasks for transparency and clarity of work being done.</w:t>
+      </w:r>
+    </w:p>
+    <w:p>
+      <w:r>
+        <w:t xml:space="preserve">Is there a system to track completion of types of work we do on a regular basis? Identifying the average completion time could help locate inefficiencies and be the start to reducing prolonged wait times. </w:t>
+      </w:r>
+    </w:p>
+    <w:p>
+      <w:r>
+        <w:lastRenderedPageBreak/>
+        <w:t xml:space="preserve">Is there a way to have one location where partners info can be inputted and stored? Reducing multiple locations of the duplicate data could reduce confusion, support data security and accurate records. </w:t>
+      </w:r>
+    </w:p>
+    <w:p>
+      <w:r>
+        <w:t>Can we design some sort of ticketing system to organize regular work? This way tasks can live in a central place instead of being spread across email threads and teams messages. Maybe Teams can be utilized more like Slack; making quicker reference to projects and ideas: can Teams be utilized the same way?</w:t>
+      </w:r>
+    </w:p>
+    <w:p>
+      <w:r>
+        <w:t>If things require supervisor approval, can they be batched and ranked and ordered by priority so that the super can have a systemized way to process work efficiently?</w:t>
+      </w:r>
+    </w:p>
+    <w:p/>
+    <w:p>
+      <w:pPr>
+        <w:rPr>
+          <w:u w:val="single"/>
+        </w:rPr>
+      </w:pPr>
+      <w:r>
+        <w:rPr>
+          <w:u w:val="single"/>
+        </w:rPr>
+        <w:t>Importance of understanding and investigating a process before trying to improve it:</w:t>
+      </w:r>
+    </w:p>
+    <w:p>
+      <w:r>
+        <w:t xml:space="preserve">we would want to provide relevant solutions instead of create unnecessary work for everyone. change can already be challenging, and if </w:t>
+      </w:r>
+      <w:proofErr w:type="spellStart"/>
+      <w:r>
+        <w:t>i</w:t>
+      </w:r>
+      <w:proofErr w:type="spellEnd"/>
+      <w:r>
+        <w:t xml:space="preserve"> propose solutions that create more problems that solve, that's very ineffective and bad for the team and clients. </w:t>
+      </w:r>
+    </w:p>
+    <w:p>
+      <w:pPr>
+        <w:pStyle w:val="ListParagraph"/>
+        <w:numPr>
+          <w:ilvl w:val="0"/>
+          <w:numId w:val="9"/>
+        </w:numPr>
+      </w:pPr>
+      <w:r>
+        <w:t>Understand and investigate the current process so that changes address the actual cause of a problem rather than an assumption. A good improvement should make the operation more effective without unnecessarily increasing workload, complexity, or friction for employees and partners.</w:t>
+      </w:r>
+    </w:p>
+    <w:p>
+      <w:pPr>
+        <w:rPr>
+          <w:u w:val="single"/>
+        </w:rPr>
+      </w:pPr>
+      <w:r>
+        <w:rPr>
+          <w:u w:val="single"/>
+        </w:rPr>
+        <w:t>9/15/2026</w:t>
+      </w:r>
+    </w:p>
+    <w:p>
+      <w:r>
+        <w:t>Getting in reps for designing data for Life CC:</w:t>
+      </w:r>
+    </w:p>
+    <w:p>
+      <w:pPr>
+        <w:pStyle w:val="ListParagraph"/>
+        <w:numPr>
+          <w:ilvl w:val="0"/>
+          <w:numId w:val="8"/>
+        </w:numPr>
+      </w:pPr>
+      <w:r>
+        <w:t xml:space="preserve">What business/user question are we actually trying to answer? </w:t>
+      </w:r>
+    </w:p>
+    <w:p>
+      <w:pPr>
+        <w:pStyle w:val="ListParagraph"/>
+        <w:numPr>
+          <w:ilvl w:val="1"/>
+          <w:numId w:val="8"/>
+        </w:numPr>
+      </w:pPr>
+      <w:r>
+        <w:t>How to combine the two things my father prioritizes in his life: financial and physical health, and showcase an overview of progress and goals? Furthermore, how can we design it so that, when my dad interacts with the app, it would create a sense meaningful work and purpose?</w:t>
+      </w:r>
+    </w:p>
+    <w:p>
+      <w:pPr>
+        <w:pStyle w:val="ListParagraph"/>
+        <w:numPr>
+          <w:ilvl w:val="0"/>
+          <w:numId w:val="8"/>
+        </w:numPr>
+      </w:pPr>
+      <w:r>
+        <w:t>What metric or metrics would matter?</w:t>
+      </w:r>
+    </w:p>
+    <w:p>
+      <w:pPr>
+        <w:pStyle w:val="ListParagraph"/>
+        <w:numPr>
+          <w:ilvl w:val="1"/>
+          <w:numId w:val="8"/>
+        </w:numPr>
+      </w:pPr>
+      <w:r>
+        <w:t xml:space="preserve"> </w:t>
+      </w:r>
+      <w:r>
+        <w:t>Total income, expenses and debt</w:t>
+      </w:r>
+    </w:p>
+    <w:p>
+      <w:pPr>
+        <w:pStyle w:val="ListParagraph"/>
+        <w:numPr>
+          <w:ilvl w:val="1"/>
+          <w:numId w:val="8"/>
+        </w:numPr>
+      </w:pPr>
+      <w:r>
+        <w:t xml:space="preserve">Count days of exercise </w:t>
+      </w:r>
+    </w:p>
+    <w:p>
+      <w:pPr>
+        <w:pStyle w:val="ListParagraph"/>
+        <w:numPr>
+          <w:ilvl w:val="1"/>
+          <w:numId w:val="8"/>
+        </w:numPr>
+      </w:pPr>
+      <w:r>
+        <w:t>Average sleep per week</w:t>
+      </w:r>
+    </w:p>
+    <w:p>
+      <w:pPr>
+        <w:pStyle w:val="ListParagraph"/>
+        <w:numPr>
+          <w:ilvl w:val="1"/>
+          <w:numId w:val="8"/>
+        </w:numPr>
+      </w:pPr>
+      <w:r>
+        <w:t xml:space="preserve">Calories per day | count of macronutrients consumed daily | days adherence to MyPlate method of eating </w:t>
+      </w:r>
+    </w:p>
+    <w:p>
+      <w:pPr>
+        <w:pStyle w:val="ListParagraph"/>
+        <w:numPr>
+          <w:ilvl w:val="1"/>
+          <w:numId w:val="8"/>
+        </w:numPr>
+      </w:pPr>
+      <w:r>
+        <w:t xml:space="preserve">Count of bills paid for the month  </w:t>
+      </w:r>
+    </w:p>
+    <w:p>
+      <w:pPr>
+        <w:pStyle w:val="ListParagraph"/>
+        <w:ind w:left="1440"/>
+      </w:pPr>
+    </w:p>
+    <w:p>
+      <w:pPr>
+        <w:pStyle w:val="ListParagraph"/>
+        <w:numPr>
+          <w:ilvl w:val="0"/>
+          <w:numId w:val="8"/>
+        </w:numPr>
+      </w:pPr>
+      <w:r>
+        <w:lastRenderedPageBreak/>
+        <w:t>What raw fields would we need to collect?</w:t>
+      </w:r>
+    </w:p>
+    <w:p>
+      <w:pPr>
+        <w:pStyle w:val="ListParagraph"/>
+        <w:numPr>
+          <w:ilvl w:val="1"/>
+          <w:numId w:val="8"/>
+        </w:numPr>
+      </w:pPr>
+      <w:r>
+        <w:t xml:space="preserve">Monthly bank statements </w:t>
+      </w:r>
+    </w:p>
+    <w:p>
+      <w:pPr>
+        <w:pStyle w:val="ListParagraph"/>
+        <w:numPr>
+          <w:ilvl w:val="1"/>
+          <w:numId w:val="8"/>
+        </w:numPr>
+      </w:pPr>
+      <w:r>
+        <w:t xml:space="preserve">Debt balances </w:t>
+      </w:r>
+    </w:p>
+    <w:p>
+      <w:pPr>
+        <w:pStyle w:val="ListParagraph"/>
+        <w:numPr>
+          <w:ilvl w:val="1"/>
+          <w:numId w:val="8"/>
+        </w:numPr>
+      </w:pPr>
+      <w:r>
+        <w:t xml:space="preserve">Lab reports from doctor’s appointments </w:t>
+      </w:r>
+    </w:p>
+    <w:p>
+      <w:pPr>
+        <w:pStyle w:val="ListParagraph"/>
+        <w:numPr>
+          <w:ilvl w:val="1"/>
+          <w:numId w:val="8"/>
+        </w:numPr>
+      </w:pPr>
+      <w:r>
+        <w:t xml:space="preserve">Bp </w:t>
+      </w:r>
+    </w:p>
+    <w:p>
+      <w:pPr>
+        <w:pStyle w:val="ListParagraph"/>
+        <w:numPr>
+          <w:ilvl w:val="1"/>
+          <w:numId w:val="8"/>
+        </w:numPr>
+      </w:pPr>
+      <w:r>
+        <w:t xml:space="preserve">Food log </w:t>
+      </w:r>
+    </w:p>
+    <w:p>
+      <w:pPr>
+        <w:pStyle w:val="ListParagraph"/>
+        <w:numPr>
+          <w:ilvl w:val="1"/>
+          <w:numId w:val="8"/>
+        </w:numPr>
+      </w:pPr>
+      <w:r>
+        <w:t xml:space="preserve">Apple watch activity: steps, calories burned, rings close rate </w:t>
+      </w:r>
+    </w:p>
+    <w:p>
+      <w:pPr>
+        <w:pStyle w:val="ListParagraph"/>
+        <w:numPr>
+          <w:ilvl w:val="1"/>
+          <w:numId w:val="8"/>
+        </w:numPr>
+      </w:pPr>
+      <w:r>
+        <w:t xml:space="preserve">Work outs </w:t>
+      </w:r>
+    </w:p>
+    <w:p>
+      <w:pPr>
+        <w:pStyle w:val="ListParagraph"/>
+        <w:numPr>
+          <w:ilvl w:val="1"/>
+          <w:numId w:val="8"/>
+        </w:numPr>
+      </w:pPr>
+      <w:r>
+        <w:t>Sleep log</w:t>
+      </w:r>
+      <w:r>
+        <w:t xml:space="preserve"> </w:t>
+      </w:r>
+    </w:p>
+    <w:p>
+      <w:pPr>
+        <w:pStyle w:val="ListParagraph"/>
+        <w:numPr>
+          <w:ilvl w:val="2"/>
+          <w:numId w:val="8"/>
+        </w:numPr>
+      </w:pPr>
+      <w:r>
+        <w:t>Correction:</w:t>
+      </w:r>
+    </w:p>
+    <w:p>
+      <w:pPr>
+        <w:pStyle w:val="ListParagraph"/>
+        <w:numPr>
+          <w:ilvl w:val="3"/>
+          <w:numId w:val="8"/>
+        </w:numPr>
+      </w:pPr>
+      <w:proofErr w:type="spellStart"/>
+      <w:r>
+        <w:t>transaction_date</w:t>
+      </w:r>
+      <w:proofErr w:type="spellEnd"/>
+      <w:r>
+        <w:t xml:space="preserve">, amount, category, </w:t>
+      </w:r>
+      <w:proofErr w:type="spellStart"/>
+      <w:r>
+        <w:t>systolic_bp</w:t>
+      </w:r>
+      <w:proofErr w:type="spellEnd"/>
+      <w:r>
+        <w:t xml:space="preserve">, </w:t>
+      </w:r>
+      <w:proofErr w:type="spellStart"/>
+      <w:r>
+        <w:t>diastolic_bp</w:t>
+      </w:r>
+      <w:proofErr w:type="spellEnd"/>
+      <w:r>
+        <w:t xml:space="preserve">, </w:t>
+      </w:r>
+      <w:proofErr w:type="spellStart"/>
+      <w:r>
+        <w:t>lab_test_name</w:t>
+      </w:r>
+      <w:proofErr w:type="spellEnd"/>
+      <w:r>
+        <w:t xml:space="preserve">, </w:t>
+      </w:r>
+      <w:proofErr w:type="spellStart"/>
+      <w:r>
+        <w:t>lab_value</w:t>
+      </w:r>
+      <w:proofErr w:type="spellEnd"/>
+    </w:p>
+    <w:p>
+      <w:pPr>
+        <w:pStyle w:val="ListParagraph"/>
+        <w:numPr>
+          <w:ilvl w:val="0"/>
+          <w:numId w:val="8"/>
+        </w:numPr>
+      </w:pPr>
+      <w:r>
+        <w:t>What would the grain of the exercise data be?</w:t>
+      </w:r>
+    </w:p>
+    <w:p>
+      <w:pPr>
+        <w:pStyle w:val="ListParagraph"/>
+        <w:numPr>
+          <w:ilvl w:val="1"/>
+          <w:numId w:val="8"/>
+        </w:numPr>
+      </w:pPr>
+      <w:r>
+        <w:t xml:space="preserve">One row per day or one row per </w:t>
+      </w:r>
+      <w:r>
+        <w:t>workout session</w:t>
+      </w:r>
+    </w:p>
+    <w:p>
+      <w:pPr>
+        <w:pStyle w:val="ListParagraph"/>
+        <w:numPr>
+          <w:ilvl w:val="0"/>
+          <w:numId w:val="8"/>
+        </w:numPr>
+      </w:pPr>
+      <w:r>
+        <w:t xml:space="preserve">What entity or entities do you think exist? </w:t>
+      </w:r>
+    </w:p>
+    <w:p>
+      <w:pPr>
+        <w:pStyle w:val="ListParagraph"/>
+        <w:numPr>
+          <w:ilvl w:val="1"/>
+          <w:numId w:val="8"/>
+        </w:numPr>
+      </w:pPr>
+      <w:r>
+        <w:t>I want to say there’s just one entity: my dad. But I’m not sure. Maybe: health, finances, so then two entities?</w:t>
+      </w:r>
+    </w:p>
+    <w:p>
+      <w:pPr>
+        <w:pStyle w:val="ListParagraph"/>
+        <w:numPr>
+          <w:ilvl w:val="0"/>
+          <w:numId w:val="8"/>
+        </w:numPr>
+      </w:pPr>
+      <w:r>
+        <w:t>Would you store everything in one table, or do you already see a reason for multiple tables?</w:t>
+      </w:r>
+    </w:p>
+    <w:p>
+      <w:pPr>
+        <w:pStyle w:val="ListParagraph"/>
+        <w:numPr>
+          <w:ilvl w:val="1"/>
+          <w:numId w:val="8"/>
+        </w:numPr>
+      </w:pPr>
+      <w:r>
+        <w:t>I see multiple tables: income/expenses, debt, lab results, food log, exercise log, and sleep log</w:t>
+      </w:r>
+    </w:p>
+    <w:p/>
+    <w:p>
+      <w:pPr>
+        <w:rPr>
+          <w:u w:val="single"/>
+        </w:rPr>
+      </w:pPr>
+      <w:r>
+        <w:rPr>
+          <w:u w:val="single"/>
+        </w:rPr>
+        <w:t>9/14/2026</w:t>
+      </w:r>
+    </w:p>
+    <w:p>
+      <w:r>
+        <w:t>Continuing with SQL Drilling</w:t>
+      </w:r>
+      <w:r>
+        <w:t xml:space="preserve">: Group By vs Window Function. </w:t>
+      </w:r>
+    </w:p>
+    <w:p>
+      <w:r>
+        <w:t>Knowing when to use CTE vs Window Function:</w:t>
+      </w:r>
+    </w:p>
+    <w:p>
+      <w:pPr>
+        <w:numPr>
+          <w:ilvl w:val="0"/>
+          <w:numId w:val="6"/>
+        </w:numPr>
+      </w:pPr>
+      <w:r>
+        <w:t>Need to change grain first? Think CTE/subquery.</w:t>
+      </w:r>
+    </w:p>
+    <w:p>
+      <w:pPr>
+        <w:numPr>
+          <w:ilvl w:val="0"/>
+          <w:numId w:val="6"/>
+        </w:numPr>
+      </w:pPr>
+      <w:r>
+        <w:t>Need to keep the current grain and add context? Think window function.</w:t>
+      </w:r>
+    </w:p>
+    <w:p>
+      <w:r>
+        <w:t xml:space="preserve">Getting used to </w:t>
+      </w:r>
+      <w:r>
+        <w:t>decomposing the</w:t>
+      </w:r>
+      <w:r>
+        <w:t xml:space="preserve"> </w:t>
+      </w:r>
+      <w:r>
+        <w:t xml:space="preserve">business questions before starting with SQL; normally I would just start trying to write SQL to solve the business problem. </w:t>
+      </w:r>
+    </w:p>
+    <w:p>
+      <w:r>
+        <w:t xml:space="preserve">Now it’s like understanding a math problem fully and then hand-picking the concept or formula to solve the problem first.  </w:t>
+      </w:r>
+    </w:p>
+    <w:p>
+      <w:pPr>
+        <w:pStyle w:val="ListParagraph"/>
+        <w:numPr>
+          <w:ilvl w:val="0"/>
+          <w:numId w:val="7"/>
+        </w:numPr>
+      </w:pPr>
+      <w:r>
+        <w:lastRenderedPageBreak/>
+        <w:t>In SQL, that means decomposing the business question into grain, metrics, relationships, and required transformations before choosing the appropriate query logic.</w:t>
+      </w:r>
+    </w:p>
+    <w:p/>
+    <w:p>
+      <w:r>
+        <w:t xml:space="preserve"> </w:t>
+      </w:r>
+    </w:p>
+    <w:p>
+      <w:pPr>
+        <w:rPr>
+          <w:u w:val="single"/>
+        </w:rPr>
+      </w:pPr>
+      <w:r>
+        <w:rPr>
+          <w:u w:val="single"/>
+        </w:rPr>
+        <w:t>9/13/2026</w:t>
+      </w:r>
+    </w:p>
+    <w:p>
+      <w:r>
+        <w:t>Started with some join logic and difference between distinct and Group By in a CTE to achieve the same result</w:t>
+      </w:r>
+      <w:r>
+        <w:t xml:space="preserve">; CTE above/below average comparisons. </w:t>
+      </w:r>
+    </w:p>
+    <w:p>
+      <w:r>
+        <w:t>In telling stories to showcase my experiences, use this format:</w:t>
+      </w:r>
+    </w:p>
+    <w:p>
+      <w:pPr>
+        <w:pStyle w:val="ListParagraph"/>
+        <w:numPr>
+          <w:ilvl w:val="0"/>
+          <w:numId w:val="5"/>
+        </w:numPr>
+      </w:pPr>
       <w:r>
         <w:rPr>
           <w:b/>
           <w:bCs/>
         </w:rPr>
-        <w:t>Handoff:</w:t>
-      </w:r>
-      <w:r>
-        <w:t xml:space="preserve"> Who or what receives it next?</w:t>
-      </w:r>
-    </w:p>
-    <w:p>
+        <w:t>Problem:</w:t>
+      </w:r>
+      <w:r>
+        <w:t xml:space="preserve"> what were you trying to improve? </w:t>
+      </w:r>
+    </w:p>
+    <w:p>
+      <w:pPr>
+        <w:pStyle w:val="ListParagraph"/>
+        <w:numPr>
+          <w:ilvl w:val="0"/>
+          <w:numId w:val="5"/>
+        </w:numPr>
+      </w:pPr>
       <w:r>
         <w:rPr>
           <w:b/>
           <w:bCs/>
         </w:rPr>
-        <w:t>Output:</w:t>
-      </w:r>
-      <w:r>
-        <w:t xml:space="preserve"> What does "</w:t>
-      </w:r>
-      <w:proofErr w:type="gramStart"/>
-      <w:r>
-        <w:t>finished</w:t>
-      </w:r>
-      <w:proofErr w:type="gramEnd"/>
-      <w:r>
-        <w:t xml:space="preserve">" </w:t>
-      </w:r>
-      <w:proofErr w:type="gramStart"/>
-      <w:r>
-        <w:t>actually mean</w:t>
-      </w:r>
-      <w:proofErr w:type="gramEnd"/>
-      <w:r>
-        <w:t>?</w:t>
-      </w:r>
-    </w:p>
-    <w:p>
+        <w:t>Data:</w:t>
+      </w:r>
+      <w:r>
+        <w:t xml:space="preserve"> what did you track? </w:t>
+      </w:r>
+    </w:p>
+    <w:p>
+      <w:pPr>
+        <w:pStyle w:val="ListParagraph"/>
+        <w:numPr>
+          <w:ilvl w:val="0"/>
+          <w:numId w:val="5"/>
+        </w:numPr>
+      </w:pPr>
       <w:r>
         <w:rPr>
           <w:b/>
           <w:bCs/>
         </w:rPr>
-        <w:t>Measurement:</w:t>
-      </w:r>
-      <w:r>
-        <w:t xml:space="preserve"> How would we know whether the process is working well?</w:t>
-      </w:r>
-    </w:p>
-    <w:p/>
-    <w:p>
-      <w:r>
-        <w:t xml:space="preserve">The following is a Synthetic Scenario Exercise: </w:t>
-      </w:r>
-    </w:p>
-    <w:p>
-      <w:pPr>
-        <w:rPr>
-          <w:u w:val="single"/>
-        </w:rPr>
-      </w:pPr>
-      <w:r>
-        <w:rPr>
-          <w:u w:val="single"/>
-        </w:rPr>
-        <w:t xml:space="preserve">Mapping the Current State </w:t>
-      </w:r>
-    </w:p>
-    <w:p>
-      <w:r>
-        <w:t xml:space="preserve">Occasional complaints from partners that some requests take a long time. </w:t>
-      </w:r>
-    </w:p>
-    <w:p>
-      <w:r>
-        <w:t>Inp</w:t>
-      </w:r>
-      <w:r>
-        <w:t>ut:</w:t>
-      </w:r>
-      <w:r>
-        <w:t xml:space="preserve"> partner-emailed request within inbox</w:t>
-      </w:r>
-    </w:p>
-    <w:p>
-      <w:r>
-        <w:t>Process: a dedicated or any available employee notices the email (seems random not standardized/ regularly scanned) and manually enters request into a shared Excel tracker. After that, an organization’s info is reviewed in the database (2</w:t>
-      </w:r>
-      <w:r>
-        <w:rPr>
-          <w:vertAlign w:val="superscript"/>
-        </w:rPr>
-        <w:t>nd</w:t>
-      </w:r>
-      <w:r>
-        <w:t xml:space="preserve"> home for the same information). If there is mission information, an employee </w:t>
-      </w:r>
-      <w:proofErr w:type="gramStart"/>
-      <w:r>
-        <w:t>has to</w:t>
-      </w:r>
-      <w:proofErr w:type="gramEnd"/>
-      <w:r>
-        <w:t xml:space="preserve"> </w:t>
-      </w:r>
-      <w:proofErr w:type="gramStart"/>
-      <w:r>
-        <w:t>reach back</w:t>
-      </w:r>
-      <w:proofErr w:type="gramEnd"/>
-      <w:r>
-        <w:t xml:space="preserve"> out to partner for clarification; this back and forth potentially causes delays in updating partner information. After a response, there seems to not be a dedicated resolution because </w:t>
-      </w:r>
-      <w:r>
-        <w:t xml:space="preserve">sometimes the available employee will update the Excel or not (wtf, that’s </w:t>
-      </w:r>
-      <w:proofErr w:type="gramStart"/>
-      <w:r>
-        <w:t>there</w:t>
-      </w:r>
-      <w:proofErr w:type="gramEnd"/>
-      <w:r>
-        <w:t xml:space="preserve"> job). </w:t>
-      </w:r>
-    </w:p>
-    <w:p>
-      <w:r>
-        <w:t xml:space="preserve">Handoff: If changes require supervisor approval, staff must send a Teams message to super for review (an employee may or may not do this/ forgetful/ delayed request to super). </w:t>
-      </w:r>
-      <w:r>
-        <w:lastRenderedPageBreak/>
-        <w:t xml:space="preserve">Here’s what I don’t like: once a super reviews the request, they then </w:t>
-      </w:r>
-      <w:proofErr w:type="gramStart"/>
-      <w:r>
-        <w:t>have to</w:t>
-      </w:r>
-      <w:proofErr w:type="gramEnd"/>
-      <w:r>
-        <w:t xml:space="preserve"> message the employee back </w:t>
-      </w:r>
-      <w:r>
-        <w:t>for</w:t>
-      </w:r>
-      <w:r>
-        <w:t xml:space="preserve"> them to reach back out to the parter notifying completion of their update request. </w:t>
-      </w:r>
-    </w:p>
-    <w:p>
-      <w:r>
-        <w:t xml:space="preserve">Output: At the end of the month, the super must manually count completed rows in Excel to report completed request summary for the month. </w:t>
-      </w:r>
-      <w:r>
-        <w:t xml:space="preserve"> </w:t>
-      </w:r>
-    </w:p>
-    <w:p>
-      <w:r>
-        <w:t>Current Measurement: The only way to measure if the process was working well was if complaints about request-completion times were reduced.</w:t>
-      </w:r>
-    </w:p>
-    <w:p>
-      <w:r>
-        <w:t xml:space="preserve">There’s no tracker for how long requests </w:t>
-      </w:r>
-      <w:proofErr w:type="gramStart"/>
-      <w:r>
-        <w:t>are</w:t>
-      </w:r>
-      <w:proofErr w:type="gramEnd"/>
-      <w:r>
-        <w:t xml:space="preserve"> taking to process. That metric could be valuable in identifying bottle necks. </w:t>
-      </w:r>
-    </w:p>
-    <w:p>
-      <w:r>
-        <w:t>There must be a way to reduce time for repetitive manual data entries, keeping data in a centralized location versus having multiple versions of the same data (loss of data integrity), and a way to reduce dead space between handoffs for verifications.</w:t>
-      </w:r>
-    </w:p>
-    <w:p>
-      <w:pPr>
-        <w:rPr>
-          <w:u w:val="single"/>
-        </w:rPr>
-      </w:pPr>
-    </w:p>
-    <w:p>
-      <w:pPr>
-        <w:rPr>
-          <w:u w:val="single"/>
-        </w:rPr>
-      </w:pPr>
-      <w:r>
-        <w:rPr>
-          <w:u w:val="single"/>
-        </w:rPr>
-        <w:t xml:space="preserve">Diagnose Before Fixing </w:t>
-      </w:r>
-    </w:p>
-    <w:p>
-      <w:r>
-        <w:t xml:space="preserve">Is there a priority pipeline for the tasks we handle on a regular basis? </w:t>
-      </w:r>
-      <w:r>
-        <w:t xml:space="preserve">How would we define priority order? </w:t>
-      </w:r>
-      <w:proofErr w:type="gramStart"/>
-      <w:r>
-        <w:t>This</w:t>
-      </w:r>
-      <w:proofErr w:type="gramEnd"/>
-      <w:r>
-        <w:t xml:space="preserve"> would provide direct guidance on which tasks to prioritize. Every partner service representative would be trained </w:t>
-      </w:r>
-      <w:proofErr w:type="gramStart"/>
-      <w:r>
-        <w:t>on</w:t>
-      </w:r>
-      <w:proofErr w:type="gramEnd"/>
-      <w:r>
-        <w:t xml:space="preserve"> how to support partners. Therefore, anyone would be able to jump in and complete tasks. I would request that documentation be built </w:t>
-      </w:r>
-      <w:proofErr w:type="gramStart"/>
-      <w:r>
-        <w:t>in to</w:t>
-      </w:r>
-      <w:proofErr w:type="gramEnd"/>
-      <w:r>
-        <w:t xml:space="preserve"> daily tasks for transparency and clarity of work being done.</w:t>
-      </w:r>
-    </w:p>
-    <w:p>
-      <w:r>
-        <w:t xml:space="preserve">Is there a system to track completion of types of work we do on a regular basis? Identifying the average completion time could help locate inefficiencies and be the start to reducing prolonged wait times. </w:t>
-      </w:r>
-    </w:p>
-    <w:p>
-      <w:r>
-        <w:t xml:space="preserve">Is there a way to have one location where </w:t>
-      </w:r>
-      <w:proofErr w:type="gramStart"/>
-      <w:r>
-        <w:t>partners</w:t>
-      </w:r>
-      <w:proofErr w:type="gramEnd"/>
-      <w:r>
-        <w:t xml:space="preserve"> info can be inputted and stored? Reducing multiple locations of the duplicate data could reduce confusion, support data security and accurate records. </w:t>
-      </w:r>
-    </w:p>
-    <w:p>
-      <w:r>
-        <w:t xml:space="preserve">Can we design some sort of ticketing system to organize regular work? This way tasks can live in a central place instead of being spread across email threads and </w:t>
-      </w:r>
-      <w:proofErr w:type="gramStart"/>
-      <w:r>
-        <w:t>teams</w:t>
-      </w:r>
-      <w:proofErr w:type="gramEnd"/>
-      <w:r>
-        <w:t xml:space="preserve"> messages. Maybe Teams can be utilized more like Slack; making quicker reference to projects and ideas: can Teams be utilized the same way?</w:t>
-      </w:r>
-    </w:p>
-    <w:p>
-      <w:r>
-        <w:t>If things require supervisor approval, can they be batched and ranked and ordered by priority so that the super can have a systemized way to process work efficiently?</w:t>
-      </w:r>
-    </w:p>
-    <w:p/>
-    <w:p>
-      <w:pPr>
-        <w:rPr>
-          <w:u w:val="single"/>
-        </w:rPr>
-      </w:pPr>
-      <w:r>
-        <w:rPr>
-          <w:u w:val="single"/>
-        </w:rPr>
-        <w:lastRenderedPageBreak/>
-        <w:t>Importance of understanding and investigating a process before trying to improve it:</w:t>
-      </w:r>
-    </w:p>
-    <w:p>
-      <w:proofErr w:type="gramStart"/>
-      <w:r>
-        <w:t>we</w:t>
-      </w:r>
-      <w:proofErr w:type="gramEnd"/>
-      <w:r>
-        <w:t xml:space="preserve"> would want to provide relevant solutions instead of </w:t>
-      </w:r>
-      <w:proofErr w:type="gramStart"/>
-      <w:r>
-        <w:t>create</w:t>
-      </w:r>
-      <w:proofErr w:type="gramEnd"/>
-      <w:r>
-        <w:t xml:space="preserve"> unnecessary work for everyone. </w:t>
-      </w:r>
-      <w:proofErr w:type="gramStart"/>
-      <w:r>
-        <w:t>change</w:t>
-      </w:r>
-      <w:proofErr w:type="gramEnd"/>
-      <w:r>
-        <w:t xml:space="preserve"> can already be challenging, and </w:t>
-      </w:r>
-      <w:proofErr w:type="gramStart"/>
-      <w:r>
-        <w:t xml:space="preserve">if </w:t>
-      </w:r>
-      <w:proofErr w:type="spellStart"/>
-      <w:r>
-        <w:t>i</w:t>
-      </w:r>
-      <w:proofErr w:type="spellEnd"/>
-      <w:proofErr w:type="gramEnd"/>
-      <w:r>
-        <w:t xml:space="preserve"> propose solutions that create more problems that solve, that's very ineffective and bad for the team and clients. </w:t>
-      </w:r>
-    </w:p>
-    <w:p>
-      <w:pPr>
-        <w:pStyle w:val="ListParagraph"/>
-        <w:numPr>
-          <w:ilvl w:val="0"/>
-          <w:numId w:val="9"/>
-        </w:numPr>
-      </w:pPr>
-      <w:r>
-        <w:t>Understand and investigate the current process so that changes address the actual cause of a problem rather than an assumption. A good improvement should make the operation more effective without unnecessarily increasing workload, complexity, or friction for employees and partners.</w:t>
-      </w:r>
-    </w:p>
-    <w:p>
-      <w:pPr>
-        <w:rPr>
-          <w:u w:val="single"/>
-        </w:rPr>
-      </w:pPr>
-      <w:r>
-        <w:rPr>
-          <w:u w:val="single"/>
-        </w:rPr>
-        <w:t>9/15/2026</w:t>
-      </w:r>
-    </w:p>
-    <w:p>
-      <w:r>
-        <w:t>Getting in reps for designing data for Life CC:</w:t>
-      </w:r>
-    </w:p>
-    <w:p>
-      <w:pPr>
-        <w:pStyle w:val="ListParagraph"/>
-        <w:numPr>
-          <w:ilvl w:val="0"/>
-          <w:numId w:val="8"/>
-        </w:numPr>
-      </w:pPr>
-      <w:r>
-        <w:t xml:space="preserve">What business/user question are we </w:t>
-      </w:r>
-      <w:proofErr w:type="gramStart"/>
-      <w:r>
-        <w:t>actually trying</w:t>
-      </w:r>
-      <w:proofErr w:type="gramEnd"/>
-      <w:r>
-        <w:t xml:space="preserve"> to answer? </w:t>
-      </w:r>
-    </w:p>
-    <w:p>
-      <w:pPr>
-        <w:pStyle w:val="ListParagraph"/>
-        <w:numPr>
-          <w:ilvl w:val="1"/>
-          <w:numId w:val="8"/>
-        </w:numPr>
-      </w:pPr>
-      <w:r>
-        <w:t>How to combine the two things my father prioritizes in his life: financial and physical health, and showcase an overview of progress and goals? Furthermore, how can we design it so that, when my dad interacts with the app, it would create a sense meaningful work and purpose?</w:t>
-      </w:r>
-    </w:p>
-    <w:p>
-      <w:pPr>
-        <w:pStyle w:val="ListParagraph"/>
-        <w:numPr>
-          <w:ilvl w:val="0"/>
-          <w:numId w:val="8"/>
-        </w:numPr>
-      </w:pPr>
-      <w:r>
-        <w:t>What metric or metrics would matter?</w:t>
-      </w:r>
-    </w:p>
-    <w:p>
-      <w:pPr>
-        <w:pStyle w:val="ListParagraph"/>
-        <w:numPr>
-          <w:ilvl w:val="1"/>
-          <w:numId w:val="8"/>
-        </w:numPr>
-      </w:pPr>
-      <w:r>
-        <w:t xml:space="preserve"> </w:t>
-      </w:r>
-      <w:r>
-        <w:t>Total income, expenses and debt</w:t>
-      </w:r>
-    </w:p>
-    <w:p>
-      <w:pPr>
-        <w:pStyle w:val="ListParagraph"/>
-        <w:numPr>
-          <w:ilvl w:val="1"/>
-          <w:numId w:val="8"/>
-        </w:numPr>
-      </w:pPr>
-      <w:r>
-        <w:t xml:space="preserve">Count days of exercise </w:t>
-      </w:r>
-    </w:p>
-    <w:p>
-      <w:pPr>
-        <w:pStyle w:val="ListParagraph"/>
-        <w:numPr>
-          <w:ilvl w:val="1"/>
-          <w:numId w:val="8"/>
-        </w:numPr>
-      </w:pPr>
-      <w:r>
-        <w:t>Average sleep per week</w:t>
-      </w:r>
-    </w:p>
-    <w:p>
-      <w:pPr>
-        <w:pStyle w:val="ListParagraph"/>
-        <w:numPr>
-          <w:ilvl w:val="1"/>
-          <w:numId w:val="8"/>
-        </w:numPr>
-      </w:pPr>
-      <w:r>
-        <w:t xml:space="preserve">Calories per day | count of macronutrients consumed daily | days adherence to MyPlate method of eating </w:t>
-      </w:r>
-    </w:p>
-    <w:p>
-      <w:pPr>
-        <w:pStyle w:val="ListParagraph"/>
-        <w:numPr>
-          <w:ilvl w:val="1"/>
-          <w:numId w:val="8"/>
-        </w:numPr>
-      </w:pPr>
-      <w:r>
-        <w:t xml:space="preserve">Count of bills paid for the month  </w:t>
-      </w:r>
-    </w:p>
-    <w:p>
-      <w:pPr>
-        <w:pStyle w:val="ListParagraph"/>
-        <w:ind w:left="1440"/>
-      </w:pPr>
-    </w:p>
-    <w:p>
-      <w:pPr>
-        <w:pStyle w:val="ListParagraph"/>
-        <w:numPr>
-          <w:ilvl w:val="0"/>
-          <w:numId w:val="8"/>
-        </w:numPr>
-      </w:pPr>
-      <w:r>
-        <w:t>What raw fields would we need to collect?</w:t>
-      </w:r>
-    </w:p>
-    <w:p>
-      <w:pPr>
-        <w:pStyle w:val="ListParagraph"/>
-        <w:numPr>
-          <w:ilvl w:val="1"/>
-          <w:numId w:val="8"/>
-        </w:numPr>
-      </w:pPr>
-      <w:r>
-        <w:t xml:space="preserve">Monthly bank statements </w:t>
-      </w:r>
-    </w:p>
-    <w:p>
-      <w:pPr>
-        <w:pStyle w:val="ListParagraph"/>
-        <w:numPr>
-          <w:ilvl w:val="1"/>
-          <w:numId w:val="8"/>
-        </w:numPr>
-      </w:pPr>
-      <w:r>
-        <w:t xml:space="preserve">Debt balances </w:t>
-      </w:r>
-    </w:p>
-    <w:p>
-      <w:pPr>
-        <w:pStyle w:val="ListParagraph"/>
-        <w:numPr>
-          <w:ilvl w:val="1"/>
-          <w:numId w:val="8"/>
-        </w:numPr>
-      </w:pPr>
-      <w:r>
-        <w:t xml:space="preserve">Lab reports from doctor’s appointments </w:t>
-      </w:r>
-    </w:p>
-    <w:p>
-      <w:pPr>
-        <w:pStyle w:val="ListParagraph"/>
-        <w:numPr>
-          <w:ilvl w:val="1"/>
-          <w:numId w:val="8"/>
-        </w:numPr>
-      </w:pPr>
-      <w:r>
-        <w:t xml:space="preserve">Bp </w:t>
-      </w:r>
-    </w:p>
-    <w:p>
-      <w:pPr>
-        <w:pStyle w:val="ListParagraph"/>
-        <w:numPr>
-          <w:ilvl w:val="1"/>
-          <w:numId w:val="8"/>
-        </w:numPr>
-      </w:pPr>
-      <w:r>
-        <w:t xml:space="preserve">Food </w:t>
-      </w:r>
-      <w:proofErr w:type="gramStart"/>
-      <w:r>
-        <w:t>log</w:t>
-      </w:r>
-      <w:proofErr w:type="gramEnd"/>
-      <w:r>
-        <w:t xml:space="preserve"> </w:t>
-      </w:r>
-    </w:p>
-    <w:p>
-      <w:pPr>
-        <w:pStyle w:val="ListParagraph"/>
-        <w:numPr>
-          <w:ilvl w:val="1"/>
-          <w:numId w:val="8"/>
-        </w:numPr>
-      </w:pPr>
-      <w:r>
-        <w:t xml:space="preserve">Apple watch activity: steps, calories burned, rings close rate </w:t>
-      </w:r>
-    </w:p>
-    <w:p>
-      <w:pPr>
-        <w:pStyle w:val="ListParagraph"/>
-        <w:numPr>
-          <w:ilvl w:val="1"/>
-          <w:numId w:val="8"/>
-        </w:numPr>
-      </w:pPr>
-      <w:r>
-        <w:t xml:space="preserve">Work outs </w:t>
-      </w:r>
-    </w:p>
-    <w:p>
-      <w:pPr>
-        <w:pStyle w:val="ListParagraph"/>
-        <w:numPr>
-          <w:ilvl w:val="1"/>
-          <w:numId w:val="8"/>
-        </w:numPr>
-      </w:pPr>
-      <w:r>
-        <w:t xml:space="preserve">Sleep </w:t>
-      </w:r>
-      <w:proofErr w:type="gramStart"/>
-      <w:r>
-        <w:t>log</w:t>
-      </w:r>
-      <w:proofErr w:type="gramEnd"/>
-      <w:r>
-        <w:t xml:space="preserve"> </w:t>
-      </w:r>
-    </w:p>
-    <w:p>
-      <w:pPr>
-        <w:pStyle w:val="ListParagraph"/>
-        <w:numPr>
-          <w:ilvl w:val="2"/>
-          <w:numId w:val="8"/>
-        </w:numPr>
-      </w:pPr>
-      <w:r>
-        <w:t>Correction:</w:t>
-      </w:r>
-    </w:p>
-    <w:p>
-      <w:pPr>
-        <w:pStyle w:val="ListParagraph"/>
-        <w:numPr>
-          <w:ilvl w:val="3"/>
-          <w:numId w:val="8"/>
-        </w:numPr>
-      </w:pPr>
-      <w:proofErr w:type="spellStart"/>
-      <w:r>
-        <w:t>transaction_date</w:t>
-      </w:r>
-      <w:proofErr w:type="spellEnd"/>
-      <w:r>
-        <w:t xml:space="preserve">, amount, category, </w:t>
-      </w:r>
-      <w:proofErr w:type="spellStart"/>
-      <w:r>
-        <w:t>systolic_bp</w:t>
-      </w:r>
-      <w:proofErr w:type="spellEnd"/>
-      <w:r>
-        <w:t xml:space="preserve">, </w:t>
-      </w:r>
-      <w:proofErr w:type="spellStart"/>
-      <w:r>
-        <w:t>diastolic_bp</w:t>
-      </w:r>
-      <w:proofErr w:type="spellEnd"/>
-      <w:r>
-        <w:t xml:space="preserve">, </w:t>
-      </w:r>
-      <w:proofErr w:type="spellStart"/>
-      <w:r>
-        <w:t>lab_test_name</w:t>
-      </w:r>
-      <w:proofErr w:type="spellEnd"/>
-      <w:r>
-        <w:t xml:space="preserve">, </w:t>
-      </w:r>
-      <w:proofErr w:type="spellStart"/>
-      <w:r>
-        <w:t>lab_value</w:t>
-      </w:r>
-      <w:proofErr w:type="spellEnd"/>
-    </w:p>
-    <w:p>
-      <w:pPr>
-        <w:pStyle w:val="ListParagraph"/>
-        <w:numPr>
-          <w:ilvl w:val="0"/>
-          <w:numId w:val="8"/>
-        </w:numPr>
-      </w:pPr>
-      <w:r>
-        <w:lastRenderedPageBreak/>
-        <w:t xml:space="preserve">What would the grain of the exercise data </w:t>
-      </w:r>
-      <w:proofErr w:type="gramStart"/>
-      <w:r>
-        <w:t>be</w:t>
-      </w:r>
-      <w:proofErr w:type="gramEnd"/>
-      <w:r>
-        <w:t>?</w:t>
-      </w:r>
-    </w:p>
-    <w:p>
-      <w:pPr>
-        <w:pStyle w:val="ListParagraph"/>
-        <w:numPr>
-          <w:ilvl w:val="1"/>
-          <w:numId w:val="8"/>
-        </w:numPr>
-      </w:pPr>
-      <w:r>
-        <w:t xml:space="preserve">One row per day or one row per </w:t>
-      </w:r>
-      <w:r>
-        <w:t>workout session</w:t>
-      </w:r>
-    </w:p>
-    <w:p>
-      <w:pPr>
-        <w:pStyle w:val="ListParagraph"/>
-        <w:numPr>
-          <w:ilvl w:val="0"/>
-          <w:numId w:val="8"/>
-        </w:numPr>
-      </w:pPr>
-      <w:r>
-        <w:t xml:space="preserve">What entity or entities do you think exist? </w:t>
-      </w:r>
-    </w:p>
-    <w:p>
-      <w:pPr>
-        <w:pStyle w:val="ListParagraph"/>
-        <w:numPr>
-          <w:ilvl w:val="1"/>
-          <w:numId w:val="8"/>
-        </w:numPr>
-      </w:pPr>
-      <w:r>
-        <w:t>I want to say there’s just one entity: my dad. But I’m not sure. Maybe: health, finances, so then two entities?</w:t>
-      </w:r>
-    </w:p>
-    <w:p>
-      <w:pPr>
-        <w:pStyle w:val="ListParagraph"/>
-        <w:numPr>
-          <w:ilvl w:val="0"/>
-          <w:numId w:val="8"/>
-        </w:numPr>
-      </w:pPr>
-      <w:r>
-        <w:t>Would you store everything in one table, or do you already see a reason for multiple tables?</w:t>
-      </w:r>
-    </w:p>
-    <w:p>
-      <w:pPr>
-        <w:pStyle w:val="ListParagraph"/>
-        <w:numPr>
-          <w:ilvl w:val="1"/>
-          <w:numId w:val="8"/>
-        </w:numPr>
-      </w:pPr>
-      <w:r>
-        <w:t>I see multiple tables: income/expenses, debt, lab results, food log, exercise log, and sleep log</w:t>
-      </w:r>
-    </w:p>
-    <w:p/>
-    <w:p>
-      <w:pPr>
-        <w:rPr>
-          <w:u w:val="single"/>
-        </w:rPr>
-      </w:pPr>
-      <w:r>
-        <w:rPr>
-          <w:u w:val="single"/>
-        </w:rPr>
-        <w:t>9/14/2026</w:t>
-      </w:r>
-    </w:p>
-    <w:p>
-      <w:r>
-        <w:t>Continuing with SQL Drilling</w:t>
-      </w:r>
-      <w:r>
-        <w:t xml:space="preserve">: Group By vs Window Function. </w:t>
-      </w:r>
-    </w:p>
-    <w:p>
-      <w:r>
-        <w:t>Knowing when to use CTE vs Window Function:</w:t>
-      </w:r>
-    </w:p>
-    <w:p>
-      <w:pPr>
-        <w:numPr>
-          <w:ilvl w:val="0"/>
-          <w:numId w:val="6"/>
-        </w:numPr>
-      </w:pPr>
-      <w:r>
-        <w:t xml:space="preserve">Need to change grain first? </w:t>
-      </w:r>
-      <w:proofErr w:type="gramStart"/>
-      <w:r>
-        <w:t>Think</w:t>
-      </w:r>
-      <w:proofErr w:type="gramEnd"/>
-      <w:r>
-        <w:t xml:space="preserve"> CTE/subquery.</w:t>
-      </w:r>
-    </w:p>
-    <w:p>
-      <w:pPr>
-        <w:numPr>
-          <w:ilvl w:val="0"/>
-          <w:numId w:val="6"/>
-        </w:numPr>
-      </w:pPr>
-      <w:r>
-        <w:t>Need to keep the current grain and add context? Think window function.</w:t>
-      </w:r>
-    </w:p>
-    <w:p>
-      <w:r>
-        <w:t xml:space="preserve">Getting used to </w:t>
-      </w:r>
-      <w:proofErr w:type="gramStart"/>
-      <w:r>
-        <w:t>decomposing</w:t>
-      </w:r>
-      <w:proofErr w:type="gramEnd"/>
-      <w:r>
-        <w:t xml:space="preserve"> the</w:t>
-      </w:r>
-      <w:r>
-        <w:t xml:space="preserve"> </w:t>
-      </w:r>
-      <w:r>
-        <w:t xml:space="preserve">business questions before starting with SQL; normally I would just start trying to write SQL to solve the business problem. </w:t>
-      </w:r>
-    </w:p>
-    <w:p>
-      <w:r>
-        <w:t xml:space="preserve">Now it’s like understanding a math problem fully and then hand-picking the concept or formula to solve the problem first.  </w:t>
-      </w:r>
-    </w:p>
-    <w:p>
-      <w:pPr>
-        <w:pStyle w:val="ListParagraph"/>
-        <w:numPr>
-          <w:ilvl w:val="0"/>
-          <w:numId w:val="7"/>
-        </w:numPr>
-      </w:pPr>
-      <w:r>
-        <w:t>In SQL, that means decomposing the business question into grain, metrics, relationships, and required transformations before choosing the appropriate query logic.</w:t>
-      </w:r>
-    </w:p>
-    <w:p/>
-    <w:p>
-      <w:r>
-        <w:t xml:space="preserve"> </w:t>
-      </w:r>
-    </w:p>
-    <w:p>
-      <w:pPr>
-        <w:rPr>
-          <w:u w:val="single"/>
-        </w:rPr>
-      </w:pPr>
-      <w:r>
-        <w:rPr>
-          <w:u w:val="single"/>
-        </w:rPr>
-        <w:t>9/13/2026</w:t>
-      </w:r>
-    </w:p>
-    <w:p>
-      <w:r>
-        <w:t xml:space="preserve">Started with some join logic and difference between distinct and Group </w:t>
-      </w:r>
-      <w:proofErr w:type="gramStart"/>
-      <w:r>
-        <w:t>By</w:t>
-      </w:r>
-      <w:proofErr w:type="gramEnd"/>
-      <w:r>
-        <w:t xml:space="preserve"> in a CTE to achieve the same result</w:t>
-      </w:r>
-      <w:r>
-        <w:t xml:space="preserve">; CTE above/below average comparisons. </w:t>
-      </w:r>
-    </w:p>
-    <w:p>
-      <w:r>
-        <w:t>In telling stories to showcase my experiences, use this format:</w:t>
+        <w:t>Analysis:</w:t>
+      </w:r>
+      <w:r>
+        <w:t xml:space="preserve"> what did you actually do with the data? </w:t>
       </w:r>
     </w:p>
     <w:p>
@@ -1077,10 +963,10 @@
           <w:b/>
           <w:bCs/>
         </w:rPr>
-        <w:t>Problem:</w:t>
-      </w:r>
-      <w:r>
-        <w:t xml:space="preserve"> what were you trying to improve? </w:t>
+        <w:t>Decision:</w:t>
+      </w:r>
+      <w:r>
+        <w:t xml:space="preserve"> what changed because of the analysis? </w:t>
       </w:r>
     </w:p>
     <w:p>
@@ -1096,38 +982,134 @@
           <w:b/>
           <w:bCs/>
         </w:rPr>
-        <w:t>Data:</w:t>
-      </w:r>
-      <w:r>
-        <w:t xml:space="preserve"> what did you track? </w:t>
-      </w:r>
-    </w:p>
-    <w:p>
-      <w:pPr>
-        <w:pStyle w:val="ListParagraph"/>
-        <w:numPr>
-          <w:ilvl w:val="0"/>
-          <w:numId w:val="5"/>
-        </w:numPr>
-      </w:pPr>
+        <w:t>Impact:</w:t>
+      </w:r>
+      <w:r>
+        <w:t xml:space="preserve"> what measurable result came out of it?</w:t>
+      </w:r>
+    </w:p>
+    <w:p>
+      <w:r>
+        <w:t xml:space="preserve">I also created flashcards to help me with basics of SQL and some window functions. </w:t>
+      </w:r>
+    </w:p>
+    <w:p/>
+    <w:p>
+      <w:pPr>
+        <w:rPr>
+          <w:u w:val="single"/>
+        </w:rPr>
+      </w:pPr>
+      <w:r>
+        <w:rPr>
+          <w:u w:val="single"/>
+        </w:rPr>
+        <w:t>Quick story for when asked about one of my analytics projects and what impact it had:</w:t>
+      </w:r>
+    </w:p>
+    <w:p>
+      <w:r>
+        <w:t xml:space="preserve">When I started doing DoorDash, I wanted to find a way to earn more money in less time while also reducing unnecessary mileage and gas costs. </w:t>
+      </w:r>
+      <w:r>
+        <w:t xml:space="preserve">So essentially, </w:t>
+      </w:r>
+      <w:r>
+        <w:t>work smarter, not harder.</w:t>
+      </w:r>
+    </w:p>
+    <w:p>
+      <w:r>
+        <w:t xml:space="preserve">I started tracking daily earnings, shift times, miles driven, earnings per mile, and hours worked per shift. Then I analyzed those metrics to look for </w:t>
+      </w:r>
+      <w:r>
+        <w:t>trends</w:t>
+      </w:r>
+      <w:r>
+        <w:t xml:space="preserve"> when I was most efficient and which shifts were actually worth my time.</w:t>
+      </w:r>
+    </w:p>
+    <w:p>
+      <w:r>
+        <w:t>Based on what I found, I changed how and when I worked. As a result, I increased my earnings from about $9 per hour to around $18 per hour, improved my earnings per mile from roughly $0.50 to at least $2.00, and reduced the time it took to hit the same daily earnings goal from about 6–7 hours to 3–4 hours.</w:t>
+      </w:r>
+    </w:p>
+    <w:p>
+      <w:r>
+        <w:t xml:space="preserve">What I liked about that project was that it showed me how </w:t>
+      </w:r>
       <w:r>
         <w:rPr>
           <w:b/>
           <w:bCs/>
         </w:rPr>
+        <w:t>useful</w:t>
+      </w:r>
+      <w:r>
+        <w:t xml:space="preserve"> even simple data can be when it’s tied to a clear business question and a decision.</w:t>
+      </w:r>
+    </w:p>
+    <w:p>
+      <w:pPr>
+        <w:rPr>
+          <w:u w:val="single"/>
+        </w:rPr>
+      </w:pPr>
+      <w:r>
+        <w:rPr>
+          <w:u w:val="single"/>
+        </w:rPr>
+        <w:t>Tell me about yourself:</w:t>
+      </w:r>
+    </w:p>
+    <w:p>
+      <w:r>
         <w:lastRenderedPageBreak/>
-        <w:t>Analysis:</w:t>
-      </w:r>
-      <w:r>
-        <w:t xml:space="preserve"> what did you </w:t>
-      </w:r>
-      <w:proofErr w:type="gramStart"/>
-      <w:r>
-        <w:t>actually do</w:t>
-      </w:r>
-      <w:proofErr w:type="gramEnd"/>
-      <w:r>
-        <w:t xml:space="preserve"> with the data? </w:t>
+        <w:t xml:space="preserve">From running my own fitness business, I’ve always been interested in using metrics to improve results </w:t>
+      </w:r>
+      <w:r>
+        <w:t xml:space="preserve">for my clients </w:t>
+      </w:r>
+      <w:r>
+        <w:t>and make better</w:t>
+      </w:r>
+      <w:r>
+        <w:t xml:space="preserve"> business </w:t>
+      </w:r>
+      <w:r>
+        <w:t>decisions.</w:t>
+      </w:r>
+    </w:p>
+    <w:p>
+      <w:r>
+        <w:t>When I transitioned to Three Square as a Nutrition Education Specialist, I was regularly reviewing performance metrics, improving processes, and using data to help support health and operational goals for the Las Vegas community.</w:t>
+      </w:r>
+    </w:p>
+    <w:p>
+      <w:r>
+        <w:t>That experience pushed me to go deeper into analytics. I started building my skills in SQL, Excel, Power BI, and more recently Python, and I found that I really enjoy using data to solve practical problems and improve how systems work.</w:t>
+      </w:r>
+    </w:p>
+    <w:p>
+      <w:r>
+        <w:t>What interests me about Mercury is the opportunity to keep developing those technical skills while contributing to a team that works across analytics, data, and systems. I think my background in operations, problem-solving, and analytics gives me a strong foundation to contribute while continuing to grow.</w:t>
+      </w:r>
+      <w:r>
+        <w:t xml:space="preserve">  </w:t>
+      </w:r>
+    </w:p>
+    <w:p/>
+    <w:p>
+      <w:pPr>
+        <w:rPr>
+          <w:u w:val="single"/>
+        </w:rPr>
+      </w:pPr>
+      <w:r>
+        <w:rPr>
+          <w:u w:val="single"/>
+        </w:rPr>
+        <w:t>9/12/2026</w:t>
       </w:r>
     </w:p>
     <w:p>
@@ -1135,425 +1117,174 @@
         <w:pStyle w:val="ListParagraph"/>
         <w:numPr>
           <w:ilvl w:val="0"/>
-          <w:numId w:val="5"/>
-        </w:numPr>
-      </w:pPr>
+          <w:numId w:val="4"/>
+        </w:numPr>
+      </w:pPr>
+      <w:r>
+        <w:t xml:space="preserve">a CTE can create a new state-level dataset </w:t>
+      </w:r>
+    </w:p>
+    <w:p>
+      <w:pPr>
+        <w:pStyle w:val="ListParagraph"/>
+        <w:numPr>
+          <w:ilvl w:val="0"/>
+          <w:numId w:val="4"/>
+        </w:numPr>
+      </w:pPr>
+      <w:r>
+        <w:t xml:space="preserve">aliases inside the CTE do not carry outside it </w:t>
+      </w:r>
+    </w:p>
+    <w:p>
+      <w:pPr>
+        <w:pStyle w:val="ListParagraph"/>
+        <w:numPr>
+          <w:ilvl w:val="0"/>
+          <w:numId w:val="4"/>
+        </w:numPr>
+      </w:pPr>
+      <w:r>
+        <w:t xml:space="preserve">aggregate functions work on columns/expressions, not the CTE name itself </w:t>
+      </w:r>
+    </w:p>
+    <w:p>
+      <w:pPr>
+        <w:pStyle w:val="ListParagraph"/>
+        <w:numPr>
+          <w:ilvl w:val="0"/>
+          <w:numId w:val="4"/>
+        </w:numPr>
+      </w:pPr>
+      <w:r>
+        <w:t>the outer query can compare each row against an aggregate of the CTE</w:t>
+      </w:r>
+    </w:p>
+    <w:p/>
+    <w:p>
+      <w:pPr>
+        <w:rPr>
+          <w:u w:val="single"/>
+        </w:rPr>
+      </w:pPr>
+      <w:r>
+        <w:rPr>
+          <w:u w:val="single"/>
+        </w:rPr>
+        <w:t>9/11/2026</w:t>
+      </w:r>
+    </w:p>
+    <w:p>
+      <w:r>
+        <w:t xml:space="preserve">Went over concepts of joins. Instead of syntaxes in isolation, my goal is to understand purpose and function of SQL concepts, but also develop the ability to apply them to various scenarios; effective application within real world. </w:t>
+      </w:r>
+    </w:p>
+    <w:p>
+      <w:r>
+        <w:t xml:space="preserve">My process: Understand the </w:t>
+      </w:r>
+      <w:r>
+        <w:t>Business question → identify the underlying problem → choose the right concept/tool → write the syntax</w:t>
+      </w:r>
+      <w:r>
+        <w:t xml:space="preserve">, produce the results/insights that lead to solutions to the problem. </w:t>
+      </w:r>
+    </w:p>
+    <w:p>
+      <w:pPr>
+        <w:rPr>
+          <w:u w:val="single"/>
+        </w:rPr>
+      </w:pPr>
+      <w:r>
+        <w:rPr>
+          <w:u w:val="single"/>
+        </w:rPr>
+        <w:t>9/10/2026</w:t>
+      </w:r>
+    </w:p>
+    <w:p>
+      <w:r>
+        <w:t xml:space="preserve">Conducted Testing on everything I’ve learned so far, then updated oneNote. Focusing on knowing when to apply certain Window Functions based off of business needs. Growing past learning Window Functions in isolation. </w:t>
+      </w:r>
+    </w:p>
+    <w:p>
+      <w:pPr>
+        <w:rPr>
+          <w:u w:val="single"/>
+        </w:rPr>
+      </w:pPr>
+      <w:r>
+        <w:rPr>
+          <w:u w:val="single"/>
+        </w:rPr>
+        <w:t>9/9/2026</w:t>
+      </w:r>
+    </w:p>
+    <w:p>
+      <w:r>
+        <w:lastRenderedPageBreak/>
+        <w:t xml:space="preserve">Learning </w:t>
+      </w:r>
+      <w:r>
+        <w:t>First_Value() and Last_Value()</w:t>
+      </w:r>
+      <w:r>
+        <w:t xml:space="preserve"> with Window Frames</w:t>
+      </w:r>
+    </w:p>
+    <w:p>
+      <w:pPr>
+        <w:pStyle w:val="ListParagraph"/>
+        <w:numPr>
+          <w:ilvl w:val="0"/>
+          <w:numId w:val="3"/>
+        </w:numPr>
+      </w:pPr>
+      <w:r>
+        <w:t>Business-wise, FIRST_VALUE() is useful for comparing current performance to a starting baseline, while LAST_VALUE() is useful for comparing rows to the final value in a defined sequence.</w:t>
+      </w:r>
+    </w:p>
+    <w:p>
+      <w:pPr>
+        <w:pStyle w:val="ListParagraph"/>
+        <w:numPr>
+          <w:ilvl w:val="0"/>
+          <w:numId w:val="3"/>
+        </w:numPr>
+      </w:pPr>
+      <w:r>
+        <w:t>Window Frame = defines how much of a sequence a function can see</w:t>
+      </w:r>
+    </w:p>
+    <w:p/>
+    <w:p>
+      <w:pPr>
+        <w:rPr>
+          <w:u w:val="single"/>
+        </w:rPr>
+      </w:pPr>
+      <w:r>
+        <w:rPr>
+          <w:u w:val="single"/>
+        </w:rPr>
+        <w:t>9-8-2026</w:t>
+      </w:r>
+    </w:p>
+    <w:p>
+      <w:r>
+        <w:t>Practiced Lag() – Value/Navigation windows</w:t>
+      </w:r>
+    </w:p>
+    <w:p>
+      <w:r>
+        <w:t xml:space="preserve">Drilled in concept for calculating Percent Change: </w:t>
+      </w:r>
       <w:r>
         <w:rPr>
           <w:b/>
           <w:bCs/>
         </w:rPr>
-        <w:t>Decision:</w:t>
-      </w:r>
-      <w:r>
-        <w:t xml:space="preserve"> what changed because of the analysis? </w:t>
-      </w:r>
-    </w:p>
-    <w:p>
-      <w:pPr>
-        <w:pStyle w:val="ListParagraph"/>
-        <w:numPr>
-          <w:ilvl w:val="0"/>
-          <w:numId w:val="5"/>
-        </w:numPr>
-      </w:pPr>
-      <w:r>
-        <w:rPr>
-          <w:b/>
-          <w:bCs/>
-        </w:rPr>
-        <w:t>Impact:</w:t>
-      </w:r>
-      <w:r>
-        <w:t xml:space="preserve"> what measurable result came out of it?</w:t>
-      </w:r>
-    </w:p>
-    <w:p>
-      <w:r>
-        <w:t xml:space="preserve">I also created flashcards to help me with basics of SQL and some window functions. </w:t>
-      </w:r>
-    </w:p>
-    <w:p/>
-    <w:p>
-      <w:pPr>
-        <w:rPr>
-          <w:u w:val="single"/>
-        </w:rPr>
-      </w:pPr>
-      <w:r>
-        <w:rPr>
-          <w:u w:val="single"/>
-        </w:rPr>
-        <w:t>Quick story for when asked about one of my analytics projects and what impact it had:</w:t>
-      </w:r>
-    </w:p>
-    <w:p>
-      <w:r>
-        <w:t xml:space="preserve">When I started doing DoorDash, I wanted to find a way to earn more money in less time while also reducing unnecessary mileage and gas costs. </w:t>
-      </w:r>
-      <w:r>
-        <w:t xml:space="preserve">So essentially, </w:t>
-      </w:r>
-      <w:r>
-        <w:t>work smarter, not harder.</w:t>
-      </w:r>
-    </w:p>
-    <w:p>
-      <w:r>
-        <w:t xml:space="preserve">I started tracking daily earnings, shift times, miles driven, earnings per mile, and hours worked per shift. Then I analyzed those metrics to look for </w:t>
-      </w:r>
-      <w:r>
-        <w:t>trends</w:t>
-      </w:r>
-      <w:r>
-        <w:t xml:space="preserve"> when I was most efficient and which shifts were </w:t>
-      </w:r>
-      <w:proofErr w:type="gramStart"/>
-      <w:r>
-        <w:t>actually worth</w:t>
-      </w:r>
-      <w:proofErr w:type="gramEnd"/>
-      <w:r>
-        <w:t xml:space="preserve"> my time.</w:t>
-      </w:r>
-    </w:p>
-    <w:p>
-      <w:r>
-        <w:t>Based on what I found, I changed how and when I worked. As a result, I increased my earnings from about $9 per hour to around $18 per hour, improved my earnings per mile from roughly $0.50 to at least $2.00, and reduced the time it took to hit the same daily earnings goal from about 6–7 hours to 3–4 hours.</w:t>
-      </w:r>
-    </w:p>
-    <w:p>
-      <w:r>
-        <w:t xml:space="preserve">What I liked about that project was that it showed me how </w:t>
-      </w:r>
-      <w:r>
-        <w:rPr>
-          <w:b/>
-          <w:bCs/>
-        </w:rPr>
-        <w:t>useful</w:t>
-      </w:r>
-      <w:r>
-        <w:t xml:space="preserve"> even simple data can be when it’s tied to a clear business question and a decision.</w:t>
-      </w:r>
-    </w:p>
-    <w:p>
-      <w:pPr>
-        <w:rPr>
-          <w:u w:val="single"/>
-        </w:rPr>
-      </w:pPr>
-      <w:r>
-        <w:rPr>
-          <w:u w:val="single"/>
-        </w:rPr>
-        <w:t>Tell me about yourself:</w:t>
-      </w:r>
-    </w:p>
-    <w:p>
-      <w:r>
-        <w:t xml:space="preserve">From running my own fitness business, I’ve always been interested in using metrics to improve results </w:t>
-      </w:r>
-      <w:r>
-        <w:t xml:space="preserve">for my clients </w:t>
-      </w:r>
-      <w:r>
-        <w:t>and make better</w:t>
-      </w:r>
-      <w:r>
-        <w:t xml:space="preserve"> business </w:t>
-      </w:r>
-      <w:r>
-        <w:t>decisions.</w:t>
-      </w:r>
-    </w:p>
-    <w:p>
-      <w:r>
-        <w:t xml:space="preserve">When I transitioned to Three Square as a Nutrition Education Specialist, </w:t>
-      </w:r>
-      <w:proofErr w:type="gramStart"/>
-      <w:r>
-        <w:t>I was</w:t>
-      </w:r>
-      <w:proofErr w:type="gramEnd"/>
-      <w:r>
-        <w:t xml:space="preserve"> regularly </w:t>
-      </w:r>
-      <w:proofErr w:type="gramStart"/>
-      <w:r>
-        <w:t>reviewing</w:t>
-      </w:r>
-      <w:proofErr w:type="gramEnd"/>
-      <w:r>
-        <w:t xml:space="preserve"> performance metrics, improving processes, and using data to help support health and operational goals for the Las Vegas community.</w:t>
-      </w:r>
-    </w:p>
-    <w:p>
-      <w:r>
-        <w:t>That experience pushed me to go deeper into analytics. I started building my skills in SQL, Excel, Power BI, and more recently Python, and I found that I really enjoy using data to solve practical problems and improve how systems work.</w:t>
-      </w:r>
-    </w:p>
-    <w:p>
-      <w:r>
-        <w:t>What interests me about Mercury is the opportunity to keep developing those technical skills while contributing to a team that works across analytics, data, and systems. I think my background in operations, problem-solving, and analytics gives me a strong foundation to contribute while continuing to grow.</w:t>
-      </w:r>
-      <w:r>
-        <w:t xml:space="preserve">  </w:t>
-      </w:r>
-    </w:p>
-    <w:p/>
-    <w:p>
-      <w:pPr>
-        <w:rPr>
-          <w:u w:val="single"/>
-        </w:rPr>
-      </w:pPr>
-      <w:r>
-        <w:rPr>
-          <w:u w:val="single"/>
-        </w:rPr>
-        <w:lastRenderedPageBreak/>
-        <w:t>9/12/2026</w:t>
-      </w:r>
-    </w:p>
-    <w:p>
-      <w:pPr>
-        <w:pStyle w:val="ListParagraph"/>
-        <w:numPr>
-          <w:ilvl w:val="0"/>
-          <w:numId w:val="4"/>
-        </w:numPr>
-      </w:pPr>
-      <w:proofErr w:type="gramStart"/>
-      <w:r>
-        <w:t>a CTE</w:t>
-      </w:r>
-      <w:proofErr w:type="gramEnd"/>
-      <w:r>
-        <w:t xml:space="preserve"> can create a new state-level dataset </w:t>
-      </w:r>
-    </w:p>
-    <w:p>
-      <w:pPr>
-        <w:pStyle w:val="ListParagraph"/>
-        <w:numPr>
-          <w:ilvl w:val="0"/>
-          <w:numId w:val="4"/>
-        </w:numPr>
-      </w:pPr>
-      <w:r>
-        <w:t xml:space="preserve">aliases inside the CTE do not carry outside it </w:t>
-      </w:r>
-    </w:p>
-    <w:p>
-      <w:pPr>
-        <w:pStyle w:val="ListParagraph"/>
-        <w:numPr>
-          <w:ilvl w:val="0"/>
-          <w:numId w:val="4"/>
-        </w:numPr>
-      </w:pPr>
-      <w:r>
-        <w:t xml:space="preserve">aggregate functions work on columns/expressions, not the CTE name itself </w:t>
-      </w:r>
-    </w:p>
-    <w:p>
-      <w:pPr>
-        <w:pStyle w:val="ListParagraph"/>
-        <w:numPr>
-          <w:ilvl w:val="0"/>
-          <w:numId w:val="4"/>
-        </w:numPr>
-      </w:pPr>
-      <w:proofErr w:type="gramStart"/>
-      <w:r>
-        <w:t>the</w:t>
-      </w:r>
-      <w:proofErr w:type="gramEnd"/>
-      <w:r>
-        <w:t xml:space="preserve"> outer query can compare each row against an aggregate of the CTE</w:t>
-      </w:r>
-    </w:p>
-    <w:p/>
-    <w:p>
-      <w:pPr>
-        <w:rPr>
-          <w:u w:val="single"/>
-        </w:rPr>
-      </w:pPr>
-      <w:r>
-        <w:rPr>
-          <w:u w:val="single"/>
-        </w:rPr>
-        <w:t>9/11/2026</w:t>
-      </w:r>
-    </w:p>
-    <w:p>
-      <w:r>
-        <w:t xml:space="preserve">Went over concepts of joins. Instead of syntaxes in isolation, my goal is to understand purpose and function of SQL </w:t>
-      </w:r>
-      <w:proofErr w:type="gramStart"/>
-      <w:r>
-        <w:t>concepts, but</w:t>
-      </w:r>
-      <w:proofErr w:type="gramEnd"/>
-      <w:r>
-        <w:t xml:space="preserve"> also develop the ability to apply them to various scenarios; effective application within real world. </w:t>
-      </w:r>
-    </w:p>
-    <w:p>
-      <w:r>
-        <w:t xml:space="preserve">My process: Understand the </w:t>
-      </w:r>
-      <w:r>
-        <w:t>Business question → identify the underlying problem → choose the right concept/tool → write the syntax</w:t>
-      </w:r>
-      <w:r>
-        <w:t xml:space="preserve">, produce the results/insights that lead to solutions to the problem. </w:t>
-      </w:r>
-    </w:p>
-    <w:p>
-      <w:pPr>
-        <w:rPr>
-          <w:u w:val="single"/>
-        </w:rPr>
-      </w:pPr>
-      <w:r>
-        <w:rPr>
-          <w:u w:val="single"/>
-        </w:rPr>
-        <w:t>9/10/2026</w:t>
-      </w:r>
-    </w:p>
-    <w:p>
-      <w:r>
-        <w:t xml:space="preserve">Conducted Testing on everything I’ve learned so far, then updated oneNote. Focusing on knowing when to apply certain Window Functions based </w:t>
-      </w:r>
-      <w:proofErr w:type="gramStart"/>
-      <w:r>
-        <w:t>off of</w:t>
-      </w:r>
-      <w:proofErr w:type="gramEnd"/>
-      <w:r>
-        <w:t xml:space="preserve"> business needs. Growing past learning Window Functions in isolation. </w:t>
-      </w:r>
-    </w:p>
-    <w:p>
-      <w:pPr>
-        <w:rPr>
-          <w:u w:val="single"/>
-        </w:rPr>
-      </w:pPr>
-      <w:r>
-        <w:rPr>
-          <w:u w:val="single"/>
-        </w:rPr>
-        <w:t>9/9/2026</w:t>
-      </w:r>
-    </w:p>
-    <w:p>
-      <w:r>
-        <w:t xml:space="preserve">Learning </w:t>
-      </w:r>
-      <w:r>
-        <w:t>First_</w:t>
-      </w:r>
-      <w:proofErr w:type="gramStart"/>
-      <w:r>
-        <w:t>Value(</w:t>
-      </w:r>
-      <w:proofErr w:type="gramEnd"/>
-      <w:r>
-        <w:t>) and Last_</w:t>
-      </w:r>
-      <w:proofErr w:type="gramStart"/>
-      <w:r>
-        <w:t>Value(</w:t>
-      </w:r>
-      <w:proofErr w:type="gramEnd"/>
-      <w:r>
-        <w:t>)</w:t>
-      </w:r>
-      <w:r>
-        <w:t xml:space="preserve"> with Window Frames</w:t>
-      </w:r>
-    </w:p>
-    <w:p>
-      <w:pPr>
-        <w:pStyle w:val="ListParagraph"/>
-        <w:numPr>
-          <w:ilvl w:val="0"/>
-          <w:numId w:val="3"/>
-        </w:numPr>
-      </w:pPr>
-      <w:r>
-        <w:t>Business-wise, FIRST_</w:t>
-      </w:r>
-      <w:proofErr w:type="gramStart"/>
-      <w:r>
-        <w:t>VALUE(</w:t>
-      </w:r>
-      <w:proofErr w:type="gramEnd"/>
-      <w:r>
-        <w:t>) is useful for comparing current performance to a starting baseline, while LAST_</w:t>
-      </w:r>
-      <w:proofErr w:type="gramStart"/>
-      <w:r>
-        <w:t>VALUE(</w:t>
-      </w:r>
-      <w:proofErr w:type="gramEnd"/>
-      <w:r>
-        <w:t>) is useful for comparing rows to the final value in a defined sequence.</w:t>
-      </w:r>
-    </w:p>
-    <w:p>
-      <w:pPr>
-        <w:pStyle w:val="ListParagraph"/>
-        <w:numPr>
-          <w:ilvl w:val="0"/>
-          <w:numId w:val="3"/>
-        </w:numPr>
-      </w:pPr>
-      <w:r>
-        <w:t>Window Frame = defines how much of a sequence a function can see</w:t>
-      </w:r>
-    </w:p>
-    <w:p/>
-    <w:p>
-      <w:pPr>
-        <w:rPr>
-          <w:u w:val="single"/>
-        </w:rPr>
-      </w:pPr>
-      <w:r>
-        <w:rPr>
-          <w:u w:val="single"/>
-        </w:rPr>
-        <w:t>9-8-2026</w:t>
-      </w:r>
-    </w:p>
-    <w:p>
-      <w:r>
-        <w:t xml:space="preserve">Practiced </w:t>
-      </w:r>
-      <w:proofErr w:type="gramStart"/>
-      <w:r>
-        <w:t>Lag(</w:t>
-      </w:r>
-      <w:proofErr w:type="gramEnd"/>
-      <w:r>
-        <w:t>) – Value/Navigation windows</w:t>
-      </w:r>
-    </w:p>
-    <w:p>
-      <w:r>
-        <w:t xml:space="preserve">Drilled in concept for calculating Percent Change: </w:t>
-      </w:r>
-      <w:r>
-        <w:rPr>
-          <w:b/>
-          <w:bCs/>
-        </w:rPr>
         <w:t>percent change = (new - old) / old × 100</w:t>
       </w:r>
     </w:p>
@@ -1591,16 +1322,7 @@
         </w:numPr>
       </w:pPr>
       <w:r>
-        <w:lastRenderedPageBreak/>
-        <w:t xml:space="preserve">Partition </w:t>
-      </w:r>
-      <w:proofErr w:type="gramStart"/>
-      <w:r>
-        <w:t>By(</w:t>
-      </w:r>
-      <w:proofErr w:type="gramEnd"/>
-      <w:r>
-        <w:t>)</w:t>
+        <w:t>Partition By()</w:t>
       </w:r>
     </w:p>
     <w:p>
@@ -1627,15 +1349,7 @@
         </w:numPr>
       </w:pPr>
       <w:r>
-        <w:t xml:space="preserve">Order </w:t>
-      </w:r>
-      <w:proofErr w:type="gramStart"/>
-      <w:r>
-        <w:t>By(</w:t>
-      </w:r>
-      <w:proofErr w:type="gramEnd"/>
-      <w:r>
-        <w:t>)</w:t>
+        <w:t>Order By()</w:t>
       </w:r>
     </w:p>
     <w:p>
@@ -1659,15 +1373,7 @@
         </w:numPr>
       </w:pPr>
       <w:r>
-        <w:t>Row_</w:t>
-      </w:r>
-      <w:proofErr w:type="gramStart"/>
-      <w:r>
-        <w:t>Number(</w:t>
-      </w:r>
-      <w:proofErr w:type="gramEnd"/>
-      <w:r>
-        <w:t>)</w:t>
+        <w:t>Row_Number()</w:t>
       </w:r>
     </w:p>
     <w:p>
@@ -1678,13 +1384,8 @@
           <w:numId w:val="2"/>
         </w:numPr>
       </w:pPr>
-      <w:proofErr w:type="gramStart"/>
-      <w:r>
-        <w:t>Rank(</w:t>
-      </w:r>
-      <w:proofErr w:type="gramEnd"/>
-      <w:r>
-        <w:t>)</w:t>
+      <w:r>
+        <w:t>Rank()</w:t>
       </w:r>
     </w:p>
     <w:p>
@@ -1696,15 +1397,7 @@
         </w:numPr>
       </w:pPr>
       <w:r>
-        <w:t>Dense_</w:t>
-      </w:r>
-      <w:proofErr w:type="gramStart"/>
-      <w:r>
-        <w:t>Rank(</w:t>
-      </w:r>
-      <w:proofErr w:type="gramEnd"/>
-      <w:r>
-        <w:t>)</w:t>
+        <w:t>Dense_Rank()</w:t>
       </w:r>
     </w:p>
     <w:p>
@@ -1715,13 +1408,8 @@
           <w:numId w:val="2"/>
         </w:numPr>
       </w:pPr>
-      <w:proofErr w:type="gramStart"/>
-      <w:r>
-        <w:t>Lag(</w:t>
-      </w:r>
-      <w:proofErr w:type="gramEnd"/>
-      <w:r>
-        <w:t>)</w:t>
+      <w:r>
+        <w:t>Lag()</w:t>
       </w:r>
     </w:p>
     <w:p>
@@ -1745,21 +1433,11 @@
         </w:numPr>
       </w:pPr>
       <w:r>
-        <w:t xml:space="preserve">Define the field I want the value from and </w:t>
-      </w:r>
-      <w:proofErr w:type="gramStart"/>
-      <w:r>
-        <w:t>pull  a</w:t>
-      </w:r>
-      <w:proofErr w:type="gramEnd"/>
-      <w:r>
-        <w:t xml:space="preserve"> previous record </w:t>
-      </w:r>
-      <w:proofErr w:type="gramStart"/>
+        <w:t xml:space="preserve">Define the field I want the value from and pull  a previous record </w:t>
+      </w:r>
       <w:r>
         <w:t>git</w:t>
       </w:r>
-      <w:proofErr w:type="gramEnd"/>
     </w:p>
     <w:p/>
     <w:p>
@@ -3479,6 +3157,7 @@
   <w:style w:type="character" w:default="1" w:styleId="DefaultParagraphFont">
     <w:name w:val="Default Paragraph Font"/>
     <w:uiPriority w:val="1"/>
+    <w:semiHidden/>
     <w:unhideWhenUsed/>
   </w:style>
   <w:style w:type="table" w:default="1" w:styleId="TableNormal">

</xml_diff>

<commit_message>
Practicing Pandas concepts, updated project documentation.
</commit_message>
<xml_diff>
--- a/documentation/da-gym-doumentation .docx
+++ b/documentation/da-gym-doumentation .docx
@@ -25,6 +25,180 @@
         <w:rPr>
           <w:u w:val="single"/>
         </w:rPr>
+        <w:t>9/21/2026</w:t>
+      </w:r>
+    </w:p>
+    <w:p>
+      <w:r>
+        <w:t>Brushing up on Python/ Pandas concepts:</w:t>
+      </w:r>
+    </w:p>
+    <w:p>
+      <w:pPr>
+        <w:pStyle w:val="ListParagraph"/>
+        <w:numPr>
+          <w:ilvl w:val="0"/>
+          <w:numId w:val="10"/>
+        </w:numPr>
+      </w:pPr>
+      <w:r>
+        <w:t>Using Boolean Mask as a way to filter a selection within a field(s)</w:t>
+      </w:r>
+    </w:p>
+    <w:p>
+      <w:pPr>
+        <w:pStyle w:val="ListParagraph"/>
+        <w:numPr>
+          <w:ilvl w:val="1"/>
+          <w:numId w:val="10"/>
+        </w:numPr>
+      </w:pPr>
+      <w:r>
+        <w:t>Df[“field”].isin([“record_a”,”record_b”])</w:t>
+      </w:r>
+    </w:p>
+    <w:p>
+      <w:pPr>
+        <w:pStyle w:val="ListParagraph"/>
+        <w:numPr>
+          <w:ilvl w:val="0"/>
+          <w:numId w:val="10"/>
+        </w:numPr>
+      </w:pPr>
+      <w:r>
+        <w:t>The method to find average is .mean() not avg()</w:t>
+      </w:r>
+    </w:p>
+    <w:p>
+      <w:pPr>
+        <w:pStyle w:val="ListParagraph"/>
+        <w:numPr>
+          <w:ilvl w:val="1"/>
+          <w:numId w:val="10"/>
+        </w:numPr>
+      </w:pPr>
+      <w:r>
+        <w:t>Usually the method gets connected after the calculation</w:t>
+      </w:r>
+    </w:p>
+    <w:p>
+      <w:pPr>
+        <w:pStyle w:val="ListParagraph"/>
+        <w:numPr>
+          <w:ilvl w:val="2"/>
+          <w:numId w:val="10"/>
+        </w:numPr>
+      </w:pPr>
+      <w:r>
+        <w:t>jobs.groupby("status")["salary"].mean()</w:t>
+      </w:r>
+    </w:p>
+    <w:p>
+      <w:pPr>
+        <w:pStyle w:val="ListParagraph"/>
+        <w:numPr>
+          <w:ilvl w:val="3"/>
+          <w:numId w:val="10"/>
+        </w:numPr>
+      </w:pPr>
+      <w:r>
+        <w:t>in the jobs df, group records by the different status records and show the average salary associated with each application status</w:t>
+      </w:r>
+    </w:p>
+    <w:p>
+      <w:pPr>
+        <w:pStyle w:val="ListParagraph"/>
+        <w:numPr>
+          <w:ilvl w:val="0"/>
+          <w:numId w:val="10"/>
+        </w:numPr>
+      </w:pPr>
+      <w:r>
+        <w:t xml:space="preserve">To join data frames in Pandas, use .merge() </w:t>
+      </w:r>
+    </w:p>
+    <w:p>
+      <w:pPr>
+        <w:pStyle w:val="ListParagraph"/>
+        <w:numPr>
+          <w:ilvl w:val="1"/>
+          <w:numId w:val="10"/>
+        </w:numPr>
+      </w:pPr>
+      <w:r>
+        <w:t>jobs.merge(</w:t>
+      </w:r>
+    </w:p>
+    <w:p>
+      <w:pPr>
+        <w:pStyle w:val="ListParagraph"/>
+        <w:numPr>
+          <w:ilvl w:val="1"/>
+          <w:numId w:val="10"/>
+        </w:numPr>
+      </w:pPr>
+      <w:r>
+        <w:t xml:space="preserve">    companies,</w:t>
+      </w:r>
+    </w:p>
+    <w:p>
+      <w:pPr>
+        <w:pStyle w:val="ListParagraph"/>
+        <w:numPr>
+          <w:ilvl w:val="1"/>
+          <w:numId w:val="10"/>
+        </w:numPr>
+      </w:pPr>
+      <w:r>
+        <w:t xml:space="preserve">    on="company_id",</w:t>
+      </w:r>
+    </w:p>
+    <w:p>
+      <w:pPr>
+        <w:pStyle w:val="ListParagraph"/>
+        <w:numPr>
+          <w:ilvl w:val="1"/>
+          <w:numId w:val="10"/>
+        </w:numPr>
+      </w:pPr>
+      <w:r>
+        <w:t xml:space="preserve">    how="left"</w:t>
+      </w:r>
+    </w:p>
+    <w:p>
+      <w:pPr>
+        <w:pStyle w:val="ListParagraph"/>
+        <w:numPr>
+          <w:ilvl w:val="1"/>
+          <w:numId w:val="10"/>
+        </w:numPr>
+      </w:pPr>
+      <w:r>
+        <w:t>)</w:t>
+      </w:r>
+    </w:p>
+    <w:p>
+      <w:pPr>
+        <w:pStyle w:val="ListParagraph"/>
+        <w:numPr>
+          <w:ilvl w:val="0"/>
+          <w:numId w:val="10"/>
+        </w:numPr>
+      </w:pPr>
+      <w:r>
+        <w:t>left_dataframe.merge(right_dataframe, on="key", how="join_type")</w:t>
+      </w:r>
+    </w:p>
+    <w:p>
+      <w:pPr>
+        <w:rPr>
+          <w:u w:val="single"/>
+        </w:rPr>
+      </w:pPr>
+      <w:r>
+        <w:rPr>
+          <w:u w:val="single"/>
+        </w:rPr>
         <w:t>9/17/2026</w:t>
       </w:r>
     </w:p>
@@ -268,48 +442,48 @@
     </w:p>
     <w:p>
       <w:r>
+        <w:t>Process: a dedicated or any available employee notices the email (seems random not standardized/ regularly scanned) and manually enters request into a shared Excel tracker. After that, an organization’s info is reviewed in the database (2</w:t>
+      </w:r>
+      <w:r>
+        <w:rPr>
+          <w:vertAlign w:val="superscript"/>
+        </w:rPr>
+        <w:t>nd</w:t>
+      </w:r>
+      <w:r>
+        <w:t xml:space="preserve"> home for the same information). If there is mission information, an employee has to reach back out to partner for clarification; this back and forth potentially causes delays in updating partner information. After a response, there seems to not be a dedicated resolution because </w:t>
+      </w:r>
+      <w:r>
+        <w:t xml:space="preserve">sometimes the available employee will update the Excel or not (wtf, that’s there job). </w:t>
+      </w:r>
+    </w:p>
+    <w:p>
+      <w:r>
+        <w:t xml:space="preserve">Handoff: If changes require supervisor approval, staff must send a Teams message to super for review (an employee may or may not do this/ forgetful/ delayed request to super). Here’s what I don’t like: once a super reviews the request, they then have to message the employee back </w:t>
+      </w:r>
+      <w:r>
+        <w:t>for</w:t>
+      </w:r>
+      <w:r>
+        <w:t xml:space="preserve"> them to reach back out to the parter notifying completion of their update request. </w:t>
+      </w:r>
+    </w:p>
+    <w:p>
+      <w:r>
+        <w:t xml:space="preserve">Output: At the end of the month, the super must manually count completed rows in Excel to report completed request summary for the month. </w:t>
+      </w:r>
+      <w:r>
+        <w:t xml:space="preserve"> </w:t>
+      </w:r>
+    </w:p>
+    <w:p>
+      <w:r>
+        <w:t>Current Measurement: The only way to measure if the process was working well was if complaints about request-completion times were reduced.</w:t>
+      </w:r>
+    </w:p>
+    <w:p>
+      <w:r>
         <w:lastRenderedPageBreak/>
-        <w:t>Process: a dedicated or any available employee notices the email (seems random not standardized/ regularly scanned) and manually enters request into a shared Excel tracker. After that, an organization’s info is reviewed in the database (2</w:t>
-      </w:r>
-      <w:r>
-        <w:rPr>
-          <w:vertAlign w:val="superscript"/>
-        </w:rPr>
-        <w:t>nd</w:t>
-      </w:r>
-      <w:r>
-        <w:t xml:space="preserve"> home for the same information). If there is mission information, an employee has to reach back out to partner for clarification; this back and forth potentially causes delays in updating partner information. After a response, there seems to not be a dedicated resolution because </w:t>
-      </w:r>
-      <w:r>
-        <w:t xml:space="preserve">sometimes the available employee will update the Excel or not (wtf, that’s there job). </w:t>
-      </w:r>
-    </w:p>
-    <w:p>
-      <w:r>
-        <w:t xml:space="preserve">Handoff: If changes require supervisor approval, staff must send a Teams message to super for review (an employee may or may not do this/ forgetful/ delayed request to super). Here’s what I don’t like: once a super reviews the request, they then have to message the employee back </w:t>
-      </w:r>
-      <w:r>
-        <w:t>for</w:t>
-      </w:r>
-      <w:r>
-        <w:t xml:space="preserve"> them to reach back out to the parter notifying completion of their update request. </w:t>
-      </w:r>
-    </w:p>
-    <w:p>
-      <w:r>
-        <w:t xml:space="preserve">Output: At the end of the month, the super must manually count completed rows in Excel to report completed request summary for the month. </w:t>
-      </w:r>
-      <w:r>
-        <w:t xml:space="preserve"> </w:t>
-      </w:r>
-    </w:p>
-    <w:p>
-      <w:r>
-        <w:t>Current Measurement: The only way to measure if the process was working well was if complaints about request-completion times were reduced.</w:t>
-      </w:r>
-    </w:p>
-    <w:p>
-      <w:r>
         <w:t xml:space="preserve">There’s no tracker for how long requests are taking to process. That metric could be valuable in identifying bottle necks. </w:t>
       </w:r>
     </w:p>
@@ -359,7 +533,6 @@
     </w:p>
     <w:p>
       <w:r>
-        <w:lastRenderedPageBreak/>
         <w:t xml:space="preserve">Is there a way to have one location where partners info can be inputted and stored? Reducing multiple locations of the duplicate data could reduce confusion, support data security and accurate records. </w:t>
       </w:r>
     </w:p>
@@ -389,15 +562,7 @@
     </w:p>
     <w:p>
       <w:r>
-        <w:t xml:space="preserve">we would want to provide relevant solutions instead of create unnecessary work for everyone. change can already be challenging, and if </w:t>
-      </w:r>
-      <w:proofErr w:type="spellStart"/>
-      <w:r>
-        <w:t>i</w:t>
-      </w:r>
-      <w:proofErr w:type="spellEnd"/>
-      <w:r>
-        <w:t xml:space="preserve"> propose solutions that create more problems that solve, that's very ineffective and bad for the team and clients. </w:t>
+        <w:t xml:space="preserve">we would want to provide relevant solutions instead of create unnecessary work for everyone. change can already be challenging, and if i propose solutions that create more problems that solve, that's very ineffective and bad for the team and clients. </w:t>
       </w:r>
     </w:p>
     <w:p>
@@ -409,7 +574,11 @@
         </w:numPr>
       </w:pPr>
       <w:r>
-        <w:t>Understand and investigate the current process so that changes address the actual cause of a problem rather than an assumption. A good improvement should make the operation more effective without unnecessarily increasing workload, complexity, or friction for employees and partners.</w:t>
+        <w:t xml:space="preserve">Understand and investigate the current process so that changes address the actual cause of a problem rather than an assumption. A good improvement should make </w:t>
+      </w:r>
+      <w:r>
+        <w:lastRenderedPageBreak/>
+        <w:t>the operation more effective without unnecessarily increasing workload, complexity, or friction for employees and partners.</w:t>
       </w:r>
     </w:p>
     <w:p>
@@ -544,7 +713,6 @@
         </w:numPr>
       </w:pPr>
       <w:r>
-        <w:lastRenderedPageBreak/>
         <w:t>What raw fields would we need to collect?</w:t>
       </w:r>
     </w:p>
@@ -667,43 +835,9 @@
           <w:numId w:val="8"/>
         </w:numPr>
       </w:pPr>
-      <w:proofErr w:type="spellStart"/>
-      <w:r>
-        <w:t>transaction_date</w:t>
-      </w:r>
-      <w:proofErr w:type="spellEnd"/>
-      <w:r>
-        <w:t xml:space="preserve">, amount, category, </w:t>
-      </w:r>
-      <w:proofErr w:type="spellStart"/>
-      <w:r>
-        <w:t>systolic_bp</w:t>
-      </w:r>
-      <w:proofErr w:type="spellEnd"/>
-      <w:r>
-        <w:t xml:space="preserve">, </w:t>
-      </w:r>
-      <w:proofErr w:type="spellStart"/>
-      <w:r>
-        <w:t>diastolic_bp</w:t>
-      </w:r>
-      <w:proofErr w:type="spellEnd"/>
-      <w:r>
-        <w:t xml:space="preserve">, </w:t>
-      </w:r>
-      <w:proofErr w:type="spellStart"/>
-      <w:r>
-        <w:t>lab_test_name</w:t>
-      </w:r>
-      <w:proofErr w:type="spellEnd"/>
-      <w:r>
-        <w:t xml:space="preserve">, </w:t>
-      </w:r>
-      <w:proofErr w:type="spellStart"/>
-      <w:r>
-        <w:t>lab_value</w:t>
-      </w:r>
-      <w:proofErr w:type="spellEnd"/>
+      <w:r>
+        <w:t>transaction_date, amount, category, systolic_bp, diastolic_bp, lab_test_name, lab_value</w:t>
+      </w:r>
     </w:p>
     <w:p>
       <w:pPr>
@@ -777,6 +911,7 @@
         </w:numPr>
       </w:pPr>
       <w:r>
+        <w:lastRenderedPageBreak/>
         <w:t>I see multiple tables: income/expenses, debt, lab results, food log, exercise log, and sleep log</w:t>
       </w:r>
     </w:p>
@@ -857,7 +992,6 @@
         </w:numPr>
       </w:pPr>
       <w:r>
-        <w:lastRenderedPageBreak/>
         <w:t>In SQL, that means decomposing the business question into grain, metrics, relationships, and required transformations before choosing the appropriate query logic.</w:t>
       </w:r>
     </w:p>
@@ -1009,6 +1143,7 @@
     </w:p>
     <w:p>
       <w:r>
+        <w:lastRenderedPageBreak/>
         <w:t xml:space="preserve">When I started doing DoorDash, I wanted to find a way to earn more money in less time while also reducing unnecessary mileage and gas costs. </w:t>
       </w:r>
       <w:r>
@@ -1064,7 +1199,6 @@
     </w:p>
     <w:p>
       <w:r>
-        <w:lastRenderedPageBreak/>
         <w:t xml:space="preserve">From running my own fitness business, I’ve always been interested in using metrics to improve results </w:t>
       </w:r>
       <w:r>
@@ -1171,6 +1305,7 @@
         <w:rPr>
           <w:u w:val="single"/>
         </w:rPr>
+        <w:lastRenderedPageBreak/>
         <w:t>9/11/2026</w:t>
       </w:r>
     </w:p>
@@ -1223,7 +1358,6 @@
     </w:p>
     <w:p>
       <w:r>
-        <w:lastRenderedPageBreak/>
         <w:t xml:space="preserve">Learning </w:t>
       </w:r>
       <w:r>
@@ -1385,6 +1519,7 @@
         </w:numPr>
       </w:pPr>
       <w:r>
+        <w:lastRenderedPageBreak/>
         <w:t>Rank()</w:t>
       </w:r>
     </w:p>
@@ -2521,6 +2656,119 @@
       <w:rPr>
         <w:rFonts w:ascii="Symbol" w:hAnsi="Symbol" w:hint="default"/>
         <w:sz w:val="20"/>
+      </w:rPr>
+    </w:lvl>
+  </w:abstractNum>
+  <w:abstractNum w:abstractNumId="9" w15:restartNumberingAfterBreak="0">
+    <w:nsid w:val="728D4BB8"/>
+    <w:multiLevelType w:val="hybridMultilevel"/>
+    <w:tmpl w:val="1E805820"/>
+    <w:lvl w:ilvl="0" w:tplc="04090001">
+      <w:start w:val="1"/>
+      <w:numFmt w:val="bullet"/>
+      <w:lvlText w:val=""/>
+      <w:lvlJc w:val="left"/>
+      <w:pPr>
+        <w:ind w:left="720" w:hanging="360"/>
+      </w:pPr>
+      <w:rPr>
+        <w:rFonts w:ascii="Symbol" w:hAnsi="Symbol" w:hint="default"/>
+      </w:rPr>
+    </w:lvl>
+    <w:lvl w:ilvl="1" w:tplc="04090003">
+      <w:start w:val="1"/>
+      <w:numFmt w:val="bullet"/>
+      <w:lvlText w:val="o"/>
+      <w:lvlJc w:val="left"/>
+      <w:pPr>
+        <w:ind w:left="1440" w:hanging="360"/>
+      </w:pPr>
+      <w:rPr>
+        <w:rFonts w:ascii="Courier New" w:hAnsi="Courier New" w:cs="Courier New" w:hint="default"/>
+      </w:rPr>
+    </w:lvl>
+    <w:lvl w:ilvl="2" w:tplc="04090005">
+      <w:start w:val="1"/>
+      <w:numFmt w:val="bullet"/>
+      <w:lvlText w:val=""/>
+      <w:lvlJc w:val="left"/>
+      <w:pPr>
+        <w:ind w:left="2160" w:hanging="360"/>
+      </w:pPr>
+      <w:rPr>
+        <w:rFonts w:ascii="Wingdings" w:hAnsi="Wingdings" w:hint="default"/>
+      </w:rPr>
+    </w:lvl>
+    <w:lvl w:ilvl="3" w:tplc="04090001">
+      <w:start w:val="1"/>
+      <w:numFmt w:val="bullet"/>
+      <w:lvlText w:val=""/>
+      <w:lvlJc w:val="left"/>
+      <w:pPr>
+        <w:ind w:left="2880" w:hanging="360"/>
+      </w:pPr>
+      <w:rPr>
+        <w:rFonts w:ascii="Symbol" w:hAnsi="Symbol" w:hint="default"/>
+      </w:rPr>
+    </w:lvl>
+    <w:lvl w:ilvl="4" w:tplc="04090003" w:tentative="1">
+      <w:start w:val="1"/>
+      <w:numFmt w:val="bullet"/>
+      <w:lvlText w:val="o"/>
+      <w:lvlJc w:val="left"/>
+      <w:pPr>
+        <w:ind w:left="3600" w:hanging="360"/>
+      </w:pPr>
+      <w:rPr>
+        <w:rFonts w:ascii="Courier New" w:hAnsi="Courier New" w:cs="Courier New" w:hint="default"/>
+      </w:rPr>
+    </w:lvl>
+    <w:lvl w:ilvl="5" w:tplc="04090005" w:tentative="1">
+      <w:start w:val="1"/>
+      <w:numFmt w:val="bullet"/>
+      <w:lvlText w:val=""/>
+      <w:lvlJc w:val="left"/>
+      <w:pPr>
+        <w:ind w:left="4320" w:hanging="360"/>
+      </w:pPr>
+      <w:rPr>
+        <w:rFonts w:ascii="Wingdings" w:hAnsi="Wingdings" w:hint="default"/>
+      </w:rPr>
+    </w:lvl>
+    <w:lvl w:ilvl="6" w:tplc="04090001" w:tentative="1">
+      <w:start w:val="1"/>
+      <w:numFmt w:val="bullet"/>
+      <w:lvlText w:val=""/>
+      <w:lvlJc w:val="left"/>
+      <w:pPr>
+        <w:ind w:left="5040" w:hanging="360"/>
+      </w:pPr>
+      <w:rPr>
+        <w:rFonts w:ascii="Symbol" w:hAnsi="Symbol" w:hint="default"/>
+      </w:rPr>
+    </w:lvl>
+    <w:lvl w:ilvl="7" w:tplc="04090003" w:tentative="1">
+      <w:start w:val="1"/>
+      <w:numFmt w:val="bullet"/>
+      <w:lvlText w:val="o"/>
+      <w:lvlJc w:val="left"/>
+      <w:pPr>
+        <w:ind w:left="5760" w:hanging="360"/>
+      </w:pPr>
+      <w:rPr>
+        <w:rFonts w:ascii="Courier New" w:hAnsi="Courier New" w:cs="Courier New" w:hint="default"/>
+      </w:rPr>
+    </w:lvl>
+    <w:lvl w:ilvl="8" w:tplc="04090005" w:tentative="1">
+      <w:start w:val="1"/>
+      <w:numFmt w:val="bullet"/>
+      <w:lvlText w:val=""/>
+      <w:lvlJc w:val="left"/>
+      <w:pPr>
+        <w:ind w:left="6480" w:hanging="360"/>
+      </w:pPr>
+      <w:rPr>
+        <w:rFonts w:ascii="Wingdings" w:hAnsi="Wingdings" w:hint="default"/>
       </w:rPr>
     </w:lvl>
   </w:abstractNum>
@@ -2550,6 +2798,9 @@
   </w:num>
   <w:num w:numId="9" w16cid:durableId="484008388">
     <w:abstractNumId w:val="5"/>
+  </w:num>
+  <w:num w:numId="10" w16cid:durableId="1161777610">
+    <w:abstractNumId w:val="9"/>
   </w:num>
 </w:numbering>
 </file>
@@ -3157,7 +3408,6 @@
   <w:style w:type="character" w:default="1" w:styleId="DefaultParagraphFont">
     <w:name w:val="Default Paragraph Font"/>
     <w:uiPriority w:val="1"/>
-    <w:semiHidden/>
     <w:unhideWhenUsed/>
   </w:style>
   <w:style w:type="table" w:default="1" w:styleId="TableNormal">

</xml_diff>

<commit_message>
Continued Pandas concepts; boolean masks and operator to connect. Updated project documentation.
</commit_message>
<xml_diff>
--- a/documentation/da-gym-doumentation .docx
+++ b/documentation/da-gym-doumentation .docx
@@ -25,6 +25,87 @@
         <w:rPr>
           <w:u w:val="single"/>
         </w:rPr>
+        <w:t>9/22/2026</w:t>
+      </w:r>
+    </w:p>
+    <w:p>
+      <w:r>
+        <w:t>= assigns. == compares</w:t>
+      </w:r>
+    </w:p>
+    <w:p>
+      <w:r>
+        <w:t>jobs[</w:t>
+      </w:r>
+    </w:p>
+    <w:p>
+      <w:r>
+        <w:t xml:space="preserve">    (jobs["salary"] &gt;= 80000)</w:t>
+      </w:r>
+    </w:p>
+    <w:p>
+      <w:r>
+        <w:t xml:space="preserve">    &amp; (jobs["status"] == "Interview")</w:t>
+      </w:r>
+    </w:p>
+    <w:p>
+      <w:r>
+        <w:t>]</w:t>
+      </w:r>
+    </w:p>
+    <w:p>
+      <w:pPr>
+        <w:pStyle w:val="ListParagraph"/>
+        <w:numPr>
+          <w:ilvl w:val="0"/>
+          <w:numId w:val="11"/>
+        </w:numPr>
+      </w:pPr>
+      <w:r>
+        <w:t>Show</w:t>
+      </w:r>
+      <w:r>
+        <w:t>s</w:t>
+      </w:r>
+      <w:r>
+        <w:t xml:space="preserve"> only jobs with salary at least 80,000 and status equal to "Interview".</w:t>
+      </w:r>
+    </w:p>
+    <w:p>
+      <w:pPr>
+        <w:pStyle w:val="ListParagraph"/>
+        <w:numPr>
+          <w:ilvl w:val="0"/>
+          <w:numId w:val="11"/>
+        </w:numPr>
+      </w:pPr>
+      <w:r>
+        <w:t xml:space="preserve">The &amp; is the operator that combines both Boolean conditions </w:t>
+      </w:r>
+    </w:p>
+    <w:p>
+      <w:pPr>
+        <w:pStyle w:val="ListParagraph"/>
+        <w:numPr>
+          <w:ilvl w:val="1"/>
+          <w:numId w:val="11"/>
+        </w:numPr>
+      </w:pPr>
+      <w:r>
+        <w:t xml:space="preserve">This is like AND within Where Clause for SQL </w:t>
+      </w:r>
+    </w:p>
+    <w:p/>
+    <w:p>
+      <w:pPr>
+        <w:rPr>
+          <w:u w:val="single"/>
+        </w:rPr>
+      </w:pPr>
+      <w:r>
+        <w:rPr>
+          <w:u w:val="single"/>
+        </w:rPr>
         <w:t>9/21/2026</w:t>
       </w:r>
     </w:p>
@@ -209,6 +290,7 @@
     </w:p>
     <w:p>
       <w:r>
+        <w:lastRenderedPageBreak/>
         <w:t xml:space="preserve">Completed another round of simulated operational workflow/processes and how in regard to incomplete or missing items in a client’s delivery. </w:t>
       </w:r>
     </w:p>
@@ -451,7 +533,11 @@
         <w:t>nd</w:t>
       </w:r>
       <w:r>
-        <w:t xml:space="preserve"> home for the same information). If there is mission information, an employee has to reach back out to partner for clarification; this back and forth potentially causes delays in updating partner information. After a response, there seems to not be a dedicated resolution because </w:t>
+        <w:t xml:space="preserve"> home for the same information). If there is mission information, an employee has to reach back out to partner </w:t>
+      </w:r>
+      <w:r>
+        <w:lastRenderedPageBreak/>
+        <w:t xml:space="preserve">for clarification; this back and forth potentially causes delays in updating partner information. After a response, there seems to not be a dedicated resolution because </w:t>
       </w:r>
       <w:r>
         <w:t xml:space="preserve">sometimes the available employee will update the Excel or not (wtf, that’s there job). </w:t>
@@ -483,62 +569,65 @@
     </w:p>
     <w:p>
       <w:r>
+        <w:t xml:space="preserve">There’s no tracker for how long requests are taking to process. That metric could be valuable in identifying bottle necks. </w:t>
+      </w:r>
+    </w:p>
+    <w:p>
+      <w:r>
+        <w:t>There must be a way to reduce time for repetitive manual data entries, keeping data in a centralized location versus having multiple versions of the same data (loss of data integrity), and a way to reduce dead space between handoffs for verifications.</w:t>
+      </w:r>
+    </w:p>
+    <w:p>
+      <w:pPr>
+        <w:rPr>
+          <w:u w:val="single"/>
+        </w:rPr>
+      </w:pPr>
+    </w:p>
+    <w:p>
+      <w:pPr>
+        <w:rPr>
+          <w:u w:val="single"/>
+        </w:rPr>
+      </w:pPr>
+      <w:r>
+        <w:rPr>
+          <w:u w:val="single"/>
+        </w:rPr>
+        <w:t xml:space="preserve">Diagnose Before Fixing </w:t>
+      </w:r>
+    </w:p>
+    <w:p>
+      <w:r>
+        <w:t xml:space="preserve">Is there a priority pipeline for the tasks we handle on a regular basis? </w:t>
+      </w:r>
+      <w:r>
+        <w:t xml:space="preserve">How would we define priority order? </w:t>
+      </w:r>
+      <w:r>
+        <w:t>This</w:t>
+      </w:r>
+      <w:r>
+        <w:t xml:space="preserve"> would provide direct guidance on which tasks to prioritize. Every partner service representative would be trained on how to support partners. Therefore, anyone would be able to jump in and complete tasks. I would request that documentation be built in to daily tasks for transparency and clarity of work being done.</w:t>
+      </w:r>
+    </w:p>
+    <w:p>
+      <w:r>
+        <w:t xml:space="preserve">Is there a system to track completion of types of work we do on a regular basis? Identifying the average completion time could help locate inefficiencies and be the start to reducing prolonged wait times. </w:t>
+      </w:r>
+    </w:p>
+    <w:p>
+      <w:r>
+        <w:t xml:space="preserve">Is there a way to have one location where partners info can be inputted and stored? Reducing multiple locations of the duplicate data could reduce confusion, support data security and accurate records. </w:t>
+      </w:r>
+    </w:p>
+    <w:p>
+      <w:r>
+        <w:t xml:space="preserve">Can we design some sort of ticketing system to organize regular work? This way tasks can live in a central place instead of being spread across email threads and teams messages. </w:t>
+      </w:r>
+      <w:r>
         <w:lastRenderedPageBreak/>
-        <w:t xml:space="preserve">There’s no tracker for how long requests are taking to process. That metric could be valuable in identifying bottle necks. </w:t>
-      </w:r>
-    </w:p>
-    <w:p>
-      <w:r>
-        <w:t>There must be a way to reduce time for repetitive manual data entries, keeping data in a centralized location versus having multiple versions of the same data (loss of data integrity), and a way to reduce dead space between handoffs for verifications.</w:t>
-      </w:r>
-    </w:p>
-    <w:p>
-      <w:pPr>
-        <w:rPr>
-          <w:u w:val="single"/>
-        </w:rPr>
-      </w:pPr>
-    </w:p>
-    <w:p>
-      <w:pPr>
-        <w:rPr>
-          <w:u w:val="single"/>
-        </w:rPr>
-      </w:pPr>
-      <w:r>
-        <w:rPr>
-          <w:u w:val="single"/>
-        </w:rPr>
-        <w:t xml:space="preserve">Diagnose Before Fixing </w:t>
-      </w:r>
-    </w:p>
-    <w:p>
-      <w:r>
-        <w:t xml:space="preserve">Is there a priority pipeline for the tasks we handle on a regular basis? </w:t>
-      </w:r>
-      <w:r>
-        <w:t xml:space="preserve">How would we define priority order? </w:t>
-      </w:r>
-      <w:r>
-        <w:t>This</w:t>
-      </w:r>
-      <w:r>
-        <w:t xml:space="preserve"> would provide direct guidance on which tasks to prioritize. Every partner service representative would be trained on how to support partners. Therefore, anyone would be able to jump in and complete tasks. I would request that documentation be built in to daily tasks for transparency and clarity of work being done.</w:t>
-      </w:r>
-    </w:p>
-    <w:p>
-      <w:r>
-        <w:t xml:space="preserve">Is there a system to track completion of types of work we do on a regular basis? Identifying the average completion time could help locate inefficiencies and be the start to reducing prolonged wait times. </w:t>
-      </w:r>
-    </w:p>
-    <w:p>
-      <w:r>
-        <w:t xml:space="preserve">Is there a way to have one location where partners info can be inputted and stored? Reducing multiple locations of the duplicate data could reduce confusion, support data security and accurate records. </w:t>
-      </w:r>
-    </w:p>
-    <w:p>
-      <w:r>
-        <w:t>Can we design some sort of ticketing system to organize regular work? This way tasks can live in a central place instead of being spread across email threads and teams messages. Maybe Teams can be utilized more like Slack; making quicker reference to projects and ideas: can Teams be utilized the same way?</w:t>
+        <w:t>Maybe Teams can be utilized more like Slack; making quicker reference to projects and ideas: can Teams be utilized the same way?</w:t>
       </w:r>
     </w:p>
     <w:p>
@@ -574,11 +663,7 @@
         </w:numPr>
       </w:pPr>
       <w:r>
-        <w:t xml:space="preserve">Understand and investigate the current process so that changes address the actual cause of a problem rather than an assumption. A good improvement should make </w:t>
-      </w:r>
-      <w:r>
-        <w:lastRenderedPageBreak/>
-        <w:t>the operation more effective without unnecessarily increasing workload, complexity, or friction for employees and partners.</w:t>
+        <w:t>Understand and investigate the current process so that changes address the actual cause of a problem rather than an assumption. A good improvement should make the operation more effective without unnecessarily increasing workload, complexity, or friction for employees and partners.</w:t>
       </w:r>
     </w:p>
     <w:p>
@@ -785,6 +870,7 @@
         </w:numPr>
       </w:pPr>
       <w:r>
+        <w:lastRenderedPageBreak/>
         <w:t xml:space="preserve">Apple watch activity: steps, calories burned, rings close rate </w:t>
       </w:r>
     </w:p>
@@ -911,7 +997,6 @@
         </w:numPr>
       </w:pPr>
       <w:r>
-        <w:lastRenderedPageBreak/>
         <w:t>I see multiple tables: income/expenses, debt, lab results, food log, exercise log, and sleep log</w:t>
       </w:r>
     </w:p>
@@ -1016,6 +1101,7 @@
     </w:p>
     <w:p>
       <w:r>
+        <w:lastRenderedPageBreak/>
         <w:t>Started with some join logic and difference between distinct and Group By in a CTE to achieve the same result</w:t>
       </w:r>
       <w:r>
@@ -1143,7 +1229,6 @@
     </w:p>
     <w:p>
       <w:r>
-        <w:lastRenderedPageBreak/>
         <w:t xml:space="preserve">When I started doing DoorDash, I wanted to find a way to earn more money in less time while also reducing unnecessary mileage and gas costs. </w:t>
       </w:r>
       <w:r>
@@ -1221,6 +1306,7 @@
     </w:p>
     <w:p>
       <w:r>
+        <w:lastRenderedPageBreak/>
         <w:t>That experience pushed me to go deeper into analytics. I started building my skills in SQL, Excel, Power BI, and more recently Python, and I found that I really enjoy using data to solve practical problems and improve how systems work.</w:t>
       </w:r>
     </w:p>
@@ -1305,7 +1391,6 @@
         <w:rPr>
           <w:u w:val="single"/>
         </w:rPr>
-        <w:lastRenderedPageBreak/>
         <w:t>9/11/2026</w:t>
       </w:r>
     </w:p>
@@ -1519,7 +1604,6 @@
         </w:numPr>
       </w:pPr>
       <w:r>
-        <w:lastRenderedPageBreak/>
         <w:t>Rank()</w:t>
       </w:r>
     </w:p>
@@ -2660,6 +2744,119 @@
     </w:lvl>
   </w:abstractNum>
   <w:abstractNum w:abstractNumId="9" w15:restartNumberingAfterBreak="0">
+    <w:nsid w:val="728228C6"/>
+    <w:multiLevelType w:val="hybridMultilevel"/>
+    <w:tmpl w:val="F0EC5204"/>
+    <w:lvl w:ilvl="0" w:tplc="04090001">
+      <w:start w:val="1"/>
+      <w:numFmt w:val="bullet"/>
+      <w:lvlText w:val=""/>
+      <w:lvlJc w:val="left"/>
+      <w:pPr>
+        <w:ind w:left="720" w:hanging="360"/>
+      </w:pPr>
+      <w:rPr>
+        <w:rFonts w:ascii="Symbol" w:hAnsi="Symbol" w:hint="default"/>
+      </w:rPr>
+    </w:lvl>
+    <w:lvl w:ilvl="1" w:tplc="04090003">
+      <w:start w:val="1"/>
+      <w:numFmt w:val="bullet"/>
+      <w:lvlText w:val="o"/>
+      <w:lvlJc w:val="left"/>
+      <w:pPr>
+        <w:ind w:left="1440" w:hanging="360"/>
+      </w:pPr>
+      <w:rPr>
+        <w:rFonts w:ascii="Courier New" w:hAnsi="Courier New" w:cs="Courier New" w:hint="default"/>
+      </w:rPr>
+    </w:lvl>
+    <w:lvl w:ilvl="2" w:tplc="04090005" w:tentative="1">
+      <w:start w:val="1"/>
+      <w:numFmt w:val="bullet"/>
+      <w:lvlText w:val=""/>
+      <w:lvlJc w:val="left"/>
+      <w:pPr>
+        <w:ind w:left="2160" w:hanging="360"/>
+      </w:pPr>
+      <w:rPr>
+        <w:rFonts w:ascii="Wingdings" w:hAnsi="Wingdings" w:hint="default"/>
+      </w:rPr>
+    </w:lvl>
+    <w:lvl w:ilvl="3" w:tplc="04090001" w:tentative="1">
+      <w:start w:val="1"/>
+      <w:numFmt w:val="bullet"/>
+      <w:lvlText w:val=""/>
+      <w:lvlJc w:val="left"/>
+      <w:pPr>
+        <w:ind w:left="2880" w:hanging="360"/>
+      </w:pPr>
+      <w:rPr>
+        <w:rFonts w:ascii="Symbol" w:hAnsi="Symbol" w:hint="default"/>
+      </w:rPr>
+    </w:lvl>
+    <w:lvl w:ilvl="4" w:tplc="04090003" w:tentative="1">
+      <w:start w:val="1"/>
+      <w:numFmt w:val="bullet"/>
+      <w:lvlText w:val="o"/>
+      <w:lvlJc w:val="left"/>
+      <w:pPr>
+        <w:ind w:left="3600" w:hanging="360"/>
+      </w:pPr>
+      <w:rPr>
+        <w:rFonts w:ascii="Courier New" w:hAnsi="Courier New" w:cs="Courier New" w:hint="default"/>
+      </w:rPr>
+    </w:lvl>
+    <w:lvl w:ilvl="5" w:tplc="04090005" w:tentative="1">
+      <w:start w:val="1"/>
+      <w:numFmt w:val="bullet"/>
+      <w:lvlText w:val=""/>
+      <w:lvlJc w:val="left"/>
+      <w:pPr>
+        <w:ind w:left="4320" w:hanging="360"/>
+      </w:pPr>
+      <w:rPr>
+        <w:rFonts w:ascii="Wingdings" w:hAnsi="Wingdings" w:hint="default"/>
+      </w:rPr>
+    </w:lvl>
+    <w:lvl w:ilvl="6" w:tplc="04090001" w:tentative="1">
+      <w:start w:val="1"/>
+      <w:numFmt w:val="bullet"/>
+      <w:lvlText w:val=""/>
+      <w:lvlJc w:val="left"/>
+      <w:pPr>
+        <w:ind w:left="5040" w:hanging="360"/>
+      </w:pPr>
+      <w:rPr>
+        <w:rFonts w:ascii="Symbol" w:hAnsi="Symbol" w:hint="default"/>
+      </w:rPr>
+    </w:lvl>
+    <w:lvl w:ilvl="7" w:tplc="04090003" w:tentative="1">
+      <w:start w:val="1"/>
+      <w:numFmt w:val="bullet"/>
+      <w:lvlText w:val="o"/>
+      <w:lvlJc w:val="left"/>
+      <w:pPr>
+        <w:ind w:left="5760" w:hanging="360"/>
+      </w:pPr>
+      <w:rPr>
+        <w:rFonts w:ascii="Courier New" w:hAnsi="Courier New" w:cs="Courier New" w:hint="default"/>
+      </w:rPr>
+    </w:lvl>
+    <w:lvl w:ilvl="8" w:tplc="04090005" w:tentative="1">
+      <w:start w:val="1"/>
+      <w:numFmt w:val="bullet"/>
+      <w:lvlText w:val=""/>
+      <w:lvlJc w:val="left"/>
+      <w:pPr>
+        <w:ind w:left="6480" w:hanging="360"/>
+      </w:pPr>
+      <w:rPr>
+        <w:rFonts w:ascii="Wingdings" w:hAnsi="Wingdings" w:hint="default"/>
+      </w:rPr>
+    </w:lvl>
+  </w:abstractNum>
+  <w:abstractNum w:abstractNumId="10" w15:restartNumberingAfterBreak="0">
     <w:nsid w:val="728D4BB8"/>
     <w:multiLevelType w:val="hybridMultilevel"/>
     <w:tmpl w:val="1E805820"/>
@@ -2800,6 +2997,9 @@
     <w:abstractNumId w:val="5"/>
   </w:num>
   <w:num w:numId="10" w16cid:durableId="1161777610">
+    <w:abstractNumId w:val="10"/>
+  </w:num>
+  <w:num w:numId="11" w16cid:durableId="898053499">
     <w:abstractNumId w:val="9"/>
   </w:num>
 </w:numbering>

</xml_diff>

<commit_message>
Practicing Python concepts and when to use them | More SQL decomposing.
</commit_message>
<xml_diff>
--- a/documentation/da-gym-doumentation .docx
+++ b/documentation/da-gym-doumentation .docx
@@ -25,6 +25,28 @@
         <w:rPr>
           <w:u w:val="single"/>
         </w:rPr>
+        <w:t>9/26/2026</w:t>
+      </w:r>
+    </w:p>
+    <w:p>
+      <w:r>
+        <w:t xml:space="preserve">Need to drill in the basic concepts of Python/Pandas. </w:t>
+      </w:r>
+      <w:r>
+        <w:t xml:space="preserve">Feels unfamiliar when using multiple concepts at once. </w:t>
+      </w:r>
+    </w:p>
+    <w:p/>
+    <w:p>
+      <w:pPr>
+        <w:rPr>
+          <w:u w:val="single"/>
+        </w:rPr>
+      </w:pPr>
+      <w:r>
+        <w:rPr>
+          <w:u w:val="single"/>
+        </w:rPr>
         <w:t>9/22/2026</w:t>
       </w:r>
     </w:p>
@@ -134,8 +156,29 @@
           <w:numId w:val="10"/>
         </w:numPr>
       </w:pPr>
-      <w:r>
-        <w:t>Df[“field”].isin([“record_a”,”record_b”])</w:t>
+      <w:proofErr w:type="spellStart"/>
+      <w:r>
+        <w:t>Df</w:t>
+      </w:r>
+      <w:proofErr w:type="spellEnd"/>
+      <w:r>
+        <w:t>[“field”].</w:t>
+      </w:r>
+      <w:proofErr w:type="spellStart"/>
+      <w:r>
+        <w:t>isin</w:t>
+      </w:r>
+      <w:proofErr w:type="spellEnd"/>
+      <w:r>
+        <w:t>([“record_a”,”</w:t>
+      </w:r>
+      <w:proofErr w:type="spellStart"/>
+      <w:r>
+        <w:t>record_b</w:t>
+      </w:r>
+      <w:proofErr w:type="spellEnd"/>
+      <w:r>
+        <w:t>”])</w:t>
       </w:r>
     </w:p>
     <w:p>
@@ -170,8 +213,13 @@
           <w:numId w:val="10"/>
         </w:numPr>
       </w:pPr>
-      <w:r>
-        <w:t>jobs.groupby("status")["salary"].mean()</w:t>
+      <w:proofErr w:type="spellStart"/>
+      <w:r>
+        <w:t>jobs.groupby</w:t>
+      </w:r>
+      <w:proofErr w:type="spellEnd"/>
+      <w:r>
+        <w:t>("status")["salary"].mean()</w:t>
       </w:r>
     </w:p>
     <w:p>
@@ -183,7 +231,15 @@
         </w:numPr>
       </w:pPr>
       <w:r>
-        <w:t>in the jobs df, group records by the different status records and show the average salary associated with each application status</w:t>
+        <w:t xml:space="preserve">in the jobs </w:t>
+      </w:r>
+      <w:proofErr w:type="spellStart"/>
+      <w:r>
+        <w:t>df</w:t>
+      </w:r>
+      <w:proofErr w:type="spellEnd"/>
+      <w:r>
+        <w:t>, group records by the different status records and show the average salary associated with each application status</w:t>
       </w:r>
     </w:p>
     <w:p>
@@ -206,8 +262,13 @@
           <w:numId w:val="10"/>
         </w:numPr>
       </w:pPr>
-      <w:r>
-        <w:t>jobs.merge(</w:t>
+      <w:proofErr w:type="spellStart"/>
+      <w:r>
+        <w:t>jobs.merge</w:t>
+      </w:r>
+      <w:proofErr w:type="spellEnd"/>
+      <w:r>
+        <w:t>(</w:t>
       </w:r>
     </w:p>
     <w:p>
@@ -231,7 +292,15 @@
         </w:numPr>
       </w:pPr>
       <w:r>
-        <w:t xml:space="preserve">    on="company_id",</w:t>
+        <w:t xml:space="preserve">    on="</w:t>
+      </w:r>
+      <w:proofErr w:type="spellStart"/>
+      <w:r>
+        <w:t>company_id</w:t>
+      </w:r>
+      <w:proofErr w:type="spellEnd"/>
+      <w:r>
+        <w:t>",</w:t>
       </w:r>
     </w:p>
     <w:p>
@@ -266,8 +335,30 @@
           <w:numId w:val="10"/>
         </w:numPr>
       </w:pPr>
-      <w:r>
-        <w:t>left_dataframe.merge(right_dataframe, on="key", how="join_type")</w:t>
+      <w:proofErr w:type="spellStart"/>
+      <w:r>
+        <w:lastRenderedPageBreak/>
+        <w:t>left_dataframe.merge</w:t>
+      </w:r>
+      <w:proofErr w:type="spellEnd"/>
+      <w:r>
+        <w:t>(</w:t>
+      </w:r>
+      <w:proofErr w:type="spellStart"/>
+      <w:r>
+        <w:t>right_dataframe</w:t>
+      </w:r>
+      <w:proofErr w:type="spellEnd"/>
+      <w:r>
+        <w:t>, on="key", how="</w:t>
+      </w:r>
+      <w:proofErr w:type="spellStart"/>
+      <w:r>
+        <w:t>join_type</w:t>
+      </w:r>
+      <w:proofErr w:type="spellEnd"/>
+      <w:r>
+        <w:t>")</w:t>
       </w:r>
     </w:p>
     <w:p>
@@ -290,7 +381,6 @@
     </w:p>
     <w:p>
       <w:r>
-        <w:lastRenderedPageBreak/>
         <w:t xml:space="preserve">Completed another round of simulated operational workflow/processes and how in regard to incomplete or missing items in a client’s delivery. </w:t>
       </w:r>
     </w:p>
@@ -524,6 +614,7 @@
     </w:p>
     <w:p>
       <w:r>
+        <w:lastRenderedPageBreak/>
         <w:t>Process: a dedicated or any available employee notices the email (seems random not standardized/ regularly scanned) and manually enters request into a shared Excel tracker. After that, an organization’s info is reviewed in the database (2</w:t>
       </w:r>
       <w:r>
@@ -533,101 +624,102 @@
         <w:t>nd</w:t>
       </w:r>
       <w:r>
-        <w:t xml:space="preserve"> home for the same information). If there is mission information, an employee has to reach back out to partner </w:t>
-      </w:r>
+        <w:t xml:space="preserve"> home for the same information). If there is mission information, an employee has to reach back out to partner for clarification; this back and forth potentially causes delays in updating partner information. After a response, there seems to not be a dedicated resolution because </w:t>
+      </w:r>
+      <w:r>
+        <w:t xml:space="preserve">sometimes the available employee will update the Excel or not (wtf, that’s </w:t>
+      </w:r>
+      <w:proofErr w:type="spellStart"/>
+      <w:r>
+        <w:t>there</w:t>
+      </w:r>
+      <w:proofErr w:type="spellEnd"/>
+      <w:r>
+        <w:t xml:space="preserve"> job). </w:t>
+      </w:r>
+    </w:p>
+    <w:p>
+      <w:r>
+        <w:t xml:space="preserve">Handoff: If changes require supervisor approval, staff must send a Teams message to super for review (an employee may or may not do this/ forgetful/ delayed request to super). Here’s what I don’t like: once a super reviews the request, they then have to message the employee back </w:t>
+      </w:r>
+      <w:r>
+        <w:t>for</w:t>
+      </w:r>
+      <w:r>
+        <w:t xml:space="preserve"> them to reach back out to the parter notifying completion of their update request. </w:t>
+      </w:r>
+    </w:p>
+    <w:p>
+      <w:r>
+        <w:t xml:space="preserve">Output: At the end of the month, the super must manually count completed rows in Excel to report completed request summary for the month. </w:t>
+      </w:r>
+      <w:r>
+        <w:t xml:space="preserve"> </w:t>
+      </w:r>
+    </w:p>
+    <w:p>
+      <w:r>
+        <w:t>Current Measurement: The only way to measure if the process was working well was if complaints about request-completion times were reduced.</w:t>
+      </w:r>
+    </w:p>
+    <w:p>
+      <w:r>
+        <w:t xml:space="preserve">There’s no tracker for how long requests are taking to process. That metric could be valuable in identifying bottle necks. </w:t>
+      </w:r>
+    </w:p>
+    <w:p>
+      <w:r>
+        <w:t>There must be a way to reduce time for repetitive manual data entries, keeping data in a centralized location versus having multiple versions of the same data (loss of data integrity), and a way to reduce dead space between handoffs for verifications.</w:t>
+      </w:r>
+    </w:p>
+    <w:p>
+      <w:pPr>
+        <w:rPr>
+          <w:u w:val="single"/>
+        </w:rPr>
+      </w:pPr>
+    </w:p>
+    <w:p>
+      <w:pPr>
+        <w:rPr>
+          <w:u w:val="single"/>
+        </w:rPr>
+      </w:pPr>
+      <w:r>
+        <w:rPr>
+          <w:u w:val="single"/>
+        </w:rPr>
+        <w:t xml:space="preserve">Diagnose Before Fixing </w:t>
+      </w:r>
+    </w:p>
+    <w:p>
+      <w:r>
+        <w:t xml:space="preserve">Is there a priority pipeline for the tasks we handle on a regular basis? </w:t>
+      </w:r>
+      <w:r>
+        <w:t xml:space="preserve">How would we define priority order? </w:t>
+      </w:r>
+      <w:r>
+        <w:t>This</w:t>
+      </w:r>
+      <w:r>
+        <w:t xml:space="preserve"> would provide direct guidance on which tasks to prioritize. Every partner service representative would be trained on how to support partners. Therefore, anyone would be able to jump in and complete tasks. I would request that documentation be built in to daily tasks for transparency and clarity of work being done.</w:t>
+      </w:r>
+    </w:p>
+    <w:p>
+      <w:r>
+        <w:t xml:space="preserve">Is there a system to track completion of types of work we do on a regular basis? Identifying the average completion time could help locate inefficiencies and be the start to reducing prolonged wait times. </w:t>
+      </w:r>
+    </w:p>
+    <w:p>
       <w:r>
         <w:lastRenderedPageBreak/>
-        <w:t xml:space="preserve">for clarification; this back and forth potentially causes delays in updating partner information. After a response, there seems to not be a dedicated resolution because </w:t>
-      </w:r>
-      <w:r>
-        <w:t xml:space="preserve">sometimes the available employee will update the Excel or not (wtf, that’s there job). </w:t>
-      </w:r>
-    </w:p>
-    <w:p>
-      <w:r>
-        <w:t xml:space="preserve">Handoff: If changes require supervisor approval, staff must send a Teams message to super for review (an employee may or may not do this/ forgetful/ delayed request to super). Here’s what I don’t like: once a super reviews the request, they then have to message the employee back </w:t>
-      </w:r>
-      <w:r>
-        <w:t>for</w:t>
-      </w:r>
-      <w:r>
-        <w:t xml:space="preserve"> them to reach back out to the parter notifying completion of their update request. </w:t>
-      </w:r>
-    </w:p>
-    <w:p>
-      <w:r>
-        <w:t xml:space="preserve">Output: At the end of the month, the super must manually count completed rows in Excel to report completed request summary for the month. </w:t>
-      </w:r>
-      <w:r>
-        <w:t xml:space="preserve"> </w:t>
-      </w:r>
-    </w:p>
-    <w:p>
-      <w:r>
-        <w:t>Current Measurement: The only way to measure if the process was working well was if complaints about request-completion times were reduced.</w:t>
-      </w:r>
-    </w:p>
-    <w:p>
-      <w:r>
-        <w:t xml:space="preserve">There’s no tracker for how long requests are taking to process. That metric could be valuable in identifying bottle necks. </w:t>
-      </w:r>
-    </w:p>
-    <w:p>
-      <w:r>
-        <w:t>There must be a way to reduce time for repetitive manual data entries, keeping data in a centralized location versus having multiple versions of the same data (loss of data integrity), and a way to reduce dead space between handoffs for verifications.</w:t>
-      </w:r>
-    </w:p>
-    <w:p>
-      <w:pPr>
-        <w:rPr>
-          <w:u w:val="single"/>
-        </w:rPr>
-      </w:pPr>
-    </w:p>
-    <w:p>
-      <w:pPr>
-        <w:rPr>
-          <w:u w:val="single"/>
-        </w:rPr>
-      </w:pPr>
-      <w:r>
-        <w:rPr>
-          <w:u w:val="single"/>
-        </w:rPr>
-        <w:t xml:space="preserve">Diagnose Before Fixing </w:t>
-      </w:r>
-    </w:p>
-    <w:p>
-      <w:r>
-        <w:t xml:space="preserve">Is there a priority pipeline for the tasks we handle on a regular basis? </w:t>
-      </w:r>
-      <w:r>
-        <w:t xml:space="preserve">How would we define priority order? </w:t>
-      </w:r>
-      <w:r>
-        <w:t>This</w:t>
-      </w:r>
-      <w:r>
-        <w:t xml:space="preserve"> would provide direct guidance on which tasks to prioritize. Every partner service representative would be trained on how to support partners. Therefore, anyone would be able to jump in and complete tasks. I would request that documentation be built in to daily tasks for transparency and clarity of work being done.</w:t>
-      </w:r>
-    </w:p>
-    <w:p>
-      <w:r>
-        <w:t xml:space="preserve">Is there a system to track completion of types of work we do on a regular basis? Identifying the average completion time could help locate inefficiencies and be the start to reducing prolonged wait times. </w:t>
-      </w:r>
-    </w:p>
-    <w:p>
-      <w:r>
         <w:t xml:space="preserve">Is there a way to have one location where partners info can be inputted and stored? Reducing multiple locations of the duplicate data could reduce confusion, support data security and accurate records. </w:t>
       </w:r>
     </w:p>
     <w:p>
       <w:r>
-        <w:t xml:space="preserve">Can we design some sort of ticketing system to organize regular work? This way tasks can live in a central place instead of being spread across email threads and teams messages. </w:t>
-      </w:r>
-      <w:r>
-        <w:lastRenderedPageBreak/>
-        <w:t>Maybe Teams can be utilized more like Slack; making quicker reference to projects and ideas: can Teams be utilized the same way?</w:t>
+        <w:t>Can we design some sort of ticketing system to organize regular work? This way tasks can live in a central place instead of being spread across email threads and teams messages. Maybe Teams can be utilized more like Slack; making quicker reference to projects and ideas: can Teams be utilized the same way?</w:t>
       </w:r>
     </w:p>
     <w:p>
@@ -651,7 +743,15 @@
     </w:p>
     <w:p>
       <w:r>
-        <w:t xml:space="preserve">we would want to provide relevant solutions instead of create unnecessary work for everyone. change can already be challenging, and if i propose solutions that create more problems that solve, that's very ineffective and bad for the team and clients. </w:t>
+        <w:t xml:space="preserve">we would want to provide relevant solutions instead of create unnecessary work for everyone. change can already be challenging, and if </w:t>
+      </w:r>
+      <w:proofErr w:type="spellStart"/>
+      <w:r>
+        <w:t>i</w:t>
+      </w:r>
+      <w:proofErr w:type="spellEnd"/>
+      <w:r>
+        <w:t xml:space="preserve"> propose solutions that create more problems that solve, that's very ineffective and bad for the team and clients. </w:t>
       </w:r>
     </w:p>
     <w:p>
@@ -798,6 +898,7 @@
         </w:numPr>
       </w:pPr>
       <w:r>
+        <w:lastRenderedPageBreak/>
         <w:t>What raw fields would we need to collect?</w:t>
       </w:r>
     </w:p>
@@ -870,7 +971,6 @@
         </w:numPr>
       </w:pPr>
       <w:r>
-        <w:lastRenderedPageBreak/>
         <w:t xml:space="preserve">Apple watch activity: steps, calories burned, rings close rate </w:t>
       </w:r>
     </w:p>
@@ -921,9 +1021,43 @@
           <w:numId w:val="8"/>
         </w:numPr>
       </w:pPr>
-      <w:r>
-        <w:t>transaction_date, amount, category, systolic_bp, diastolic_bp, lab_test_name, lab_value</w:t>
-      </w:r>
+      <w:proofErr w:type="spellStart"/>
+      <w:r>
+        <w:t>transaction_date</w:t>
+      </w:r>
+      <w:proofErr w:type="spellEnd"/>
+      <w:r>
+        <w:t xml:space="preserve">, amount, category, </w:t>
+      </w:r>
+      <w:proofErr w:type="spellStart"/>
+      <w:r>
+        <w:t>systolic_bp</w:t>
+      </w:r>
+      <w:proofErr w:type="spellEnd"/>
+      <w:r>
+        <w:t xml:space="preserve">, </w:t>
+      </w:r>
+      <w:proofErr w:type="spellStart"/>
+      <w:r>
+        <w:t>diastolic_bp</w:t>
+      </w:r>
+      <w:proofErr w:type="spellEnd"/>
+      <w:r>
+        <w:t xml:space="preserve">, </w:t>
+      </w:r>
+      <w:proofErr w:type="spellStart"/>
+      <w:r>
+        <w:t>lab_test_name</w:t>
+      </w:r>
+      <w:proofErr w:type="spellEnd"/>
+      <w:r>
+        <w:t xml:space="preserve">, </w:t>
+      </w:r>
+      <w:proofErr w:type="spellStart"/>
+      <w:r>
+        <w:t>lab_value</w:t>
+      </w:r>
+      <w:proofErr w:type="spellEnd"/>
     </w:p>
     <w:p>
       <w:pPr>
@@ -1077,6 +1211,7 @@
         </w:numPr>
       </w:pPr>
       <w:r>
+        <w:lastRenderedPageBreak/>
         <w:t>In SQL, that means decomposing the business question into grain, metrics, relationships, and required transformations before choosing the appropriate query logic.</w:t>
       </w:r>
     </w:p>
@@ -1101,7 +1236,6 @@
     </w:p>
     <w:p>
       <w:r>
-        <w:lastRenderedPageBreak/>
         <w:t>Started with some join logic and difference between distinct and Group By in a CTE to achieve the same result</w:t>
       </w:r>
       <w:r>
@@ -1284,6 +1418,7 @@
     </w:p>
     <w:p>
       <w:r>
+        <w:lastRenderedPageBreak/>
         <w:t xml:space="preserve">From running my own fitness business, I’ve always been interested in using metrics to improve results </w:t>
       </w:r>
       <w:r>
@@ -1306,7 +1441,6 @@
     </w:p>
     <w:p>
       <w:r>
-        <w:lastRenderedPageBreak/>
         <w:t>That experience pushed me to go deeper into analytics. I started building my skills in SQL, Excel, Power BI, and more recently Python, and I found that I really enjoy using data to solve practical problems and improve how systems work.</w:t>
       </w:r>
     </w:p>
@@ -1425,7 +1559,15 @@
     </w:p>
     <w:p>
       <w:r>
-        <w:t xml:space="preserve">Conducted Testing on everything I’ve learned so far, then updated oneNote. Focusing on knowing when to apply certain Window Functions based off of business needs. Growing past learning Window Functions in isolation. </w:t>
+        <w:t xml:space="preserve">Conducted Testing on everything I’ve learned so far, then updated </w:t>
+      </w:r>
+      <w:proofErr w:type="spellStart"/>
+      <w:r>
+        <w:t>oneNote</w:t>
+      </w:r>
+      <w:proofErr w:type="spellEnd"/>
+      <w:r>
+        <w:t xml:space="preserve">. Focusing on knowing when to apply certain Window Functions based off of business needs. Growing past learning Window Functions in isolation. </w:t>
       </w:r>
     </w:p>
     <w:p>
@@ -1443,10 +1585,24 @@
     </w:p>
     <w:p>
       <w:r>
+        <w:lastRenderedPageBreak/>
         <w:t xml:space="preserve">Learning </w:t>
       </w:r>
-      <w:r>
-        <w:t>First_Value() and Last_Value()</w:t>
+      <w:proofErr w:type="spellStart"/>
+      <w:r>
+        <w:t>First_Value</w:t>
+      </w:r>
+      <w:proofErr w:type="spellEnd"/>
+      <w:r>
+        <w:t xml:space="preserve">() and </w:t>
+      </w:r>
+      <w:proofErr w:type="spellStart"/>
+      <w:r>
+        <w:t>Last_Value</w:t>
+      </w:r>
+      <w:proofErr w:type="spellEnd"/>
+      <w:r>
+        <w:t>()</w:t>
       </w:r>
       <w:r>
         <w:t xml:space="preserve"> with Window Frames</w:t>
@@ -1591,8 +1747,13 @@
           <w:numId w:val="2"/>
         </w:numPr>
       </w:pPr>
-      <w:r>
-        <w:t>Row_Number()</w:t>
+      <w:proofErr w:type="spellStart"/>
+      <w:r>
+        <w:t>Row_Number</w:t>
+      </w:r>
+      <w:proofErr w:type="spellEnd"/>
+      <w:r>
+        <w:t>()</w:t>
       </w:r>
     </w:p>
     <w:p>
@@ -1615,8 +1776,13 @@
           <w:numId w:val="2"/>
         </w:numPr>
       </w:pPr>
-      <w:r>
-        <w:t>Dense_Rank()</w:t>
+      <w:proofErr w:type="spellStart"/>
+      <w:r>
+        <w:t>Dense_Rank</w:t>
+      </w:r>
+      <w:proofErr w:type="spellEnd"/>
+      <w:r>
+        <w:t>()</w:t>
       </w:r>
     </w:p>
     <w:p>
@@ -3608,6 +3774,7 @@
   <w:style w:type="character" w:default="1" w:styleId="DefaultParagraphFont">
     <w:name w:val="Default Paragraph Font"/>
     <w:uiPriority w:val="1"/>
+    <w:semiHidden/>
     <w:unhideWhenUsed/>
   </w:style>
   <w:style w:type="table" w:default="1" w:styleId="TableNormal">

</xml_diff>

<commit_message>
Refreshed on Excel: AVERAGEIF(),COUNTIF(), AND SUMIF(), and also what to use when there are multiple conditions.
</commit_message>
<xml_diff>
--- a/documentation/da-gym-doumentation .docx
+++ b/documentation/da-gym-doumentation .docx
@@ -25,6 +25,126 @@
         <w:rPr>
           <w:u w:val="single"/>
         </w:rPr>
+        <w:t>9/27/2026</w:t>
+      </w:r>
+    </w:p>
+    <w:p>
+      <w:r>
+        <w:t xml:space="preserve">Keep in mind for the </w:t>
+      </w:r>
+      <w:proofErr w:type="gramStart"/>
+      <w:r>
+        <w:t>Excel-Project</w:t>
+      </w:r>
+      <w:proofErr w:type="gramEnd"/>
+      <w:r>
+        <w:t xml:space="preserve">: separate tables to keep the workbook clean. For example, raw data | analysis | dashboard. </w:t>
+      </w:r>
+    </w:p>
+    <w:p>
+      <w:r>
+        <w:t>Same, Same, Same, but Different:</w:t>
+      </w:r>
+    </w:p>
+    <w:p>
+      <w:r>
+        <w:t>AVERAGEIF()/</w:t>
+      </w:r>
+      <w:proofErr w:type="gramStart"/>
+      <w:r>
+        <w:t>AVERAGEIFS(</w:t>
+      </w:r>
+      <w:proofErr w:type="gramEnd"/>
+      <w:r>
+        <w:t xml:space="preserve">) | </w:t>
+      </w:r>
+      <w:proofErr w:type="gramStart"/>
+      <w:r>
+        <w:t>COUNTIF(</w:t>
+      </w:r>
+      <w:proofErr w:type="gramEnd"/>
+      <w:r>
+        <w:t>)/COUNTIFS | SUMIF/SUMIFS</w:t>
+      </w:r>
+    </w:p>
+    <w:p>
+      <w:r>
+        <w:t>A</w:t>
+      </w:r>
+      <w:r>
+        <w:t>verage</w:t>
+      </w:r>
+      <w:r>
+        <w:t>/Count/Sum</w:t>
+      </w:r>
+      <w:r>
+        <w:t xml:space="preserve"> range first → criteria range → criteria → criteria range → criteria</w:t>
+      </w:r>
+    </w:p>
+    <w:p>
+      <w:r>
+        <w:drawing>
+          <wp:inline distT="0" distB="0" distL="0" distR="0" wp14:anchorId="384523BA" wp14:editId="7A8FC952">
+            <wp:extent cx="5943600" cy="5340350"/>
+            <wp:effectExtent l="0" t="0" r="0" b="0"/>
+            <wp:docPr id="1254813906" name="Picture 1"/>
+            <wp:cNvGraphicFramePr>
+              <a:graphicFrameLocks xmlns:a="http://schemas.openxmlformats.org/drawingml/2006/main" noChangeAspect="1"/>
+            </wp:cNvGraphicFramePr>
+            <a:graphic xmlns:a="http://schemas.openxmlformats.org/drawingml/2006/main">
+              <a:graphicData uri="http://schemas.openxmlformats.org/drawingml/2006/picture">
+                <pic:pic xmlns:pic="http://schemas.openxmlformats.org/drawingml/2006/picture">
+                  <pic:nvPicPr>
+                    <pic:cNvPr id="1254813906" name=""/>
+                    <pic:cNvPicPr/>
+                  </pic:nvPicPr>
+                  <pic:blipFill>
+                    <a:blip r:embed="rId5"/>
+                    <a:stretch>
+                      <a:fillRect/>
+                    </a:stretch>
+                  </pic:blipFill>
+                  <pic:spPr>
+                    <a:xfrm>
+                      <a:off x="0" y="0"/>
+                      <a:ext cx="5943600" cy="5340350"/>
+                    </a:xfrm>
+                    <a:prstGeom prst="rect">
+                      <a:avLst/>
+                    </a:prstGeom>
+                  </pic:spPr>
+                </pic:pic>
+              </a:graphicData>
+            </a:graphic>
+          </wp:inline>
+        </w:drawing>
+      </w:r>
+    </w:p>
+    <w:p>
+      <w:pPr>
+        <w:rPr>
+          <w:u w:val="single"/>
+        </w:rPr>
+      </w:pPr>
+    </w:p>
+    <w:p>
+      <w:pPr>
+        <w:rPr>
+          <w:u w:val="single"/>
+        </w:rPr>
+      </w:pPr>
+    </w:p>
+    <w:p>
+      <w:pPr>
+        <w:rPr>
+          <w:u w:val="single"/>
+        </w:rPr>
+      </w:pPr>
+      <w:r>
+        <w:rPr>
+          <w:u w:val="single"/>
+        </w:rPr>
+        <w:lastRenderedPageBreak/>
         <w:t>9/26/2026</w:t>
       </w:r>
     </w:p>
@@ -56,9 +176,11 @@
       </w:r>
     </w:p>
     <w:p>
+      <w:proofErr w:type="gramStart"/>
       <w:r>
         <w:t>jobs[</w:t>
       </w:r>
+      <w:proofErr w:type="gramEnd"/>
     </w:p>
     <w:p>
       <w:r>
@@ -145,7 +267,15 @@
         </w:numPr>
       </w:pPr>
       <w:r>
-        <w:t>Using Boolean Mask as a way to filter a selection within a field(s)</w:t>
+        <w:t xml:space="preserve">Using Boolean Mask </w:t>
+      </w:r>
+      <w:proofErr w:type="gramStart"/>
+      <w:r>
+        <w:t>as a way to</w:t>
+      </w:r>
+      <w:proofErr w:type="gramEnd"/>
+      <w:r>
+        <w:t xml:space="preserve"> filter a selection within a field(s)</w:t>
       </w:r>
     </w:p>
     <w:p>
@@ -162,19 +292,32 @@
       </w:r>
       <w:proofErr w:type="spellEnd"/>
       <w:r>
-        <w:t>[“field”].</w:t>
+        <w:t>[“field”</w:t>
+      </w:r>
+      <w:proofErr w:type="gramStart"/>
+      <w:r>
+        <w:t>].</w:t>
       </w:r>
       <w:proofErr w:type="spellStart"/>
       <w:r>
         <w:t>isin</w:t>
       </w:r>
       <w:proofErr w:type="spellEnd"/>
-      <w:r>
-        <w:t>([“record_a”,”</w:t>
+      <w:proofErr w:type="gramEnd"/>
+      <w:r>
+        <w:t>([“record_a”</w:t>
+      </w:r>
+      <w:proofErr w:type="gramStart"/>
+      <w:r>
+        <w:t>,”</w:t>
       </w:r>
       <w:proofErr w:type="spellStart"/>
       <w:r>
-        <w:t>record_b</w:t>
+        <w:t>record</w:t>
+      </w:r>
+      <w:proofErr w:type="gramEnd"/>
+      <w:r>
+        <w:t>_b</w:t>
       </w:r>
       <w:proofErr w:type="spellEnd"/>
       <w:r>
@@ -190,7 +333,23 @@
         </w:numPr>
       </w:pPr>
       <w:r>
-        <w:t>The method to find average is .mean() not avg()</w:t>
+        <w:t xml:space="preserve">The method to find average </w:t>
+      </w:r>
+      <w:proofErr w:type="gramStart"/>
+      <w:r>
+        <w:t>is .mean</w:t>
+      </w:r>
+      <w:proofErr w:type="gramEnd"/>
+      <w:r>
+        <w:t xml:space="preserve">() not </w:t>
+      </w:r>
+      <w:proofErr w:type="gramStart"/>
+      <w:r>
+        <w:t>avg(</w:t>
+      </w:r>
+      <w:proofErr w:type="gramEnd"/>
+      <w:r>
+        <w:t>)</w:t>
       </w:r>
     </w:p>
     <w:p>
@@ -201,8 +360,13 @@
           <w:numId w:val="10"/>
         </w:numPr>
       </w:pPr>
-      <w:r>
-        <w:t>Usually the method gets connected after the calculation</w:t>
+      <w:proofErr w:type="gramStart"/>
+      <w:r>
+        <w:t>Usually</w:t>
+      </w:r>
+      <w:proofErr w:type="gramEnd"/>
+      <w:r>
+        <w:t xml:space="preserve"> the method gets connected after the calculation</w:t>
       </w:r>
     </w:p>
     <w:p>
@@ -214,12 +378,30 @@
         </w:numPr>
       </w:pPr>
       <w:proofErr w:type="spellStart"/>
+      <w:proofErr w:type="gramStart"/>
       <w:r>
         <w:t>jobs.groupby</w:t>
       </w:r>
       <w:proofErr w:type="spellEnd"/>
-      <w:r>
-        <w:t>("status")["salary"].mean()</w:t>
+      <w:proofErr w:type="gramEnd"/>
+      <w:r>
+        <w:t>("status</w:t>
+      </w:r>
+      <w:proofErr w:type="gramStart"/>
+      <w:r>
+        <w:t>")[</w:t>
+      </w:r>
+      <w:proofErr w:type="gramEnd"/>
+      <w:r>
+        <w:t>"salary"</w:t>
+      </w:r>
+      <w:proofErr w:type="gramStart"/>
+      <w:r>
+        <w:t>].mean</w:t>
+      </w:r>
+      <w:proofErr w:type="gramEnd"/>
+      <w:r>
+        <w:t>()</w:t>
       </w:r>
     </w:p>
     <w:p>
@@ -251,7 +433,15 @@
         </w:numPr>
       </w:pPr>
       <w:r>
-        <w:t xml:space="preserve">To join data frames in Pandas, use .merge() </w:t>
+        <w:t xml:space="preserve">To join data frames in Pandas, </w:t>
+      </w:r>
+      <w:proofErr w:type="gramStart"/>
+      <w:r>
+        <w:t>use .merge</w:t>
+      </w:r>
+      <w:proofErr w:type="gramEnd"/>
+      <w:r>
+        <w:t xml:space="preserve">() </w:t>
       </w:r>
     </w:p>
     <w:p>
@@ -263,10 +453,12 @@
         </w:numPr>
       </w:pPr>
       <w:proofErr w:type="spellStart"/>
+      <w:proofErr w:type="gramStart"/>
       <w:r>
         <w:t>jobs.merge</w:t>
       </w:r>
       <w:proofErr w:type="spellEnd"/>
+      <w:proofErr w:type="gramEnd"/>
       <w:r>
         <w:t>(</w:t>
       </w:r>
@@ -337,40 +529,45 @@
       </w:pPr>
       <w:proofErr w:type="spellStart"/>
       <w:r>
+        <w:t>left_</w:t>
+      </w:r>
+      <w:proofErr w:type="gramStart"/>
+      <w:r>
+        <w:t>dataframe.merge</w:t>
+      </w:r>
+      <w:proofErr w:type="spellEnd"/>
+      <w:proofErr w:type="gramEnd"/>
+      <w:r>
+        <w:t>(</w:t>
+      </w:r>
+      <w:proofErr w:type="spellStart"/>
+      <w:r>
+        <w:t>right_dataframe</w:t>
+      </w:r>
+      <w:proofErr w:type="spellEnd"/>
+      <w:r>
+        <w:t>, on="key", how="</w:t>
+      </w:r>
+      <w:proofErr w:type="spellStart"/>
+      <w:r>
+        <w:t>join_type</w:t>
+      </w:r>
+      <w:proofErr w:type="spellEnd"/>
+      <w:r>
+        <w:t>")</w:t>
+      </w:r>
+    </w:p>
+    <w:p>
+      <w:pPr>
+        <w:rPr>
+          <w:u w:val="single"/>
+        </w:rPr>
+      </w:pPr>
+      <w:r>
+        <w:rPr>
+          <w:u w:val="single"/>
+        </w:rPr>
         <w:lastRenderedPageBreak/>
-        <w:t>left_dataframe.merge</w:t>
-      </w:r>
-      <w:proofErr w:type="spellEnd"/>
-      <w:r>
-        <w:t>(</w:t>
-      </w:r>
-      <w:proofErr w:type="spellStart"/>
-      <w:r>
-        <w:t>right_dataframe</w:t>
-      </w:r>
-      <w:proofErr w:type="spellEnd"/>
-      <w:r>
-        <w:t>, on="key", how="</w:t>
-      </w:r>
-      <w:proofErr w:type="spellStart"/>
-      <w:r>
-        <w:t>join_type</w:t>
-      </w:r>
-      <w:proofErr w:type="spellEnd"/>
-      <w:r>
-        <w:t>")</w:t>
-      </w:r>
-    </w:p>
-    <w:p>
-      <w:pPr>
-        <w:rPr>
-          <w:u w:val="single"/>
-        </w:rPr>
-      </w:pPr>
-      <w:r>
-        <w:rPr>
-          <w:u w:val="single"/>
-        </w:rPr>
         <w:t>9/17/2026</w:t>
       </w:r>
     </w:p>
@@ -381,7 +578,15 @@
     </w:p>
     <w:p>
       <w:r>
-        <w:t xml:space="preserve">Completed another round of simulated operational workflow/processes and how in regard to incomplete or missing items in a client’s delivery. </w:t>
+        <w:t xml:space="preserve">Completed another round of simulated operational workflow/processes and how </w:t>
+      </w:r>
+      <w:proofErr w:type="gramStart"/>
+      <w:r>
+        <w:t>in regard to</w:t>
+      </w:r>
+      <w:proofErr w:type="gramEnd"/>
+      <w:r>
+        <w:t xml:space="preserve"> incomplete or missing items in a client’s delivery. </w:t>
       </w:r>
     </w:p>
     <w:p>
@@ -405,7 +610,15 @@
     </w:p>
     <w:p>
       <w:r>
-        <w:t xml:space="preserve">Today, we are pivoting and taking a different approach to my development in light of a new position I’d be starting in a couple weeks. </w:t>
+        <w:t xml:space="preserve">Today, we are pivoting and taking a different approach to my development </w:t>
+      </w:r>
+      <w:proofErr w:type="gramStart"/>
+      <w:r>
+        <w:t>in light of</w:t>
+      </w:r>
+      <w:proofErr w:type="gramEnd"/>
+      <w:r>
+        <w:t xml:space="preserve"> a new position I’d be starting in a couple weeks. </w:t>
       </w:r>
     </w:p>
     <w:p>
@@ -441,6 +654,7 @@
         </w:rPr>
         <w:t xml:space="preserve">why </w:t>
       </w:r>
+      <w:proofErr w:type="gramStart"/>
       <w:r>
         <w:rPr>
           <w:b/>
@@ -453,7 +667,15 @@
           <w:b/>
           <w:bCs/>
         </w:rPr>
-        <w:t xml:space="preserve"> exist in the first place.</w:t>
+        <w:t xml:space="preserve"> exist</w:t>
+      </w:r>
+      <w:proofErr w:type="gramEnd"/>
+      <w:r>
+        <w:rPr>
+          <w:b/>
+          <w:bCs/>
+        </w:rPr>
+        <w:t xml:space="preserve"> in the first place.</w:t>
       </w:r>
     </w:p>
     <w:p>
@@ -475,7 +697,23 @@
           <w:b/>
           <w:bCs/>
         </w:rPr>
-        <w:t>How does this actually work?</w:t>
+        <w:t xml:space="preserve">How does this </w:t>
+      </w:r>
+      <w:proofErr w:type="gramStart"/>
+      <w:r>
+        <w:rPr>
+          <w:b/>
+          <w:bCs/>
+        </w:rPr>
+        <w:t>actually work</w:t>
+      </w:r>
+      <w:proofErr w:type="gramEnd"/>
+      <w:r>
+        <w:rPr>
+          <w:b/>
+          <w:bCs/>
+        </w:rPr>
+        <w:t>?</w:t>
       </w:r>
     </w:p>
     <w:p/>
@@ -562,7 +800,23 @@
         <w:t>Output:</w:t>
       </w:r>
       <w:r>
-        <w:t xml:space="preserve"> What does "finished" actually mean?</w:t>
+        <w:t xml:space="preserve"> What does "</w:t>
+      </w:r>
+      <w:proofErr w:type="gramStart"/>
+      <w:r>
+        <w:t>finished</w:t>
+      </w:r>
+      <w:proofErr w:type="gramEnd"/>
+      <w:r>
+        <w:t xml:space="preserve">" </w:t>
+      </w:r>
+      <w:proofErr w:type="gramStart"/>
+      <w:r>
+        <w:t>actually mean</w:t>
+      </w:r>
+      <w:proofErr w:type="gramEnd"/>
+      <w:r>
+        <w:t>?</w:t>
       </w:r>
     </w:p>
     <w:p>
@@ -624,23 +878,49 @@
         <w:t>nd</w:t>
       </w:r>
       <w:r>
-        <w:t xml:space="preserve"> home for the same information). If there is mission information, an employee has to reach back out to partner for clarification; this back and forth potentially causes delays in updating partner information. After a response, there seems to not be a dedicated resolution because </w:t>
+        <w:t xml:space="preserve"> home for the same information). If there is mission information, an employee </w:t>
+      </w:r>
+      <w:proofErr w:type="gramStart"/>
+      <w:r>
+        <w:t>has to</w:t>
+      </w:r>
+      <w:proofErr w:type="gramEnd"/>
+      <w:r>
+        <w:t xml:space="preserve"> </w:t>
+      </w:r>
+      <w:proofErr w:type="gramStart"/>
+      <w:r>
+        <w:t>reach back</w:t>
+      </w:r>
+      <w:proofErr w:type="gramEnd"/>
+      <w:r>
+        <w:t xml:space="preserve"> out to partner for clarification; this back and forth potentially causes delays in updating partner information. After a response, there seems to not be a dedicated resolution because </w:t>
       </w:r>
       <w:r>
         <w:t xml:space="preserve">sometimes the available employee will update the Excel or not (wtf, that’s </w:t>
       </w:r>
       <w:proofErr w:type="spellStart"/>
+      <w:proofErr w:type="gramStart"/>
       <w:r>
         <w:t>there</w:t>
       </w:r>
       <w:proofErr w:type="spellEnd"/>
+      <w:proofErr w:type="gramEnd"/>
       <w:r>
         <w:t xml:space="preserve"> job). </w:t>
       </w:r>
     </w:p>
     <w:p>
       <w:r>
-        <w:t xml:space="preserve">Handoff: If changes require supervisor approval, staff must send a Teams message to super for review (an employee may or may not do this/ forgetful/ delayed request to super). Here’s what I don’t like: once a super reviews the request, they then have to message the employee back </w:t>
+        <w:t xml:space="preserve">Handoff: If changes require supervisor approval, staff must send a Teams message to super for review (an employee may or may not do this/ forgetful/ delayed request to super). Here’s what I don’t like: once a super reviews the request, they then </w:t>
+      </w:r>
+      <w:proofErr w:type="gramStart"/>
+      <w:r>
+        <w:t>have to</w:t>
+      </w:r>
+      <w:proofErr w:type="gramEnd"/>
+      <w:r>
+        <w:t xml:space="preserve"> message the employee back </w:t>
       </w:r>
       <w:r>
         <w:t>for</w:t>
@@ -664,7 +944,15 @@
     </w:p>
     <w:p>
       <w:r>
-        <w:t xml:space="preserve">There’s no tracker for how long requests are taking to process. That metric could be valuable in identifying bottle necks. </w:t>
+        <w:t xml:space="preserve">There’s no tracker for how long requests </w:t>
+      </w:r>
+      <w:proofErr w:type="gramStart"/>
+      <w:r>
+        <w:t>are</w:t>
+      </w:r>
+      <w:proofErr w:type="gramEnd"/>
+      <w:r>
+        <w:t xml:space="preserve"> taking to process. That metric could be valuable in identifying bottle necks. </w:t>
       </w:r>
     </w:p>
     <w:p>
@@ -703,7 +991,23 @@
         <w:t>This</w:t>
       </w:r>
       <w:r>
-        <w:t xml:space="preserve"> would provide direct guidance on which tasks to prioritize. Every partner service representative would be trained on how to support partners. Therefore, anyone would be able to jump in and complete tasks. I would request that documentation be built in to daily tasks for transparency and clarity of work being done.</w:t>
+        <w:t xml:space="preserve"> would provide direct guidance on which tasks to prioritize. Every partner service representative would be trained </w:t>
+      </w:r>
+      <w:proofErr w:type="gramStart"/>
+      <w:r>
+        <w:t>on</w:t>
+      </w:r>
+      <w:proofErr w:type="gramEnd"/>
+      <w:r>
+        <w:t xml:space="preserve"> how to support partners. Therefore, anyone would be able to jump in and complete tasks. I would request that documentation be built </w:t>
+      </w:r>
+      <w:proofErr w:type="gramStart"/>
+      <w:r>
+        <w:t>in to</w:t>
+      </w:r>
+      <w:proofErr w:type="gramEnd"/>
+      <w:r>
+        <w:t xml:space="preserve"> daily tasks for transparency and clarity of work being done.</w:t>
       </w:r>
     </w:p>
     <w:p>
@@ -714,12 +1018,28 @@
     <w:p>
       <w:r>
         <w:lastRenderedPageBreak/>
-        <w:t xml:space="preserve">Is there a way to have one location where partners info can be inputted and stored? Reducing multiple locations of the duplicate data could reduce confusion, support data security and accurate records. </w:t>
-      </w:r>
-    </w:p>
-    <w:p>
-      <w:r>
-        <w:t>Can we design some sort of ticketing system to organize regular work? This way tasks can live in a central place instead of being spread across email threads and teams messages. Maybe Teams can be utilized more like Slack; making quicker reference to projects and ideas: can Teams be utilized the same way?</w:t>
+        <w:t xml:space="preserve">Is there a way to have one location where </w:t>
+      </w:r>
+      <w:proofErr w:type="gramStart"/>
+      <w:r>
+        <w:t>partners</w:t>
+      </w:r>
+      <w:proofErr w:type="gramEnd"/>
+      <w:r>
+        <w:t xml:space="preserve"> info can be inputted and stored? Reducing multiple locations of the duplicate data could reduce confusion, support data security and accurate records. </w:t>
+      </w:r>
+    </w:p>
+    <w:p>
+      <w:r>
+        <w:t xml:space="preserve">Can we design some sort of ticketing system to organize regular work? This way tasks can live in a central place instead of being spread across email threads and </w:t>
+      </w:r>
+      <w:proofErr w:type="gramStart"/>
+      <w:r>
+        <w:t>teams</w:t>
+      </w:r>
+      <w:proofErr w:type="gramEnd"/>
+      <w:r>
+        <w:t xml:space="preserve"> messages. Maybe Teams can be utilized more like Slack; making quicker reference to projects and ideas: can Teams be utilized the same way?</w:t>
       </w:r>
     </w:p>
     <w:p>
@@ -742,14 +1062,40 @@
       </w:r>
     </w:p>
     <w:p>
-      <w:r>
-        <w:t xml:space="preserve">we would want to provide relevant solutions instead of create unnecessary work for everyone. change can already be challenging, and if </w:t>
+      <w:proofErr w:type="gramStart"/>
+      <w:r>
+        <w:t>we</w:t>
+      </w:r>
+      <w:proofErr w:type="gramEnd"/>
+      <w:r>
+        <w:t xml:space="preserve"> would want to provide relevant solutions instead of </w:t>
+      </w:r>
+      <w:proofErr w:type="gramStart"/>
+      <w:r>
+        <w:t>create</w:t>
+      </w:r>
+      <w:proofErr w:type="gramEnd"/>
+      <w:r>
+        <w:t xml:space="preserve"> unnecessary work for everyone. </w:t>
+      </w:r>
+      <w:proofErr w:type="gramStart"/>
+      <w:r>
+        <w:t>change</w:t>
+      </w:r>
+      <w:proofErr w:type="gramEnd"/>
+      <w:r>
+        <w:t xml:space="preserve"> can already be challenging, and </w:t>
+      </w:r>
+      <w:proofErr w:type="gramStart"/>
+      <w:r>
+        <w:t xml:space="preserve">if </w:t>
       </w:r>
       <w:proofErr w:type="spellStart"/>
       <w:r>
         <w:t>i</w:t>
       </w:r>
       <w:proofErr w:type="spellEnd"/>
+      <w:proofErr w:type="gramEnd"/>
       <w:r>
         <w:t xml:space="preserve"> propose solutions that create more problems that solve, that's very ineffective and bad for the team and clients. </w:t>
       </w:r>
@@ -793,7 +1139,15 @@
         </w:numPr>
       </w:pPr>
       <w:r>
-        <w:t xml:space="preserve">What business/user question are we actually trying to answer? </w:t>
+        <w:t xml:space="preserve">What business/user question are we </w:t>
+      </w:r>
+      <w:proofErr w:type="gramStart"/>
+      <w:r>
+        <w:t>actually trying</w:t>
+      </w:r>
+      <w:proofErr w:type="gramEnd"/>
+      <w:r>
+        <w:t xml:space="preserve"> to answer? </w:t>
       </w:r>
     </w:p>
     <w:p>
@@ -959,7 +1313,15 @@
         </w:numPr>
       </w:pPr>
       <w:r>
-        <w:t xml:space="preserve">Food log </w:t>
+        <w:t xml:space="preserve">Food </w:t>
+      </w:r>
+      <w:proofErr w:type="gramStart"/>
+      <w:r>
+        <w:t>log</w:t>
+      </w:r>
+      <w:proofErr w:type="gramEnd"/>
+      <w:r>
+        <w:t xml:space="preserve"> </w:t>
       </w:r>
     </w:p>
     <w:p>
@@ -995,8 +1357,13 @@
         </w:numPr>
       </w:pPr>
       <w:r>
-        <w:t>Sleep log</w:t>
-      </w:r>
+        <w:t xml:space="preserve">Sleep </w:t>
+      </w:r>
+      <w:proofErr w:type="gramStart"/>
+      <w:r>
+        <w:t>log</w:t>
+      </w:r>
+      <w:proofErr w:type="gramEnd"/>
       <w:r>
         <w:t xml:space="preserve"> </w:t>
       </w:r>
@@ -1068,7 +1435,15 @@
         </w:numPr>
       </w:pPr>
       <w:r>
-        <w:t>What would the grain of the exercise data be?</w:t>
+        <w:t xml:space="preserve">What would the grain of the exercise data </w:t>
+      </w:r>
+      <w:proofErr w:type="gramStart"/>
+      <w:r>
+        <w:t>be</w:t>
+      </w:r>
+      <w:proofErr w:type="gramEnd"/>
+      <w:r>
+        <w:t>?</w:t>
       </w:r>
     </w:p>
     <w:p>
@@ -1169,7 +1544,15 @@
         </w:numPr>
       </w:pPr>
       <w:r>
-        <w:t>Need to change grain first? Think CTE/subquery.</w:t>
+        <w:t xml:space="preserve">Need to change grain first? </w:t>
+      </w:r>
+      <w:proofErr w:type="gramStart"/>
+      <w:r>
+        <w:t>Think</w:t>
+      </w:r>
+      <w:proofErr w:type="gramEnd"/>
+      <w:r>
+        <w:t xml:space="preserve"> CTE/subquery.</w:t>
       </w:r>
     </w:p>
     <w:p>
@@ -1187,8 +1570,13 @@
       <w:r>
         <w:t xml:space="preserve">Getting used to </w:t>
       </w:r>
-      <w:r>
-        <w:t>decomposing the</w:t>
+      <w:proofErr w:type="gramStart"/>
+      <w:r>
+        <w:t>decomposing</w:t>
+      </w:r>
+      <w:proofErr w:type="gramEnd"/>
+      <w:r>
+        <w:t xml:space="preserve"> the</w:t>
       </w:r>
       <w:r>
         <w:t xml:space="preserve"> </w:t>
@@ -1236,7 +1624,15 @@
     </w:p>
     <w:p>
       <w:r>
-        <w:t>Started with some join logic and difference between distinct and Group By in a CTE to achieve the same result</w:t>
+        <w:t xml:space="preserve">Started with some join logic and difference between distinct and Group </w:t>
+      </w:r>
+      <w:proofErr w:type="gramStart"/>
+      <w:r>
+        <w:t>By</w:t>
+      </w:r>
+      <w:proofErr w:type="gramEnd"/>
+      <w:r>
+        <w:t xml:space="preserve"> in a CTE to achieve the same result</w:t>
       </w:r>
       <w:r>
         <w:t xml:space="preserve">; CTE above/below average comparisons. </w:t>
@@ -1301,7 +1697,15 @@
         <w:t>Analysis:</w:t>
       </w:r>
       <w:r>
-        <w:t xml:space="preserve"> what did you actually do with the data? </w:t>
+        <w:t xml:space="preserve"> what did you </w:t>
+      </w:r>
+      <w:proofErr w:type="gramStart"/>
+      <w:r>
+        <w:t>actually do</w:t>
+      </w:r>
+      <w:proofErr w:type="gramEnd"/>
+      <w:r>
+        <w:t xml:space="preserve"> with the data? </w:t>
       </w:r>
     </w:p>
     <w:p>
@@ -1380,7 +1784,15 @@
         <w:t>trends</w:t>
       </w:r>
       <w:r>
-        <w:t xml:space="preserve"> when I was most efficient and which shifts were actually worth my time.</w:t>
+        <w:t xml:space="preserve"> when I was most efficient and which shifts were </w:t>
+      </w:r>
+      <w:proofErr w:type="gramStart"/>
+      <w:r>
+        <w:t>actually worth</w:t>
+      </w:r>
+      <w:proofErr w:type="gramEnd"/>
+      <w:r>
+        <w:t xml:space="preserve"> my time.</w:t>
       </w:r>
     </w:p>
     <w:p>
@@ -1436,7 +1848,23 @@
     </w:p>
     <w:p>
       <w:r>
-        <w:t>When I transitioned to Three Square as a Nutrition Education Specialist, I was regularly reviewing performance metrics, improving processes, and using data to help support health and operational goals for the Las Vegas community.</w:t>
+        <w:t xml:space="preserve">When I transitioned to Three Square as a Nutrition Education Specialist, </w:t>
+      </w:r>
+      <w:proofErr w:type="gramStart"/>
+      <w:r>
+        <w:t>I was</w:t>
+      </w:r>
+      <w:proofErr w:type="gramEnd"/>
+      <w:r>
+        <w:t xml:space="preserve"> regularly </w:t>
+      </w:r>
+      <w:proofErr w:type="gramStart"/>
+      <w:r>
+        <w:t>reviewing</w:t>
+      </w:r>
+      <w:proofErr w:type="gramEnd"/>
+      <w:r>
+        <w:t xml:space="preserve"> performance metrics, improving processes, and using data to help support health and operational goals for the Las Vegas community.</w:t>
       </w:r>
     </w:p>
     <w:p>
@@ -1474,8 +1902,13 @@
           <w:numId w:val="4"/>
         </w:numPr>
       </w:pPr>
-      <w:r>
-        <w:t xml:space="preserve">a CTE can create a new state-level dataset </w:t>
+      <w:proofErr w:type="gramStart"/>
+      <w:r>
+        <w:t>a CTE</w:t>
+      </w:r>
+      <w:proofErr w:type="gramEnd"/>
+      <w:r>
+        <w:t xml:space="preserve"> can create a new state-level dataset </w:t>
       </w:r>
     </w:p>
     <w:p>
@@ -1510,8 +1943,13 @@
           <w:numId w:val="4"/>
         </w:numPr>
       </w:pPr>
-      <w:r>
-        <w:t>the outer query can compare each row against an aggregate of the CTE</w:t>
+      <w:proofErr w:type="gramStart"/>
+      <w:r>
+        <w:t>the</w:t>
+      </w:r>
+      <w:proofErr w:type="gramEnd"/>
+      <w:r>
+        <w:t xml:space="preserve"> outer query can compare each row against an aggregate of the CTE</w:t>
       </w:r>
     </w:p>
     <w:p/>
@@ -1530,7 +1968,15 @@
     </w:p>
     <w:p>
       <w:r>
-        <w:t xml:space="preserve">Went over concepts of joins. Instead of syntaxes in isolation, my goal is to understand purpose and function of SQL concepts, but also develop the ability to apply them to various scenarios; effective application within real world. </w:t>
+        <w:t xml:space="preserve">Went over concepts of joins. Instead of syntaxes in isolation, my goal is to understand purpose and function of SQL </w:t>
+      </w:r>
+      <w:proofErr w:type="gramStart"/>
+      <w:r>
+        <w:t>concepts, but</w:t>
+      </w:r>
+      <w:proofErr w:type="gramEnd"/>
+      <w:r>
+        <w:t xml:space="preserve"> also develop the ability to apply them to various scenarios; effective application within real world. </w:t>
       </w:r>
     </w:p>
     <w:p>
@@ -1567,7 +2013,15 @@
       </w:r>
       <w:proofErr w:type="spellEnd"/>
       <w:r>
-        <w:t xml:space="preserve">. Focusing on knowing when to apply certain Window Functions based off of business needs. Growing past learning Window Functions in isolation. </w:t>
+        <w:t xml:space="preserve">. Focusing on knowing when to apply certain Window Functions based </w:t>
+      </w:r>
+      <w:proofErr w:type="gramStart"/>
+      <w:r>
+        <w:t>off of</w:t>
+      </w:r>
+      <w:proofErr w:type="gramEnd"/>
+      <w:r>
+        <w:t xml:space="preserve"> business needs. Growing past learning Window Functions in isolation. </w:t>
       </w:r>
     </w:p>
     <w:p>
@@ -1590,19 +2044,35 @@
       </w:r>
       <w:proofErr w:type="spellStart"/>
       <w:r>
-        <w:t>First_Value</w:t>
+        <w:t>First_</w:t>
+      </w:r>
+      <w:proofErr w:type="gramStart"/>
+      <w:r>
+        <w:t>Value</w:t>
       </w:r>
       <w:proofErr w:type="spellEnd"/>
       <w:r>
-        <w:t xml:space="preserve">() and </w:t>
+        <w:t>(</w:t>
+      </w:r>
+      <w:proofErr w:type="gramEnd"/>
+      <w:r>
+        <w:t xml:space="preserve">) and </w:t>
       </w:r>
       <w:proofErr w:type="spellStart"/>
       <w:r>
-        <w:t>Last_Value</w:t>
+        <w:t>Last_</w:t>
+      </w:r>
+      <w:proofErr w:type="gramStart"/>
+      <w:r>
+        <w:t>Value</w:t>
       </w:r>
       <w:proofErr w:type="spellEnd"/>
       <w:r>
-        <w:t>()</w:t>
+        <w:t>(</w:t>
+      </w:r>
+      <w:proofErr w:type="gramEnd"/>
+      <w:r>
+        <w:t>)</w:t>
       </w:r>
       <w:r>
         <w:t xml:space="preserve"> with Window Frames</w:t>
@@ -1617,7 +2087,23 @@
         </w:numPr>
       </w:pPr>
       <w:r>
-        <w:t>Business-wise, FIRST_VALUE() is useful for comparing current performance to a starting baseline, while LAST_VALUE() is useful for comparing rows to the final value in a defined sequence.</w:t>
+        <w:t>Business-wise, FIRST_</w:t>
+      </w:r>
+      <w:proofErr w:type="gramStart"/>
+      <w:r>
+        <w:t>VALUE(</w:t>
+      </w:r>
+      <w:proofErr w:type="gramEnd"/>
+      <w:r>
+        <w:t>) is useful for comparing current performance to a starting baseline, while LAST_</w:t>
+      </w:r>
+      <w:proofErr w:type="gramStart"/>
+      <w:r>
+        <w:t>VALUE(</w:t>
+      </w:r>
+      <w:proofErr w:type="gramEnd"/>
+      <w:r>
+        <w:t>) is useful for comparing rows to the final value in a defined sequence.</w:t>
       </w:r>
     </w:p>
     <w:p>
@@ -1648,7 +2134,15 @@
     </w:p>
     <w:p>
       <w:r>
-        <w:t>Practiced Lag() – Value/Navigation windows</w:t>
+        <w:t xml:space="preserve">Practiced </w:t>
+      </w:r>
+      <w:proofErr w:type="gramStart"/>
+      <w:r>
+        <w:t>Lag(</w:t>
+      </w:r>
+      <w:proofErr w:type="gramEnd"/>
+      <w:r>
+        <w:t>) – Value/Navigation windows</w:t>
       </w:r>
     </w:p>
     <w:p>
@@ -1697,7 +2191,15 @@
         </w:numPr>
       </w:pPr>
       <w:r>
-        <w:t>Partition By()</w:t>
+        <w:t xml:space="preserve">Partition </w:t>
+      </w:r>
+      <w:proofErr w:type="gramStart"/>
+      <w:r>
+        <w:t>By(</w:t>
+      </w:r>
+      <w:proofErr w:type="gramEnd"/>
+      <w:r>
+        <w:t>)</w:t>
       </w:r>
     </w:p>
     <w:p>
@@ -1724,7 +2226,15 @@
         </w:numPr>
       </w:pPr>
       <w:r>
-        <w:t>Order By()</w:t>
+        <w:t xml:space="preserve">Order </w:t>
+      </w:r>
+      <w:proofErr w:type="gramStart"/>
+      <w:r>
+        <w:t>By(</w:t>
+      </w:r>
+      <w:proofErr w:type="gramEnd"/>
+      <w:r>
+        <w:t>)</w:t>
       </w:r>
     </w:p>
     <w:p>
@@ -1749,11 +2259,19 @@
       </w:pPr>
       <w:proofErr w:type="spellStart"/>
       <w:r>
-        <w:t>Row_Number</w:t>
+        <w:t>Row_</w:t>
+      </w:r>
+      <w:proofErr w:type="gramStart"/>
+      <w:r>
+        <w:t>Number</w:t>
       </w:r>
       <w:proofErr w:type="spellEnd"/>
       <w:r>
-        <w:t>()</w:t>
+        <w:t>(</w:t>
+      </w:r>
+      <w:proofErr w:type="gramEnd"/>
+      <w:r>
+        <w:t>)</w:t>
       </w:r>
     </w:p>
     <w:p>
@@ -1764,8 +2282,13 @@
           <w:numId w:val="2"/>
         </w:numPr>
       </w:pPr>
-      <w:r>
-        <w:t>Rank()</w:t>
+      <w:proofErr w:type="gramStart"/>
+      <w:r>
+        <w:t>Rank(</w:t>
+      </w:r>
+      <w:proofErr w:type="gramEnd"/>
+      <w:r>
+        <w:t>)</w:t>
       </w:r>
     </w:p>
     <w:p>
@@ -1778,11 +2301,19 @@
       </w:pPr>
       <w:proofErr w:type="spellStart"/>
       <w:r>
-        <w:t>Dense_Rank</w:t>
+        <w:t>Dense_</w:t>
+      </w:r>
+      <w:proofErr w:type="gramStart"/>
+      <w:r>
+        <w:t>Rank</w:t>
       </w:r>
       <w:proofErr w:type="spellEnd"/>
       <w:r>
-        <w:t>()</w:t>
+        <w:t>(</w:t>
+      </w:r>
+      <w:proofErr w:type="gramEnd"/>
+      <w:r>
+        <w:t>)</w:t>
       </w:r>
     </w:p>
     <w:p>
@@ -1793,8 +2324,13 @@
           <w:numId w:val="2"/>
         </w:numPr>
       </w:pPr>
-      <w:r>
-        <w:t>Lag()</w:t>
+      <w:proofErr w:type="gramStart"/>
+      <w:r>
+        <w:t>Lag(</w:t>
+      </w:r>
+      <w:proofErr w:type="gramEnd"/>
+      <w:r>
+        <w:t>)</w:t>
       </w:r>
     </w:p>
     <w:p>
@@ -1818,11 +2354,21 @@
         </w:numPr>
       </w:pPr>
       <w:r>
-        <w:t xml:space="preserve">Define the field I want the value from and pull  a previous record </w:t>
-      </w:r>
+        <w:t xml:space="preserve">Define the field I want the value from and </w:t>
+      </w:r>
+      <w:proofErr w:type="gramStart"/>
+      <w:r>
+        <w:t>pull  a</w:t>
+      </w:r>
+      <w:proofErr w:type="gramEnd"/>
+      <w:r>
+        <w:t xml:space="preserve"> previous record </w:t>
+      </w:r>
+      <w:proofErr w:type="gramStart"/>
       <w:r>
         <w:t>git</w:t>
       </w:r>
+      <w:proofErr w:type="gramEnd"/>
     </w:p>
     <w:p/>
     <w:p>
@@ -3774,7 +4320,6 @@
   <w:style w:type="character" w:default="1" w:styleId="DefaultParagraphFont">
     <w:name w:val="Default Paragraph Font"/>
     <w:uiPriority w:val="1"/>
-    <w:semiHidden/>
     <w:unhideWhenUsed/>
   </w:style>
   <w:style w:type="table" w:default="1" w:styleId="TableNormal">

</xml_diff>

<commit_message>
Practicing Excel functions for anlaytics.
</commit_message>
<xml_diff>
--- a/documentation/da-gym-doumentation .docx
+++ b/documentation/da-gym-doumentation .docx
@@ -25,6 +25,79 @@
         <w:rPr>
           <w:u w:val="single"/>
         </w:rPr>
+        <w:t>9/28/2026</w:t>
+      </w:r>
+    </w:p>
+    <w:p>
+      <w:r>
+        <w:t xml:space="preserve">Excel drill: </w:t>
+      </w:r>
+      <w:r>
+        <w:t>XLOOKUP | define a lookup value, Search for that value in a specific column, return a corresponding value from a defined column.</w:t>
+      </w:r>
+    </w:p>
+    <w:p>
+      <w:r>
+        <w:t xml:space="preserve">Within Excel, I can define Table Names and use them as reference when using functions such as XLOOKUP. </w:t>
+      </w:r>
+    </w:p>
+    <w:p>
+      <w:r>
+        <w:t xml:space="preserve">Instead of writing out RAW coordinates within XLOOKUP, I can have a cleaner approach using structured references; use of table name and column name instead of ordinary cell coordinates. </w:t>
+      </w:r>
+    </w:p>
+    <w:p>
+      <w:r>
+        <w:t xml:space="preserve">Normal: range reference: </w:t>
+      </w:r>
+      <w:proofErr w:type="spellStart"/>
+      <w:r>
+        <w:t>Raw_</w:t>
+      </w:r>
+      <w:proofErr w:type="gramStart"/>
+      <w:r>
+        <w:t>Data!B</w:t>
+      </w:r>
+      <w:proofErr w:type="gramEnd"/>
+      <w:r>
+        <w:t>:B</w:t>
+      </w:r>
+      <w:proofErr w:type="spellEnd"/>
+    </w:p>
+    <w:p>
+      <w:r>
+        <w:t xml:space="preserve">Structured reference: </w:t>
+      </w:r>
+      <w:proofErr w:type="spellStart"/>
+      <w:proofErr w:type="gramStart"/>
+      <w:r>
+        <w:t>JobSearch</w:t>
+      </w:r>
+      <w:proofErr w:type="spellEnd"/>
+      <w:r>
+        <w:t>[</w:t>
+      </w:r>
+      <w:proofErr w:type="spellStart"/>
+      <w:proofErr w:type="gramEnd"/>
+      <w:r>
+        <w:t>Compnay</w:t>
+      </w:r>
+      <w:proofErr w:type="spellEnd"/>
+      <w:r>
+        <w:t>]</w:t>
+      </w:r>
+    </w:p>
+    <w:p/>
+    <w:p>
+      <w:pPr>
+        <w:rPr>
+          <w:u w:val="single"/>
+        </w:rPr>
+      </w:pPr>
+      <w:r>
+        <w:rPr>
+          <w:u w:val="single"/>
+        </w:rPr>
         <w:t>9/27/2026</w:t>
       </w:r>
     </w:p>
@@ -83,6 +156,10 @@
     </w:p>
     <w:p>
       <w:r>
+        <w:rPr>
+          <w:noProof/>
+        </w:rPr>
+        <w:lastRenderedPageBreak/>
         <w:drawing>
           <wp:inline distT="0" distB="0" distL="0" distR="0" wp14:anchorId="384523BA" wp14:editId="7A8FC952">
             <wp:extent cx="5943600" cy="5340350"/>
@@ -144,46 +221,46 @@
         <w:rPr>
           <w:u w:val="single"/>
         </w:rPr>
+        <w:t>9/26/2026</w:t>
+      </w:r>
+    </w:p>
+    <w:p>
+      <w:r>
+        <w:t xml:space="preserve">Need to drill in the basic concepts of Python/Pandas. </w:t>
+      </w:r>
+      <w:r>
+        <w:t xml:space="preserve">Feels unfamiliar when using multiple concepts at once. </w:t>
+      </w:r>
+    </w:p>
+    <w:p/>
+    <w:p>
+      <w:pPr>
+        <w:rPr>
+          <w:u w:val="single"/>
+        </w:rPr>
+      </w:pPr>
+      <w:r>
+        <w:rPr>
+          <w:u w:val="single"/>
+        </w:rPr>
+        <w:t>9/22/2026</w:t>
+      </w:r>
+    </w:p>
+    <w:p>
+      <w:r>
+        <w:t>= assigns. == compares</w:t>
+      </w:r>
+    </w:p>
+    <w:p>
+      <w:proofErr w:type="gramStart"/>
+      <w:r>
+        <w:t>jobs[</w:t>
+      </w:r>
+      <w:proofErr w:type="gramEnd"/>
+    </w:p>
+    <w:p>
+      <w:r>
         <w:lastRenderedPageBreak/>
-        <w:t>9/26/2026</w:t>
-      </w:r>
-    </w:p>
-    <w:p>
-      <w:r>
-        <w:t xml:space="preserve">Need to drill in the basic concepts of Python/Pandas. </w:t>
-      </w:r>
-      <w:r>
-        <w:t xml:space="preserve">Feels unfamiliar when using multiple concepts at once. </w:t>
-      </w:r>
-    </w:p>
-    <w:p/>
-    <w:p>
-      <w:pPr>
-        <w:rPr>
-          <w:u w:val="single"/>
-        </w:rPr>
-      </w:pPr>
-      <w:r>
-        <w:rPr>
-          <w:u w:val="single"/>
-        </w:rPr>
-        <w:t>9/22/2026</w:t>
-      </w:r>
-    </w:p>
-    <w:p>
-      <w:r>
-        <w:t>= assigns. == compares</w:t>
-      </w:r>
-    </w:p>
-    <w:p>
-      <w:proofErr w:type="gramStart"/>
-      <w:r>
-        <w:t>jobs[</w:t>
-      </w:r>
-      <w:proofErr w:type="gramEnd"/>
-    </w:p>
-    <w:p>
-      <w:r>
         <w:t xml:space="preserve">    (jobs["salary"] &gt;= 80000)</w:t>
       </w:r>
     </w:p>
@@ -567,49 +644,49 @@
         <w:rPr>
           <w:u w:val="single"/>
         </w:rPr>
+        <w:t>9/17/2026</w:t>
+      </w:r>
+    </w:p>
+    <w:p>
+      <w:r>
+        <w:t xml:space="preserve">Continued making flashcards with Python: using as a validator to SQL results. </w:t>
+      </w:r>
+    </w:p>
+    <w:p>
+      <w:r>
+        <w:t xml:space="preserve">Completed another round of simulated operational workflow/processes and how </w:t>
+      </w:r>
+      <w:proofErr w:type="gramStart"/>
+      <w:r>
+        <w:t>in regard to</w:t>
+      </w:r>
+      <w:proofErr w:type="gramEnd"/>
+      <w:r>
+        <w:t xml:space="preserve"> incomplete or missing items in a client’s delivery. </w:t>
+      </w:r>
+    </w:p>
+    <w:p>
+      <w:r>
+        <w:t xml:space="preserve">Input | Process | Handoff | Output | Measurement </w:t>
+      </w:r>
+    </w:p>
+    <w:p/>
+    <w:p>
+      <w:pPr>
+        <w:rPr>
+          <w:u w:val="single"/>
+        </w:rPr>
+      </w:pPr>
+      <w:r>
+        <w:rPr>
+          <w:u w:val="single"/>
+        </w:rPr>
+        <w:t>9/16/2026</w:t>
+      </w:r>
+    </w:p>
+    <w:p>
+      <w:r>
         <w:lastRenderedPageBreak/>
-        <w:t>9/17/2026</w:t>
-      </w:r>
-    </w:p>
-    <w:p>
-      <w:r>
-        <w:t xml:space="preserve">Continued making flashcards with Python: using as a validator to SQL results. </w:t>
-      </w:r>
-    </w:p>
-    <w:p>
-      <w:r>
-        <w:t xml:space="preserve">Completed another round of simulated operational workflow/processes and how </w:t>
-      </w:r>
-      <w:proofErr w:type="gramStart"/>
-      <w:r>
-        <w:t>in regard to</w:t>
-      </w:r>
-      <w:proofErr w:type="gramEnd"/>
-      <w:r>
-        <w:t xml:space="preserve"> incomplete or missing items in a client’s delivery. </w:t>
-      </w:r>
-    </w:p>
-    <w:p>
-      <w:r>
-        <w:t xml:space="preserve">Input | Process | Handoff | Output | Measurement </w:t>
-      </w:r>
-    </w:p>
-    <w:p/>
-    <w:p>
-      <w:pPr>
-        <w:rPr>
-          <w:u w:val="single"/>
-        </w:rPr>
-      </w:pPr>
-      <w:r>
-        <w:rPr>
-          <w:u w:val="single"/>
-        </w:rPr>
-        <w:t>9/16/2026</w:t>
-      </w:r>
-    </w:p>
-    <w:p>
-      <w:r>
         <w:t xml:space="preserve">Today, we are pivoting and taking a different approach to my development </w:t>
       </w:r>
       <w:proofErr w:type="gramStart"/>
@@ -868,74 +945,77 @@
     </w:p>
     <w:p>
       <w:r>
+        <w:t>Process: a dedicated or any available employee notices the email (seems random not standardized/ regularly scanned) and manually enters request into a shared Excel tracker. After that, an organization’s info is reviewed in the database (2</w:t>
+      </w:r>
+      <w:r>
+        <w:rPr>
+          <w:vertAlign w:val="superscript"/>
+        </w:rPr>
+        <w:t>nd</w:t>
+      </w:r>
+      <w:r>
+        <w:t xml:space="preserve"> home for the same information). If there is mission information, an employee </w:t>
+      </w:r>
+      <w:proofErr w:type="gramStart"/>
+      <w:r>
+        <w:t>has to</w:t>
+      </w:r>
+      <w:proofErr w:type="gramEnd"/>
+      <w:r>
+        <w:t xml:space="preserve"> </w:t>
+      </w:r>
+      <w:proofErr w:type="gramStart"/>
+      <w:r>
+        <w:t>reach back</w:t>
+      </w:r>
+      <w:proofErr w:type="gramEnd"/>
+      <w:r>
+        <w:t xml:space="preserve"> out to partner for clarification; this back and forth potentially causes delays in updating partner information. After a response, there seems to not be a dedicated resolution because </w:t>
+      </w:r>
+      <w:r>
+        <w:t xml:space="preserve">sometimes the available employee will update the Excel or not (wtf, that’s </w:t>
+      </w:r>
+      <w:proofErr w:type="spellStart"/>
+      <w:proofErr w:type="gramStart"/>
+      <w:r>
+        <w:t>there</w:t>
+      </w:r>
+      <w:proofErr w:type="spellEnd"/>
+      <w:proofErr w:type="gramEnd"/>
+      <w:r>
+        <w:t xml:space="preserve"> job). </w:t>
+      </w:r>
+    </w:p>
+    <w:p>
+      <w:r>
+        <w:t xml:space="preserve">Handoff: If changes require supervisor approval, staff must send a Teams message to super for review (an employee may or may not do this/ forgetful/ delayed request to super). Here’s what I don’t like: once a super reviews the request, they then </w:t>
+      </w:r>
+      <w:proofErr w:type="gramStart"/>
+      <w:r>
+        <w:t>have to</w:t>
+      </w:r>
+      <w:proofErr w:type="gramEnd"/>
+      <w:r>
+        <w:t xml:space="preserve"> message the </w:t>
+      </w:r>
+      <w:r>
         <w:lastRenderedPageBreak/>
-        <w:t>Process: a dedicated or any available employee notices the email (seems random not standardized/ regularly scanned) and manually enters request into a shared Excel tracker. After that, an organization’s info is reviewed in the database (2</w:t>
-      </w:r>
-      <w:r>
-        <w:rPr>
-          <w:vertAlign w:val="superscript"/>
-        </w:rPr>
-        <w:t>nd</w:t>
-      </w:r>
-      <w:r>
-        <w:t xml:space="preserve"> home for the same information). If there is mission information, an employee </w:t>
-      </w:r>
-      <w:proofErr w:type="gramStart"/>
-      <w:r>
-        <w:t>has to</w:t>
-      </w:r>
-      <w:proofErr w:type="gramEnd"/>
+        <w:t xml:space="preserve">employee back </w:t>
+      </w:r>
+      <w:r>
+        <w:t>for</w:t>
+      </w:r>
+      <w:r>
+        <w:t xml:space="preserve"> them to reach back out to the parter notifying completion of their update request. </w:t>
+      </w:r>
+    </w:p>
+    <w:p>
+      <w:r>
+        <w:t xml:space="preserve">Output: At the end of the month, the super must manually count completed rows in Excel to report completed request summary for the month. </w:t>
+      </w:r>
       <w:r>
         <w:t xml:space="preserve"> </w:t>
       </w:r>
-      <w:proofErr w:type="gramStart"/>
-      <w:r>
-        <w:t>reach back</w:t>
-      </w:r>
-      <w:proofErr w:type="gramEnd"/>
-      <w:r>
-        <w:t xml:space="preserve"> out to partner for clarification; this back and forth potentially causes delays in updating partner information. After a response, there seems to not be a dedicated resolution because </w:t>
-      </w:r>
-      <w:r>
-        <w:t xml:space="preserve">sometimes the available employee will update the Excel or not (wtf, that’s </w:t>
-      </w:r>
-      <w:proofErr w:type="spellStart"/>
-      <w:proofErr w:type="gramStart"/>
-      <w:r>
-        <w:t>there</w:t>
-      </w:r>
-      <w:proofErr w:type="spellEnd"/>
-      <w:proofErr w:type="gramEnd"/>
-      <w:r>
-        <w:t xml:space="preserve"> job). </w:t>
-      </w:r>
-    </w:p>
-    <w:p>
-      <w:r>
-        <w:t xml:space="preserve">Handoff: If changes require supervisor approval, staff must send a Teams message to super for review (an employee may or may not do this/ forgetful/ delayed request to super). Here’s what I don’t like: once a super reviews the request, they then </w:t>
-      </w:r>
-      <w:proofErr w:type="gramStart"/>
-      <w:r>
-        <w:t>have to</w:t>
-      </w:r>
-      <w:proofErr w:type="gramEnd"/>
-      <w:r>
-        <w:t xml:space="preserve"> message the employee back </w:t>
-      </w:r>
-      <w:r>
-        <w:t>for</w:t>
-      </w:r>
-      <w:r>
-        <w:t xml:space="preserve"> them to reach back out to the parter notifying completion of their update request. </w:t>
-      </w:r>
-    </w:p>
-    <w:p>
-      <w:r>
-        <w:t xml:space="preserve">Output: At the end of the month, the super must manually count completed rows in Excel to report completed request summary for the month. </w:t>
-      </w:r>
-      <w:r>
-        <w:t xml:space="preserve"> </w:t>
-      </w:r>
     </w:p>
     <w:p>
       <w:r>
@@ -1017,53 +1097,53 @@
     </w:p>
     <w:p>
       <w:r>
+        <w:t xml:space="preserve">Is there a way to have one location where </w:t>
+      </w:r>
+      <w:proofErr w:type="gramStart"/>
+      <w:r>
+        <w:t>partners</w:t>
+      </w:r>
+      <w:proofErr w:type="gramEnd"/>
+      <w:r>
+        <w:t xml:space="preserve"> info can be inputted and stored? Reducing multiple locations of the duplicate data could reduce confusion, support data security and accurate records. </w:t>
+      </w:r>
+    </w:p>
+    <w:p>
+      <w:r>
+        <w:t xml:space="preserve">Can we design some sort of ticketing system to organize regular work? This way tasks can live in a central place instead of being spread across email threads and </w:t>
+      </w:r>
+      <w:proofErr w:type="gramStart"/>
+      <w:r>
+        <w:t>teams</w:t>
+      </w:r>
+      <w:proofErr w:type="gramEnd"/>
+      <w:r>
+        <w:t xml:space="preserve"> messages. Maybe Teams can be utilized more like Slack; making quicker reference to projects and ideas: can Teams be utilized the same way?</w:t>
+      </w:r>
+    </w:p>
+    <w:p>
+      <w:r>
+        <w:t>If things require supervisor approval, can they be batched and ranked and ordered by priority so that the super can have a systemized way to process work efficiently?</w:t>
+      </w:r>
+    </w:p>
+    <w:p/>
+    <w:p>
+      <w:pPr>
+        <w:rPr>
+          <w:u w:val="single"/>
+        </w:rPr>
+      </w:pPr>
+      <w:r>
+        <w:rPr>
+          <w:u w:val="single"/>
+        </w:rPr>
+        <w:t>Importance of understanding and investigating a process before trying to improve it:</w:t>
+      </w:r>
+    </w:p>
+    <w:p>
+      <w:proofErr w:type="gramStart"/>
+      <w:r>
         <w:lastRenderedPageBreak/>
-        <w:t xml:space="preserve">Is there a way to have one location where </w:t>
-      </w:r>
-      <w:proofErr w:type="gramStart"/>
-      <w:r>
-        <w:t>partners</w:t>
-      </w:r>
-      <w:proofErr w:type="gramEnd"/>
-      <w:r>
-        <w:t xml:space="preserve"> info can be inputted and stored? Reducing multiple locations of the duplicate data could reduce confusion, support data security and accurate records. </w:t>
-      </w:r>
-    </w:p>
-    <w:p>
-      <w:r>
-        <w:t xml:space="preserve">Can we design some sort of ticketing system to organize regular work? This way tasks can live in a central place instead of being spread across email threads and </w:t>
-      </w:r>
-      <w:proofErr w:type="gramStart"/>
-      <w:r>
-        <w:t>teams</w:t>
-      </w:r>
-      <w:proofErr w:type="gramEnd"/>
-      <w:r>
-        <w:t xml:space="preserve"> messages. Maybe Teams can be utilized more like Slack; making quicker reference to projects and ideas: can Teams be utilized the same way?</w:t>
-      </w:r>
-    </w:p>
-    <w:p>
-      <w:r>
-        <w:t>If things require supervisor approval, can they be batched and ranked and ordered by priority so that the super can have a systemized way to process work efficiently?</w:t>
-      </w:r>
-    </w:p>
-    <w:p/>
-    <w:p>
-      <w:pPr>
-        <w:rPr>
-          <w:u w:val="single"/>
-        </w:rPr>
-      </w:pPr>
-      <w:r>
-        <w:rPr>
-          <w:u w:val="single"/>
-        </w:rPr>
-        <w:t>Importance of understanding and investigating a process before trying to improve it:</w:t>
-      </w:r>
-    </w:p>
-    <w:p>
-      <w:proofErr w:type="gramStart"/>
-      <w:r>
         <w:t>we</w:t>
       </w:r>
       <w:proofErr w:type="gramEnd"/>
@@ -1252,7 +1332,6 @@
         </w:numPr>
       </w:pPr>
       <w:r>
-        <w:lastRenderedPageBreak/>
         <w:t>What raw fields would we need to collect?</w:t>
       </w:r>
     </w:p>
@@ -1470,6 +1549,7 @@
         </w:numPr>
       </w:pPr>
       <w:r>
+        <w:lastRenderedPageBreak/>
         <w:t xml:space="preserve">What entity or entities do you think exist? </w:t>
       </w:r>
     </w:p>
@@ -1599,7 +1679,6 @@
         </w:numPr>
       </w:pPr>
       <w:r>
-        <w:lastRenderedPageBreak/>
         <w:t>In SQL, that means decomposing the business question into grain, metrics, relationships, and required transformations before choosing the appropriate query logic.</w:t>
       </w:r>
     </w:p>
@@ -1740,6 +1819,7 @@
           <w:b/>
           <w:bCs/>
         </w:rPr>
+        <w:lastRenderedPageBreak/>
         <w:t>Impact:</w:t>
       </w:r>
       <w:r>
@@ -1830,7 +1910,6 @@
     </w:p>
     <w:p>
       <w:r>
-        <w:lastRenderedPageBreak/>
         <w:t xml:space="preserve">From running my own fitness business, I’ve always been interested in using metrics to improve results </w:t>
       </w:r>
       <w:r>
@@ -1904,6 +1983,7 @@
       </w:pPr>
       <w:proofErr w:type="gramStart"/>
       <w:r>
+        <w:lastRenderedPageBreak/>
         <w:t>a CTE</w:t>
       </w:r>
       <w:proofErr w:type="gramEnd"/>
@@ -2039,7 +2119,6 @@
     </w:p>
     <w:p>
       <w:r>
-        <w:lastRenderedPageBreak/>
         <w:t xml:space="preserve">Learning </w:t>
       </w:r>
       <w:proofErr w:type="spellStart"/>
@@ -2191,6 +2270,7 @@
         </w:numPr>
       </w:pPr>
       <w:r>
+        <w:lastRenderedPageBreak/>
         <w:t xml:space="preserve">Partition </w:t>
       </w:r>
       <w:proofErr w:type="gramStart"/>
@@ -4320,6 +4400,7 @@
   <w:style w:type="character" w:default="1" w:styleId="DefaultParagraphFont">
     <w:name w:val="Default Paragraph Font"/>
     <w:uiPriority w:val="1"/>
+    <w:semiHidden/>
     <w:unhideWhenUsed/>
   </w:style>
   <w:style w:type="table" w:default="1" w:styleId="TableNormal">

</xml_diff>

<commit_message>
Continued Excel practice functions and updated documentation.
</commit_message>
<xml_diff>
--- a/documentation/da-gym-doumentation .docx
+++ b/documentation/da-gym-doumentation .docx
@@ -15,6 +15,31 @@
         <w:t xml:space="preserve">Data Analytics Gym – Documentation </w:t>
       </w:r>
     </w:p>
+    <w:p>
+      <w:pPr>
+        <w:rPr>
+          <w:u w:val="single"/>
+        </w:rPr>
+      </w:pPr>
+      <w:r>
+        <w:rPr>
+          <w:u w:val="single"/>
+        </w:rPr>
+        <w:t xml:space="preserve">10/02/2026 </w:t>
+      </w:r>
+      <w:r>
+        <w:rPr>
+          <w:u w:val="single"/>
+        </w:rPr>
+        <w:t xml:space="preserve"> </w:t>
+      </w:r>
+    </w:p>
+    <w:p>
+      <w:r>
+        <w:t xml:space="preserve">Completed Excel practice with functions. Created flashcards. </w:t>
+      </w:r>
+    </w:p>
+    <w:p/>
     <w:p>
       <w:pPr>
         <w:rPr>

</xml_diff>

<commit_message>
SQL practice knowing when to use CTE vs. Window Function or both.
</commit_message>
<xml_diff>
--- a/documentation/da-gym-doumentation .docx
+++ b/documentation/da-gym-doumentation .docx
@@ -25,6 +25,36 @@
         <w:rPr>
           <w:u w:val="single"/>
         </w:rPr>
+        <w:t>10/3/2026</w:t>
+      </w:r>
+    </w:p>
+    <w:p>
+      <w:r>
+        <w:t xml:space="preserve">Practicing when to use: Where vs Having vs Window </w:t>
+      </w:r>
+      <w:r>
+        <w:t xml:space="preserve">logic and knowing how many CTEs/window functions are needed based </w:t>
+      </w:r>
+      <w:proofErr w:type="gramStart"/>
+      <w:r>
+        <w:t>off</w:t>
+      </w:r>
+      <w:proofErr w:type="gramEnd"/>
+      <w:r>
+        <w:t xml:space="preserve"> the business question. I’m focusing more on defining what’s needed instead of assuming that there’s only one solution if I recognize a problem shape. </w:t>
+      </w:r>
+    </w:p>
+    <w:p/>
+    <w:p>
+      <w:pPr>
+        <w:rPr>
+          <w:u w:val="single"/>
+        </w:rPr>
+      </w:pPr>
+      <w:r>
+        <w:rPr>
+          <w:u w:val="single"/>
+        </w:rPr>
         <w:t xml:space="preserve">10/02/2026 </w:t>
       </w:r>
       <w:r>
@@ -89,7 +119,15 @@
       </w:r>
       <w:proofErr w:type="spellStart"/>
       <w:r>
-        <w:t>Raw_Data!B:B</w:t>
+        <w:t>Raw_</w:t>
+      </w:r>
+      <w:proofErr w:type="gramStart"/>
+      <w:r>
+        <w:t>Data!B</w:t>
+      </w:r>
+      <w:proofErr w:type="gramEnd"/>
+      <w:r>
+        <w:t>:B</w:t>
       </w:r>
       <w:proofErr w:type="spellEnd"/>
     </w:p>
@@ -98,6 +136,7 @@
         <w:t xml:space="preserve">Structured reference: </w:t>
       </w:r>
       <w:proofErr w:type="spellStart"/>
+      <w:proofErr w:type="gramStart"/>
       <w:r>
         <w:t>JobSearch</w:t>
       </w:r>
@@ -106,6 +145,7 @@
         <w:t>[</w:t>
       </w:r>
       <w:proofErr w:type="spellStart"/>
+      <w:proofErr w:type="gramEnd"/>
       <w:r>
         <w:t>Compnay</w:t>
       </w:r>
@@ -130,7 +170,15 @@
     </w:p>
     <w:p>
       <w:r>
-        <w:t xml:space="preserve">Keep in mind for the Excel-Project: separate tables to keep the workbook clean. For example, raw data | analysis | dashboard. </w:t>
+        <w:t xml:space="preserve">Keep in mind for the </w:t>
+      </w:r>
+      <w:proofErr w:type="gramStart"/>
+      <w:r>
+        <w:t>Excel-Project</w:t>
+      </w:r>
+      <w:proofErr w:type="gramEnd"/>
+      <w:r>
+        <w:t xml:space="preserve">: separate tables to keep the workbook clean. For example, raw data | analysis | dashboard. </w:t>
       </w:r>
     </w:p>
     <w:p>
@@ -140,7 +188,24 @@
     </w:p>
     <w:p>
       <w:r>
-        <w:t>AVERAGEIF()/AVERAGEIFS() | COUNTIF()/COUNTIFS | SUMIF/SUMIFS</w:t>
+        <w:lastRenderedPageBreak/>
+        <w:t>AVERAGEIF()/</w:t>
+      </w:r>
+      <w:proofErr w:type="gramStart"/>
+      <w:r>
+        <w:t>AVERAGEIFS(</w:t>
+      </w:r>
+      <w:proofErr w:type="gramEnd"/>
+      <w:r>
+        <w:t xml:space="preserve">) | </w:t>
+      </w:r>
+      <w:proofErr w:type="gramStart"/>
+      <w:r>
+        <w:t>COUNTIF(</w:t>
+      </w:r>
+      <w:proofErr w:type="gramEnd"/>
+      <w:r>
+        <w:t>)/COUNTIFS | SUMIF/SUMIFS</w:t>
       </w:r>
     </w:p>
     <w:p>
@@ -162,7 +227,6 @@
         <w:rPr>
           <w:noProof/>
         </w:rPr>
-        <w:lastRenderedPageBreak/>
         <w:drawing>
           <wp:inline distT="0" distB="0" distL="0" distR="0" wp14:anchorId="384523BA" wp14:editId="7A8FC952">
             <wp:extent cx="5943600" cy="5340350"/>
@@ -251,17 +315,19 @@
     </w:p>
     <w:p>
       <w:r>
+        <w:lastRenderedPageBreak/>
         <w:t>= assigns. == compares</w:t>
       </w:r>
     </w:p>
     <w:p>
+      <w:proofErr w:type="gramStart"/>
       <w:r>
         <w:t>jobs[</w:t>
       </w:r>
-    </w:p>
-    <w:p>
-      <w:r>
-        <w:lastRenderedPageBreak/>
+      <w:proofErr w:type="gramEnd"/>
+    </w:p>
+    <w:p>
+      <w:r>
         <w:t xml:space="preserve">    (jobs["salary"] &gt;= 80000)</w:t>
       </w:r>
     </w:p>
@@ -345,7 +411,15 @@
         </w:numPr>
       </w:pPr>
       <w:r>
-        <w:t>Using Boolean Mask as a way to filter a selection within a field(s)</w:t>
+        <w:t xml:space="preserve">Using Boolean Mask </w:t>
+      </w:r>
+      <w:proofErr w:type="gramStart"/>
+      <w:r>
+        <w:t>as a way to</w:t>
+      </w:r>
+      <w:proofErr w:type="gramEnd"/>
+      <w:r>
+        <w:t xml:space="preserve"> filter a selection within a field(s)</w:t>
       </w:r>
     </w:p>
     <w:p>
@@ -362,19 +436,32 @@
       </w:r>
       <w:proofErr w:type="spellEnd"/>
       <w:r>
-        <w:t>[“field”].</w:t>
+        <w:t>[“field”</w:t>
+      </w:r>
+      <w:proofErr w:type="gramStart"/>
+      <w:r>
+        <w:t>].</w:t>
       </w:r>
       <w:proofErr w:type="spellStart"/>
       <w:r>
         <w:t>isin</w:t>
       </w:r>
       <w:proofErr w:type="spellEnd"/>
-      <w:r>
-        <w:t>([“record_a”,”</w:t>
+      <w:proofErr w:type="gramEnd"/>
+      <w:r>
+        <w:t>([“record_a”</w:t>
+      </w:r>
+      <w:proofErr w:type="gramStart"/>
+      <w:r>
+        <w:t>,”</w:t>
       </w:r>
       <w:proofErr w:type="spellStart"/>
       <w:r>
-        <w:t>record_b</w:t>
+        <w:t>record</w:t>
+      </w:r>
+      <w:proofErr w:type="gramEnd"/>
+      <w:r>
+        <w:t>_b</w:t>
       </w:r>
       <w:proofErr w:type="spellEnd"/>
       <w:r>
@@ -390,7 +477,23 @@
         </w:numPr>
       </w:pPr>
       <w:r>
-        <w:t>The method to find average is .mean() not avg()</w:t>
+        <w:t xml:space="preserve">The method to find average </w:t>
+      </w:r>
+      <w:proofErr w:type="gramStart"/>
+      <w:r>
+        <w:t>is .mean</w:t>
+      </w:r>
+      <w:proofErr w:type="gramEnd"/>
+      <w:r>
+        <w:t xml:space="preserve">() not </w:t>
+      </w:r>
+      <w:proofErr w:type="gramStart"/>
+      <w:r>
+        <w:t>avg(</w:t>
+      </w:r>
+      <w:proofErr w:type="gramEnd"/>
+      <w:r>
+        <w:t>)</w:t>
       </w:r>
     </w:p>
     <w:p>
@@ -401,8 +504,13 @@
           <w:numId w:val="10"/>
         </w:numPr>
       </w:pPr>
-      <w:r>
-        <w:t>Usually the method gets connected after the calculation</w:t>
+      <w:proofErr w:type="gramStart"/>
+      <w:r>
+        <w:t>Usually</w:t>
+      </w:r>
+      <w:proofErr w:type="gramEnd"/>
+      <w:r>
+        <w:t xml:space="preserve"> the method gets connected after the calculation</w:t>
       </w:r>
     </w:p>
     <w:p>
@@ -414,12 +522,30 @@
         </w:numPr>
       </w:pPr>
       <w:proofErr w:type="spellStart"/>
+      <w:proofErr w:type="gramStart"/>
       <w:r>
         <w:t>jobs.groupby</w:t>
       </w:r>
       <w:proofErr w:type="spellEnd"/>
-      <w:r>
-        <w:t>("status")["salary"].mean()</w:t>
+      <w:proofErr w:type="gramEnd"/>
+      <w:r>
+        <w:t>("status</w:t>
+      </w:r>
+      <w:proofErr w:type="gramStart"/>
+      <w:r>
+        <w:t>")[</w:t>
+      </w:r>
+      <w:proofErr w:type="gramEnd"/>
+      <w:r>
+        <w:t>"salary"</w:t>
+      </w:r>
+      <w:proofErr w:type="gramStart"/>
+      <w:r>
+        <w:t>].mean</w:t>
+      </w:r>
+      <w:proofErr w:type="gramEnd"/>
+      <w:r>
+        <w:t>()</w:t>
       </w:r>
     </w:p>
     <w:p>
@@ -451,7 +577,15 @@
         </w:numPr>
       </w:pPr>
       <w:r>
-        <w:t xml:space="preserve">To join data frames in Pandas, use .merge() </w:t>
+        <w:t xml:space="preserve">To join data frames in Pandas, </w:t>
+      </w:r>
+      <w:proofErr w:type="gramStart"/>
+      <w:r>
+        <w:t>use .merge</w:t>
+      </w:r>
+      <w:proofErr w:type="gramEnd"/>
+      <w:r>
+        <w:t xml:space="preserve">() </w:t>
       </w:r>
     </w:p>
     <w:p>
@@ -463,10 +597,12 @@
         </w:numPr>
       </w:pPr>
       <w:proofErr w:type="spellStart"/>
+      <w:proofErr w:type="gramStart"/>
       <w:r>
         <w:t>jobs.merge</w:t>
       </w:r>
       <w:proofErr w:type="spellEnd"/>
+      <w:proofErr w:type="gramEnd"/>
       <w:r>
         <w:t>(</w:t>
       </w:r>
@@ -537,9 +673,14 @@
       </w:pPr>
       <w:proofErr w:type="spellStart"/>
       <w:r>
-        <w:t>left_dataframe.merge</w:t>
+        <w:t>left_</w:t>
+      </w:r>
+      <w:proofErr w:type="gramStart"/>
+      <w:r>
+        <w:t>dataframe.merge</w:t>
       </w:r>
       <w:proofErr w:type="spellEnd"/>
+      <w:proofErr w:type="gramEnd"/>
       <w:r>
         <w:t>(</w:t>
       </w:r>
@@ -580,7 +721,15 @@
     </w:p>
     <w:p>
       <w:r>
-        <w:t xml:space="preserve">Completed another round of simulated operational workflow/processes and how in regard to incomplete or missing items in a client’s delivery. </w:t>
+        <w:t xml:space="preserve">Completed another round of simulated operational workflow/processes and how </w:t>
+      </w:r>
+      <w:proofErr w:type="gramStart"/>
+      <w:r>
+        <w:t>in regard to</w:t>
+      </w:r>
+      <w:proofErr w:type="gramEnd"/>
+      <w:r>
+        <w:t xml:space="preserve"> incomplete or missing items in a client’s delivery. </w:t>
       </w:r>
     </w:p>
     <w:p>
@@ -604,8 +753,15 @@
     </w:p>
     <w:p>
       <w:r>
-        <w:lastRenderedPageBreak/>
-        <w:t xml:space="preserve">Today, we are pivoting and taking a different approach to my development in light of a new position I’d be starting in a couple weeks. </w:t>
+        <w:t xml:space="preserve">Today, we are pivoting and taking a different approach to my development </w:t>
+      </w:r>
+      <w:proofErr w:type="gramStart"/>
+      <w:r>
+        <w:t>in light of</w:t>
+      </w:r>
+      <w:proofErr w:type="gramEnd"/>
+      <w:r>
+        <w:t xml:space="preserve"> a new position I’d be starting in a couple weeks. </w:t>
       </w:r>
     </w:p>
     <w:p>
@@ -641,6 +797,7 @@
         </w:rPr>
         <w:t xml:space="preserve">why </w:t>
       </w:r>
+      <w:proofErr w:type="gramStart"/>
       <w:r>
         <w:rPr>
           <w:b/>
@@ -653,7 +810,15 @@
           <w:b/>
           <w:bCs/>
         </w:rPr>
-        <w:t xml:space="preserve"> exist in the first place.</w:t>
+        <w:t xml:space="preserve"> exist</w:t>
+      </w:r>
+      <w:proofErr w:type="gramEnd"/>
+      <w:r>
+        <w:rPr>
+          <w:b/>
+          <w:bCs/>
+        </w:rPr>
+        <w:t xml:space="preserve"> in the first place.</w:t>
       </w:r>
     </w:p>
     <w:p>
@@ -675,7 +840,23 @@
           <w:b/>
           <w:bCs/>
         </w:rPr>
-        <w:t>How does this actually work?</w:t>
+        <w:t xml:space="preserve">How does this </w:t>
+      </w:r>
+      <w:proofErr w:type="gramStart"/>
+      <w:r>
+        <w:rPr>
+          <w:b/>
+          <w:bCs/>
+        </w:rPr>
+        <w:t>actually work</w:t>
+      </w:r>
+      <w:proofErr w:type="gramEnd"/>
+      <w:r>
+        <w:rPr>
+          <w:b/>
+          <w:bCs/>
+        </w:rPr>
+        <w:t>?</w:t>
       </w:r>
     </w:p>
     <w:p/>
@@ -762,7 +943,23 @@
         <w:t>Output:</w:t>
       </w:r>
       <w:r>
-        <w:t xml:space="preserve"> What does "finished" actually mean?</w:t>
+        <w:t xml:space="preserve"> What does "</w:t>
+      </w:r>
+      <w:proofErr w:type="gramStart"/>
+      <w:r>
+        <w:t>finished</w:t>
+      </w:r>
+      <w:proofErr w:type="gramEnd"/>
+      <w:r>
+        <w:t xml:space="preserve">" </w:t>
+      </w:r>
+      <w:proofErr w:type="gramStart"/>
+      <w:r>
+        <w:t>actually mean</w:t>
+      </w:r>
+      <w:proofErr w:type="gramEnd"/>
+      <w:r>
+        <w:t>?</w:t>
       </w:r>
     </w:p>
     <w:p>
@@ -823,27 +1020,50 @@
         <w:t>nd</w:t>
       </w:r>
       <w:r>
-        <w:t xml:space="preserve"> home for the same information). If there is mission information, an employee has to reach back out to partner for clarification; this back and forth potentially causes delays in updating partner information. After a response, there seems to not be a dedicated resolution because </w:t>
+        <w:t xml:space="preserve"> home for the same information). If there is mission information, an employee </w:t>
+      </w:r>
+      <w:proofErr w:type="gramStart"/>
+      <w:r>
+        <w:t>has to</w:t>
+      </w:r>
+      <w:proofErr w:type="gramEnd"/>
+      <w:r>
+        <w:t xml:space="preserve"> </w:t>
+      </w:r>
+      <w:proofErr w:type="gramStart"/>
+      <w:r>
+        <w:t>reach back</w:t>
+      </w:r>
+      <w:proofErr w:type="gramEnd"/>
+      <w:r>
+        <w:t xml:space="preserve"> out to partner for clarification; this back and forth potentially causes delays in updating partner information. After a response, there seems to not be a dedicated resolution because </w:t>
       </w:r>
       <w:r>
         <w:t xml:space="preserve">sometimes the available employee will update the Excel or not (wtf, that’s </w:t>
       </w:r>
       <w:proofErr w:type="spellStart"/>
+      <w:proofErr w:type="gramStart"/>
       <w:r>
         <w:t>there</w:t>
       </w:r>
       <w:proofErr w:type="spellEnd"/>
+      <w:proofErr w:type="gramEnd"/>
       <w:r>
         <w:t xml:space="preserve"> job). </w:t>
       </w:r>
     </w:p>
     <w:p>
       <w:r>
-        <w:t xml:space="preserve">Handoff: If changes require supervisor approval, staff must send a Teams message to super for review (an employee may or may not do this/ forgetful/ delayed request to super). Here’s what I don’t like: once a super reviews the request, they then have to message the </w:t>
-      </w:r>
-      <w:r>
         <w:lastRenderedPageBreak/>
-        <w:t xml:space="preserve">employee back </w:t>
+        <w:t xml:space="preserve">Handoff: If changes require supervisor approval, staff must send a Teams message to super for review (an employee may or may not do this/ forgetful/ delayed request to super). Here’s what I don’t like: once a super reviews the request, they then </w:t>
+      </w:r>
+      <w:proofErr w:type="gramStart"/>
+      <w:r>
+        <w:t>have to</w:t>
+      </w:r>
+      <w:proofErr w:type="gramEnd"/>
+      <w:r>
+        <w:t xml:space="preserve"> message the employee back </w:t>
       </w:r>
       <w:r>
         <w:t>for</w:t>
@@ -854,7 +1074,15 @@
     </w:p>
     <w:p>
       <w:r>
-        <w:t xml:space="preserve">Output: At the end of the month, the super must manually count completed rows in Excel to report completed request summary for the month. </w:t>
+        <w:t xml:space="preserve">Output: At the end of the month, the super must manually </w:t>
+      </w:r>
+      <w:proofErr w:type="gramStart"/>
+      <w:r>
+        <w:t>count</w:t>
+      </w:r>
+      <w:proofErr w:type="gramEnd"/>
+      <w:r>
+        <w:t xml:space="preserve"> completed rows in Excel to report completed request summary for the month. </w:t>
       </w:r>
       <w:r>
         <w:t xml:space="preserve"> </w:t>
@@ -867,7 +1095,15 @@
     </w:p>
     <w:p>
       <w:r>
-        <w:t xml:space="preserve">There’s no tracker for how long requests are taking to process. That metric could be valuable in identifying bottle necks. </w:t>
+        <w:t xml:space="preserve">There’s no tracker for how long requests </w:t>
+      </w:r>
+      <w:proofErr w:type="gramStart"/>
+      <w:r>
+        <w:t>are</w:t>
+      </w:r>
+      <w:proofErr w:type="gramEnd"/>
+      <w:r>
+        <w:t xml:space="preserve"> taking to process. That metric could be valuable in identifying bottle necks. </w:t>
       </w:r>
     </w:p>
     <w:p>
@@ -906,7 +1142,23 @@
         <w:t>This</w:t>
       </w:r>
       <w:r>
-        <w:t xml:space="preserve"> would provide direct guidance on which tasks to prioritize. Every partner service representative would be trained on how to support partners. Therefore, anyone would be able to jump in and complete tasks. I would request that documentation be built in to daily tasks for transparency and clarity of work being done.</w:t>
+        <w:t xml:space="preserve"> would provide direct guidance on which tasks to prioritize. Every partner service representative would be trained </w:t>
+      </w:r>
+      <w:proofErr w:type="gramStart"/>
+      <w:r>
+        <w:t>on</w:t>
+      </w:r>
+      <w:proofErr w:type="gramEnd"/>
+      <w:r>
+        <w:t xml:space="preserve"> how to support partners. Therefore, anyone would be able to jump in and complete tasks. I would request that documentation be built </w:t>
+      </w:r>
+      <w:proofErr w:type="gramStart"/>
+      <w:r>
+        <w:t>in to</w:t>
+      </w:r>
+      <w:proofErr w:type="gramEnd"/>
+      <w:r>
+        <w:t xml:space="preserve"> daily tasks for transparency and clarity of work being done.</w:t>
       </w:r>
     </w:p>
     <w:p>
@@ -916,12 +1168,28 @@
     </w:p>
     <w:p>
       <w:r>
-        <w:t xml:space="preserve">Is there a way to have one location where partners info can be inputted and stored? Reducing multiple locations of the duplicate data could reduce confusion, support data security and accurate records. </w:t>
-      </w:r>
-    </w:p>
-    <w:p>
-      <w:r>
-        <w:t>Can we design some sort of ticketing system to organize regular work? This way tasks can live in a central place instead of being spread across email threads and teams messages. Maybe Teams can be utilized more like Slack; making quicker reference to projects and ideas: can Teams be utilized the same way?</w:t>
+        <w:t xml:space="preserve">Is there a way to have one location where </w:t>
+      </w:r>
+      <w:proofErr w:type="gramStart"/>
+      <w:r>
+        <w:t>partners</w:t>
+      </w:r>
+      <w:proofErr w:type="gramEnd"/>
+      <w:r>
+        <w:t xml:space="preserve"> info can be inputted and stored? Reducing multiple locations of the duplicate data could reduce confusion, support data security and accurate records. </w:t>
+      </w:r>
+    </w:p>
+    <w:p>
+      <w:r>
+        <w:t xml:space="preserve">Can we design some sort of ticketing system to organize regular work? This way tasks can live in a central place instead of being spread across email threads and </w:t>
+      </w:r>
+      <w:proofErr w:type="gramStart"/>
+      <w:r>
+        <w:t>teams</w:t>
+      </w:r>
+      <w:proofErr w:type="gramEnd"/>
+      <w:r>
+        <w:t xml:space="preserve"> messages. Maybe Teams can be utilized more like Slack; making quicker reference to projects and ideas: can Teams be utilized the same way?</w:t>
       </w:r>
     </w:p>
     <w:p>
@@ -944,15 +1212,40 @@
       </w:r>
     </w:p>
     <w:p>
-      <w:r>
-        <w:lastRenderedPageBreak/>
-        <w:t xml:space="preserve">we would want to provide relevant solutions instead of create unnecessary work for everyone. change can already be challenging, and if </w:t>
+      <w:proofErr w:type="gramStart"/>
+      <w:r>
+        <w:t>we</w:t>
+      </w:r>
+      <w:proofErr w:type="gramEnd"/>
+      <w:r>
+        <w:t xml:space="preserve"> would want to provide relevant solutions instead of </w:t>
+      </w:r>
+      <w:proofErr w:type="gramStart"/>
+      <w:r>
+        <w:t>create</w:t>
+      </w:r>
+      <w:proofErr w:type="gramEnd"/>
+      <w:r>
+        <w:t xml:space="preserve"> unnecessary work for everyone. </w:t>
+      </w:r>
+      <w:proofErr w:type="gramStart"/>
+      <w:r>
+        <w:t>change</w:t>
+      </w:r>
+      <w:proofErr w:type="gramEnd"/>
+      <w:r>
+        <w:t xml:space="preserve"> can already be challenging, and </w:t>
+      </w:r>
+      <w:proofErr w:type="gramStart"/>
+      <w:r>
+        <w:t xml:space="preserve">if </w:t>
       </w:r>
       <w:proofErr w:type="spellStart"/>
       <w:r>
         <w:t>i</w:t>
       </w:r>
       <w:proofErr w:type="spellEnd"/>
+      <w:proofErr w:type="gramEnd"/>
       <w:r>
         <w:t xml:space="preserve"> propose solutions that create more problems that solve, that's very ineffective and bad for the team and clients. </w:t>
       </w:r>
@@ -996,7 +1289,15 @@
         </w:numPr>
       </w:pPr>
       <w:r>
-        <w:t xml:space="preserve">What business/user question are we actually trying to answer? </w:t>
+        <w:t xml:space="preserve">What business/user question are we </w:t>
+      </w:r>
+      <w:proofErr w:type="gramStart"/>
+      <w:r>
+        <w:t>actually trying</w:t>
+      </w:r>
+      <w:proofErr w:type="gramEnd"/>
+      <w:r>
+        <w:t xml:space="preserve"> to answer? </w:t>
       </w:r>
     </w:p>
     <w:p>
@@ -1161,7 +1462,15 @@
         </w:numPr>
       </w:pPr>
       <w:r>
-        <w:t xml:space="preserve">Food log </w:t>
+        <w:t xml:space="preserve">Food </w:t>
+      </w:r>
+      <w:proofErr w:type="gramStart"/>
+      <w:r>
+        <w:t>log</w:t>
+      </w:r>
+      <w:proofErr w:type="gramEnd"/>
+      <w:r>
+        <w:t xml:space="preserve"> </w:t>
       </w:r>
     </w:p>
     <w:p>
@@ -1197,8 +1506,13 @@
         </w:numPr>
       </w:pPr>
       <w:r>
-        <w:t>Sleep log</w:t>
-      </w:r>
+        <w:t xml:space="preserve">Sleep </w:t>
+      </w:r>
+      <w:proofErr w:type="gramStart"/>
+      <w:r>
+        <w:t>log</w:t>
+      </w:r>
+      <w:proofErr w:type="gramEnd"/>
       <w:r>
         <w:t xml:space="preserve"> </w:t>
       </w:r>
@@ -1225,6 +1539,7 @@
       </w:pPr>
       <w:proofErr w:type="spellStart"/>
       <w:r>
+        <w:lastRenderedPageBreak/>
         <w:t>transaction_date</w:t>
       </w:r>
       <w:proofErr w:type="spellEnd"/>
@@ -1270,7 +1585,15 @@
         </w:numPr>
       </w:pPr>
       <w:r>
-        <w:t>What would the grain of the exercise data be?</w:t>
+        <w:t xml:space="preserve">What would the grain of the exercise data </w:t>
+      </w:r>
+      <w:proofErr w:type="gramStart"/>
+      <w:r>
+        <w:t>be</w:t>
+      </w:r>
+      <w:proofErr w:type="gramEnd"/>
+      <w:r>
+        <w:t>?</w:t>
       </w:r>
     </w:p>
     <w:p>
@@ -1297,7 +1620,6 @@
         </w:numPr>
       </w:pPr>
       <w:r>
-        <w:lastRenderedPageBreak/>
         <w:t xml:space="preserve">What entity or entities do you think exist? </w:t>
       </w:r>
     </w:p>
@@ -1372,7 +1694,15 @@
         </w:numPr>
       </w:pPr>
       <w:r>
-        <w:t>Need to change grain first? Think CTE/subquery.</w:t>
+        <w:t xml:space="preserve">Need to change grain first? </w:t>
+      </w:r>
+      <w:proofErr w:type="gramStart"/>
+      <w:r>
+        <w:t>Think</w:t>
+      </w:r>
+      <w:proofErr w:type="gramEnd"/>
+      <w:r>
+        <w:t xml:space="preserve"> CTE/subquery.</w:t>
       </w:r>
     </w:p>
     <w:p>
@@ -1390,8 +1720,13 @@
       <w:r>
         <w:t xml:space="preserve">Getting used to </w:t>
       </w:r>
-      <w:r>
-        <w:t>decomposing the</w:t>
+      <w:proofErr w:type="gramStart"/>
+      <w:r>
+        <w:t>decomposing</w:t>
+      </w:r>
+      <w:proofErr w:type="gramEnd"/>
+      <w:r>
+        <w:t xml:space="preserve"> the</w:t>
       </w:r>
       <w:r>
         <w:t xml:space="preserve"> </w:t>
@@ -1438,7 +1773,15 @@
     </w:p>
     <w:p>
       <w:r>
-        <w:t>Started with some join logic and difference between distinct and Group By in a CTE to achieve the same result</w:t>
+        <w:t xml:space="preserve">Started with some join logic and difference between distinct and Group </w:t>
+      </w:r>
+      <w:proofErr w:type="gramStart"/>
+      <w:r>
+        <w:t>By</w:t>
+      </w:r>
+      <w:proofErr w:type="gramEnd"/>
+      <w:r>
+        <w:t xml:space="preserve"> in a CTE to achieve the same result</w:t>
       </w:r>
       <w:r>
         <w:t xml:space="preserve">; CTE above/below average comparisons. </w:t>
@@ -1462,6 +1805,7 @@
           <w:b/>
           <w:bCs/>
         </w:rPr>
+        <w:lastRenderedPageBreak/>
         <w:t>Problem:</w:t>
       </w:r>
       <w:r>
@@ -1503,7 +1847,15 @@
         <w:t>Analysis:</w:t>
       </w:r>
       <w:r>
-        <w:t xml:space="preserve"> what did you actually do with the data? </w:t>
+        <w:t xml:space="preserve"> what did you </w:t>
+      </w:r>
+      <w:proofErr w:type="gramStart"/>
+      <w:r>
+        <w:t>actually do</w:t>
+      </w:r>
+      <w:proofErr w:type="gramEnd"/>
+      <w:r>
+        <w:t xml:space="preserve"> with the data? </w:t>
       </w:r>
     </w:p>
     <w:p>
@@ -1538,7 +1890,6 @@
           <w:b/>
           <w:bCs/>
         </w:rPr>
-        <w:lastRenderedPageBreak/>
         <w:t>Impact:</w:t>
       </w:r>
       <w:r>
@@ -1583,7 +1934,15 @@
         <w:t>trends</w:t>
       </w:r>
       <w:r>
-        <w:t xml:space="preserve"> when I was most efficient and which shifts were actually worth my time.</w:t>
+        <w:t xml:space="preserve"> when I was most efficient and which shifts were </w:t>
+      </w:r>
+      <w:proofErr w:type="gramStart"/>
+      <w:r>
+        <w:t>actually worth</w:t>
+      </w:r>
+      <w:proofErr w:type="gramEnd"/>
+      <w:r>
+        <w:t xml:space="preserve"> my time.</w:t>
       </w:r>
     </w:p>
     <w:p>
@@ -1638,7 +1997,23 @@
     </w:p>
     <w:p>
       <w:r>
-        <w:t>When I transitioned to Three Square as a Nutrition Education Specialist, I was regularly reviewing performance metrics, improving processes, and using data to help support health and operational goals for the Las Vegas community.</w:t>
+        <w:t xml:space="preserve">When I transitioned to Three Square as a Nutrition Education Specialist, </w:t>
+      </w:r>
+      <w:proofErr w:type="gramStart"/>
+      <w:r>
+        <w:t>I was</w:t>
+      </w:r>
+      <w:proofErr w:type="gramEnd"/>
+      <w:r>
+        <w:t xml:space="preserve"> regularly </w:t>
+      </w:r>
+      <w:proofErr w:type="gramStart"/>
+      <w:r>
+        <w:t>reviewing</w:t>
+      </w:r>
+      <w:proofErr w:type="gramEnd"/>
+      <w:r>
+        <w:t xml:space="preserve"> performance metrics, improving processes, and using data to help support health and operational goals for the Las Vegas community.</w:t>
       </w:r>
     </w:p>
     <w:p>
@@ -1648,7 +2023,11 @@
     </w:p>
     <w:p>
       <w:r>
-        <w:t>What interests me about Mercury is the opportunity to keep developing those technical skills while contributing to a team that works across analytics, data, and systems. I think my background in operations, problem-solving, and analytics gives me a strong foundation to contribute while continuing to grow.</w:t>
+        <w:t xml:space="preserve">What interests me about Mercury is the opportunity to keep developing those technical skills while contributing to a team that works across analytics, data, and systems. I think </w:t>
+      </w:r>
+      <w:r>
+        <w:lastRenderedPageBreak/>
+        <w:t>my background in operations, problem-solving, and analytics gives me a strong foundation to contribute while continuing to grow.</w:t>
       </w:r>
       <w:r>
         <w:t xml:space="preserve">  </w:t>
@@ -1676,9 +2055,13 @@
           <w:numId w:val="4"/>
         </w:numPr>
       </w:pPr>
-      <w:r>
-        <w:lastRenderedPageBreak/>
-        <w:t xml:space="preserve">a CTE can create a new state-level dataset </w:t>
+      <w:proofErr w:type="gramStart"/>
+      <w:r>
+        <w:t>a CTE</w:t>
+      </w:r>
+      <w:proofErr w:type="gramEnd"/>
+      <w:r>
+        <w:t xml:space="preserve"> can create a new state-level dataset </w:t>
       </w:r>
     </w:p>
     <w:p>
@@ -1713,8 +2096,13 @@
           <w:numId w:val="4"/>
         </w:numPr>
       </w:pPr>
-      <w:r>
-        <w:t>the outer query can compare each row against an aggregate of the CTE</w:t>
+      <w:proofErr w:type="gramStart"/>
+      <w:r>
+        <w:t>the</w:t>
+      </w:r>
+      <w:proofErr w:type="gramEnd"/>
+      <w:r>
+        <w:t xml:space="preserve"> outer query can compare each row against an aggregate of the CTE</w:t>
       </w:r>
     </w:p>
     <w:p/>
@@ -1733,7 +2121,15 @@
     </w:p>
     <w:p>
       <w:r>
-        <w:t xml:space="preserve">Went over concepts of joins. Instead of syntaxes in isolation, my goal is to understand purpose and function of SQL concepts, but also develop the ability to apply them to various scenarios; effective application within real world. </w:t>
+        <w:t xml:space="preserve">Went over concepts of joins. Instead of syntaxes in isolation, my goal is to understand purpose and function of SQL </w:t>
+      </w:r>
+      <w:proofErr w:type="gramStart"/>
+      <w:r>
+        <w:t>concepts, but</w:t>
+      </w:r>
+      <w:proofErr w:type="gramEnd"/>
+      <w:r>
+        <w:t xml:space="preserve"> also develop the ability to apply them to various scenarios; effective application within real world. </w:t>
       </w:r>
     </w:p>
     <w:p>
@@ -1770,7 +2166,15 @@
       </w:r>
       <w:proofErr w:type="spellEnd"/>
       <w:r>
-        <w:t xml:space="preserve">. Focusing on knowing when to apply certain Window Functions based off of business needs. Growing past learning Window Functions in isolation. </w:t>
+        <w:t xml:space="preserve">. Focusing on knowing when to apply certain Window Functions based </w:t>
+      </w:r>
+      <w:proofErr w:type="gramStart"/>
+      <w:r>
+        <w:t>off of</w:t>
+      </w:r>
+      <w:proofErr w:type="gramEnd"/>
+      <w:r>
+        <w:t xml:space="preserve"> business needs. Growing past learning Window Functions in isolation. </w:t>
       </w:r>
     </w:p>
     <w:p>
@@ -1792,19 +2196,35 @@
       </w:r>
       <w:proofErr w:type="spellStart"/>
       <w:r>
-        <w:t>First_Value</w:t>
+        <w:t>First_</w:t>
+      </w:r>
+      <w:proofErr w:type="gramStart"/>
+      <w:r>
+        <w:t>Value</w:t>
       </w:r>
       <w:proofErr w:type="spellEnd"/>
       <w:r>
-        <w:t xml:space="preserve">() and </w:t>
+        <w:t>(</w:t>
+      </w:r>
+      <w:proofErr w:type="gramEnd"/>
+      <w:r>
+        <w:t xml:space="preserve">) and </w:t>
       </w:r>
       <w:proofErr w:type="spellStart"/>
       <w:r>
-        <w:t>Last_Value</w:t>
+        <w:t>Last_</w:t>
+      </w:r>
+      <w:proofErr w:type="gramStart"/>
+      <w:r>
+        <w:t>Value</w:t>
       </w:r>
       <w:proofErr w:type="spellEnd"/>
       <w:r>
-        <w:t>()</w:t>
+        <w:t>(</w:t>
+      </w:r>
+      <w:proofErr w:type="gramEnd"/>
+      <w:r>
+        <w:t>)</w:t>
       </w:r>
       <w:r>
         <w:t xml:space="preserve"> with Window Frames</w:t>
@@ -1819,7 +2239,23 @@
         </w:numPr>
       </w:pPr>
       <w:r>
-        <w:t>Business-wise, FIRST_VALUE() is useful for comparing current performance to a starting baseline, while LAST_VALUE() is useful for comparing rows to the final value in a defined sequence.</w:t>
+        <w:t>Business-wise, FIRST_</w:t>
+      </w:r>
+      <w:proofErr w:type="gramStart"/>
+      <w:r>
+        <w:t>VALUE(</w:t>
+      </w:r>
+      <w:proofErr w:type="gramEnd"/>
+      <w:r>
+        <w:t>) is useful for comparing current performance to a starting baseline, while LAST_</w:t>
+      </w:r>
+      <w:proofErr w:type="gramStart"/>
+      <w:r>
+        <w:t>VALUE(</w:t>
+      </w:r>
+      <w:proofErr w:type="gramEnd"/>
+      <w:r>
+        <w:t>) is useful for comparing rows to the final value in a defined sequence.</w:t>
       </w:r>
     </w:p>
     <w:p>
@@ -1850,7 +2286,15 @@
     </w:p>
     <w:p>
       <w:r>
-        <w:t>Practiced Lag() – Value/Navigation windows</w:t>
+        <w:t xml:space="preserve">Practiced </w:t>
+      </w:r>
+      <w:proofErr w:type="gramStart"/>
+      <w:r>
+        <w:t>Lag(</w:t>
+      </w:r>
+      <w:proofErr w:type="gramEnd"/>
+      <w:r>
+        <w:t>) – Value/Navigation windows</w:t>
       </w:r>
     </w:p>
     <w:p>
@@ -1899,8 +2343,15 @@
         </w:numPr>
       </w:pPr>
       <w:r>
-        <w:lastRenderedPageBreak/>
-        <w:t>Partition By()</w:t>
+        <w:t xml:space="preserve">Partition </w:t>
+      </w:r>
+      <w:proofErr w:type="gramStart"/>
+      <w:r>
+        <w:t>By(</w:t>
+      </w:r>
+      <w:proofErr w:type="gramEnd"/>
+      <w:r>
+        <w:t>)</w:t>
       </w:r>
     </w:p>
     <w:p>
@@ -1927,7 +2378,15 @@
         </w:numPr>
       </w:pPr>
       <w:r>
-        <w:t>Order By()</w:t>
+        <w:t xml:space="preserve">Order </w:t>
+      </w:r>
+      <w:proofErr w:type="gramStart"/>
+      <w:r>
+        <w:t>By(</w:t>
+      </w:r>
+      <w:proofErr w:type="gramEnd"/>
+      <w:r>
+        <w:t>)</w:t>
       </w:r>
     </w:p>
     <w:p>
@@ -1952,11 +2411,19 @@
       </w:pPr>
       <w:proofErr w:type="spellStart"/>
       <w:r>
-        <w:t>Row_Number</w:t>
+        <w:t>Row_</w:t>
+      </w:r>
+      <w:proofErr w:type="gramStart"/>
+      <w:r>
+        <w:t>Number</w:t>
       </w:r>
       <w:proofErr w:type="spellEnd"/>
       <w:r>
-        <w:t>()</w:t>
+        <w:t>(</w:t>
+      </w:r>
+      <w:proofErr w:type="gramEnd"/>
+      <w:r>
+        <w:t>)</w:t>
       </w:r>
     </w:p>
     <w:p>
@@ -1967,8 +2434,13 @@
           <w:numId w:val="2"/>
         </w:numPr>
       </w:pPr>
-      <w:r>
-        <w:t>Rank()</w:t>
+      <w:proofErr w:type="gramStart"/>
+      <w:r>
+        <w:t>Rank(</w:t>
+      </w:r>
+      <w:proofErr w:type="gramEnd"/>
+      <w:r>
+        <w:t>)</w:t>
       </w:r>
     </w:p>
     <w:p>
@@ -1981,11 +2453,19 @@
       </w:pPr>
       <w:proofErr w:type="spellStart"/>
       <w:r>
-        <w:t>Dense_Rank</w:t>
+        <w:t>Dense_</w:t>
+      </w:r>
+      <w:proofErr w:type="gramStart"/>
+      <w:r>
+        <w:t>Rank</w:t>
       </w:r>
       <w:proofErr w:type="spellEnd"/>
       <w:r>
-        <w:t>()</w:t>
+        <w:t>(</w:t>
+      </w:r>
+      <w:proofErr w:type="gramEnd"/>
+      <w:r>
+        <w:t>)</w:t>
       </w:r>
     </w:p>
     <w:p>
@@ -1996,8 +2476,13 @@
           <w:numId w:val="2"/>
         </w:numPr>
       </w:pPr>
-      <w:r>
-        <w:t>Lag()</w:t>
+      <w:proofErr w:type="gramStart"/>
+      <w:r>
+        <w:t>Lag(</w:t>
+      </w:r>
+      <w:proofErr w:type="gramEnd"/>
+      <w:r>
+        <w:t>)</w:t>
       </w:r>
     </w:p>
     <w:p>
@@ -2021,11 +2506,21 @@
         </w:numPr>
       </w:pPr>
       <w:r>
-        <w:t xml:space="preserve">Define the field I want the value from and pull  a previous record </w:t>
-      </w:r>
+        <w:t xml:space="preserve">Define the field I want the value from and </w:t>
+      </w:r>
+      <w:proofErr w:type="gramStart"/>
+      <w:r>
+        <w:t>pull  a</w:t>
+      </w:r>
+      <w:proofErr w:type="gramEnd"/>
+      <w:r>
+        <w:t xml:space="preserve"> previous record </w:t>
+      </w:r>
+      <w:proofErr w:type="gramStart"/>
       <w:r>
         <w:t>git</w:t>
       </w:r>
+      <w:proofErr w:type="gramEnd"/>
     </w:p>
     <w:p/>
     <w:p>

</xml_diff>